<commit_message>
Sprint 9 Commit 1: Introduce reusable neural forecasting infrastructure
</commit_message>
<xml_diff>
--- a/docs/draft/development_flow.docx
+++ b/docs/draft/development_flow.docx
@@ -15613,51 +15613,7 @@
           <w:szCs w:val="32"/>
           <w:u w:val="single"/>
         </w:rPr>
-        <w:t>P</w:t>
-      </w:r>
-      <w:r>
-        <w:rPr>
-          <w:b/>
-          <w:bCs/>
-          <w:noProof/>
-          <w:sz w:val="32"/>
-          <w:szCs w:val="32"/>
-          <w:u w:val="single"/>
-        </w:rPr>
-        <w:t xml:space="preserve">rognostics </w:t>
-      </w:r>
-      <w:r>
-        <w:rPr>
-          <w:b/>
-          <w:bCs/>
-          <w:noProof/>
-          <w:sz w:val="32"/>
-          <w:szCs w:val="32"/>
-          <w:u w:val="single"/>
-        </w:rPr>
-        <w:t>P</w:t>
-      </w:r>
-      <w:r>
-        <w:rPr>
-          <w:b/>
-          <w:bCs/>
-          <w:noProof/>
-          <w:sz w:val="32"/>
-          <w:szCs w:val="32"/>
-          <w:u w:val="single"/>
-        </w:rPr>
-        <w:t>ackage</w:t>
-      </w:r>
-      <w:r>
-        <w:rPr>
-          <w:b/>
-          <w:bCs/>
-          <w:noProof/>
-          <w:sz w:val="32"/>
-          <w:szCs w:val="32"/>
-          <w:u w:val="single"/>
-        </w:rPr>
-        <w:t>:</w:t>
+        <w:t>Prognostics Package:</w:t>
       </w:r>
     </w:p>
     <w:p>
@@ -16121,6 +16077,1551 @@
           <w:szCs w:val="24"/>
         </w:rPr>
       </w:pPr>
+    </w:p>
+    <w:p>
+      <w:pPr>
+        <w:rPr>
+          <w:noProof/>
+          <w:sz w:val="24"/>
+          <w:szCs w:val="24"/>
+        </w:rPr>
+      </w:pPr>
+      <w:r>
+        <w:rPr>
+          <w:noProof/>
+          <w:sz w:val="24"/>
+          <w:szCs w:val="24"/>
+        </w:rPr>
+        <w:br w:type="page"/>
+      </w:r>
+    </w:p>
+    <w:p>
+      <w:pPr>
+        <w:spacing w:after="0" w:line="240" w:lineRule="auto"/>
+        <w:rPr>
+          <w:b/>
+          <w:bCs/>
+          <w:noProof/>
+          <w:sz w:val="32"/>
+          <w:szCs w:val="32"/>
+        </w:rPr>
+      </w:pPr>
+      <w:r>
+        <w:rPr>
+          <w:b/>
+          <w:bCs/>
+          <w:noProof/>
+          <w:sz w:val="32"/>
+          <w:szCs w:val="32"/>
+        </w:rPr>
+        <w:lastRenderedPageBreak/>
+        <w:t>Neural Network Infrastructure</w:t>
+      </w:r>
+    </w:p>
+    <w:p>
+      <w:pPr>
+        <w:spacing w:after="0" w:line="240" w:lineRule="auto"/>
+        <w:rPr>
+          <w:noProof/>
+          <w:sz w:val="24"/>
+          <w:szCs w:val="24"/>
+        </w:rPr>
+      </w:pPr>
+    </w:p>
+    <w:p>
+      <w:pPr>
+        <w:spacing w:after="0" w:line="240" w:lineRule="auto"/>
+        <w:rPr>
+          <w:noProof/>
+          <w:sz w:val="24"/>
+          <w:szCs w:val="24"/>
+        </w:rPr>
+      </w:pPr>
+    </w:p>
+    <w:p>
+      <w:pPr>
+        <w:spacing w:after="0" w:line="240" w:lineRule="auto"/>
+        <w:rPr>
+          <w:noProof/>
+          <w:sz w:val="24"/>
+          <w:szCs w:val="24"/>
+        </w:rPr>
+      </w:pPr>
+      <w:r>
+        <w:rPr>
+          <w:noProof/>
+          <w:sz w:val="24"/>
+          <w:szCs w:val="24"/>
+        </w:rPr>
+        <w:t>zenerestimation/</w:t>
+      </w:r>
+    </w:p>
+    <w:p>
+      <w:pPr>
+        <w:spacing w:after="0" w:line="240" w:lineRule="auto"/>
+        <w:rPr>
+          <w:noProof/>
+          <w:sz w:val="24"/>
+          <w:szCs w:val="24"/>
+        </w:rPr>
+      </w:pPr>
+    </w:p>
+    <w:p>
+      <w:pPr>
+        <w:spacing w:after="0" w:line="240" w:lineRule="auto"/>
+        <w:rPr>
+          <w:noProof/>
+          <w:sz w:val="24"/>
+          <w:szCs w:val="24"/>
+        </w:rPr>
+      </w:pPr>
+      <w:r>
+        <w:rPr>
+          <w:noProof/>
+          <w:sz w:val="24"/>
+          <w:szCs w:val="24"/>
+        </w:rPr>
+        <w:t xml:space="preserve">    forecasting/</w:t>
+      </w:r>
+    </w:p>
+    <w:p>
+      <w:pPr>
+        <w:spacing w:after="0" w:line="240" w:lineRule="auto"/>
+        <w:rPr>
+          <w:noProof/>
+          <w:sz w:val="24"/>
+          <w:szCs w:val="24"/>
+        </w:rPr>
+      </w:pPr>
+    </w:p>
+    <w:p>
+      <w:pPr>
+        <w:spacing w:after="0" w:line="240" w:lineRule="auto"/>
+        <w:rPr>
+          <w:noProof/>
+          <w:sz w:val="24"/>
+          <w:szCs w:val="24"/>
+        </w:rPr>
+      </w:pPr>
+      <w:r>
+        <w:rPr>
+          <w:noProof/>
+          <w:sz w:val="24"/>
+          <w:szCs w:val="24"/>
+        </w:rPr>
+        <w:t xml:space="preserve">        neural/</w:t>
+      </w:r>
+    </w:p>
+    <w:p>
+      <w:pPr>
+        <w:spacing w:after="0" w:line="240" w:lineRule="auto"/>
+        <w:rPr>
+          <w:noProof/>
+          <w:sz w:val="24"/>
+          <w:szCs w:val="24"/>
+        </w:rPr>
+      </w:pPr>
+    </w:p>
+    <w:p>
+      <w:pPr>
+        <w:spacing w:after="0" w:line="240" w:lineRule="auto"/>
+        <w:rPr>
+          <w:noProof/>
+          <w:sz w:val="24"/>
+          <w:szCs w:val="24"/>
+        </w:rPr>
+      </w:pPr>
+      <w:r>
+        <w:rPr>
+          <w:noProof/>
+          <w:sz w:val="24"/>
+          <w:szCs w:val="24"/>
+        </w:rPr>
+        <w:t xml:space="preserve">            __init__.py</w:t>
+      </w:r>
+    </w:p>
+    <w:p>
+      <w:pPr>
+        <w:spacing w:after="0" w:line="240" w:lineRule="auto"/>
+        <w:rPr>
+          <w:noProof/>
+          <w:sz w:val="24"/>
+          <w:szCs w:val="24"/>
+        </w:rPr>
+      </w:pPr>
+    </w:p>
+    <w:p>
+      <w:pPr>
+        <w:spacing w:after="0" w:line="240" w:lineRule="auto"/>
+        <w:rPr>
+          <w:noProof/>
+          <w:sz w:val="24"/>
+          <w:szCs w:val="24"/>
+        </w:rPr>
+      </w:pPr>
+      <w:r>
+        <w:rPr>
+          <w:noProof/>
+          <w:sz w:val="24"/>
+          <w:szCs w:val="24"/>
+        </w:rPr>
+        <w:t xml:space="preserve">            base.py</w:t>
+      </w:r>
+    </w:p>
+    <w:p>
+      <w:pPr>
+        <w:spacing w:after="0" w:line="240" w:lineRule="auto"/>
+        <w:rPr>
+          <w:noProof/>
+          <w:sz w:val="24"/>
+          <w:szCs w:val="24"/>
+        </w:rPr>
+      </w:pPr>
+    </w:p>
+    <w:p>
+      <w:pPr>
+        <w:spacing w:after="0" w:line="240" w:lineRule="auto"/>
+        <w:rPr>
+          <w:noProof/>
+          <w:sz w:val="24"/>
+          <w:szCs w:val="24"/>
+        </w:rPr>
+      </w:pPr>
+      <w:r>
+        <w:rPr>
+          <w:noProof/>
+          <w:sz w:val="24"/>
+          <w:szCs w:val="24"/>
+        </w:rPr>
+        <w:t xml:space="preserve">            windows.py</w:t>
+      </w:r>
+    </w:p>
+    <w:p>
+      <w:pPr>
+        <w:spacing w:after="0" w:line="240" w:lineRule="auto"/>
+        <w:rPr>
+          <w:noProof/>
+          <w:sz w:val="24"/>
+          <w:szCs w:val="24"/>
+        </w:rPr>
+      </w:pPr>
+    </w:p>
+    <w:p>
+      <w:pPr>
+        <w:spacing w:after="0" w:line="240" w:lineRule="auto"/>
+        <w:rPr>
+          <w:noProof/>
+          <w:sz w:val="24"/>
+          <w:szCs w:val="24"/>
+        </w:rPr>
+      </w:pPr>
+      <w:r>
+        <w:rPr>
+          <w:noProof/>
+          <w:sz w:val="24"/>
+          <w:szCs w:val="24"/>
+        </w:rPr>
+        <w:t xml:space="preserve">            scaler.py</w:t>
+      </w:r>
+    </w:p>
+    <w:p>
+      <w:pPr>
+        <w:spacing w:after="0" w:line="240" w:lineRule="auto"/>
+        <w:rPr>
+          <w:noProof/>
+          <w:sz w:val="24"/>
+          <w:szCs w:val="24"/>
+        </w:rPr>
+      </w:pPr>
+    </w:p>
+    <w:p>
+      <w:pPr>
+        <w:spacing w:after="0" w:line="240" w:lineRule="auto"/>
+        <w:rPr>
+          <w:noProof/>
+          <w:sz w:val="24"/>
+          <w:szCs w:val="24"/>
+        </w:rPr>
+      </w:pPr>
+      <w:r>
+        <w:rPr>
+          <w:noProof/>
+          <w:sz w:val="24"/>
+          <w:szCs w:val="24"/>
+        </w:rPr>
+        <w:t xml:space="preserve">            utils.py</w:t>
+      </w:r>
+    </w:p>
+    <w:p>
+      <w:pPr>
+        <w:spacing w:after="0" w:line="240" w:lineRule="auto"/>
+        <w:rPr>
+          <w:noProof/>
+          <w:sz w:val="24"/>
+          <w:szCs w:val="24"/>
+        </w:rPr>
+      </w:pPr>
+    </w:p>
+    <w:p>
+      <w:pPr>
+        <w:spacing w:after="0" w:line="240" w:lineRule="auto"/>
+        <w:rPr>
+          <w:noProof/>
+          <w:sz w:val="24"/>
+          <w:szCs w:val="24"/>
+        </w:rPr>
+      </w:pPr>
+    </w:p>
+    <w:p>
+      <w:pPr>
+        <w:spacing w:after="0" w:line="240" w:lineRule="auto"/>
+        <w:rPr>
+          <w:b/>
+          <w:bCs/>
+          <w:noProof/>
+          <w:sz w:val="24"/>
+          <w:szCs w:val="24"/>
+          <w:lang w:val="tr-TR"/>
+        </w:rPr>
+      </w:pPr>
+      <w:r>
+        <w:rPr>
+          <w:b/>
+          <w:bCs/>
+          <w:noProof/>
+          <w:sz w:val="24"/>
+          <w:szCs w:val="24"/>
+          <w:lang w:val="tr-TR"/>
+        </w:rPr>
+        <w:t>Responsibilities</w:t>
+      </w:r>
+    </w:p>
+    <w:p>
+      <w:pPr>
+        <w:spacing w:after="0" w:line="240" w:lineRule="auto"/>
+        <w:rPr>
+          <w:b/>
+          <w:bCs/>
+          <w:noProof/>
+          <w:sz w:val="24"/>
+          <w:szCs w:val="24"/>
+          <w:lang w:val="tr-TR"/>
+        </w:rPr>
+      </w:pPr>
+      <w:r>
+        <w:rPr>
+          <w:b/>
+          <w:bCs/>
+          <w:noProof/>
+          <w:sz w:val="24"/>
+          <w:szCs w:val="24"/>
+          <w:lang w:val="tr-TR"/>
+        </w:rPr>
+        <w:t>base.py</w:t>
+      </w:r>
+    </w:p>
+    <w:p>
+      <w:pPr>
+        <w:spacing w:after="0" w:line="240" w:lineRule="auto"/>
+        <w:rPr>
+          <w:noProof/>
+          <w:sz w:val="24"/>
+          <w:szCs w:val="24"/>
+          <w:lang w:val="tr-TR"/>
+        </w:rPr>
+      </w:pPr>
+      <w:r>
+        <w:rPr>
+          <w:noProof/>
+          <w:sz w:val="24"/>
+          <w:szCs w:val="24"/>
+          <w:lang w:val="tr-TR"/>
+        </w:rPr>
+        <w:t>Contains</w:t>
+      </w:r>
+    </w:p>
+    <w:p>
+      <w:pPr>
+        <w:spacing w:after="0" w:line="240" w:lineRule="auto"/>
+        <w:rPr>
+          <w:noProof/>
+          <w:sz w:val="24"/>
+          <w:szCs w:val="24"/>
+          <w:lang w:val="tr-TR"/>
+        </w:rPr>
+      </w:pPr>
+      <w:r>
+        <w:rPr>
+          <w:noProof/>
+          <w:sz w:val="24"/>
+          <w:szCs w:val="24"/>
+          <w:lang w:val="tr-TR"/>
+        </w:rPr>
+        <w:t>BaseNeuralForecaster</w:t>
+      </w:r>
+    </w:p>
+    <w:p>
+      <w:pPr>
+        <w:spacing w:after="0" w:line="240" w:lineRule="auto"/>
+        <w:rPr>
+          <w:noProof/>
+          <w:sz w:val="24"/>
+          <w:szCs w:val="24"/>
+          <w:lang w:val="tr-TR"/>
+        </w:rPr>
+      </w:pPr>
+      <w:r>
+        <w:rPr>
+          <w:noProof/>
+          <w:sz w:val="24"/>
+          <w:szCs w:val="24"/>
+          <w:lang w:val="tr-TR"/>
+        </w:rPr>
+        <w:t>Responsible for</w:t>
+      </w:r>
+    </w:p>
+    <w:p>
+      <w:pPr>
+        <w:numPr>
+          <w:ilvl w:val="0"/>
+          <w:numId w:val="12"/>
+        </w:numPr>
+        <w:spacing w:after="0" w:line="240" w:lineRule="auto"/>
+        <w:rPr>
+          <w:noProof/>
+          <w:sz w:val="24"/>
+          <w:szCs w:val="24"/>
+          <w:lang w:val="tr-TR"/>
+        </w:rPr>
+      </w:pPr>
+      <w:r>
+        <w:rPr>
+          <w:noProof/>
+          <w:sz w:val="24"/>
+          <w:szCs w:val="24"/>
+          <w:lang w:val="tr-TR"/>
+        </w:rPr>
+        <w:t xml:space="preserve">common fit/predict interface </w:t>
+      </w:r>
+    </w:p>
+    <w:p>
+      <w:pPr>
+        <w:numPr>
+          <w:ilvl w:val="0"/>
+          <w:numId w:val="12"/>
+        </w:numPr>
+        <w:spacing w:after="0" w:line="240" w:lineRule="auto"/>
+        <w:rPr>
+          <w:noProof/>
+          <w:sz w:val="24"/>
+          <w:szCs w:val="24"/>
+          <w:lang w:val="tr-TR"/>
+        </w:rPr>
+      </w:pPr>
+      <w:r>
+        <w:rPr>
+          <w:noProof/>
+          <w:sz w:val="24"/>
+          <w:szCs w:val="24"/>
+          <w:lang w:val="tr-TR"/>
+        </w:rPr>
+        <w:t xml:space="preserve">preprocessing pipeline </w:t>
+      </w:r>
+    </w:p>
+    <w:p>
+      <w:pPr>
+        <w:numPr>
+          <w:ilvl w:val="0"/>
+          <w:numId w:val="12"/>
+        </w:numPr>
+        <w:spacing w:after="0" w:line="240" w:lineRule="auto"/>
+        <w:rPr>
+          <w:noProof/>
+          <w:sz w:val="24"/>
+          <w:szCs w:val="24"/>
+          <w:lang w:val="tr-TR"/>
+        </w:rPr>
+      </w:pPr>
+      <w:r>
+        <w:rPr>
+          <w:noProof/>
+          <w:sz w:val="24"/>
+          <w:szCs w:val="24"/>
+          <w:lang w:val="tr-TR"/>
+        </w:rPr>
+        <w:t xml:space="preserve">ForecastResult creation </w:t>
+      </w:r>
+    </w:p>
+    <w:p>
+      <w:pPr>
+        <w:numPr>
+          <w:ilvl w:val="0"/>
+          <w:numId w:val="12"/>
+        </w:numPr>
+        <w:spacing w:after="0" w:line="240" w:lineRule="auto"/>
+        <w:rPr>
+          <w:noProof/>
+          <w:sz w:val="24"/>
+          <w:szCs w:val="24"/>
+          <w:lang w:val="tr-TR"/>
+        </w:rPr>
+      </w:pPr>
+      <w:r>
+        <w:rPr>
+          <w:noProof/>
+          <w:sz w:val="24"/>
+          <w:szCs w:val="24"/>
+          <w:lang w:val="tr-TR"/>
+        </w:rPr>
+        <w:t xml:space="preserve">integration with the framework </w:t>
+      </w:r>
+    </w:p>
+    <w:p>
+      <w:pPr>
+        <w:spacing w:after="0" w:line="240" w:lineRule="auto"/>
+        <w:rPr>
+          <w:noProof/>
+          <w:sz w:val="24"/>
+          <w:szCs w:val="24"/>
+          <w:lang w:val="tr-TR"/>
+        </w:rPr>
+      </w:pPr>
+      <w:r>
+        <w:rPr>
+          <w:noProof/>
+          <w:sz w:val="24"/>
+          <w:szCs w:val="24"/>
+          <w:lang w:val="tr-TR"/>
+        </w:rPr>
+        <w:pict w14:anchorId="6405C952">
+          <v:rect id="_x0000_i1049" style="width:0;height:1.5pt" o:hralign="center" o:hrstd="t" o:hr="t" fillcolor="#a0a0a0" stroked="f"/>
+        </w:pict>
+      </w:r>
+    </w:p>
+    <w:p>
+      <w:pPr>
+        <w:spacing w:after="0" w:line="240" w:lineRule="auto"/>
+        <w:rPr>
+          <w:b/>
+          <w:bCs/>
+          <w:noProof/>
+          <w:sz w:val="24"/>
+          <w:szCs w:val="24"/>
+          <w:lang w:val="tr-TR"/>
+        </w:rPr>
+      </w:pPr>
+      <w:r>
+        <w:rPr>
+          <w:b/>
+          <w:bCs/>
+          <w:noProof/>
+          <w:sz w:val="24"/>
+          <w:szCs w:val="24"/>
+          <w:lang w:val="tr-TR"/>
+        </w:rPr>
+        <w:t>windows.py</w:t>
+      </w:r>
+    </w:p>
+    <w:p>
+      <w:pPr>
+        <w:spacing w:after="0" w:line="240" w:lineRule="auto"/>
+        <w:rPr>
+          <w:noProof/>
+          <w:sz w:val="24"/>
+          <w:szCs w:val="24"/>
+          <w:lang w:val="tr-TR"/>
+        </w:rPr>
+      </w:pPr>
+      <w:r>
+        <w:rPr>
+          <w:noProof/>
+          <w:sz w:val="24"/>
+          <w:szCs w:val="24"/>
+          <w:lang w:val="tr-TR"/>
+        </w:rPr>
+        <w:t>Contains</w:t>
+      </w:r>
+    </w:p>
+    <w:p>
+      <w:pPr>
+        <w:spacing w:after="0" w:line="240" w:lineRule="auto"/>
+        <w:rPr>
+          <w:noProof/>
+          <w:sz w:val="24"/>
+          <w:szCs w:val="24"/>
+          <w:lang w:val="tr-TR"/>
+        </w:rPr>
+      </w:pPr>
+      <w:r>
+        <w:rPr>
+          <w:noProof/>
+          <w:sz w:val="24"/>
+          <w:szCs w:val="24"/>
+          <w:lang w:val="tr-TR"/>
+        </w:rPr>
+        <w:t>WindowGenerator</w:t>
+      </w:r>
+    </w:p>
+    <w:p>
+      <w:pPr>
+        <w:spacing w:after="0" w:line="240" w:lineRule="auto"/>
+        <w:rPr>
+          <w:noProof/>
+          <w:sz w:val="24"/>
+          <w:szCs w:val="24"/>
+          <w:lang w:val="tr-TR"/>
+        </w:rPr>
+      </w:pPr>
+      <w:r>
+        <w:rPr>
+          <w:noProof/>
+          <w:sz w:val="24"/>
+          <w:szCs w:val="24"/>
+          <w:lang w:val="tr-TR"/>
+        </w:rPr>
+        <w:t>Responsible only for</w:t>
+      </w:r>
+      <w:r>
+        <w:rPr>
+          <w:noProof/>
+          <w:sz w:val="24"/>
+          <w:szCs w:val="24"/>
+          <w:lang w:val="tr-TR"/>
+        </w:rPr>
+        <w:t>:</w:t>
+      </w:r>
+    </w:p>
+    <w:p>
+      <w:pPr>
+        <w:spacing w:after="0" w:line="240" w:lineRule="auto"/>
+        <w:rPr>
+          <w:noProof/>
+          <w:sz w:val="24"/>
+          <w:szCs w:val="24"/>
+          <w:lang w:val="tr-TR"/>
+        </w:rPr>
+      </w:pPr>
+      <w:r>
+        <w:rPr>
+          <w:noProof/>
+          <w:sz w:val="24"/>
+          <w:szCs w:val="24"/>
+          <w:lang w:val="tr-TR"/>
+        </w:rPr>
+        <w:t>Series</w:t>
+      </w:r>
+    </w:p>
+    <w:p>
+      <w:pPr>
+        <w:spacing w:after="0" w:line="240" w:lineRule="auto"/>
+        <w:rPr>
+          <w:noProof/>
+          <w:sz w:val="24"/>
+          <w:szCs w:val="24"/>
+          <w:lang w:val="tr-TR"/>
+        </w:rPr>
+      </w:pPr>
+      <w:r>
+        <w:rPr>
+          <w:noProof/>
+          <w:sz w:val="24"/>
+          <w:szCs w:val="24"/>
+          <w:lang w:val="tr-TR"/>
+        </w:rPr>
+        <w:t>↓</w:t>
+      </w:r>
+    </w:p>
+    <w:p>
+      <w:pPr>
+        <w:spacing w:after="0" w:line="240" w:lineRule="auto"/>
+        <w:rPr>
+          <w:noProof/>
+          <w:sz w:val="24"/>
+          <w:szCs w:val="24"/>
+          <w:lang w:val="tr-TR"/>
+        </w:rPr>
+      </w:pPr>
+      <w:r>
+        <w:rPr>
+          <w:noProof/>
+          <w:sz w:val="24"/>
+          <w:szCs w:val="24"/>
+          <w:lang w:val="tr-TR"/>
+        </w:rPr>
+        <w:t>Sliding windows</w:t>
+      </w:r>
+    </w:p>
+    <w:p>
+      <w:pPr>
+        <w:spacing w:after="0" w:line="240" w:lineRule="auto"/>
+        <w:rPr>
+          <w:noProof/>
+          <w:sz w:val="24"/>
+          <w:szCs w:val="24"/>
+          <w:lang w:val="tr-TR"/>
+        </w:rPr>
+      </w:pPr>
+      <w:r>
+        <w:rPr>
+          <w:noProof/>
+          <w:sz w:val="24"/>
+          <w:szCs w:val="24"/>
+          <w:lang w:val="tr-TR"/>
+        </w:rPr>
+        <w:t>↓</w:t>
+      </w:r>
+    </w:p>
+    <w:p>
+      <w:pPr>
+        <w:spacing w:after="0" w:line="240" w:lineRule="auto"/>
+        <w:rPr>
+          <w:noProof/>
+          <w:sz w:val="24"/>
+          <w:szCs w:val="24"/>
+          <w:lang w:val="tr-TR"/>
+        </w:rPr>
+      </w:pPr>
+      <w:r>
+        <w:rPr>
+          <w:noProof/>
+          <w:sz w:val="24"/>
+          <w:szCs w:val="24"/>
+          <w:lang w:val="tr-TR"/>
+        </w:rPr>
+        <w:t>X</w:t>
+      </w:r>
+    </w:p>
+    <w:p>
+      <w:pPr>
+        <w:spacing w:after="0" w:line="240" w:lineRule="auto"/>
+        <w:rPr>
+          <w:noProof/>
+          <w:sz w:val="24"/>
+          <w:szCs w:val="24"/>
+          <w:lang w:val="tr-TR"/>
+        </w:rPr>
+      </w:pPr>
+      <w:r>
+        <w:rPr>
+          <w:noProof/>
+          <w:sz w:val="24"/>
+          <w:szCs w:val="24"/>
+          <w:lang w:val="tr-TR"/>
+        </w:rPr>
+        <w:t>y</w:t>
+      </w:r>
+    </w:p>
+    <w:p>
+      <w:pPr>
+        <w:spacing w:after="0" w:line="240" w:lineRule="auto"/>
+        <w:rPr>
+          <w:noProof/>
+          <w:sz w:val="24"/>
+          <w:szCs w:val="24"/>
+          <w:lang w:val="tr-TR"/>
+        </w:rPr>
+      </w:pPr>
+      <w:r>
+        <w:rPr>
+          <w:noProof/>
+          <w:sz w:val="24"/>
+          <w:szCs w:val="24"/>
+          <w:lang w:val="tr-TR"/>
+        </w:rPr>
+        <w:t>No normalization.</w:t>
+      </w:r>
+    </w:p>
+    <w:p>
+      <w:pPr>
+        <w:spacing w:after="0" w:line="240" w:lineRule="auto"/>
+        <w:rPr>
+          <w:noProof/>
+          <w:sz w:val="24"/>
+          <w:szCs w:val="24"/>
+          <w:lang w:val="tr-TR"/>
+        </w:rPr>
+      </w:pPr>
+      <w:r>
+        <w:rPr>
+          <w:noProof/>
+          <w:sz w:val="24"/>
+          <w:szCs w:val="24"/>
+          <w:lang w:val="tr-TR"/>
+        </w:rPr>
+        <w:t>No TensorFlow.</w:t>
+      </w:r>
+    </w:p>
+    <w:p>
+      <w:pPr>
+        <w:spacing w:after="0" w:line="240" w:lineRule="auto"/>
+        <w:rPr>
+          <w:noProof/>
+          <w:sz w:val="24"/>
+          <w:szCs w:val="24"/>
+          <w:lang w:val="tr-TR"/>
+        </w:rPr>
+      </w:pPr>
+      <w:r>
+        <w:rPr>
+          <w:noProof/>
+          <w:sz w:val="24"/>
+          <w:szCs w:val="24"/>
+          <w:lang w:val="tr-TR"/>
+        </w:rPr>
+        <w:t>Just window generation.</w:t>
+      </w:r>
+    </w:p>
+    <w:p>
+      <w:pPr>
+        <w:spacing w:after="0" w:line="240" w:lineRule="auto"/>
+        <w:rPr>
+          <w:noProof/>
+          <w:sz w:val="24"/>
+          <w:szCs w:val="24"/>
+          <w:lang w:val="tr-TR"/>
+        </w:rPr>
+      </w:pPr>
+      <w:r>
+        <w:rPr>
+          <w:noProof/>
+          <w:sz w:val="24"/>
+          <w:szCs w:val="24"/>
+          <w:lang w:val="tr-TR"/>
+        </w:rPr>
+        <w:pict w14:anchorId="4D0940AE">
+          <v:rect id="_x0000_i1050" style="width:0;height:1.5pt" o:hralign="center" o:hrstd="t" o:hr="t" fillcolor="#a0a0a0" stroked="f"/>
+        </w:pict>
+      </w:r>
+    </w:p>
+    <w:p>
+      <w:pPr>
+        <w:rPr>
+          <w:b/>
+          <w:bCs/>
+          <w:noProof/>
+          <w:sz w:val="24"/>
+          <w:szCs w:val="24"/>
+          <w:lang w:val="tr-TR"/>
+        </w:rPr>
+      </w:pPr>
+      <w:r>
+        <w:rPr>
+          <w:b/>
+          <w:bCs/>
+          <w:noProof/>
+          <w:sz w:val="24"/>
+          <w:szCs w:val="24"/>
+          <w:lang w:val="tr-TR"/>
+        </w:rPr>
+        <w:br w:type="page"/>
+      </w:r>
+    </w:p>
+    <w:p>
+      <w:pPr>
+        <w:spacing w:after="0" w:line="240" w:lineRule="auto"/>
+        <w:rPr>
+          <w:b/>
+          <w:bCs/>
+          <w:noProof/>
+          <w:sz w:val="24"/>
+          <w:szCs w:val="24"/>
+          <w:lang w:val="tr-TR"/>
+        </w:rPr>
+      </w:pPr>
+      <w:r>
+        <w:rPr>
+          <w:b/>
+          <w:bCs/>
+          <w:noProof/>
+          <w:sz w:val="24"/>
+          <w:szCs w:val="24"/>
+          <w:lang w:val="tr-TR"/>
+        </w:rPr>
+        <w:lastRenderedPageBreak/>
+        <w:t>scaler.py</w:t>
+      </w:r>
+    </w:p>
+    <w:p>
+      <w:pPr>
+        <w:spacing w:after="0" w:line="240" w:lineRule="auto"/>
+        <w:rPr>
+          <w:noProof/>
+          <w:sz w:val="24"/>
+          <w:szCs w:val="24"/>
+          <w:lang w:val="tr-TR"/>
+        </w:rPr>
+      </w:pPr>
+      <w:r>
+        <w:rPr>
+          <w:noProof/>
+          <w:sz w:val="24"/>
+          <w:szCs w:val="24"/>
+          <w:lang w:val="tr-TR"/>
+        </w:rPr>
+        <w:t>Contains</w:t>
+      </w:r>
+    </w:p>
+    <w:p>
+      <w:pPr>
+        <w:spacing w:after="0" w:line="240" w:lineRule="auto"/>
+        <w:rPr>
+          <w:noProof/>
+          <w:sz w:val="24"/>
+          <w:szCs w:val="24"/>
+          <w:lang w:val="tr-TR"/>
+        </w:rPr>
+      </w:pPr>
+      <w:r>
+        <w:rPr>
+          <w:noProof/>
+          <w:sz w:val="24"/>
+          <w:szCs w:val="24"/>
+          <w:lang w:val="tr-TR"/>
+        </w:rPr>
+        <w:t>SequenceScaler</w:t>
+      </w:r>
+    </w:p>
+    <w:p>
+      <w:pPr>
+        <w:spacing w:after="0" w:line="240" w:lineRule="auto"/>
+        <w:rPr>
+          <w:noProof/>
+          <w:sz w:val="24"/>
+          <w:szCs w:val="24"/>
+          <w:lang w:val="tr-TR"/>
+        </w:rPr>
+      </w:pPr>
+      <w:r>
+        <w:rPr>
+          <w:noProof/>
+          <w:sz w:val="24"/>
+          <w:szCs w:val="24"/>
+          <w:lang w:val="tr-TR"/>
+        </w:rPr>
+        <w:t>Responsible only for</w:t>
+      </w:r>
+      <w:r>
+        <w:rPr>
+          <w:noProof/>
+          <w:sz w:val="24"/>
+          <w:szCs w:val="24"/>
+          <w:lang w:val="tr-TR"/>
+        </w:rPr>
+        <w:t>:</w:t>
+      </w:r>
+    </w:p>
+    <w:p>
+      <w:pPr>
+        <w:spacing w:after="0" w:line="240" w:lineRule="auto"/>
+        <w:rPr>
+          <w:noProof/>
+          <w:sz w:val="24"/>
+          <w:szCs w:val="24"/>
+          <w:lang w:val="tr-TR"/>
+        </w:rPr>
+      </w:pPr>
+      <w:r>
+        <w:rPr>
+          <w:noProof/>
+          <w:sz w:val="24"/>
+          <w:szCs w:val="24"/>
+          <w:lang w:val="tr-TR"/>
+        </w:rPr>
+        <w:t>fit()</w:t>
+      </w:r>
+    </w:p>
+    <w:p>
+      <w:pPr>
+        <w:spacing w:after="0" w:line="240" w:lineRule="auto"/>
+        <w:rPr>
+          <w:noProof/>
+          <w:sz w:val="24"/>
+          <w:szCs w:val="24"/>
+          <w:lang w:val="tr-TR"/>
+        </w:rPr>
+      </w:pPr>
+      <w:r>
+        <w:rPr>
+          <w:noProof/>
+          <w:sz w:val="24"/>
+          <w:szCs w:val="24"/>
+          <w:lang w:val="tr-TR"/>
+        </w:rPr>
+        <w:t>transform()</w:t>
+      </w:r>
+    </w:p>
+    <w:p>
+      <w:pPr>
+        <w:spacing w:after="0" w:line="240" w:lineRule="auto"/>
+        <w:rPr>
+          <w:noProof/>
+          <w:sz w:val="24"/>
+          <w:szCs w:val="24"/>
+          <w:lang w:val="tr-TR"/>
+        </w:rPr>
+      </w:pPr>
+      <w:r>
+        <w:rPr>
+          <w:noProof/>
+          <w:sz w:val="24"/>
+          <w:szCs w:val="24"/>
+          <w:lang w:val="tr-TR"/>
+        </w:rPr>
+        <w:t>inverse_transform()</w:t>
+      </w:r>
+    </w:p>
+    <w:p>
+      <w:pPr>
+        <w:spacing w:after="0" w:line="240" w:lineRule="auto"/>
+        <w:rPr>
+          <w:noProof/>
+          <w:sz w:val="24"/>
+          <w:szCs w:val="24"/>
+          <w:lang w:val="tr-TR"/>
+        </w:rPr>
+      </w:pPr>
+      <w:r>
+        <w:rPr>
+          <w:noProof/>
+          <w:sz w:val="24"/>
+          <w:szCs w:val="24"/>
+          <w:lang w:val="tr-TR"/>
+        </w:rPr>
+        <w:t>Initially it wraps</w:t>
+      </w:r>
+    </w:p>
+    <w:p>
+      <w:pPr>
+        <w:spacing w:after="0" w:line="240" w:lineRule="auto"/>
+        <w:rPr>
+          <w:noProof/>
+          <w:sz w:val="24"/>
+          <w:szCs w:val="24"/>
+          <w:lang w:val="tr-TR"/>
+        </w:rPr>
+      </w:pPr>
+      <w:r>
+        <w:rPr>
+          <w:noProof/>
+          <w:sz w:val="24"/>
+          <w:szCs w:val="24"/>
+          <w:lang w:val="tr-TR"/>
+        </w:rPr>
+        <w:t>MinMaxScaler</w:t>
+      </w:r>
+    </w:p>
+    <w:p>
+      <w:pPr>
+        <w:spacing w:after="0" w:line="240" w:lineRule="auto"/>
+        <w:rPr>
+          <w:noProof/>
+          <w:sz w:val="24"/>
+          <w:szCs w:val="24"/>
+          <w:lang w:val="tr-TR"/>
+        </w:rPr>
+      </w:pPr>
+      <w:r>
+        <w:rPr>
+          <w:noProof/>
+          <w:sz w:val="24"/>
+          <w:szCs w:val="24"/>
+          <w:lang w:val="tr-TR"/>
+        </w:rPr>
+        <w:t>Later we can swap</w:t>
+      </w:r>
+    </w:p>
+    <w:p>
+      <w:pPr>
+        <w:numPr>
+          <w:ilvl w:val="0"/>
+          <w:numId w:val="14"/>
+        </w:numPr>
+        <w:spacing w:after="0" w:line="240" w:lineRule="auto"/>
+        <w:rPr>
+          <w:noProof/>
+          <w:sz w:val="24"/>
+          <w:szCs w:val="24"/>
+          <w:lang w:val="tr-TR"/>
+        </w:rPr>
+      </w:pPr>
+      <w:r>
+        <w:rPr>
+          <w:noProof/>
+          <w:sz w:val="24"/>
+          <w:szCs w:val="24"/>
+          <w:lang w:val="tr-TR"/>
+        </w:rPr>
+        <w:t xml:space="preserve">StandardScaler </w:t>
+      </w:r>
+    </w:p>
+    <w:p>
+      <w:pPr>
+        <w:numPr>
+          <w:ilvl w:val="0"/>
+          <w:numId w:val="14"/>
+        </w:numPr>
+        <w:spacing w:after="0" w:line="240" w:lineRule="auto"/>
+        <w:rPr>
+          <w:noProof/>
+          <w:sz w:val="24"/>
+          <w:szCs w:val="24"/>
+          <w:lang w:val="tr-TR"/>
+        </w:rPr>
+      </w:pPr>
+      <w:r>
+        <w:rPr>
+          <w:noProof/>
+          <w:sz w:val="24"/>
+          <w:szCs w:val="24"/>
+          <w:lang w:val="tr-TR"/>
+        </w:rPr>
+        <w:t xml:space="preserve">RobustScaler </w:t>
+      </w:r>
+    </w:p>
+    <w:p>
+      <w:pPr>
+        <w:numPr>
+          <w:ilvl w:val="0"/>
+          <w:numId w:val="14"/>
+        </w:numPr>
+        <w:spacing w:after="0" w:line="240" w:lineRule="auto"/>
+        <w:rPr>
+          <w:noProof/>
+          <w:sz w:val="24"/>
+          <w:szCs w:val="24"/>
+          <w:lang w:val="tr-TR"/>
+        </w:rPr>
+      </w:pPr>
+      <w:r>
+        <w:rPr>
+          <w:noProof/>
+          <w:sz w:val="24"/>
+          <w:szCs w:val="24"/>
+          <w:lang w:val="tr-TR"/>
+        </w:rPr>
+        <w:t xml:space="preserve">QuantileTransformer </w:t>
+      </w:r>
+    </w:p>
+    <w:p>
+      <w:pPr>
+        <w:spacing w:after="0" w:line="240" w:lineRule="auto"/>
+        <w:rPr>
+          <w:noProof/>
+          <w:sz w:val="24"/>
+          <w:szCs w:val="24"/>
+          <w:lang w:val="tr-TR"/>
+        </w:rPr>
+      </w:pPr>
+      <w:r>
+        <w:rPr>
+          <w:noProof/>
+          <w:sz w:val="24"/>
+          <w:szCs w:val="24"/>
+          <w:lang w:val="tr-TR"/>
+        </w:rPr>
+        <w:t>without touching any forecasting model.</w:t>
+      </w:r>
+    </w:p>
+    <w:p>
+      <w:pPr>
+        <w:spacing w:after="0" w:line="240" w:lineRule="auto"/>
+        <w:rPr>
+          <w:noProof/>
+          <w:sz w:val="24"/>
+          <w:szCs w:val="24"/>
+          <w:lang w:val="tr-TR"/>
+        </w:rPr>
+      </w:pPr>
+      <w:r>
+        <w:rPr>
+          <w:noProof/>
+          <w:sz w:val="24"/>
+          <w:szCs w:val="24"/>
+          <w:lang w:val="tr-TR"/>
+        </w:rPr>
+        <w:pict w14:anchorId="770330A5">
+          <v:rect id="_x0000_i1051" style="width:0;height:1.5pt" o:hralign="center" o:hrstd="t" o:hr="t" fillcolor="#a0a0a0" stroked="f"/>
+        </w:pict>
+      </w:r>
+    </w:p>
+    <w:p>
+      <w:pPr>
+        <w:spacing w:after="0" w:line="240" w:lineRule="auto"/>
+        <w:rPr>
+          <w:b/>
+          <w:bCs/>
+          <w:noProof/>
+          <w:sz w:val="24"/>
+          <w:szCs w:val="24"/>
+          <w:lang w:val="tr-TR"/>
+        </w:rPr>
+      </w:pPr>
+      <w:r>
+        <w:rPr>
+          <w:b/>
+          <w:bCs/>
+          <w:noProof/>
+          <w:sz w:val="24"/>
+          <w:szCs w:val="24"/>
+          <w:lang w:val="tr-TR"/>
+        </w:rPr>
+        <w:t>utils.py</w:t>
+      </w:r>
+    </w:p>
+    <w:p>
+      <w:pPr>
+        <w:spacing w:after="0" w:line="240" w:lineRule="auto"/>
+        <w:rPr>
+          <w:noProof/>
+          <w:sz w:val="24"/>
+          <w:szCs w:val="24"/>
+          <w:lang w:val="tr-TR"/>
+        </w:rPr>
+      </w:pPr>
+      <w:r>
+        <w:rPr>
+          <w:noProof/>
+          <w:sz w:val="24"/>
+          <w:szCs w:val="24"/>
+          <w:lang w:val="tr-TR"/>
+        </w:rPr>
+        <w:t>Contains small helper functions.</w:t>
+      </w:r>
+    </w:p>
+    <w:p>
+      <w:pPr>
+        <w:spacing w:after="0" w:line="240" w:lineRule="auto"/>
+        <w:rPr>
+          <w:noProof/>
+          <w:sz w:val="24"/>
+          <w:szCs w:val="24"/>
+          <w:lang w:val="tr-TR"/>
+        </w:rPr>
+      </w:pPr>
+      <w:r>
+        <w:rPr>
+          <w:noProof/>
+          <w:sz w:val="24"/>
+          <w:szCs w:val="24"/>
+          <w:lang w:val="tr-TR"/>
+        </w:rPr>
+        <w:t>For example</w:t>
+      </w:r>
+      <w:r>
+        <w:rPr>
+          <w:noProof/>
+          <w:sz w:val="24"/>
+          <w:szCs w:val="24"/>
+          <w:lang w:val="tr-TR"/>
+        </w:rPr>
+        <w:t>:</w:t>
+      </w:r>
+    </w:p>
+    <w:p>
+      <w:pPr>
+        <w:spacing w:after="0" w:line="240" w:lineRule="auto"/>
+        <w:rPr>
+          <w:noProof/>
+          <w:sz w:val="24"/>
+          <w:szCs w:val="24"/>
+          <w:lang w:val="tr-TR"/>
+        </w:rPr>
+      </w:pPr>
+      <w:r>
+        <w:rPr>
+          <w:noProof/>
+          <w:sz w:val="24"/>
+          <w:szCs w:val="24"/>
+          <w:lang w:val="tr-TR"/>
+        </w:rPr>
+        <w:t>set_seed()</w:t>
+      </w:r>
+    </w:p>
+    <w:p>
+      <w:pPr>
+        <w:spacing w:after="0" w:line="240" w:lineRule="auto"/>
+        <w:rPr>
+          <w:noProof/>
+          <w:sz w:val="24"/>
+          <w:szCs w:val="24"/>
+          <w:lang w:val="tr-TR"/>
+        </w:rPr>
+      </w:pPr>
+      <w:r>
+        <w:rPr>
+          <w:noProof/>
+          <w:sz w:val="24"/>
+          <w:szCs w:val="24"/>
+          <w:lang w:val="tr-TR"/>
+        </w:rPr>
+        <w:t>configure_tensorflow()</w:t>
+      </w:r>
+    </w:p>
+    <w:p>
+      <w:pPr>
+        <w:spacing w:after="0" w:line="240" w:lineRule="auto"/>
+        <w:rPr>
+          <w:noProof/>
+          <w:sz w:val="24"/>
+          <w:szCs w:val="24"/>
+          <w:lang w:val="tr-TR"/>
+        </w:rPr>
+      </w:pPr>
+      <w:r>
+        <w:rPr>
+          <w:noProof/>
+          <w:sz w:val="24"/>
+          <w:szCs w:val="24"/>
+          <w:lang w:val="tr-TR"/>
+        </w:rPr>
+        <w:t>early_stopping()</w:t>
+      </w:r>
+    </w:p>
+    <w:p>
+      <w:pPr>
+        <w:spacing w:after="0" w:line="240" w:lineRule="auto"/>
+        <w:rPr>
+          <w:noProof/>
+          <w:sz w:val="24"/>
+          <w:szCs w:val="24"/>
+          <w:lang w:val="tr-TR"/>
+        </w:rPr>
+      </w:pPr>
+      <w:r>
+        <w:rPr>
+          <w:noProof/>
+          <w:sz w:val="24"/>
+          <w:szCs w:val="24"/>
+          <w:lang w:val="tr-TR"/>
+        </w:rPr>
+        <w:t>check_gpu()</w:t>
+      </w:r>
+    </w:p>
+    <w:p>
+      <w:pPr>
+        <w:spacing w:after="0" w:line="240" w:lineRule="auto"/>
+        <w:rPr>
+          <w:noProof/>
+          <w:sz w:val="24"/>
+          <w:szCs w:val="24"/>
+          <w:lang w:val="tr-TR"/>
+        </w:rPr>
+      </w:pPr>
+      <w:r>
+        <w:rPr>
+          <w:noProof/>
+          <w:sz w:val="24"/>
+          <w:szCs w:val="24"/>
+          <w:lang w:val="tr-TR"/>
+        </w:rPr>
+        <w:t>Nothing model-specific.</w:t>
+      </w:r>
+    </w:p>
+    <w:p>
+      <w:pPr>
+        <w:spacing w:after="0" w:line="240" w:lineRule="auto"/>
+        <w:rPr>
+          <w:noProof/>
+          <w:sz w:val="24"/>
+          <w:szCs w:val="24"/>
+          <w:lang w:val="tr-TR"/>
+        </w:rPr>
+      </w:pPr>
+      <w:r>
+        <w:rPr>
+          <w:noProof/>
+          <w:sz w:val="24"/>
+          <w:szCs w:val="24"/>
+          <w:lang w:val="tr-TR"/>
+        </w:rPr>
+        <w:pict w14:anchorId="506E1730">
+          <v:rect id="_x0000_i1052" style="width:0;height:1.5pt" o:hralign="center" o:hrstd="t" o:hr="t" fillcolor="#a0a0a0" stroked="f"/>
+        </w:pict>
+      </w:r>
+    </w:p>
+    <w:p>
+      <w:pPr>
+        <w:spacing w:after="0" w:line="240" w:lineRule="auto"/>
+        <w:rPr>
+          <w:b/>
+          <w:bCs/>
+          <w:noProof/>
+          <w:sz w:val="24"/>
+          <w:szCs w:val="24"/>
+          <w:lang w:val="tr-TR"/>
+        </w:rPr>
+      </w:pPr>
+      <w:r>
+        <w:rPr>
+          <w:b/>
+          <w:bCs/>
+          <w:noProof/>
+          <w:sz w:val="24"/>
+          <w:szCs w:val="24"/>
+          <w:lang w:val="tr-TR"/>
+        </w:rPr>
+        <w:t>__init__.py</w:t>
+      </w:r>
+    </w:p>
+    <w:p>
+      <w:pPr>
+        <w:spacing w:after="0" w:line="240" w:lineRule="auto"/>
+        <w:rPr>
+          <w:noProof/>
+          <w:sz w:val="24"/>
+          <w:szCs w:val="24"/>
+          <w:lang w:val="tr-TR"/>
+        </w:rPr>
+      </w:pPr>
+      <w:r>
+        <w:rPr>
+          <w:noProof/>
+          <w:sz w:val="24"/>
+          <w:szCs w:val="24"/>
+          <w:lang w:val="tr-TR"/>
+        </w:rPr>
+        <w:t>Exports</w:t>
+      </w:r>
+    </w:p>
+    <w:p>
+      <w:pPr>
+        <w:spacing w:after="0" w:line="240" w:lineRule="auto"/>
+        <w:rPr>
+          <w:noProof/>
+          <w:sz w:val="24"/>
+          <w:szCs w:val="24"/>
+          <w:lang w:val="tr-TR"/>
+        </w:rPr>
+      </w:pPr>
+      <w:r>
+        <w:rPr>
+          <w:noProof/>
+          <w:sz w:val="24"/>
+          <w:szCs w:val="24"/>
+          <w:lang w:val="tr-TR"/>
+        </w:rPr>
+        <w:t>from .base import BaseNeuralForecaster</w:t>
+      </w:r>
+    </w:p>
+    <w:p>
+      <w:pPr>
+        <w:spacing w:after="0" w:line="240" w:lineRule="auto"/>
+        <w:rPr>
+          <w:noProof/>
+          <w:sz w:val="24"/>
+          <w:szCs w:val="24"/>
+          <w:lang w:val="tr-TR"/>
+        </w:rPr>
+      </w:pPr>
+      <w:r>
+        <w:rPr>
+          <w:noProof/>
+          <w:sz w:val="24"/>
+          <w:szCs w:val="24"/>
+          <w:lang w:val="tr-TR"/>
+        </w:rPr>
+        <w:t>from .windows import WindowGenerator</w:t>
+      </w:r>
+    </w:p>
+    <w:p>
+      <w:pPr>
+        <w:spacing w:after="0" w:line="240" w:lineRule="auto"/>
+        <w:rPr>
+          <w:noProof/>
+          <w:sz w:val="24"/>
+          <w:szCs w:val="24"/>
+          <w:lang w:val="tr-TR"/>
+        </w:rPr>
+      </w:pPr>
+      <w:r>
+        <w:rPr>
+          <w:noProof/>
+          <w:sz w:val="24"/>
+          <w:szCs w:val="24"/>
+          <w:lang w:val="tr-TR"/>
+        </w:rPr>
+        <w:t>from .scaler import SequenceScaler</w:t>
+      </w:r>
+    </w:p>
+    <w:p>
+      <w:pPr>
+        <w:spacing w:after="0" w:line="240" w:lineRule="auto"/>
+        <w:rPr>
+          <w:noProof/>
+          <w:sz w:val="24"/>
+          <w:szCs w:val="24"/>
+          <w:lang w:val="tr-TR"/>
+        </w:rPr>
+      </w:pPr>
+      <w:r>
+        <w:rPr>
+          <w:noProof/>
+          <w:sz w:val="24"/>
+          <w:szCs w:val="24"/>
+          <w:lang w:val="tr-TR"/>
+        </w:rPr>
+        <w:t>Later</w:t>
+      </w:r>
+    </w:p>
+    <w:p>
+      <w:pPr>
+        <w:spacing w:after="0" w:line="240" w:lineRule="auto"/>
+        <w:rPr>
+          <w:noProof/>
+          <w:sz w:val="24"/>
+          <w:szCs w:val="24"/>
+          <w:lang w:val="tr-TR"/>
+        </w:rPr>
+      </w:pPr>
+      <w:r>
+        <w:rPr>
+          <w:noProof/>
+          <w:sz w:val="24"/>
+          <w:szCs w:val="24"/>
+          <w:lang w:val="tr-TR"/>
+        </w:rPr>
+        <w:t>from .lstm import LSTMForecaster</w:t>
+      </w:r>
+    </w:p>
+    <w:p>
+      <w:pPr>
+        <w:spacing w:after="0" w:line="240" w:lineRule="auto"/>
+        <w:rPr>
+          <w:noProof/>
+          <w:sz w:val="24"/>
+          <w:szCs w:val="24"/>
+          <w:lang w:val="tr-TR"/>
+        </w:rPr>
+      </w:pPr>
+      <w:r>
+        <w:rPr>
+          <w:noProof/>
+          <w:sz w:val="24"/>
+          <w:szCs w:val="24"/>
+          <w:lang w:val="tr-TR"/>
+        </w:rPr>
+        <w:t>from .gru import GRUForecaster</w:t>
+      </w:r>
+    </w:p>
+    <w:p>
+      <w:pPr>
+        <w:spacing w:after="0" w:line="240" w:lineRule="auto"/>
+        <w:rPr>
+          <w:noProof/>
+          <w:sz w:val="24"/>
+          <w:szCs w:val="24"/>
+          <w:lang w:val="tr-TR"/>
+        </w:rPr>
+      </w:pPr>
+      <w:r>
+        <w:rPr>
+          <w:noProof/>
+          <w:sz w:val="24"/>
+          <w:szCs w:val="24"/>
+          <w:lang w:val="tr-TR"/>
+        </w:rPr>
+        <w:t>will simply be added.</w:t>
+      </w:r>
     </w:p>
     <w:p>
       <w:pPr>
@@ -16592,98 +18093,9 @@
     </w:lvl>
   </w:abstractNum>
   <w:abstractNum w:abstractNumId="3" w15:restartNumberingAfterBreak="0">
-    <w:nsid w:val="321D4140"/>
-    <w:multiLevelType w:val="hybridMultilevel"/>
-    <w:tmpl w:val="3E7CA19E"/>
-    <w:lvl w:ilvl="0" w:tplc="041F000F">
-      <w:start w:val="1"/>
-      <w:numFmt w:val="decimal"/>
-      <w:lvlText w:val="%1."/>
-      <w:lvlJc w:val="left"/>
-      <w:pPr>
-        <w:ind w:left="720" w:hanging="360"/>
-      </w:pPr>
-      <w:rPr>
-        <w:rFonts w:hint="default"/>
-      </w:rPr>
-    </w:lvl>
-    <w:lvl w:ilvl="1" w:tplc="041F0019" w:tentative="1">
-      <w:start w:val="1"/>
-      <w:numFmt w:val="lowerLetter"/>
-      <w:lvlText w:val="%2."/>
-      <w:lvlJc w:val="left"/>
-      <w:pPr>
-        <w:ind w:left="1440" w:hanging="360"/>
-      </w:pPr>
-    </w:lvl>
-    <w:lvl w:ilvl="2" w:tplc="041F001B" w:tentative="1">
-      <w:start w:val="1"/>
-      <w:numFmt w:val="lowerRoman"/>
-      <w:lvlText w:val="%3."/>
-      <w:lvlJc w:val="right"/>
-      <w:pPr>
-        <w:ind w:left="2160" w:hanging="180"/>
-      </w:pPr>
-    </w:lvl>
-    <w:lvl w:ilvl="3" w:tplc="041F000F" w:tentative="1">
-      <w:start w:val="1"/>
-      <w:numFmt w:val="decimal"/>
-      <w:lvlText w:val="%4."/>
-      <w:lvlJc w:val="left"/>
-      <w:pPr>
-        <w:ind w:left="2880" w:hanging="360"/>
-      </w:pPr>
-    </w:lvl>
-    <w:lvl w:ilvl="4" w:tplc="041F0019" w:tentative="1">
-      <w:start w:val="1"/>
-      <w:numFmt w:val="lowerLetter"/>
-      <w:lvlText w:val="%5."/>
-      <w:lvlJc w:val="left"/>
-      <w:pPr>
-        <w:ind w:left="3600" w:hanging="360"/>
-      </w:pPr>
-    </w:lvl>
-    <w:lvl w:ilvl="5" w:tplc="041F001B" w:tentative="1">
-      <w:start w:val="1"/>
-      <w:numFmt w:val="lowerRoman"/>
-      <w:lvlText w:val="%6."/>
-      <w:lvlJc w:val="right"/>
-      <w:pPr>
-        <w:ind w:left="4320" w:hanging="180"/>
-      </w:pPr>
-    </w:lvl>
-    <w:lvl w:ilvl="6" w:tplc="041F000F" w:tentative="1">
-      <w:start w:val="1"/>
-      <w:numFmt w:val="decimal"/>
-      <w:lvlText w:val="%7."/>
-      <w:lvlJc w:val="left"/>
-      <w:pPr>
-        <w:ind w:left="5040" w:hanging="360"/>
-      </w:pPr>
-    </w:lvl>
-    <w:lvl w:ilvl="7" w:tplc="041F0019" w:tentative="1">
-      <w:start w:val="1"/>
-      <w:numFmt w:val="lowerLetter"/>
-      <w:lvlText w:val="%8."/>
-      <w:lvlJc w:val="left"/>
-      <w:pPr>
-        <w:ind w:left="5760" w:hanging="360"/>
-      </w:pPr>
-    </w:lvl>
-    <w:lvl w:ilvl="8" w:tplc="041F001B" w:tentative="1">
-      <w:start w:val="1"/>
-      <w:numFmt w:val="lowerRoman"/>
-      <w:lvlText w:val="%9."/>
-      <w:lvlJc w:val="right"/>
-      <w:pPr>
-        <w:ind w:left="6480" w:hanging="180"/>
-      </w:pPr>
-    </w:lvl>
-  </w:abstractNum>
-  <w:abstractNum w:abstractNumId="4" w15:restartNumberingAfterBreak="0">
-    <w:nsid w:val="36354E43"/>
+    <w:nsid w:val="2D490C38"/>
     <w:multiLevelType w:val="multilevel"/>
-    <w:tmpl w:val="3AF2AC0C"/>
+    <w:tmpl w:val="E1749C3E"/>
     <w:lvl w:ilvl="0">
       <w:start w:val="1"/>
       <w:numFmt w:val="bullet"/>
@@ -16829,10 +18241,99 @@
       </w:rPr>
     </w:lvl>
   </w:abstractNum>
+  <w:abstractNum w:abstractNumId="4" w15:restartNumberingAfterBreak="0">
+    <w:nsid w:val="321D4140"/>
+    <w:multiLevelType w:val="hybridMultilevel"/>
+    <w:tmpl w:val="3E7CA19E"/>
+    <w:lvl w:ilvl="0" w:tplc="041F000F">
+      <w:start w:val="1"/>
+      <w:numFmt w:val="decimal"/>
+      <w:lvlText w:val="%1."/>
+      <w:lvlJc w:val="left"/>
+      <w:pPr>
+        <w:ind w:left="720" w:hanging="360"/>
+      </w:pPr>
+      <w:rPr>
+        <w:rFonts w:hint="default"/>
+      </w:rPr>
+    </w:lvl>
+    <w:lvl w:ilvl="1" w:tplc="041F0019" w:tentative="1">
+      <w:start w:val="1"/>
+      <w:numFmt w:val="lowerLetter"/>
+      <w:lvlText w:val="%2."/>
+      <w:lvlJc w:val="left"/>
+      <w:pPr>
+        <w:ind w:left="1440" w:hanging="360"/>
+      </w:pPr>
+    </w:lvl>
+    <w:lvl w:ilvl="2" w:tplc="041F001B" w:tentative="1">
+      <w:start w:val="1"/>
+      <w:numFmt w:val="lowerRoman"/>
+      <w:lvlText w:val="%3."/>
+      <w:lvlJc w:val="right"/>
+      <w:pPr>
+        <w:ind w:left="2160" w:hanging="180"/>
+      </w:pPr>
+    </w:lvl>
+    <w:lvl w:ilvl="3" w:tplc="041F000F" w:tentative="1">
+      <w:start w:val="1"/>
+      <w:numFmt w:val="decimal"/>
+      <w:lvlText w:val="%4."/>
+      <w:lvlJc w:val="left"/>
+      <w:pPr>
+        <w:ind w:left="2880" w:hanging="360"/>
+      </w:pPr>
+    </w:lvl>
+    <w:lvl w:ilvl="4" w:tplc="041F0019" w:tentative="1">
+      <w:start w:val="1"/>
+      <w:numFmt w:val="lowerLetter"/>
+      <w:lvlText w:val="%5."/>
+      <w:lvlJc w:val="left"/>
+      <w:pPr>
+        <w:ind w:left="3600" w:hanging="360"/>
+      </w:pPr>
+    </w:lvl>
+    <w:lvl w:ilvl="5" w:tplc="041F001B" w:tentative="1">
+      <w:start w:val="1"/>
+      <w:numFmt w:val="lowerRoman"/>
+      <w:lvlText w:val="%6."/>
+      <w:lvlJc w:val="right"/>
+      <w:pPr>
+        <w:ind w:left="4320" w:hanging="180"/>
+      </w:pPr>
+    </w:lvl>
+    <w:lvl w:ilvl="6" w:tplc="041F000F" w:tentative="1">
+      <w:start w:val="1"/>
+      <w:numFmt w:val="decimal"/>
+      <w:lvlText w:val="%7."/>
+      <w:lvlJc w:val="left"/>
+      <w:pPr>
+        <w:ind w:left="5040" w:hanging="360"/>
+      </w:pPr>
+    </w:lvl>
+    <w:lvl w:ilvl="7" w:tplc="041F0019" w:tentative="1">
+      <w:start w:val="1"/>
+      <w:numFmt w:val="lowerLetter"/>
+      <w:lvlText w:val="%8."/>
+      <w:lvlJc w:val="left"/>
+      <w:pPr>
+        <w:ind w:left="5760" w:hanging="360"/>
+      </w:pPr>
+    </w:lvl>
+    <w:lvl w:ilvl="8" w:tplc="041F001B" w:tentative="1">
+      <w:start w:val="1"/>
+      <w:numFmt w:val="lowerRoman"/>
+      <w:lvlText w:val="%9."/>
+      <w:lvlJc w:val="right"/>
+      <w:pPr>
+        <w:ind w:left="6480" w:hanging="180"/>
+      </w:pPr>
+    </w:lvl>
+  </w:abstractNum>
   <w:abstractNum w:abstractNumId="5" w15:restartNumberingAfterBreak="0">
-    <w:nsid w:val="3D733783"/>
+    <w:nsid w:val="36354E43"/>
     <w:multiLevelType w:val="multilevel"/>
-    <w:tmpl w:val="A6383A0C"/>
+    <w:tmpl w:val="3AF2AC0C"/>
     <w:lvl w:ilvl="0">
       <w:start w:val="1"/>
       <w:numFmt w:val="bullet"/>
@@ -16979,9 +18480,9 @@
     </w:lvl>
   </w:abstractNum>
   <w:abstractNum w:abstractNumId="6" w15:restartNumberingAfterBreak="0">
-    <w:nsid w:val="44D72C93"/>
+    <w:nsid w:val="3D733783"/>
     <w:multiLevelType w:val="multilevel"/>
-    <w:tmpl w:val="64604668"/>
+    <w:tmpl w:val="A6383A0C"/>
     <w:lvl w:ilvl="0">
       <w:start w:val="1"/>
       <w:numFmt w:val="bullet"/>
@@ -17128,9 +18629,9 @@
     </w:lvl>
   </w:abstractNum>
   <w:abstractNum w:abstractNumId="7" w15:restartNumberingAfterBreak="0">
-    <w:nsid w:val="63050202"/>
+    <w:nsid w:val="44D72C93"/>
     <w:multiLevelType w:val="multilevel"/>
-    <w:tmpl w:val="8D1E2ABC"/>
+    <w:tmpl w:val="64604668"/>
     <w:lvl w:ilvl="0">
       <w:start w:val="1"/>
       <w:numFmt w:val="bullet"/>
@@ -17277,9 +18778,9 @@
     </w:lvl>
   </w:abstractNum>
   <w:abstractNum w:abstractNumId="8" w15:restartNumberingAfterBreak="0">
-    <w:nsid w:val="6B0579E7"/>
+    <w:nsid w:val="4DC845A1"/>
     <w:multiLevelType w:val="multilevel"/>
-    <w:tmpl w:val="A8DA2166"/>
+    <w:tmpl w:val="EF786B8A"/>
     <w:lvl w:ilvl="0">
       <w:start w:val="1"/>
       <w:numFmt w:val="bullet"/>
@@ -17426,9 +18927,9 @@
     </w:lvl>
   </w:abstractNum>
   <w:abstractNum w:abstractNumId="9" w15:restartNumberingAfterBreak="0">
-    <w:nsid w:val="78733247"/>
+    <w:nsid w:val="63050202"/>
     <w:multiLevelType w:val="multilevel"/>
-    <w:tmpl w:val="18361A16"/>
+    <w:tmpl w:val="8D1E2ABC"/>
     <w:lvl w:ilvl="0">
       <w:start w:val="1"/>
       <w:numFmt w:val="bullet"/>
@@ -17575,9 +19076,9 @@
     </w:lvl>
   </w:abstractNum>
   <w:abstractNum w:abstractNumId="10" w15:restartNumberingAfterBreak="0">
-    <w:nsid w:val="78940C2D"/>
+    <w:nsid w:val="6B0579E7"/>
     <w:multiLevelType w:val="multilevel"/>
-    <w:tmpl w:val="7A36FD2E"/>
+    <w:tmpl w:val="A8DA2166"/>
     <w:lvl w:ilvl="0">
       <w:start w:val="1"/>
       <w:numFmt w:val="bullet"/>
@@ -17723,38 +19224,494 @@
       </w:rPr>
     </w:lvl>
   </w:abstractNum>
+  <w:abstractNum w:abstractNumId="11" w15:restartNumberingAfterBreak="0">
+    <w:nsid w:val="6CF718B0"/>
+    <w:multiLevelType w:val="multilevel"/>
+    <w:tmpl w:val="9C1416D6"/>
+    <w:lvl w:ilvl="0">
+      <w:start w:val="1"/>
+      <w:numFmt w:val="bullet"/>
+      <w:lvlText w:val=""/>
+      <w:lvlJc w:val="left"/>
+      <w:pPr>
+        <w:tabs>
+          <w:tab w:val="num" w:pos="720"/>
+        </w:tabs>
+        <w:ind w:left="720" w:hanging="360"/>
+      </w:pPr>
+      <w:rPr>
+        <w:rFonts w:ascii="Symbol" w:hAnsi="Symbol" w:hint="default"/>
+        <w:sz w:val="20"/>
+      </w:rPr>
+    </w:lvl>
+    <w:lvl w:ilvl="1" w:tentative="1">
+      <w:start w:val="1"/>
+      <w:numFmt w:val="bullet"/>
+      <w:lvlText w:val="o"/>
+      <w:lvlJc w:val="left"/>
+      <w:pPr>
+        <w:tabs>
+          <w:tab w:val="num" w:pos="1440"/>
+        </w:tabs>
+        <w:ind w:left="1440" w:hanging="360"/>
+      </w:pPr>
+      <w:rPr>
+        <w:rFonts w:ascii="Courier New" w:hAnsi="Courier New" w:hint="default"/>
+        <w:sz w:val="20"/>
+      </w:rPr>
+    </w:lvl>
+    <w:lvl w:ilvl="2" w:tentative="1">
+      <w:start w:val="1"/>
+      <w:numFmt w:val="bullet"/>
+      <w:lvlText w:val=""/>
+      <w:lvlJc w:val="left"/>
+      <w:pPr>
+        <w:tabs>
+          <w:tab w:val="num" w:pos="2160"/>
+        </w:tabs>
+        <w:ind w:left="2160" w:hanging="360"/>
+      </w:pPr>
+      <w:rPr>
+        <w:rFonts w:ascii="Wingdings" w:hAnsi="Wingdings" w:hint="default"/>
+        <w:sz w:val="20"/>
+      </w:rPr>
+    </w:lvl>
+    <w:lvl w:ilvl="3" w:tentative="1">
+      <w:start w:val="1"/>
+      <w:numFmt w:val="bullet"/>
+      <w:lvlText w:val=""/>
+      <w:lvlJc w:val="left"/>
+      <w:pPr>
+        <w:tabs>
+          <w:tab w:val="num" w:pos="2880"/>
+        </w:tabs>
+        <w:ind w:left="2880" w:hanging="360"/>
+      </w:pPr>
+      <w:rPr>
+        <w:rFonts w:ascii="Wingdings" w:hAnsi="Wingdings" w:hint="default"/>
+        <w:sz w:val="20"/>
+      </w:rPr>
+    </w:lvl>
+    <w:lvl w:ilvl="4" w:tentative="1">
+      <w:start w:val="1"/>
+      <w:numFmt w:val="bullet"/>
+      <w:lvlText w:val=""/>
+      <w:lvlJc w:val="left"/>
+      <w:pPr>
+        <w:tabs>
+          <w:tab w:val="num" w:pos="3600"/>
+        </w:tabs>
+        <w:ind w:left="3600" w:hanging="360"/>
+      </w:pPr>
+      <w:rPr>
+        <w:rFonts w:ascii="Wingdings" w:hAnsi="Wingdings" w:hint="default"/>
+        <w:sz w:val="20"/>
+      </w:rPr>
+    </w:lvl>
+    <w:lvl w:ilvl="5" w:tentative="1">
+      <w:start w:val="1"/>
+      <w:numFmt w:val="bullet"/>
+      <w:lvlText w:val=""/>
+      <w:lvlJc w:val="left"/>
+      <w:pPr>
+        <w:tabs>
+          <w:tab w:val="num" w:pos="4320"/>
+        </w:tabs>
+        <w:ind w:left="4320" w:hanging="360"/>
+      </w:pPr>
+      <w:rPr>
+        <w:rFonts w:ascii="Wingdings" w:hAnsi="Wingdings" w:hint="default"/>
+        <w:sz w:val="20"/>
+      </w:rPr>
+    </w:lvl>
+    <w:lvl w:ilvl="6" w:tentative="1">
+      <w:start w:val="1"/>
+      <w:numFmt w:val="bullet"/>
+      <w:lvlText w:val=""/>
+      <w:lvlJc w:val="left"/>
+      <w:pPr>
+        <w:tabs>
+          <w:tab w:val="num" w:pos="5040"/>
+        </w:tabs>
+        <w:ind w:left="5040" w:hanging="360"/>
+      </w:pPr>
+      <w:rPr>
+        <w:rFonts w:ascii="Wingdings" w:hAnsi="Wingdings" w:hint="default"/>
+        <w:sz w:val="20"/>
+      </w:rPr>
+    </w:lvl>
+    <w:lvl w:ilvl="7" w:tentative="1">
+      <w:start w:val="1"/>
+      <w:numFmt w:val="bullet"/>
+      <w:lvlText w:val=""/>
+      <w:lvlJc w:val="left"/>
+      <w:pPr>
+        <w:tabs>
+          <w:tab w:val="num" w:pos="5760"/>
+        </w:tabs>
+        <w:ind w:left="5760" w:hanging="360"/>
+      </w:pPr>
+      <w:rPr>
+        <w:rFonts w:ascii="Wingdings" w:hAnsi="Wingdings" w:hint="default"/>
+        <w:sz w:val="20"/>
+      </w:rPr>
+    </w:lvl>
+    <w:lvl w:ilvl="8" w:tentative="1">
+      <w:start w:val="1"/>
+      <w:numFmt w:val="bullet"/>
+      <w:lvlText w:val=""/>
+      <w:lvlJc w:val="left"/>
+      <w:pPr>
+        <w:tabs>
+          <w:tab w:val="num" w:pos="6480"/>
+        </w:tabs>
+        <w:ind w:left="6480" w:hanging="360"/>
+      </w:pPr>
+      <w:rPr>
+        <w:rFonts w:ascii="Wingdings" w:hAnsi="Wingdings" w:hint="default"/>
+        <w:sz w:val="20"/>
+      </w:rPr>
+    </w:lvl>
+  </w:abstractNum>
+  <w:abstractNum w:abstractNumId="12" w15:restartNumberingAfterBreak="0">
+    <w:nsid w:val="78733247"/>
+    <w:multiLevelType w:val="multilevel"/>
+    <w:tmpl w:val="18361A16"/>
+    <w:lvl w:ilvl="0">
+      <w:start w:val="1"/>
+      <w:numFmt w:val="bullet"/>
+      <w:lvlText w:val=""/>
+      <w:lvlJc w:val="left"/>
+      <w:pPr>
+        <w:tabs>
+          <w:tab w:val="num" w:pos="720"/>
+        </w:tabs>
+        <w:ind w:left="720" w:hanging="360"/>
+      </w:pPr>
+      <w:rPr>
+        <w:rFonts w:ascii="Symbol" w:hAnsi="Symbol" w:hint="default"/>
+        <w:sz w:val="20"/>
+      </w:rPr>
+    </w:lvl>
+    <w:lvl w:ilvl="1" w:tentative="1">
+      <w:start w:val="1"/>
+      <w:numFmt w:val="bullet"/>
+      <w:lvlText w:val="o"/>
+      <w:lvlJc w:val="left"/>
+      <w:pPr>
+        <w:tabs>
+          <w:tab w:val="num" w:pos="1440"/>
+        </w:tabs>
+        <w:ind w:left="1440" w:hanging="360"/>
+      </w:pPr>
+      <w:rPr>
+        <w:rFonts w:ascii="Courier New" w:hAnsi="Courier New" w:hint="default"/>
+        <w:sz w:val="20"/>
+      </w:rPr>
+    </w:lvl>
+    <w:lvl w:ilvl="2" w:tentative="1">
+      <w:start w:val="1"/>
+      <w:numFmt w:val="bullet"/>
+      <w:lvlText w:val=""/>
+      <w:lvlJc w:val="left"/>
+      <w:pPr>
+        <w:tabs>
+          <w:tab w:val="num" w:pos="2160"/>
+        </w:tabs>
+        <w:ind w:left="2160" w:hanging="360"/>
+      </w:pPr>
+      <w:rPr>
+        <w:rFonts w:ascii="Wingdings" w:hAnsi="Wingdings" w:hint="default"/>
+        <w:sz w:val="20"/>
+      </w:rPr>
+    </w:lvl>
+    <w:lvl w:ilvl="3" w:tentative="1">
+      <w:start w:val="1"/>
+      <w:numFmt w:val="bullet"/>
+      <w:lvlText w:val=""/>
+      <w:lvlJc w:val="left"/>
+      <w:pPr>
+        <w:tabs>
+          <w:tab w:val="num" w:pos="2880"/>
+        </w:tabs>
+        <w:ind w:left="2880" w:hanging="360"/>
+      </w:pPr>
+      <w:rPr>
+        <w:rFonts w:ascii="Wingdings" w:hAnsi="Wingdings" w:hint="default"/>
+        <w:sz w:val="20"/>
+      </w:rPr>
+    </w:lvl>
+    <w:lvl w:ilvl="4" w:tentative="1">
+      <w:start w:val="1"/>
+      <w:numFmt w:val="bullet"/>
+      <w:lvlText w:val=""/>
+      <w:lvlJc w:val="left"/>
+      <w:pPr>
+        <w:tabs>
+          <w:tab w:val="num" w:pos="3600"/>
+        </w:tabs>
+        <w:ind w:left="3600" w:hanging="360"/>
+      </w:pPr>
+      <w:rPr>
+        <w:rFonts w:ascii="Wingdings" w:hAnsi="Wingdings" w:hint="default"/>
+        <w:sz w:val="20"/>
+      </w:rPr>
+    </w:lvl>
+    <w:lvl w:ilvl="5" w:tentative="1">
+      <w:start w:val="1"/>
+      <w:numFmt w:val="bullet"/>
+      <w:lvlText w:val=""/>
+      <w:lvlJc w:val="left"/>
+      <w:pPr>
+        <w:tabs>
+          <w:tab w:val="num" w:pos="4320"/>
+        </w:tabs>
+        <w:ind w:left="4320" w:hanging="360"/>
+      </w:pPr>
+      <w:rPr>
+        <w:rFonts w:ascii="Wingdings" w:hAnsi="Wingdings" w:hint="default"/>
+        <w:sz w:val="20"/>
+      </w:rPr>
+    </w:lvl>
+    <w:lvl w:ilvl="6" w:tentative="1">
+      <w:start w:val="1"/>
+      <w:numFmt w:val="bullet"/>
+      <w:lvlText w:val=""/>
+      <w:lvlJc w:val="left"/>
+      <w:pPr>
+        <w:tabs>
+          <w:tab w:val="num" w:pos="5040"/>
+        </w:tabs>
+        <w:ind w:left="5040" w:hanging="360"/>
+      </w:pPr>
+      <w:rPr>
+        <w:rFonts w:ascii="Wingdings" w:hAnsi="Wingdings" w:hint="default"/>
+        <w:sz w:val="20"/>
+      </w:rPr>
+    </w:lvl>
+    <w:lvl w:ilvl="7" w:tentative="1">
+      <w:start w:val="1"/>
+      <w:numFmt w:val="bullet"/>
+      <w:lvlText w:val=""/>
+      <w:lvlJc w:val="left"/>
+      <w:pPr>
+        <w:tabs>
+          <w:tab w:val="num" w:pos="5760"/>
+        </w:tabs>
+        <w:ind w:left="5760" w:hanging="360"/>
+      </w:pPr>
+      <w:rPr>
+        <w:rFonts w:ascii="Wingdings" w:hAnsi="Wingdings" w:hint="default"/>
+        <w:sz w:val="20"/>
+      </w:rPr>
+    </w:lvl>
+    <w:lvl w:ilvl="8" w:tentative="1">
+      <w:start w:val="1"/>
+      <w:numFmt w:val="bullet"/>
+      <w:lvlText w:val=""/>
+      <w:lvlJc w:val="left"/>
+      <w:pPr>
+        <w:tabs>
+          <w:tab w:val="num" w:pos="6480"/>
+        </w:tabs>
+        <w:ind w:left="6480" w:hanging="360"/>
+      </w:pPr>
+      <w:rPr>
+        <w:rFonts w:ascii="Wingdings" w:hAnsi="Wingdings" w:hint="default"/>
+        <w:sz w:val="20"/>
+      </w:rPr>
+    </w:lvl>
+  </w:abstractNum>
+  <w:abstractNum w:abstractNumId="13" w15:restartNumberingAfterBreak="0">
+    <w:nsid w:val="78940C2D"/>
+    <w:multiLevelType w:val="multilevel"/>
+    <w:tmpl w:val="7A36FD2E"/>
+    <w:lvl w:ilvl="0">
+      <w:start w:val="1"/>
+      <w:numFmt w:val="bullet"/>
+      <w:lvlText w:val=""/>
+      <w:lvlJc w:val="left"/>
+      <w:pPr>
+        <w:tabs>
+          <w:tab w:val="num" w:pos="720"/>
+        </w:tabs>
+        <w:ind w:left="720" w:hanging="360"/>
+      </w:pPr>
+      <w:rPr>
+        <w:rFonts w:ascii="Symbol" w:hAnsi="Symbol" w:hint="default"/>
+        <w:sz w:val="20"/>
+      </w:rPr>
+    </w:lvl>
+    <w:lvl w:ilvl="1" w:tentative="1">
+      <w:start w:val="1"/>
+      <w:numFmt w:val="bullet"/>
+      <w:lvlText w:val="o"/>
+      <w:lvlJc w:val="left"/>
+      <w:pPr>
+        <w:tabs>
+          <w:tab w:val="num" w:pos="1440"/>
+        </w:tabs>
+        <w:ind w:left="1440" w:hanging="360"/>
+      </w:pPr>
+      <w:rPr>
+        <w:rFonts w:ascii="Courier New" w:hAnsi="Courier New" w:hint="default"/>
+        <w:sz w:val="20"/>
+      </w:rPr>
+    </w:lvl>
+    <w:lvl w:ilvl="2" w:tentative="1">
+      <w:start w:val="1"/>
+      <w:numFmt w:val="bullet"/>
+      <w:lvlText w:val=""/>
+      <w:lvlJc w:val="left"/>
+      <w:pPr>
+        <w:tabs>
+          <w:tab w:val="num" w:pos="2160"/>
+        </w:tabs>
+        <w:ind w:left="2160" w:hanging="360"/>
+      </w:pPr>
+      <w:rPr>
+        <w:rFonts w:ascii="Wingdings" w:hAnsi="Wingdings" w:hint="default"/>
+        <w:sz w:val="20"/>
+      </w:rPr>
+    </w:lvl>
+    <w:lvl w:ilvl="3" w:tentative="1">
+      <w:start w:val="1"/>
+      <w:numFmt w:val="bullet"/>
+      <w:lvlText w:val=""/>
+      <w:lvlJc w:val="left"/>
+      <w:pPr>
+        <w:tabs>
+          <w:tab w:val="num" w:pos="2880"/>
+        </w:tabs>
+        <w:ind w:left="2880" w:hanging="360"/>
+      </w:pPr>
+      <w:rPr>
+        <w:rFonts w:ascii="Wingdings" w:hAnsi="Wingdings" w:hint="default"/>
+        <w:sz w:val="20"/>
+      </w:rPr>
+    </w:lvl>
+    <w:lvl w:ilvl="4" w:tentative="1">
+      <w:start w:val="1"/>
+      <w:numFmt w:val="bullet"/>
+      <w:lvlText w:val=""/>
+      <w:lvlJc w:val="left"/>
+      <w:pPr>
+        <w:tabs>
+          <w:tab w:val="num" w:pos="3600"/>
+        </w:tabs>
+        <w:ind w:left="3600" w:hanging="360"/>
+      </w:pPr>
+      <w:rPr>
+        <w:rFonts w:ascii="Wingdings" w:hAnsi="Wingdings" w:hint="default"/>
+        <w:sz w:val="20"/>
+      </w:rPr>
+    </w:lvl>
+    <w:lvl w:ilvl="5" w:tentative="1">
+      <w:start w:val="1"/>
+      <w:numFmt w:val="bullet"/>
+      <w:lvlText w:val=""/>
+      <w:lvlJc w:val="left"/>
+      <w:pPr>
+        <w:tabs>
+          <w:tab w:val="num" w:pos="4320"/>
+        </w:tabs>
+        <w:ind w:left="4320" w:hanging="360"/>
+      </w:pPr>
+      <w:rPr>
+        <w:rFonts w:ascii="Wingdings" w:hAnsi="Wingdings" w:hint="default"/>
+        <w:sz w:val="20"/>
+      </w:rPr>
+    </w:lvl>
+    <w:lvl w:ilvl="6" w:tentative="1">
+      <w:start w:val="1"/>
+      <w:numFmt w:val="bullet"/>
+      <w:lvlText w:val=""/>
+      <w:lvlJc w:val="left"/>
+      <w:pPr>
+        <w:tabs>
+          <w:tab w:val="num" w:pos="5040"/>
+        </w:tabs>
+        <w:ind w:left="5040" w:hanging="360"/>
+      </w:pPr>
+      <w:rPr>
+        <w:rFonts w:ascii="Wingdings" w:hAnsi="Wingdings" w:hint="default"/>
+        <w:sz w:val="20"/>
+      </w:rPr>
+    </w:lvl>
+    <w:lvl w:ilvl="7" w:tentative="1">
+      <w:start w:val="1"/>
+      <w:numFmt w:val="bullet"/>
+      <w:lvlText w:val=""/>
+      <w:lvlJc w:val="left"/>
+      <w:pPr>
+        <w:tabs>
+          <w:tab w:val="num" w:pos="5760"/>
+        </w:tabs>
+        <w:ind w:left="5760" w:hanging="360"/>
+      </w:pPr>
+      <w:rPr>
+        <w:rFonts w:ascii="Wingdings" w:hAnsi="Wingdings" w:hint="default"/>
+        <w:sz w:val="20"/>
+      </w:rPr>
+    </w:lvl>
+    <w:lvl w:ilvl="8" w:tentative="1">
+      <w:start w:val="1"/>
+      <w:numFmt w:val="bullet"/>
+      <w:lvlText w:val=""/>
+      <w:lvlJc w:val="left"/>
+      <w:pPr>
+        <w:tabs>
+          <w:tab w:val="num" w:pos="6480"/>
+        </w:tabs>
+        <w:ind w:left="6480" w:hanging="360"/>
+      </w:pPr>
+      <w:rPr>
+        <w:rFonts w:ascii="Wingdings" w:hAnsi="Wingdings" w:hint="default"/>
+        <w:sz w:val="20"/>
+      </w:rPr>
+    </w:lvl>
+  </w:abstractNum>
   <w:num w:numId="1" w16cid:durableId="320813693">
     <w:abstractNumId w:val="1"/>
   </w:num>
   <w:num w:numId="2" w16cid:durableId="680281116">
-    <w:abstractNumId w:val="3"/>
+    <w:abstractNumId w:val="4"/>
   </w:num>
   <w:num w:numId="3" w16cid:durableId="1288438365">
-    <w:abstractNumId w:val="6"/>
+    <w:abstractNumId w:val="7"/>
   </w:num>
   <w:num w:numId="4" w16cid:durableId="1155562159">
-    <w:abstractNumId w:val="8"/>
+    <w:abstractNumId w:val="10"/>
   </w:num>
   <w:num w:numId="5" w16cid:durableId="1958020517">
-    <w:abstractNumId w:val="7"/>
+    <w:abstractNumId w:val="9"/>
   </w:num>
   <w:num w:numId="6" w16cid:durableId="1596940668">
-    <w:abstractNumId w:val="4"/>
+    <w:abstractNumId w:val="5"/>
   </w:num>
   <w:num w:numId="7" w16cid:durableId="1579166471">
     <w:abstractNumId w:val="0"/>
   </w:num>
   <w:num w:numId="8" w16cid:durableId="753748469">
-    <w:abstractNumId w:val="10"/>
+    <w:abstractNumId w:val="13"/>
   </w:num>
   <w:num w:numId="9" w16cid:durableId="604701249">
-    <w:abstractNumId w:val="9"/>
+    <w:abstractNumId w:val="12"/>
   </w:num>
   <w:num w:numId="10" w16cid:durableId="1503279606">
     <w:abstractNumId w:val="2"/>
   </w:num>
   <w:num w:numId="11" w16cid:durableId="785000340">
-    <w:abstractNumId w:val="5"/>
+    <w:abstractNumId w:val="6"/>
+  </w:num>
+  <w:num w:numId="12" w16cid:durableId="290215297">
+    <w:abstractNumId w:val="8"/>
+  </w:num>
+  <w:num w:numId="13" w16cid:durableId="1160194568">
+    <w:abstractNumId w:val="11"/>
+  </w:num>
+  <w:num w:numId="14" w16cid:durableId="1407336860">
+    <w:abstractNumId w:val="3"/>
   </w:num>
 </w:numbering>
 </file>

</xml_diff>

<commit_message>
Sprint 9 - Commit 2: Implemented first LSTM forecasting model
</commit_message>
<xml_diff>
--- a/docs/draft/development_flow.docx
+++ b/docs/draft/development_flow.docx
@@ -16594,7 +16594,7 @@
           <w:lang w:val="tr-TR"/>
         </w:rPr>
         <w:pict w14:anchorId="6405C952">
-          <v:rect id="_x0000_i1049" style="width:0;height:1.5pt" o:hralign="center" o:hrstd="t" o:hr="t" fillcolor="#a0a0a0" stroked="f"/>
+          <v:rect id="_x0000_i1025" style="width:0;height:1.5pt" o:hralign="center" o:hrstd="t" o:hr="t" fillcolor="#a0a0a0" stroked="f"/>
         </w:pict>
       </w:r>
     </w:p>
@@ -16889,7 +16889,7 @@
           <w:lang w:val="tr-TR"/>
         </w:rPr>
         <w:pict w14:anchorId="4D0940AE">
-          <v:rect id="_x0000_i1050" style="width:0;height:1.5pt" o:hralign="center" o:hrstd="t" o:hr="t" fillcolor="#a0a0a0" stroked="f"/>
+          <v:rect id="_x0000_i1026" style="width:0;height:1.5pt" o:hralign="center" o:hrstd="t" o:hr="t" fillcolor="#a0a0a0" stroked="f"/>
         </w:pict>
       </w:r>
     </w:p>
@@ -17240,7 +17240,7 @@
           <w:lang w:val="tr-TR"/>
         </w:rPr>
         <w:pict w14:anchorId="770330A5">
-          <v:rect id="_x0000_i1051" style="width:0;height:1.5pt" o:hralign="center" o:hrstd="t" o:hr="t" fillcolor="#a0a0a0" stroked="f"/>
+          <v:rect id="_x0000_i1027" style="width:0;height:1.5pt" o:hralign="center" o:hrstd="t" o:hr="t" fillcolor="#a0a0a0" stroked="f"/>
         </w:pict>
       </w:r>
     </w:p>
@@ -17435,7 +17435,7 @@
           <w:lang w:val="tr-TR"/>
         </w:rPr>
         <w:pict w14:anchorId="506E1730">
-          <v:rect id="_x0000_i1052" style="width:0;height:1.5pt" o:hralign="center" o:hrstd="t" o:hr="t" fillcolor="#a0a0a0" stroked="f"/>
+          <v:rect id="_x0000_i1028" style="width:0;height:1.5pt" o:hralign="center" o:hrstd="t" o:hr="t" fillcolor="#a0a0a0" stroked="f"/>
         </w:pict>
       </w:r>
     </w:p>
@@ -17632,6 +17632,2602 @@
           <w:szCs w:val="24"/>
         </w:rPr>
       </w:pPr>
+    </w:p>
+    <w:p>
+      <w:pPr>
+        <w:rPr>
+          <w:noProof/>
+          <w:sz w:val="24"/>
+          <w:szCs w:val="24"/>
+        </w:rPr>
+      </w:pPr>
+      <w:r>
+        <w:rPr>
+          <w:noProof/>
+          <w:sz w:val="24"/>
+          <w:szCs w:val="24"/>
+        </w:rPr>
+        <w:br w:type="page"/>
+      </w:r>
+    </w:p>
+    <w:p>
+      <w:pPr>
+        <w:spacing w:after="0" w:line="240" w:lineRule="auto"/>
+        <w:rPr>
+          <w:b/>
+          <w:bCs/>
+          <w:noProof/>
+          <w:sz w:val="32"/>
+          <w:szCs w:val="32"/>
+          <w:lang w:val="tr-TR"/>
+        </w:rPr>
+      </w:pPr>
+      <w:r>
+        <w:rPr>
+          <w:b/>
+          <w:bCs/>
+          <w:noProof/>
+          <w:sz w:val="32"/>
+          <w:szCs w:val="32"/>
+          <w:lang w:val="tr-TR"/>
+        </w:rPr>
+        <w:lastRenderedPageBreak/>
+        <w:t>Sprint 9 — Commit 2</w:t>
+      </w:r>
+    </w:p>
+    <w:p>
+      <w:pPr>
+        <w:spacing w:after="0" w:line="240" w:lineRule="auto"/>
+        <w:rPr>
+          <w:b/>
+          <w:bCs/>
+          <w:noProof/>
+          <w:sz w:val="24"/>
+          <w:szCs w:val="24"/>
+          <w:lang w:val="tr-TR"/>
+        </w:rPr>
+      </w:pPr>
+    </w:p>
+    <w:p>
+      <w:pPr>
+        <w:spacing w:after="0" w:line="240" w:lineRule="auto"/>
+        <w:rPr>
+          <w:b/>
+          <w:bCs/>
+          <w:noProof/>
+          <w:sz w:val="24"/>
+          <w:szCs w:val="24"/>
+          <w:lang w:val="tr-TR"/>
+        </w:rPr>
+      </w:pPr>
+      <w:r>
+        <w:rPr>
+          <w:b/>
+          <w:bCs/>
+          <w:noProof/>
+          <w:sz w:val="24"/>
+          <w:szCs w:val="24"/>
+          <w:lang w:val="tr-TR"/>
+        </w:rPr>
+        <w:t>Architecture</w:t>
+      </w:r>
+      <w:r>
+        <w:rPr>
+          <w:b/>
+          <w:bCs/>
+          <w:noProof/>
+          <w:sz w:val="24"/>
+          <w:szCs w:val="24"/>
+          <w:lang w:val="tr-TR"/>
+        </w:rPr>
+        <w:t xml:space="preserve"> :</w:t>
+      </w:r>
+    </w:p>
+    <w:p>
+      <w:pPr>
+        <w:spacing w:after="0" w:line="240" w:lineRule="auto"/>
+        <w:rPr>
+          <w:noProof/>
+          <w:sz w:val="24"/>
+          <w:szCs w:val="24"/>
+          <w:lang w:val="tr-TR"/>
+        </w:rPr>
+      </w:pPr>
+      <w:r>
+        <w:rPr>
+          <w:noProof/>
+          <w:sz w:val="24"/>
+          <w:szCs w:val="24"/>
+          <w:lang w:val="tr-TR"/>
+        </w:rPr>
+        <w:t>Input Window</w:t>
+      </w:r>
+    </w:p>
+    <w:p>
+      <w:pPr>
+        <w:spacing w:after="0" w:line="240" w:lineRule="auto"/>
+        <w:rPr>
+          <w:noProof/>
+          <w:sz w:val="24"/>
+          <w:szCs w:val="24"/>
+          <w:lang w:val="tr-TR"/>
+        </w:rPr>
+      </w:pPr>
+      <w:r>
+        <w:rPr>
+          <w:noProof/>
+          <w:sz w:val="24"/>
+          <w:szCs w:val="24"/>
+          <w:lang w:val="tr-TR"/>
+        </w:rPr>
+        <w:t xml:space="preserve">      │</w:t>
+      </w:r>
+    </w:p>
+    <w:p>
+      <w:pPr>
+        <w:spacing w:after="0" w:line="240" w:lineRule="auto"/>
+        <w:rPr>
+          <w:noProof/>
+          <w:sz w:val="24"/>
+          <w:szCs w:val="24"/>
+          <w:lang w:val="tr-TR"/>
+        </w:rPr>
+      </w:pPr>
+      <w:r>
+        <w:rPr>
+          <w:noProof/>
+          <w:sz w:val="24"/>
+          <w:szCs w:val="24"/>
+          <w:lang w:val="tr-TR"/>
+        </w:rPr>
+        <w:t xml:space="preserve">      </w:t>
+      </w:r>
+      <w:r>
+        <w:rPr>
+          <w:rFonts w:ascii="Arial" w:hAnsi="Arial" w:cs="Arial"/>
+          <w:noProof/>
+          <w:sz w:val="24"/>
+          <w:szCs w:val="24"/>
+          <w:lang w:val="tr-TR"/>
+        </w:rPr>
+        <w:t>▼</w:t>
+      </w:r>
+    </w:p>
+    <w:p>
+      <w:pPr>
+        <w:spacing w:after="0" w:line="240" w:lineRule="auto"/>
+        <w:rPr>
+          <w:noProof/>
+          <w:sz w:val="24"/>
+          <w:szCs w:val="24"/>
+          <w:lang w:val="tr-TR"/>
+        </w:rPr>
+      </w:pPr>
+      <w:r>
+        <w:rPr>
+          <w:noProof/>
+          <w:sz w:val="24"/>
+          <w:szCs w:val="24"/>
+          <w:lang w:val="tr-TR"/>
+        </w:rPr>
+        <w:t>LSTM(32)</w:t>
+      </w:r>
+    </w:p>
+    <w:p>
+      <w:pPr>
+        <w:spacing w:after="0" w:line="240" w:lineRule="auto"/>
+        <w:rPr>
+          <w:noProof/>
+          <w:sz w:val="24"/>
+          <w:szCs w:val="24"/>
+          <w:lang w:val="tr-TR"/>
+        </w:rPr>
+      </w:pPr>
+      <w:r>
+        <w:rPr>
+          <w:noProof/>
+          <w:sz w:val="24"/>
+          <w:szCs w:val="24"/>
+          <w:lang w:val="tr-TR"/>
+        </w:rPr>
+        <w:t xml:space="preserve">      │</w:t>
+      </w:r>
+    </w:p>
+    <w:p>
+      <w:pPr>
+        <w:spacing w:after="0" w:line="240" w:lineRule="auto"/>
+        <w:rPr>
+          <w:noProof/>
+          <w:sz w:val="24"/>
+          <w:szCs w:val="24"/>
+          <w:lang w:val="tr-TR"/>
+        </w:rPr>
+      </w:pPr>
+      <w:r>
+        <w:rPr>
+          <w:noProof/>
+          <w:sz w:val="24"/>
+          <w:szCs w:val="24"/>
+          <w:lang w:val="tr-TR"/>
+        </w:rPr>
+        <w:t xml:space="preserve">      </w:t>
+      </w:r>
+      <w:r>
+        <w:rPr>
+          <w:rFonts w:ascii="Arial" w:hAnsi="Arial" w:cs="Arial"/>
+          <w:noProof/>
+          <w:sz w:val="24"/>
+          <w:szCs w:val="24"/>
+          <w:lang w:val="tr-TR"/>
+        </w:rPr>
+        <w:t>▼</w:t>
+      </w:r>
+    </w:p>
+    <w:p>
+      <w:pPr>
+        <w:spacing w:after="0" w:line="240" w:lineRule="auto"/>
+        <w:rPr>
+          <w:noProof/>
+          <w:sz w:val="24"/>
+          <w:szCs w:val="24"/>
+          <w:lang w:val="tr-TR"/>
+        </w:rPr>
+      </w:pPr>
+      <w:r>
+        <w:rPr>
+          <w:noProof/>
+          <w:sz w:val="24"/>
+          <w:szCs w:val="24"/>
+          <w:lang w:val="tr-TR"/>
+        </w:rPr>
+        <w:t>Dense(1)</w:t>
+      </w:r>
+    </w:p>
+    <w:p>
+      <w:pPr>
+        <w:spacing w:after="0" w:line="240" w:lineRule="auto"/>
+        <w:rPr>
+          <w:noProof/>
+          <w:sz w:val="24"/>
+          <w:szCs w:val="24"/>
+          <w:lang w:val="tr-TR"/>
+        </w:rPr>
+      </w:pPr>
+      <w:r>
+        <w:rPr>
+          <w:noProof/>
+          <w:sz w:val="24"/>
+          <w:szCs w:val="24"/>
+          <w:lang w:val="tr-TR"/>
+        </w:rPr>
+        <w:t xml:space="preserve">      │</w:t>
+      </w:r>
+    </w:p>
+    <w:p>
+      <w:pPr>
+        <w:spacing w:after="0" w:line="240" w:lineRule="auto"/>
+        <w:rPr>
+          <w:noProof/>
+          <w:sz w:val="24"/>
+          <w:szCs w:val="24"/>
+          <w:lang w:val="tr-TR"/>
+        </w:rPr>
+      </w:pPr>
+      <w:r>
+        <w:rPr>
+          <w:noProof/>
+          <w:sz w:val="24"/>
+          <w:szCs w:val="24"/>
+          <w:lang w:val="tr-TR"/>
+        </w:rPr>
+        <w:t xml:space="preserve">      </w:t>
+      </w:r>
+      <w:r>
+        <w:rPr>
+          <w:rFonts w:ascii="Arial" w:hAnsi="Arial" w:cs="Arial"/>
+          <w:noProof/>
+          <w:sz w:val="24"/>
+          <w:szCs w:val="24"/>
+          <w:lang w:val="tr-TR"/>
+        </w:rPr>
+        <w:t>▼</w:t>
+      </w:r>
+    </w:p>
+    <w:p>
+      <w:pPr>
+        <w:spacing w:after="0" w:line="240" w:lineRule="auto"/>
+        <w:rPr>
+          <w:noProof/>
+          <w:sz w:val="24"/>
+          <w:szCs w:val="24"/>
+          <w:lang w:val="tr-TR"/>
+        </w:rPr>
+      </w:pPr>
+      <w:r>
+        <w:rPr>
+          <w:noProof/>
+          <w:sz w:val="24"/>
+          <w:szCs w:val="24"/>
+          <w:lang w:val="tr-TR"/>
+        </w:rPr>
+        <w:t>Forecast</w:t>
+      </w:r>
+    </w:p>
+    <w:p>
+      <w:pPr>
+        <w:spacing w:after="0" w:line="240" w:lineRule="auto"/>
+        <w:rPr>
+          <w:noProof/>
+          <w:sz w:val="24"/>
+          <w:szCs w:val="24"/>
+          <w:lang w:val="tr-TR"/>
+        </w:rPr>
+      </w:pPr>
+      <w:r>
+        <w:rPr>
+          <w:noProof/>
+          <w:sz w:val="24"/>
+          <w:szCs w:val="24"/>
+          <w:lang w:val="tr-TR"/>
+        </w:rPr>
+        <w:pict w14:anchorId="5663E2C3">
+          <v:rect id="_x0000_i1071" style="width:0;height:1.5pt" o:hralign="center" o:hrstd="t" o:hr="t" fillcolor="#a0a0a0" stroked="f"/>
+        </w:pict>
+      </w:r>
+    </w:p>
+    <w:p>
+      <w:pPr>
+        <w:spacing w:after="0" w:line="240" w:lineRule="auto"/>
+        <w:rPr>
+          <w:b/>
+          <w:bCs/>
+          <w:noProof/>
+          <w:sz w:val="24"/>
+          <w:szCs w:val="24"/>
+          <w:lang w:val="tr-TR"/>
+        </w:rPr>
+      </w:pPr>
+      <w:r>
+        <w:rPr>
+          <w:b/>
+          <w:bCs/>
+          <w:noProof/>
+          <w:sz w:val="24"/>
+          <w:szCs w:val="24"/>
+          <w:lang w:val="tr-TR"/>
+        </w:rPr>
+        <w:t>Constructor</w:t>
+      </w:r>
+      <w:r>
+        <w:rPr>
+          <w:b/>
+          <w:bCs/>
+          <w:noProof/>
+          <w:sz w:val="24"/>
+          <w:szCs w:val="24"/>
+          <w:lang w:val="tr-TR"/>
+        </w:rPr>
+        <w:t xml:space="preserve"> :</w:t>
+      </w:r>
+    </w:p>
+    <w:p>
+      <w:pPr>
+        <w:spacing w:after="0" w:line="240" w:lineRule="auto"/>
+        <w:rPr>
+          <w:noProof/>
+          <w:sz w:val="24"/>
+          <w:szCs w:val="24"/>
+          <w:lang w:val="tr-TR"/>
+        </w:rPr>
+      </w:pPr>
+      <w:r>
+        <w:rPr>
+          <w:noProof/>
+          <w:sz w:val="24"/>
+          <w:szCs w:val="24"/>
+          <w:lang w:val="tr-TR"/>
+        </w:rPr>
+        <w:t>LSTMForecaster(</w:t>
+      </w:r>
+    </w:p>
+    <w:p>
+      <w:pPr>
+        <w:spacing w:after="0" w:line="240" w:lineRule="auto"/>
+        <w:rPr>
+          <w:noProof/>
+          <w:sz w:val="24"/>
+          <w:szCs w:val="24"/>
+          <w:lang w:val="tr-TR"/>
+        </w:rPr>
+      </w:pPr>
+    </w:p>
+    <w:p>
+      <w:pPr>
+        <w:spacing w:after="0" w:line="240" w:lineRule="auto"/>
+        <w:rPr>
+          <w:noProof/>
+          <w:sz w:val="24"/>
+          <w:szCs w:val="24"/>
+          <w:lang w:val="tr-TR"/>
+        </w:rPr>
+      </w:pPr>
+      <w:r>
+        <w:rPr>
+          <w:noProof/>
+          <w:sz w:val="24"/>
+          <w:szCs w:val="24"/>
+          <w:lang w:val="tr-TR"/>
+        </w:rPr>
+        <w:t xml:space="preserve">    window=6,</w:t>
+      </w:r>
+    </w:p>
+    <w:p>
+      <w:pPr>
+        <w:spacing w:after="0" w:line="240" w:lineRule="auto"/>
+        <w:rPr>
+          <w:noProof/>
+          <w:sz w:val="24"/>
+          <w:szCs w:val="24"/>
+          <w:lang w:val="tr-TR"/>
+        </w:rPr>
+      </w:pPr>
+    </w:p>
+    <w:p>
+      <w:pPr>
+        <w:spacing w:after="0" w:line="240" w:lineRule="auto"/>
+        <w:rPr>
+          <w:noProof/>
+          <w:sz w:val="24"/>
+          <w:szCs w:val="24"/>
+          <w:lang w:val="tr-TR"/>
+        </w:rPr>
+      </w:pPr>
+      <w:r>
+        <w:rPr>
+          <w:noProof/>
+          <w:sz w:val="24"/>
+          <w:szCs w:val="24"/>
+          <w:lang w:val="tr-TR"/>
+        </w:rPr>
+        <w:t xml:space="preserve">    units=32,</w:t>
+      </w:r>
+    </w:p>
+    <w:p>
+      <w:pPr>
+        <w:spacing w:after="0" w:line="240" w:lineRule="auto"/>
+        <w:rPr>
+          <w:noProof/>
+          <w:sz w:val="24"/>
+          <w:szCs w:val="24"/>
+          <w:lang w:val="tr-TR"/>
+        </w:rPr>
+      </w:pPr>
+    </w:p>
+    <w:p>
+      <w:pPr>
+        <w:spacing w:after="0" w:line="240" w:lineRule="auto"/>
+        <w:rPr>
+          <w:noProof/>
+          <w:sz w:val="24"/>
+          <w:szCs w:val="24"/>
+          <w:lang w:val="tr-TR"/>
+        </w:rPr>
+      </w:pPr>
+      <w:r>
+        <w:rPr>
+          <w:noProof/>
+          <w:sz w:val="24"/>
+          <w:szCs w:val="24"/>
+          <w:lang w:val="tr-TR"/>
+        </w:rPr>
+        <w:t xml:space="preserve">    epochs=100,</w:t>
+      </w:r>
+    </w:p>
+    <w:p>
+      <w:pPr>
+        <w:spacing w:after="0" w:line="240" w:lineRule="auto"/>
+        <w:rPr>
+          <w:noProof/>
+          <w:sz w:val="24"/>
+          <w:szCs w:val="24"/>
+          <w:lang w:val="tr-TR"/>
+        </w:rPr>
+      </w:pPr>
+    </w:p>
+    <w:p>
+      <w:pPr>
+        <w:spacing w:after="0" w:line="240" w:lineRule="auto"/>
+        <w:rPr>
+          <w:noProof/>
+          <w:sz w:val="24"/>
+          <w:szCs w:val="24"/>
+          <w:lang w:val="tr-TR"/>
+        </w:rPr>
+      </w:pPr>
+      <w:r>
+        <w:rPr>
+          <w:noProof/>
+          <w:sz w:val="24"/>
+          <w:szCs w:val="24"/>
+          <w:lang w:val="tr-TR"/>
+        </w:rPr>
+        <w:t xml:space="preserve">    batch_size=8,</w:t>
+      </w:r>
+    </w:p>
+    <w:p>
+      <w:pPr>
+        <w:spacing w:after="0" w:line="240" w:lineRule="auto"/>
+        <w:rPr>
+          <w:noProof/>
+          <w:sz w:val="24"/>
+          <w:szCs w:val="24"/>
+          <w:lang w:val="tr-TR"/>
+        </w:rPr>
+      </w:pPr>
+    </w:p>
+    <w:p>
+      <w:pPr>
+        <w:spacing w:after="0" w:line="240" w:lineRule="auto"/>
+        <w:rPr>
+          <w:noProof/>
+          <w:sz w:val="24"/>
+          <w:szCs w:val="24"/>
+          <w:lang w:val="tr-TR"/>
+        </w:rPr>
+      </w:pPr>
+      <w:r>
+        <w:rPr>
+          <w:noProof/>
+          <w:sz w:val="24"/>
+          <w:szCs w:val="24"/>
+          <w:lang w:val="tr-TR"/>
+        </w:rPr>
+        <w:t>)</w:t>
+      </w:r>
+    </w:p>
+    <w:p>
+      <w:pPr>
+        <w:spacing w:after="0" w:line="240" w:lineRule="auto"/>
+        <w:rPr>
+          <w:noProof/>
+          <w:sz w:val="24"/>
+          <w:szCs w:val="24"/>
+          <w:lang w:val="tr-TR"/>
+        </w:rPr>
+      </w:pPr>
+      <w:r>
+        <w:rPr>
+          <w:noProof/>
+          <w:sz w:val="24"/>
+          <w:szCs w:val="24"/>
+          <w:lang w:val="tr-TR"/>
+        </w:rPr>
+        <w:pict w14:anchorId="50FF30CD">
+          <v:rect id="_x0000_i1072" style="width:0;height:1.5pt" o:hralign="center" o:hrstd="t" o:hr="t" fillcolor="#a0a0a0" stroked="f"/>
+        </w:pict>
+      </w:r>
+    </w:p>
+    <w:p>
+      <w:pPr>
+        <w:spacing w:after="0" w:line="240" w:lineRule="auto"/>
+        <w:rPr>
+          <w:b/>
+          <w:bCs/>
+          <w:noProof/>
+          <w:sz w:val="24"/>
+          <w:szCs w:val="24"/>
+          <w:lang w:val="tr-TR"/>
+        </w:rPr>
+      </w:pPr>
+      <w:r>
+        <w:rPr>
+          <w:b/>
+          <w:bCs/>
+          <w:noProof/>
+          <w:sz w:val="24"/>
+          <w:szCs w:val="24"/>
+          <w:lang w:val="tr-TR"/>
+        </w:rPr>
+        <w:t>TensorFlow model</w:t>
+      </w:r>
+      <w:r>
+        <w:rPr>
+          <w:b/>
+          <w:bCs/>
+          <w:noProof/>
+          <w:sz w:val="24"/>
+          <w:szCs w:val="24"/>
+          <w:lang w:val="tr-TR"/>
+        </w:rPr>
+        <w:t xml:space="preserve"> :</w:t>
+      </w:r>
+    </w:p>
+    <w:p>
+      <w:pPr>
+        <w:spacing w:after="0" w:line="240" w:lineRule="auto"/>
+        <w:rPr>
+          <w:noProof/>
+          <w:sz w:val="24"/>
+          <w:szCs w:val="24"/>
+          <w:lang w:val="tr-TR"/>
+        </w:rPr>
+      </w:pPr>
+      <w:r>
+        <w:rPr>
+          <w:noProof/>
+          <w:sz w:val="24"/>
+          <w:szCs w:val="24"/>
+          <w:lang w:val="tr-TR"/>
+        </w:rPr>
+        <w:t>Sequential(</w:t>
+      </w:r>
+    </w:p>
+    <w:p>
+      <w:pPr>
+        <w:spacing w:after="0" w:line="240" w:lineRule="auto"/>
+        <w:rPr>
+          <w:noProof/>
+          <w:sz w:val="24"/>
+          <w:szCs w:val="24"/>
+          <w:lang w:val="tr-TR"/>
+        </w:rPr>
+      </w:pPr>
+    </w:p>
+    <w:p>
+      <w:pPr>
+        <w:spacing w:after="0" w:line="240" w:lineRule="auto"/>
+        <w:rPr>
+          <w:noProof/>
+          <w:sz w:val="24"/>
+          <w:szCs w:val="24"/>
+          <w:lang w:val="tr-TR"/>
+        </w:rPr>
+      </w:pPr>
+      <w:r>
+        <w:rPr>
+          <w:noProof/>
+          <w:sz w:val="24"/>
+          <w:szCs w:val="24"/>
+          <w:lang w:val="tr-TR"/>
+        </w:rPr>
+        <w:t xml:space="preserve">    [</w:t>
+      </w:r>
+    </w:p>
+    <w:p>
+      <w:pPr>
+        <w:spacing w:after="0" w:line="240" w:lineRule="auto"/>
+        <w:rPr>
+          <w:noProof/>
+          <w:sz w:val="24"/>
+          <w:szCs w:val="24"/>
+          <w:lang w:val="tr-TR"/>
+        </w:rPr>
+      </w:pPr>
+    </w:p>
+    <w:p>
+      <w:pPr>
+        <w:spacing w:after="0" w:line="240" w:lineRule="auto"/>
+        <w:rPr>
+          <w:noProof/>
+          <w:sz w:val="24"/>
+          <w:szCs w:val="24"/>
+          <w:lang w:val="tr-TR"/>
+        </w:rPr>
+      </w:pPr>
+      <w:r>
+        <w:rPr>
+          <w:noProof/>
+          <w:sz w:val="24"/>
+          <w:szCs w:val="24"/>
+          <w:lang w:val="tr-TR"/>
+        </w:rPr>
+        <w:t xml:space="preserve">        LSTM(units),</w:t>
+      </w:r>
+    </w:p>
+    <w:p>
+      <w:pPr>
+        <w:spacing w:after="0" w:line="240" w:lineRule="auto"/>
+        <w:rPr>
+          <w:noProof/>
+          <w:sz w:val="24"/>
+          <w:szCs w:val="24"/>
+          <w:lang w:val="tr-TR"/>
+        </w:rPr>
+      </w:pPr>
+    </w:p>
+    <w:p>
+      <w:pPr>
+        <w:spacing w:after="0" w:line="240" w:lineRule="auto"/>
+        <w:rPr>
+          <w:noProof/>
+          <w:sz w:val="24"/>
+          <w:szCs w:val="24"/>
+          <w:lang w:val="tr-TR"/>
+        </w:rPr>
+      </w:pPr>
+      <w:r>
+        <w:rPr>
+          <w:noProof/>
+          <w:sz w:val="24"/>
+          <w:szCs w:val="24"/>
+          <w:lang w:val="tr-TR"/>
+        </w:rPr>
+        <w:t xml:space="preserve">        Dense(1),</w:t>
+      </w:r>
+    </w:p>
+    <w:p>
+      <w:pPr>
+        <w:spacing w:after="0" w:line="240" w:lineRule="auto"/>
+        <w:rPr>
+          <w:noProof/>
+          <w:sz w:val="24"/>
+          <w:szCs w:val="24"/>
+          <w:lang w:val="tr-TR"/>
+        </w:rPr>
+      </w:pPr>
+    </w:p>
+    <w:p>
+      <w:pPr>
+        <w:spacing w:after="0" w:line="240" w:lineRule="auto"/>
+        <w:rPr>
+          <w:noProof/>
+          <w:sz w:val="24"/>
+          <w:szCs w:val="24"/>
+          <w:lang w:val="tr-TR"/>
+        </w:rPr>
+      </w:pPr>
+      <w:r>
+        <w:rPr>
+          <w:noProof/>
+          <w:sz w:val="24"/>
+          <w:szCs w:val="24"/>
+          <w:lang w:val="tr-TR"/>
+        </w:rPr>
+        <w:t xml:space="preserve">    ]</w:t>
+      </w:r>
+    </w:p>
+    <w:p>
+      <w:pPr>
+        <w:spacing w:after="0" w:line="240" w:lineRule="auto"/>
+        <w:rPr>
+          <w:noProof/>
+          <w:sz w:val="24"/>
+          <w:szCs w:val="24"/>
+          <w:lang w:val="tr-TR"/>
+        </w:rPr>
+      </w:pPr>
+    </w:p>
+    <w:p>
+      <w:pPr>
+        <w:spacing w:after="0" w:line="240" w:lineRule="auto"/>
+        <w:rPr>
+          <w:noProof/>
+          <w:sz w:val="24"/>
+          <w:szCs w:val="24"/>
+          <w:lang w:val="tr-TR"/>
+        </w:rPr>
+      </w:pPr>
+      <w:r>
+        <w:rPr>
+          <w:noProof/>
+          <w:sz w:val="24"/>
+          <w:szCs w:val="24"/>
+          <w:lang w:val="tr-TR"/>
+        </w:rPr>
+        <w:t>)</w:t>
+      </w:r>
+    </w:p>
+    <w:p>
+      <w:pPr>
+        <w:spacing w:after="0" w:line="240" w:lineRule="auto"/>
+        <w:rPr>
+          <w:noProof/>
+          <w:sz w:val="24"/>
+          <w:szCs w:val="24"/>
+          <w:lang w:val="tr-TR"/>
+        </w:rPr>
+      </w:pPr>
+      <w:r>
+        <w:rPr>
+          <w:noProof/>
+          <w:sz w:val="24"/>
+          <w:szCs w:val="24"/>
+          <w:lang w:val="tr-TR"/>
+        </w:rPr>
+        <w:pict w14:anchorId="68FFF9C5">
+          <v:rect id="_x0000_i1073" style="width:0;height:1.5pt" o:hralign="center" o:hrstd="t" o:hr="t" fillcolor="#a0a0a0" stroked="f"/>
+        </w:pict>
+      </w:r>
+    </w:p>
+    <w:p>
+      <w:pPr>
+        <w:rPr>
+          <w:b/>
+          <w:bCs/>
+          <w:noProof/>
+          <w:sz w:val="24"/>
+          <w:szCs w:val="24"/>
+          <w:lang w:val="tr-TR"/>
+        </w:rPr>
+      </w:pPr>
+      <w:r>
+        <w:rPr>
+          <w:b/>
+          <w:bCs/>
+          <w:noProof/>
+          <w:sz w:val="24"/>
+          <w:szCs w:val="24"/>
+          <w:lang w:val="tr-TR"/>
+        </w:rPr>
+        <w:br w:type="page"/>
+      </w:r>
+    </w:p>
+    <w:p>
+      <w:pPr>
+        <w:spacing w:after="0" w:line="240" w:lineRule="auto"/>
+        <w:rPr>
+          <w:b/>
+          <w:bCs/>
+          <w:noProof/>
+          <w:sz w:val="24"/>
+          <w:szCs w:val="24"/>
+          <w:lang w:val="tr-TR"/>
+        </w:rPr>
+      </w:pPr>
+      <w:r>
+        <w:rPr>
+          <w:b/>
+          <w:bCs/>
+          <w:noProof/>
+          <w:sz w:val="24"/>
+          <w:szCs w:val="24"/>
+          <w:lang w:val="tr-TR"/>
+        </w:rPr>
+        <w:lastRenderedPageBreak/>
+        <w:t>fit()</w:t>
+      </w:r>
+      <w:r>
+        <w:rPr>
+          <w:b/>
+          <w:bCs/>
+          <w:noProof/>
+          <w:sz w:val="24"/>
+          <w:szCs w:val="24"/>
+          <w:lang w:val="tr-TR"/>
+        </w:rPr>
+        <w:t xml:space="preserve"> :</w:t>
+      </w:r>
+    </w:p>
+    <w:p>
+      <w:pPr>
+        <w:spacing w:after="0" w:line="240" w:lineRule="auto"/>
+        <w:rPr>
+          <w:noProof/>
+          <w:sz w:val="24"/>
+          <w:szCs w:val="24"/>
+          <w:lang w:val="tr-TR"/>
+        </w:rPr>
+      </w:pPr>
+      <w:r>
+        <w:rPr>
+          <w:noProof/>
+          <w:sz w:val="24"/>
+          <w:szCs w:val="24"/>
+          <w:lang w:val="tr-TR"/>
+        </w:rPr>
+        <w:t>Dataset</w:t>
+      </w:r>
+    </w:p>
+    <w:p>
+      <w:pPr>
+        <w:spacing w:after="0" w:line="240" w:lineRule="auto"/>
+        <w:rPr>
+          <w:noProof/>
+          <w:sz w:val="24"/>
+          <w:szCs w:val="24"/>
+          <w:lang w:val="tr-TR"/>
+        </w:rPr>
+      </w:pPr>
+      <w:r>
+        <w:rPr>
+          <w:noProof/>
+          <w:sz w:val="24"/>
+          <w:szCs w:val="24"/>
+          <w:lang w:val="tr-TR"/>
+        </w:rPr>
+        <w:t>↓</w:t>
+      </w:r>
+    </w:p>
+    <w:p>
+      <w:pPr>
+        <w:spacing w:after="0" w:line="240" w:lineRule="auto"/>
+        <w:rPr>
+          <w:noProof/>
+          <w:sz w:val="24"/>
+          <w:szCs w:val="24"/>
+          <w:lang w:val="tr-TR"/>
+        </w:rPr>
+      </w:pPr>
+      <w:r>
+        <w:rPr>
+          <w:noProof/>
+          <w:sz w:val="24"/>
+          <w:szCs w:val="24"/>
+          <w:lang w:val="tr-TR"/>
+        </w:rPr>
+        <w:t>prepare_data()</w:t>
+      </w:r>
+    </w:p>
+    <w:p>
+      <w:pPr>
+        <w:spacing w:after="0" w:line="240" w:lineRule="auto"/>
+        <w:rPr>
+          <w:noProof/>
+          <w:sz w:val="24"/>
+          <w:szCs w:val="24"/>
+          <w:lang w:val="tr-TR"/>
+        </w:rPr>
+      </w:pPr>
+      <w:r>
+        <w:rPr>
+          <w:noProof/>
+          <w:sz w:val="24"/>
+          <w:szCs w:val="24"/>
+          <w:lang w:val="tr-TR"/>
+        </w:rPr>
+        <w:t>↓</w:t>
+      </w:r>
+    </w:p>
+    <w:p>
+      <w:pPr>
+        <w:spacing w:after="0" w:line="240" w:lineRule="auto"/>
+        <w:rPr>
+          <w:noProof/>
+          <w:sz w:val="24"/>
+          <w:szCs w:val="24"/>
+          <w:lang w:val="tr-TR"/>
+        </w:rPr>
+      </w:pPr>
+      <w:r>
+        <w:rPr>
+          <w:noProof/>
+          <w:sz w:val="24"/>
+          <w:szCs w:val="24"/>
+          <w:lang w:val="tr-TR"/>
+        </w:rPr>
+        <w:t>build_model()</w:t>
+      </w:r>
+    </w:p>
+    <w:p>
+      <w:pPr>
+        <w:spacing w:after="0" w:line="240" w:lineRule="auto"/>
+        <w:rPr>
+          <w:noProof/>
+          <w:sz w:val="24"/>
+          <w:szCs w:val="24"/>
+          <w:lang w:val="tr-TR"/>
+        </w:rPr>
+      </w:pPr>
+      <w:r>
+        <w:rPr>
+          <w:noProof/>
+          <w:sz w:val="24"/>
+          <w:szCs w:val="24"/>
+          <w:lang w:val="tr-TR"/>
+        </w:rPr>
+        <w:t>↓</w:t>
+      </w:r>
+    </w:p>
+    <w:p>
+      <w:pPr>
+        <w:spacing w:after="0" w:line="240" w:lineRule="auto"/>
+        <w:rPr>
+          <w:noProof/>
+          <w:sz w:val="24"/>
+          <w:szCs w:val="24"/>
+          <w:lang w:val="tr-TR"/>
+        </w:rPr>
+      </w:pPr>
+      <w:r>
+        <w:rPr>
+          <w:noProof/>
+          <w:sz w:val="24"/>
+          <w:szCs w:val="24"/>
+          <w:lang w:val="tr-TR"/>
+        </w:rPr>
+        <w:t>model.fit()</w:t>
+      </w:r>
+    </w:p>
+    <w:p>
+      <w:pPr>
+        <w:spacing w:after="0" w:line="240" w:lineRule="auto"/>
+        <w:rPr>
+          <w:noProof/>
+          <w:sz w:val="24"/>
+          <w:szCs w:val="24"/>
+          <w:lang w:val="tr-TR"/>
+        </w:rPr>
+      </w:pPr>
+      <w:r>
+        <w:rPr>
+          <w:noProof/>
+          <w:sz w:val="24"/>
+          <w:szCs w:val="24"/>
+          <w:lang w:val="tr-TR"/>
+        </w:rPr>
+        <w:t>↓</w:t>
+      </w:r>
+    </w:p>
+    <w:p>
+      <w:pPr>
+        <w:spacing w:after="0" w:line="240" w:lineRule="auto"/>
+        <w:rPr>
+          <w:noProof/>
+          <w:sz w:val="24"/>
+          <w:szCs w:val="24"/>
+          <w:lang w:val="tr-TR"/>
+        </w:rPr>
+      </w:pPr>
+      <w:r>
+        <w:rPr>
+          <w:noProof/>
+          <w:sz w:val="24"/>
+          <w:szCs w:val="24"/>
+          <w:lang w:val="tr-TR"/>
+        </w:rPr>
+        <w:t>store history</w:t>
+      </w:r>
+    </w:p>
+    <w:p>
+      <w:pPr>
+        <w:spacing w:after="0" w:line="240" w:lineRule="auto"/>
+        <w:rPr>
+          <w:noProof/>
+          <w:sz w:val="24"/>
+          <w:szCs w:val="24"/>
+          <w:lang w:val="tr-TR"/>
+        </w:rPr>
+      </w:pPr>
+      <w:r>
+        <w:rPr>
+          <w:noProof/>
+          <w:sz w:val="24"/>
+          <w:szCs w:val="24"/>
+          <w:lang w:val="tr-TR"/>
+        </w:rPr>
+        <w:pict w14:anchorId="3F1DD77A">
+          <v:rect id="_x0000_i1074" style="width:0;height:1.5pt" o:hralign="center" o:hrstd="t" o:hr="t" fillcolor="#a0a0a0" stroked="f"/>
+        </w:pict>
+      </w:r>
+    </w:p>
+    <w:p>
+      <w:pPr>
+        <w:spacing w:after="0" w:line="240" w:lineRule="auto"/>
+        <w:rPr>
+          <w:b/>
+          <w:bCs/>
+          <w:noProof/>
+          <w:sz w:val="24"/>
+          <w:szCs w:val="24"/>
+          <w:lang w:val="tr-TR"/>
+        </w:rPr>
+      </w:pPr>
+      <w:r>
+        <w:rPr>
+          <w:b/>
+          <w:bCs/>
+          <w:noProof/>
+          <w:sz w:val="24"/>
+          <w:szCs w:val="24"/>
+          <w:lang w:val="tr-TR"/>
+        </w:rPr>
+        <w:t>predict()</w:t>
+      </w:r>
+      <w:r>
+        <w:rPr>
+          <w:b/>
+          <w:bCs/>
+          <w:noProof/>
+          <w:sz w:val="24"/>
+          <w:szCs w:val="24"/>
+          <w:lang w:val="tr-TR"/>
+        </w:rPr>
+        <w:t xml:space="preserve"> :</w:t>
+      </w:r>
+    </w:p>
+    <w:p>
+      <w:pPr>
+        <w:spacing w:after="0" w:line="240" w:lineRule="auto"/>
+        <w:rPr>
+          <w:noProof/>
+          <w:sz w:val="24"/>
+          <w:szCs w:val="24"/>
+          <w:lang w:val="tr-TR"/>
+        </w:rPr>
+      </w:pPr>
+      <w:r>
+        <w:rPr>
+          <w:noProof/>
+          <w:sz w:val="24"/>
+          <w:szCs w:val="24"/>
+          <w:lang w:val="tr-TR"/>
+        </w:rPr>
+        <w:t>ForecastResult(</w:t>
+      </w:r>
+    </w:p>
+    <w:p>
+      <w:pPr>
+        <w:spacing w:after="0" w:line="240" w:lineRule="auto"/>
+        <w:rPr>
+          <w:noProof/>
+          <w:sz w:val="24"/>
+          <w:szCs w:val="24"/>
+          <w:lang w:val="tr-TR"/>
+        </w:rPr>
+      </w:pPr>
+      <w:r>
+        <w:rPr>
+          <w:noProof/>
+          <w:sz w:val="24"/>
+          <w:szCs w:val="24"/>
+          <w:lang w:val="tr-TR"/>
+        </w:rPr>
+        <w:t xml:space="preserve">    ...</w:t>
+      </w:r>
+    </w:p>
+    <w:p>
+      <w:pPr>
+        <w:spacing w:after="0" w:line="240" w:lineRule="auto"/>
+        <w:rPr>
+          <w:noProof/>
+          <w:sz w:val="24"/>
+          <w:szCs w:val="24"/>
+          <w:lang w:val="tr-TR"/>
+        </w:rPr>
+      </w:pPr>
+      <w:r>
+        <w:rPr>
+          <w:noProof/>
+          <w:sz w:val="24"/>
+          <w:szCs w:val="24"/>
+          <w:lang w:val="tr-TR"/>
+        </w:rPr>
+        <w:t>)</w:t>
+      </w:r>
+    </w:p>
+    <w:p>
+      <w:pPr>
+        <w:spacing w:after="0" w:line="240" w:lineRule="auto"/>
+        <w:rPr>
+          <w:noProof/>
+          <w:sz w:val="24"/>
+          <w:szCs w:val="24"/>
+          <w:lang w:val="tr-TR"/>
+        </w:rPr>
+      </w:pPr>
+      <w:r>
+        <w:rPr>
+          <w:noProof/>
+          <w:sz w:val="24"/>
+          <w:szCs w:val="24"/>
+          <w:lang w:val="tr-TR"/>
+        </w:rPr>
+        <w:t>with the same API.</w:t>
+      </w:r>
+    </w:p>
+    <w:p>
+      <w:pPr>
+        <w:spacing w:after="0" w:line="240" w:lineRule="auto"/>
+        <w:rPr>
+          <w:noProof/>
+          <w:sz w:val="24"/>
+          <w:szCs w:val="24"/>
+          <w:lang w:val="tr-TR"/>
+        </w:rPr>
+      </w:pPr>
+      <w:r>
+        <w:rPr>
+          <w:noProof/>
+          <w:sz w:val="24"/>
+          <w:szCs w:val="24"/>
+          <w:lang w:val="tr-TR"/>
+        </w:rPr>
+        <w:t>The outside world should not know</w:t>
+      </w:r>
+    </w:p>
+    <w:p>
+      <w:pPr>
+        <w:spacing w:after="0" w:line="240" w:lineRule="auto"/>
+        <w:rPr>
+          <w:noProof/>
+          <w:sz w:val="24"/>
+          <w:szCs w:val="24"/>
+          <w:lang w:val="tr-TR"/>
+        </w:rPr>
+      </w:pPr>
+      <w:r>
+        <w:rPr>
+          <w:noProof/>
+          <w:sz w:val="24"/>
+          <w:szCs w:val="24"/>
+          <w:lang w:val="tr-TR"/>
+        </w:rPr>
+        <w:t>whether the forecast came from</w:t>
+      </w:r>
+    </w:p>
+    <w:p>
+      <w:pPr>
+        <w:numPr>
+          <w:ilvl w:val="0"/>
+          <w:numId w:val="15"/>
+        </w:numPr>
+        <w:spacing w:after="0" w:line="240" w:lineRule="auto"/>
+        <w:rPr>
+          <w:noProof/>
+          <w:sz w:val="24"/>
+          <w:szCs w:val="24"/>
+          <w:lang w:val="tr-TR"/>
+        </w:rPr>
+      </w:pPr>
+      <w:r>
+        <w:rPr>
+          <w:noProof/>
+          <w:sz w:val="24"/>
+          <w:szCs w:val="24"/>
+          <w:lang w:val="tr-TR"/>
+        </w:rPr>
+        <w:t xml:space="preserve">ARIMA </w:t>
+      </w:r>
+    </w:p>
+    <w:p>
+      <w:pPr>
+        <w:spacing w:after="0" w:line="240" w:lineRule="auto"/>
+        <w:rPr>
+          <w:noProof/>
+          <w:sz w:val="24"/>
+          <w:szCs w:val="24"/>
+          <w:lang w:val="tr-TR"/>
+        </w:rPr>
+      </w:pPr>
+      <w:r>
+        <w:rPr>
+          <w:noProof/>
+          <w:sz w:val="24"/>
+          <w:szCs w:val="24"/>
+          <w:lang w:val="tr-TR"/>
+        </w:rPr>
+        <w:t>or</w:t>
+      </w:r>
+    </w:p>
+    <w:p>
+      <w:pPr>
+        <w:numPr>
+          <w:ilvl w:val="0"/>
+          <w:numId w:val="16"/>
+        </w:numPr>
+        <w:spacing w:after="0" w:line="240" w:lineRule="auto"/>
+        <w:rPr>
+          <w:noProof/>
+          <w:sz w:val="24"/>
+          <w:szCs w:val="24"/>
+          <w:lang w:val="tr-TR"/>
+        </w:rPr>
+      </w:pPr>
+      <w:r>
+        <w:rPr>
+          <w:noProof/>
+          <w:sz w:val="24"/>
+          <w:szCs w:val="24"/>
+          <w:lang w:val="tr-TR"/>
+        </w:rPr>
+        <w:t xml:space="preserve">Kalman </w:t>
+      </w:r>
+    </w:p>
+    <w:p>
+      <w:pPr>
+        <w:spacing w:after="0" w:line="240" w:lineRule="auto"/>
+        <w:rPr>
+          <w:noProof/>
+          <w:sz w:val="24"/>
+          <w:szCs w:val="24"/>
+          <w:lang w:val="tr-TR"/>
+        </w:rPr>
+      </w:pPr>
+      <w:r>
+        <w:rPr>
+          <w:noProof/>
+          <w:sz w:val="24"/>
+          <w:szCs w:val="24"/>
+          <w:lang w:val="tr-TR"/>
+        </w:rPr>
+        <w:t>or</w:t>
+      </w:r>
+    </w:p>
+    <w:p>
+      <w:pPr>
+        <w:numPr>
+          <w:ilvl w:val="0"/>
+          <w:numId w:val="17"/>
+        </w:numPr>
+        <w:spacing w:after="0" w:line="240" w:lineRule="auto"/>
+        <w:rPr>
+          <w:noProof/>
+          <w:sz w:val="24"/>
+          <w:szCs w:val="24"/>
+          <w:lang w:val="tr-TR"/>
+        </w:rPr>
+      </w:pPr>
+      <w:r>
+        <w:rPr>
+          <w:noProof/>
+          <w:sz w:val="24"/>
+          <w:szCs w:val="24"/>
+          <w:lang w:val="tr-TR"/>
+        </w:rPr>
+        <w:t xml:space="preserve">LSTM. </w:t>
+      </w:r>
+    </w:p>
+    <w:p>
+      <w:pPr>
+        <w:spacing w:after="0" w:line="240" w:lineRule="auto"/>
+        <w:rPr>
+          <w:noProof/>
+          <w:sz w:val="24"/>
+          <w:szCs w:val="24"/>
+          <w:lang w:val="tr-TR"/>
+        </w:rPr>
+      </w:pPr>
+      <w:r>
+        <w:rPr>
+          <w:noProof/>
+          <w:sz w:val="24"/>
+          <w:szCs w:val="24"/>
+          <w:lang w:val="tr-TR"/>
+        </w:rPr>
+        <w:pict w14:anchorId="76E04626">
+          <v:rect id="_x0000_i1075" style="width:0;height:1.5pt" o:hralign="center" o:hrstd="t" o:hr="t" fillcolor="#a0a0a0" stroked="f"/>
+        </w:pict>
+      </w:r>
+    </w:p>
+    <w:p>
+      <w:pPr>
+        <w:spacing w:after="0" w:line="240" w:lineRule="auto"/>
+        <w:rPr>
+          <w:b/>
+          <w:bCs/>
+          <w:noProof/>
+          <w:sz w:val="24"/>
+          <w:szCs w:val="24"/>
+          <w:lang w:val="tr-TR"/>
+        </w:rPr>
+      </w:pPr>
+      <w:r>
+        <w:rPr>
+          <w:b/>
+          <w:bCs/>
+          <w:noProof/>
+          <w:sz w:val="24"/>
+          <w:szCs w:val="24"/>
+          <w:lang w:val="tr-TR"/>
+        </w:rPr>
+        <w:t>Metadata</w:t>
+      </w:r>
+      <w:r>
+        <w:rPr>
+          <w:b/>
+          <w:bCs/>
+          <w:noProof/>
+          <w:sz w:val="24"/>
+          <w:szCs w:val="24"/>
+          <w:lang w:val="tr-TR"/>
+        </w:rPr>
+        <w:t xml:space="preserve"> :</w:t>
+      </w:r>
+    </w:p>
+    <w:p>
+      <w:pPr>
+        <w:spacing w:after="0" w:line="240" w:lineRule="auto"/>
+        <w:rPr>
+          <w:noProof/>
+          <w:sz w:val="24"/>
+          <w:szCs w:val="24"/>
+          <w:lang w:val="tr-TR"/>
+        </w:rPr>
+      </w:pPr>
+      <w:r>
+        <w:rPr>
+          <w:noProof/>
+          <w:sz w:val="24"/>
+          <w:szCs w:val="24"/>
+          <w:lang w:val="tr-TR"/>
+        </w:rPr>
+        <w:t>window</w:t>
+      </w:r>
+    </w:p>
+    <w:p>
+      <w:pPr>
+        <w:spacing w:after="0" w:line="240" w:lineRule="auto"/>
+        <w:rPr>
+          <w:noProof/>
+          <w:sz w:val="24"/>
+          <w:szCs w:val="24"/>
+          <w:lang w:val="tr-TR"/>
+        </w:rPr>
+      </w:pPr>
+      <w:r>
+        <w:rPr>
+          <w:noProof/>
+          <w:sz w:val="24"/>
+          <w:szCs w:val="24"/>
+          <w:lang w:val="tr-TR"/>
+        </w:rPr>
+        <w:t>units</w:t>
+      </w:r>
+    </w:p>
+    <w:p>
+      <w:pPr>
+        <w:spacing w:after="0" w:line="240" w:lineRule="auto"/>
+        <w:rPr>
+          <w:noProof/>
+          <w:sz w:val="24"/>
+          <w:szCs w:val="24"/>
+          <w:lang w:val="tr-TR"/>
+        </w:rPr>
+      </w:pPr>
+      <w:r>
+        <w:rPr>
+          <w:noProof/>
+          <w:sz w:val="24"/>
+          <w:szCs w:val="24"/>
+          <w:lang w:val="tr-TR"/>
+        </w:rPr>
+        <w:t>epochs</w:t>
+      </w:r>
+    </w:p>
+    <w:p>
+      <w:pPr>
+        <w:spacing w:after="0" w:line="240" w:lineRule="auto"/>
+        <w:rPr>
+          <w:noProof/>
+          <w:sz w:val="24"/>
+          <w:szCs w:val="24"/>
+          <w:lang w:val="tr-TR"/>
+        </w:rPr>
+      </w:pPr>
+      <w:r>
+        <w:rPr>
+          <w:noProof/>
+          <w:sz w:val="24"/>
+          <w:szCs w:val="24"/>
+          <w:lang w:val="tr-TR"/>
+        </w:rPr>
+        <w:t>batch_size</w:t>
+      </w:r>
+    </w:p>
+    <w:p>
+      <w:pPr>
+        <w:spacing w:after="0" w:line="240" w:lineRule="auto"/>
+        <w:rPr>
+          <w:noProof/>
+          <w:sz w:val="24"/>
+          <w:szCs w:val="24"/>
+          <w:lang w:val="tr-TR"/>
+        </w:rPr>
+      </w:pPr>
+      <w:r>
+        <w:rPr>
+          <w:noProof/>
+          <w:sz w:val="24"/>
+          <w:szCs w:val="24"/>
+          <w:lang w:val="tr-TR"/>
+        </w:rPr>
+        <w:pict w14:anchorId="14F0100D">
+          <v:rect id="_x0000_i1076" style="width:0;height:1.5pt" o:hralign="center" o:hrstd="t" o:hr="t" fillcolor="#a0a0a0" stroked="f"/>
+        </w:pict>
+      </w:r>
+    </w:p>
+    <w:p>
+      <w:pPr>
+        <w:spacing w:after="0" w:line="240" w:lineRule="auto"/>
+        <w:rPr>
+          <w:b/>
+          <w:bCs/>
+          <w:noProof/>
+          <w:sz w:val="24"/>
+          <w:szCs w:val="24"/>
+          <w:lang w:val="tr-TR"/>
+        </w:rPr>
+      </w:pPr>
+      <w:r>
+        <w:rPr>
+          <w:b/>
+          <w:bCs/>
+          <w:noProof/>
+          <w:sz w:val="24"/>
+          <w:szCs w:val="24"/>
+          <w:lang w:val="tr-TR"/>
+        </w:rPr>
+        <w:t>ForecastPlot</w:t>
+      </w:r>
+    </w:p>
+    <w:p>
+      <w:pPr>
+        <w:spacing w:after="0" w:line="240" w:lineRule="auto"/>
+        <w:rPr>
+          <w:noProof/>
+          <w:sz w:val="24"/>
+          <w:szCs w:val="24"/>
+          <w:lang w:val="tr-TR"/>
+        </w:rPr>
+      </w:pPr>
+      <w:r>
+        <w:rPr>
+          <w:noProof/>
+          <w:sz w:val="24"/>
+          <w:szCs w:val="24"/>
+          <w:lang w:val="tr-TR"/>
+        </w:rPr>
+        <w:pict w14:anchorId="58A47A18">
+          <v:rect id="_x0000_i1077" style="width:0;height:1.5pt" o:hralign="center" o:hrstd="t" o:hr="t" fillcolor="#a0a0a0" stroked="f"/>
+        </w:pict>
+      </w:r>
+    </w:p>
+    <w:p>
+      <w:pPr>
+        <w:spacing w:after="0" w:line="240" w:lineRule="auto"/>
+        <w:rPr>
+          <w:b/>
+          <w:bCs/>
+          <w:noProof/>
+          <w:sz w:val="24"/>
+          <w:szCs w:val="24"/>
+          <w:lang w:val="tr-TR"/>
+        </w:rPr>
+      </w:pPr>
+      <w:r>
+        <w:rPr>
+          <w:b/>
+          <w:bCs/>
+          <w:noProof/>
+          <w:sz w:val="24"/>
+          <w:szCs w:val="24"/>
+          <w:lang w:val="tr-TR"/>
+        </w:rPr>
+        <w:t>Tests</w:t>
+      </w:r>
+      <w:r>
+        <w:rPr>
+          <w:b/>
+          <w:bCs/>
+          <w:noProof/>
+          <w:sz w:val="24"/>
+          <w:szCs w:val="24"/>
+          <w:lang w:val="tr-TR"/>
+        </w:rPr>
+        <w:t xml:space="preserve"> :</w:t>
+      </w:r>
+    </w:p>
+    <w:p>
+      <w:pPr>
+        <w:spacing w:after="0" w:line="240" w:lineRule="auto"/>
+        <w:rPr>
+          <w:noProof/>
+          <w:sz w:val="24"/>
+          <w:szCs w:val="24"/>
+          <w:lang w:val="tr-TR"/>
+        </w:rPr>
+      </w:pPr>
+      <w:r>
+        <w:rPr>
+          <w:noProof/>
+          <w:sz w:val="24"/>
+          <w:szCs w:val="24"/>
+          <w:lang w:val="tr-TR"/>
+        </w:rPr>
+        <w:t>test_lstm_constructor</w:t>
+      </w:r>
+    </w:p>
+    <w:p>
+      <w:pPr>
+        <w:spacing w:after="0" w:line="240" w:lineRule="auto"/>
+        <w:rPr>
+          <w:noProof/>
+          <w:sz w:val="24"/>
+          <w:szCs w:val="24"/>
+          <w:lang w:val="tr-TR"/>
+        </w:rPr>
+      </w:pPr>
+      <w:r>
+        <w:rPr>
+          <w:noProof/>
+          <w:sz w:val="24"/>
+          <w:szCs w:val="24"/>
+          <w:lang w:val="tr-TR"/>
+        </w:rPr>
+        <w:t>test_fit_predict</w:t>
+      </w:r>
+    </w:p>
+    <w:p>
+      <w:pPr>
+        <w:spacing w:after="0" w:line="240" w:lineRule="auto"/>
+        <w:rPr>
+          <w:noProof/>
+          <w:sz w:val="24"/>
+          <w:szCs w:val="24"/>
+          <w:lang w:val="tr-TR"/>
+        </w:rPr>
+      </w:pPr>
+      <w:r>
+        <w:rPr>
+          <w:noProof/>
+          <w:sz w:val="24"/>
+          <w:szCs w:val="24"/>
+          <w:lang w:val="tr-TR"/>
+        </w:rPr>
+        <w:t>test_forecast_result</w:t>
+      </w:r>
+    </w:p>
+    <w:p>
+      <w:pPr>
+        <w:spacing w:after="0" w:line="240" w:lineRule="auto"/>
+        <w:rPr>
+          <w:noProof/>
+          <w:sz w:val="24"/>
+          <w:szCs w:val="24"/>
+          <w:lang w:val="tr-TR"/>
+        </w:rPr>
+      </w:pPr>
+      <w:r>
+        <w:rPr>
+          <w:noProof/>
+          <w:sz w:val="24"/>
+          <w:szCs w:val="24"/>
+          <w:lang w:val="tr-TR"/>
+        </w:rPr>
+        <w:t>test_metadata</w:t>
+      </w:r>
+    </w:p>
+    <w:p>
+      <w:pPr>
+        <w:spacing w:after="0" w:line="240" w:lineRule="auto"/>
+        <w:rPr>
+          <w:noProof/>
+          <w:sz w:val="24"/>
+          <w:szCs w:val="24"/>
+          <w:lang w:val="tr-TR"/>
+        </w:rPr>
+      </w:pPr>
+    </w:p>
+    <w:p>
+      <w:pPr>
+        <w:rPr>
+          <w:noProof/>
+          <w:sz w:val="24"/>
+          <w:szCs w:val="24"/>
+          <w:lang w:val="tr-TR"/>
+        </w:rPr>
+      </w:pPr>
+      <w:r>
+        <w:rPr>
+          <w:noProof/>
+          <w:sz w:val="24"/>
+          <w:szCs w:val="24"/>
+          <w:lang w:val="tr-TR"/>
+        </w:rPr>
+        <w:br w:type="page"/>
+      </w:r>
+    </w:p>
+    <w:p>
+      <w:pPr>
+        <w:spacing w:after="0" w:line="240" w:lineRule="auto"/>
+        <w:rPr>
+          <w:b/>
+          <w:bCs/>
+          <w:noProof/>
+          <w:sz w:val="32"/>
+          <w:szCs w:val="32"/>
+          <w:u w:val="single"/>
+          <w:lang w:val="tr-TR"/>
+        </w:rPr>
+      </w:pPr>
+      <w:r>
+        <w:rPr>
+          <w:b/>
+          <w:bCs/>
+          <w:noProof/>
+          <w:sz w:val="32"/>
+          <w:szCs w:val="32"/>
+          <w:u w:val="single"/>
+          <w:lang w:val="tr-TR"/>
+        </w:rPr>
+        <w:lastRenderedPageBreak/>
+        <w:t>Sprint 9</w:t>
+      </w:r>
+      <w:r>
+        <w:rPr>
+          <w:b/>
+          <w:bCs/>
+          <w:noProof/>
+          <w:sz w:val="32"/>
+          <w:szCs w:val="32"/>
+          <w:u w:val="single"/>
+          <w:lang w:val="tr-TR"/>
+        </w:rPr>
+        <w:t>:</w:t>
+      </w:r>
+    </w:p>
+    <w:p>
+      <w:pPr>
+        <w:spacing w:after="0" w:line="240" w:lineRule="auto"/>
+        <w:rPr>
+          <w:b/>
+          <w:bCs/>
+          <w:noProof/>
+          <w:sz w:val="32"/>
+          <w:szCs w:val="32"/>
+          <w:u w:val="single"/>
+          <w:lang w:val="tr-TR"/>
+        </w:rPr>
+      </w:pPr>
+    </w:p>
+    <w:p>
+      <w:pPr>
+        <w:spacing w:after="0" w:line="240" w:lineRule="auto"/>
+        <w:rPr>
+          <w:b/>
+          <w:bCs/>
+          <w:noProof/>
+          <w:sz w:val="24"/>
+          <w:szCs w:val="24"/>
+          <w:lang w:val="tr-TR"/>
+        </w:rPr>
+      </w:pPr>
+      <w:r>
+        <w:rPr>
+          <w:b/>
+          <w:bCs/>
+          <w:noProof/>
+          <w:sz w:val="24"/>
+          <w:szCs w:val="24"/>
+          <w:lang w:val="tr-TR"/>
+        </w:rPr>
+        <w:t>Commit 1</w:t>
+      </w:r>
+    </w:p>
+    <w:p>
+      <w:pPr>
+        <w:spacing w:after="0" w:line="240" w:lineRule="auto"/>
+        <w:rPr>
+          <w:b/>
+          <w:bCs/>
+          <w:noProof/>
+          <w:sz w:val="24"/>
+          <w:szCs w:val="24"/>
+          <w:lang w:val="tr-TR"/>
+        </w:rPr>
+      </w:pPr>
+      <w:r>
+        <w:rPr>
+          <w:b/>
+          <w:bCs/>
+          <w:noProof/>
+          <w:sz w:val="24"/>
+          <w:szCs w:val="24"/>
+          <w:lang w:val="tr-TR"/>
+        </w:rPr>
+        <w:t>Neural Infrastructure</w:t>
+      </w:r>
+    </w:p>
+    <w:p>
+      <w:pPr>
+        <w:spacing w:after="0" w:line="240" w:lineRule="auto"/>
+        <w:rPr>
+          <w:noProof/>
+          <w:sz w:val="24"/>
+          <w:szCs w:val="24"/>
+          <w:lang w:val="tr-TR"/>
+        </w:rPr>
+      </w:pPr>
+      <w:r>
+        <w:rPr>
+          <w:noProof/>
+          <w:sz w:val="24"/>
+          <w:szCs w:val="24"/>
+          <w:lang w:val="tr-TR"/>
+        </w:rPr>
+        <w:t>forecasting/</w:t>
+      </w:r>
+    </w:p>
+    <w:p>
+      <w:pPr>
+        <w:spacing w:after="0" w:line="240" w:lineRule="auto"/>
+        <w:rPr>
+          <w:noProof/>
+          <w:sz w:val="24"/>
+          <w:szCs w:val="24"/>
+          <w:lang w:val="tr-TR"/>
+        </w:rPr>
+      </w:pPr>
+    </w:p>
+    <w:p>
+      <w:pPr>
+        <w:spacing w:after="0" w:line="240" w:lineRule="auto"/>
+        <w:rPr>
+          <w:noProof/>
+          <w:sz w:val="24"/>
+          <w:szCs w:val="24"/>
+          <w:lang w:val="tr-TR"/>
+        </w:rPr>
+      </w:pPr>
+      <w:r>
+        <w:rPr>
+          <w:noProof/>
+          <w:sz w:val="24"/>
+          <w:szCs w:val="24"/>
+          <w:lang w:val="tr-TR"/>
+        </w:rPr>
+        <w:t xml:space="preserve">    neural/</w:t>
+      </w:r>
+    </w:p>
+    <w:p>
+      <w:pPr>
+        <w:spacing w:after="0" w:line="240" w:lineRule="auto"/>
+        <w:rPr>
+          <w:noProof/>
+          <w:sz w:val="24"/>
+          <w:szCs w:val="24"/>
+          <w:lang w:val="tr-TR"/>
+        </w:rPr>
+      </w:pPr>
+    </w:p>
+    <w:p>
+      <w:pPr>
+        <w:spacing w:after="0" w:line="240" w:lineRule="auto"/>
+        <w:rPr>
+          <w:noProof/>
+          <w:sz w:val="24"/>
+          <w:szCs w:val="24"/>
+          <w:lang w:val="tr-TR"/>
+        </w:rPr>
+      </w:pPr>
+      <w:r>
+        <w:rPr>
+          <w:noProof/>
+          <w:sz w:val="24"/>
+          <w:szCs w:val="24"/>
+          <w:lang w:val="tr-TR"/>
+        </w:rPr>
+        <w:t xml:space="preserve">        __init__.py</w:t>
+      </w:r>
+    </w:p>
+    <w:p>
+      <w:pPr>
+        <w:spacing w:after="0" w:line="240" w:lineRule="auto"/>
+        <w:rPr>
+          <w:noProof/>
+          <w:sz w:val="24"/>
+          <w:szCs w:val="24"/>
+          <w:lang w:val="tr-TR"/>
+        </w:rPr>
+      </w:pPr>
+    </w:p>
+    <w:p>
+      <w:pPr>
+        <w:spacing w:after="0" w:line="240" w:lineRule="auto"/>
+        <w:rPr>
+          <w:noProof/>
+          <w:sz w:val="24"/>
+          <w:szCs w:val="24"/>
+          <w:lang w:val="tr-TR"/>
+        </w:rPr>
+      </w:pPr>
+      <w:r>
+        <w:rPr>
+          <w:noProof/>
+          <w:sz w:val="24"/>
+          <w:szCs w:val="24"/>
+          <w:lang w:val="tr-TR"/>
+        </w:rPr>
+        <w:t xml:space="preserve">        base.py</w:t>
+      </w:r>
+    </w:p>
+    <w:p>
+      <w:pPr>
+        <w:spacing w:after="0" w:line="240" w:lineRule="auto"/>
+        <w:rPr>
+          <w:noProof/>
+          <w:sz w:val="24"/>
+          <w:szCs w:val="24"/>
+          <w:lang w:val="tr-TR"/>
+        </w:rPr>
+      </w:pPr>
+    </w:p>
+    <w:p>
+      <w:pPr>
+        <w:spacing w:after="0" w:line="240" w:lineRule="auto"/>
+        <w:rPr>
+          <w:noProof/>
+          <w:sz w:val="24"/>
+          <w:szCs w:val="24"/>
+          <w:lang w:val="tr-TR"/>
+        </w:rPr>
+      </w:pPr>
+      <w:r>
+        <w:rPr>
+          <w:noProof/>
+          <w:sz w:val="24"/>
+          <w:szCs w:val="24"/>
+          <w:lang w:val="tr-TR"/>
+        </w:rPr>
+        <w:t xml:space="preserve">        windows.py</w:t>
+      </w:r>
+    </w:p>
+    <w:p>
+      <w:pPr>
+        <w:spacing w:after="0" w:line="240" w:lineRule="auto"/>
+        <w:rPr>
+          <w:noProof/>
+          <w:sz w:val="24"/>
+          <w:szCs w:val="24"/>
+          <w:lang w:val="tr-TR"/>
+        </w:rPr>
+      </w:pPr>
+    </w:p>
+    <w:p>
+      <w:pPr>
+        <w:spacing w:after="0" w:line="240" w:lineRule="auto"/>
+        <w:rPr>
+          <w:noProof/>
+          <w:sz w:val="24"/>
+          <w:szCs w:val="24"/>
+          <w:lang w:val="tr-TR"/>
+        </w:rPr>
+      </w:pPr>
+      <w:r>
+        <w:rPr>
+          <w:noProof/>
+          <w:sz w:val="24"/>
+          <w:szCs w:val="24"/>
+          <w:lang w:val="tr-TR"/>
+        </w:rPr>
+        <w:t xml:space="preserve">        scaler.py</w:t>
+      </w:r>
+    </w:p>
+    <w:p>
+      <w:pPr>
+        <w:spacing w:after="0" w:line="240" w:lineRule="auto"/>
+        <w:rPr>
+          <w:noProof/>
+          <w:sz w:val="24"/>
+          <w:szCs w:val="24"/>
+          <w:lang w:val="tr-TR"/>
+        </w:rPr>
+      </w:pPr>
+      <w:r>
+        <w:rPr>
+          <w:noProof/>
+          <w:sz w:val="24"/>
+          <w:szCs w:val="24"/>
+          <w:lang w:val="tr-TR"/>
+        </w:rPr>
+        <w:pict w14:anchorId="7C2E47EE">
+          <v:rect id="_x0000_i1103" style="width:0;height:1.5pt" o:hralign="center" o:hrstd="t" o:hr="t" fillcolor="#a0a0a0" stroked="f"/>
+        </w:pict>
+      </w:r>
+    </w:p>
+    <w:p>
+      <w:pPr>
+        <w:spacing w:after="0" w:line="240" w:lineRule="auto"/>
+        <w:rPr>
+          <w:b/>
+          <w:bCs/>
+          <w:noProof/>
+          <w:sz w:val="24"/>
+          <w:szCs w:val="24"/>
+          <w:lang w:val="tr-TR"/>
+        </w:rPr>
+      </w:pPr>
+      <w:r>
+        <w:rPr>
+          <w:b/>
+          <w:bCs/>
+          <w:noProof/>
+          <w:sz w:val="24"/>
+          <w:szCs w:val="24"/>
+          <w:lang w:val="tr-TR"/>
+        </w:rPr>
+        <w:t>Commit 2</w:t>
+      </w:r>
+    </w:p>
+    <w:p>
+      <w:pPr>
+        <w:spacing w:after="0" w:line="240" w:lineRule="auto"/>
+        <w:rPr>
+          <w:b/>
+          <w:bCs/>
+          <w:noProof/>
+          <w:sz w:val="24"/>
+          <w:szCs w:val="24"/>
+          <w:lang w:val="tr-TR"/>
+        </w:rPr>
+      </w:pPr>
+      <w:r>
+        <w:rPr>
+          <w:b/>
+          <w:bCs/>
+          <w:noProof/>
+          <w:sz w:val="24"/>
+          <w:szCs w:val="24"/>
+          <w:lang w:val="tr-TR"/>
+        </w:rPr>
+        <w:t>LSTMForecaster</w:t>
+      </w:r>
+    </w:p>
+    <w:p>
+      <w:pPr>
+        <w:spacing w:after="0" w:line="240" w:lineRule="auto"/>
+        <w:rPr>
+          <w:noProof/>
+          <w:sz w:val="24"/>
+          <w:szCs w:val="24"/>
+          <w:lang w:val="tr-TR"/>
+        </w:rPr>
+      </w:pPr>
+      <w:r>
+        <w:rPr>
+          <w:noProof/>
+          <w:sz w:val="24"/>
+          <w:szCs w:val="24"/>
+          <w:lang w:val="tr-TR"/>
+        </w:rPr>
+        <w:t>forecasting/</w:t>
+      </w:r>
+    </w:p>
+    <w:p>
+      <w:pPr>
+        <w:spacing w:after="0" w:line="240" w:lineRule="auto"/>
+        <w:rPr>
+          <w:noProof/>
+          <w:sz w:val="24"/>
+          <w:szCs w:val="24"/>
+          <w:lang w:val="tr-TR"/>
+        </w:rPr>
+      </w:pPr>
+    </w:p>
+    <w:p>
+      <w:pPr>
+        <w:spacing w:after="0" w:line="240" w:lineRule="auto"/>
+        <w:rPr>
+          <w:noProof/>
+          <w:sz w:val="24"/>
+          <w:szCs w:val="24"/>
+          <w:lang w:val="tr-TR"/>
+        </w:rPr>
+      </w:pPr>
+      <w:r>
+        <w:rPr>
+          <w:noProof/>
+          <w:sz w:val="24"/>
+          <w:szCs w:val="24"/>
+          <w:lang w:val="tr-TR"/>
+        </w:rPr>
+        <w:t xml:space="preserve">    neural/</w:t>
+      </w:r>
+    </w:p>
+    <w:p>
+      <w:pPr>
+        <w:spacing w:after="0" w:line="240" w:lineRule="auto"/>
+        <w:rPr>
+          <w:noProof/>
+          <w:sz w:val="24"/>
+          <w:szCs w:val="24"/>
+          <w:lang w:val="tr-TR"/>
+        </w:rPr>
+      </w:pPr>
+    </w:p>
+    <w:p>
+      <w:pPr>
+        <w:spacing w:after="0" w:line="240" w:lineRule="auto"/>
+        <w:rPr>
+          <w:noProof/>
+          <w:sz w:val="24"/>
+          <w:szCs w:val="24"/>
+          <w:lang w:val="tr-TR"/>
+        </w:rPr>
+      </w:pPr>
+      <w:r>
+        <w:rPr>
+          <w:noProof/>
+          <w:sz w:val="24"/>
+          <w:szCs w:val="24"/>
+          <w:lang w:val="tr-TR"/>
+        </w:rPr>
+        <w:t xml:space="preserve">        lstm.py</w:t>
+      </w:r>
+    </w:p>
+    <w:p>
+      <w:pPr>
+        <w:spacing w:after="0" w:line="240" w:lineRule="auto"/>
+        <w:rPr>
+          <w:noProof/>
+          <w:sz w:val="24"/>
+          <w:szCs w:val="24"/>
+          <w:lang w:val="tr-TR"/>
+        </w:rPr>
+      </w:pPr>
+      <w:r>
+        <w:rPr>
+          <w:noProof/>
+          <w:sz w:val="24"/>
+          <w:szCs w:val="24"/>
+          <w:lang w:val="tr-TR"/>
+        </w:rPr>
+        <w:pict w14:anchorId="168A6C4D">
+          <v:rect id="_x0000_i1104" style="width:0;height:1.5pt" o:hralign="center" o:hrstd="t" o:hr="t" fillcolor="#a0a0a0" stroked="f"/>
+        </w:pict>
+      </w:r>
+    </w:p>
+    <w:p>
+      <w:pPr>
+        <w:spacing w:after="0" w:line="240" w:lineRule="auto"/>
+        <w:rPr>
+          <w:b/>
+          <w:bCs/>
+          <w:noProof/>
+          <w:sz w:val="24"/>
+          <w:szCs w:val="24"/>
+          <w:lang w:val="tr-TR"/>
+        </w:rPr>
+      </w:pPr>
+      <w:r>
+        <w:rPr>
+          <w:b/>
+          <w:bCs/>
+          <w:noProof/>
+          <w:sz w:val="24"/>
+          <w:szCs w:val="24"/>
+          <w:lang w:val="tr-TR"/>
+        </w:rPr>
+        <w:t>Commit 3</w:t>
+      </w:r>
+    </w:p>
+    <w:p>
+      <w:pPr>
+        <w:spacing w:after="0" w:line="240" w:lineRule="auto"/>
+        <w:rPr>
+          <w:b/>
+          <w:bCs/>
+          <w:noProof/>
+          <w:sz w:val="24"/>
+          <w:szCs w:val="24"/>
+          <w:lang w:val="tr-TR"/>
+        </w:rPr>
+      </w:pPr>
+      <w:r>
+        <w:rPr>
+          <w:b/>
+          <w:bCs/>
+          <w:noProof/>
+          <w:sz w:val="24"/>
+          <w:szCs w:val="24"/>
+          <w:lang w:val="tr-TR"/>
+        </w:rPr>
+        <w:t>demo_lstm.py</w:t>
+      </w:r>
+    </w:p>
+    <w:p>
+      <w:pPr>
+        <w:numPr>
+          <w:ilvl w:val="0"/>
+          <w:numId w:val="18"/>
+        </w:numPr>
+        <w:spacing w:after="0" w:line="240" w:lineRule="auto"/>
+        <w:rPr>
+          <w:noProof/>
+          <w:sz w:val="24"/>
+          <w:szCs w:val="24"/>
+          <w:lang w:val="tr-TR"/>
+        </w:rPr>
+      </w:pPr>
+      <w:r>
+        <w:rPr>
+          <w:noProof/>
+          <w:sz w:val="24"/>
+          <w:szCs w:val="24"/>
+          <w:lang w:val="tr-TR"/>
+        </w:rPr>
+        <w:t xml:space="preserve">demo_arima.py </w:t>
+      </w:r>
+    </w:p>
+    <w:p>
+      <w:pPr>
+        <w:numPr>
+          <w:ilvl w:val="0"/>
+          <w:numId w:val="18"/>
+        </w:numPr>
+        <w:spacing w:after="0" w:line="240" w:lineRule="auto"/>
+        <w:rPr>
+          <w:noProof/>
+          <w:sz w:val="24"/>
+          <w:szCs w:val="24"/>
+          <w:lang w:val="tr-TR"/>
+        </w:rPr>
+      </w:pPr>
+      <w:r>
+        <w:rPr>
+          <w:noProof/>
+          <w:sz w:val="24"/>
+          <w:szCs w:val="24"/>
+          <w:lang w:val="tr-TR"/>
+        </w:rPr>
+        <w:t xml:space="preserve">demo_kalman.py </w:t>
+      </w:r>
+    </w:p>
+    <w:p>
+      <w:pPr>
+        <w:numPr>
+          <w:ilvl w:val="0"/>
+          <w:numId w:val="18"/>
+        </w:numPr>
+        <w:spacing w:after="0" w:line="240" w:lineRule="auto"/>
+        <w:rPr>
+          <w:noProof/>
+          <w:sz w:val="24"/>
+          <w:szCs w:val="24"/>
+          <w:lang w:val="tr-TR"/>
+        </w:rPr>
+      </w:pPr>
+      <w:r>
+        <w:rPr>
+          <w:noProof/>
+          <w:sz w:val="24"/>
+          <w:szCs w:val="24"/>
+          <w:lang w:val="tr-TR"/>
+        </w:rPr>
+        <w:t xml:space="preserve">demo_rul.py </w:t>
+      </w:r>
+    </w:p>
+    <w:p>
+      <w:pPr>
+        <w:spacing w:after="0" w:line="240" w:lineRule="auto"/>
+        <w:rPr>
+          <w:noProof/>
+          <w:sz w:val="24"/>
+          <w:szCs w:val="24"/>
+          <w:lang w:val="tr-TR"/>
+        </w:rPr>
+      </w:pPr>
+      <w:r>
+        <w:rPr>
+          <w:noProof/>
+          <w:sz w:val="24"/>
+          <w:szCs w:val="24"/>
+          <w:lang w:val="tr-TR"/>
+        </w:rPr>
+        <w:pict w14:anchorId="57697CBE">
+          <v:rect id="_x0000_i1105" style="width:0;height:1.5pt" o:hralign="center" o:hrstd="t" o:hr="t" fillcolor="#a0a0a0" stroked="f"/>
+        </w:pict>
+      </w:r>
+    </w:p>
+    <w:p>
+      <w:pPr>
+        <w:spacing w:after="0" w:line="240" w:lineRule="auto"/>
+        <w:rPr>
+          <w:b/>
+          <w:bCs/>
+          <w:noProof/>
+          <w:sz w:val="24"/>
+          <w:szCs w:val="24"/>
+          <w:lang w:val="tr-TR"/>
+        </w:rPr>
+      </w:pPr>
+      <w:r>
+        <w:rPr>
+          <w:b/>
+          <w:bCs/>
+          <w:noProof/>
+          <w:sz w:val="24"/>
+          <w:szCs w:val="24"/>
+          <w:lang w:val="tr-TR"/>
+        </w:rPr>
+        <w:t>Commit 4</w:t>
+      </w:r>
+    </w:p>
+    <w:p>
+      <w:pPr>
+        <w:spacing w:after="0" w:line="240" w:lineRule="auto"/>
+        <w:rPr>
+          <w:noProof/>
+          <w:sz w:val="24"/>
+          <w:szCs w:val="24"/>
+          <w:lang w:val="tr-TR"/>
+        </w:rPr>
+      </w:pPr>
+      <w:r>
+        <w:rPr>
+          <w:noProof/>
+          <w:sz w:val="24"/>
+          <w:szCs w:val="24"/>
+          <w:lang w:val="tr-TR"/>
+        </w:rPr>
+        <w:t>Instead of hyperparameter search...</w:t>
+      </w:r>
+    </w:p>
+    <w:p>
+      <w:pPr>
+        <w:spacing w:after="0" w:line="240" w:lineRule="auto"/>
+        <w:rPr>
+          <w:b/>
+          <w:bCs/>
+          <w:noProof/>
+          <w:sz w:val="24"/>
+          <w:szCs w:val="24"/>
+          <w:lang w:val="tr-TR"/>
+        </w:rPr>
+      </w:pPr>
+      <w:r>
+        <w:rPr>
+          <w:b/>
+          <w:bCs/>
+          <w:noProof/>
+          <w:sz w:val="24"/>
+          <w:szCs w:val="24"/>
+          <w:lang w:val="tr-TR"/>
+        </w:rPr>
+        <w:t>NeuralModelConfig</w:t>
+      </w:r>
+    </w:p>
+    <w:p>
+      <w:pPr>
+        <w:spacing w:after="0" w:line="240" w:lineRule="auto"/>
+        <w:rPr>
+          <w:noProof/>
+          <w:sz w:val="24"/>
+          <w:szCs w:val="24"/>
+          <w:lang w:val="tr-TR"/>
+        </w:rPr>
+      </w:pPr>
+      <w:r>
+        <w:rPr>
+          <w:noProof/>
+          <w:sz w:val="24"/>
+          <w:szCs w:val="24"/>
+          <w:lang w:val="tr-TR"/>
+        </w:rPr>
+        <w:t>For example:</w:t>
+      </w:r>
+    </w:p>
+    <w:p>
+      <w:pPr>
+        <w:spacing w:after="0" w:line="240" w:lineRule="auto"/>
+        <w:rPr>
+          <w:noProof/>
+          <w:sz w:val="24"/>
+          <w:szCs w:val="24"/>
+          <w:lang w:val="tr-TR"/>
+        </w:rPr>
+      </w:pPr>
+      <w:r>
+        <w:rPr>
+          <w:noProof/>
+          <w:sz w:val="24"/>
+          <w:szCs w:val="24"/>
+          <w:lang w:val="tr-TR"/>
+        </w:rPr>
+        <w:t>config = NeuralModelConfig(</w:t>
+      </w:r>
+    </w:p>
+    <w:p>
+      <w:pPr>
+        <w:spacing w:after="0" w:line="240" w:lineRule="auto"/>
+        <w:rPr>
+          <w:noProof/>
+          <w:sz w:val="24"/>
+          <w:szCs w:val="24"/>
+          <w:lang w:val="tr-TR"/>
+        </w:rPr>
+      </w:pPr>
+      <w:r>
+        <w:rPr>
+          <w:noProof/>
+          <w:sz w:val="24"/>
+          <w:szCs w:val="24"/>
+          <w:lang w:val="tr-TR"/>
+        </w:rPr>
+        <w:t xml:space="preserve">    window=6,</w:t>
+      </w:r>
+    </w:p>
+    <w:p>
+      <w:pPr>
+        <w:spacing w:after="0" w:line="240" w:lineRule="auto"/>
+        <w:rPr>
+          <w:noProof/>
+          <w:sz w:val="24"/>
+          <w:szCs w:val="24"/>
+          <w:lang w:val="tr-TR"/>
+        </w:rPr>
+      </w:pPr>
+      <w:r>
+        <w:rPr>
+          <w:noProof/>
+          <w:sz w:val="24"/>
+          <w:szCs w:val="24"/>
+          <w:lang w:val="tr-TR"/>
+        </w:rPr>
+        <w:t xml:space="preserve">    units=32,</w:t>
+      </w:r>
+    </w:p>
+    <w:p>
+      <w:pPr>
+        <w:spacing w:after="0" w:line="240" w:lineRule="auto"/>
+        <w:rPr>
+          <w:noProof/>
+          <w:sz w:val="24"/>
+          <w:szCs w:val="24"/>
+          <w:lang w:val="tr-TR"/>
+        </w:rPr>
+      </w:pPr>
+      <w:r>
+        <w:rPr>
+          <w:noProof/>
+          <w:sz w:val="24"/>
+          <w:szCs w:val="24"/>
+          <w:lang w:val="tr-TR"/>
+        </w:rPr>
+        <w:t xml:space="preserve">    epochs=100,</w:t>
+      </w:r>
+    </w:p>
+    <w:p>
+      <w:pPr>
+        <w:spacing w:after="0" w:line="240" w:lineRule="auto"/>
+        <w:rPr>
+          <w:noProof/>
+          <w:sz w:val="24"/>
+          <w:szCs w:val="24"/>
+          <w:lang w:val="tr-TR"/>
+        </w:rPr>
+      </w:pPr>
+      <w:r>
+        <w:rPr>
+          <w:noProof/>
+          <w:sz w:val="24"/>
+          <w:szCs w:val="24"/>
+          <w:lang w:val="tr-TR"/>
+        </w:rPr>
+        <w:t xml:space="preserve">    batch_size=8,</w:t>
+      </w:r>
+    </w:p>
+    <w:p>
+      <w:pPr>
+        <w:spacing w:after="0" w:line="240" w:lineRule="auto"/>
+        <w:rPr>
+          <w:noProof/>
+          <w:sz w:val="24"/>
+          <w:szCs w:val="24"/>
+          <w:lang w:val="tr-TR"/>
+        </w:rPr>
+      </w:pPr>
+      <w:r>
+        <w:rPr>
+          <w:noProof/>
+          <w:sz w:val="24"/>
+          <w:szCs w:val="24"/>
+          <w:lang w:val="tr-TR"/>
+        </w:rPr>
+        <w:t xml:space="preserve">    learning_rate=0.001,</w:t>
+      </w:r>
+    </w:p>
+    <w:p>
+      <w:pPr>
+        <w:spacing w:after="0" w:line="240" w:lineRule="auto"/>
+        <w:rPr>
+          <w:noProof/>
+          <w:sz w:val="24"/>
+          <w:szCs w:val="24"/>
+          <w:lang w:val="tr-TR"/>
+        </w:rPr>
+      </w:pPr>
+      <w:r>
+        <w:rPr>
+          <w:noProof/>
+          <w:sz w:val="24"/>
+          <w:szCs w:val="24"/>
+          <w:lang w:val="tr-TR"/>
+        </w:rPr>
+        <w:t>)</w:t>
+      </w:r>
+    </w:p>
+    <w:p>
+      <w:pPr>
+        <w:spacing w:after="0" w:line="240" w:lineRule="auto"/>
+        <w:rPr>
+          <w:noProof/>
+          <w:sz w:val="24"/>
+          <w:szCs w:val="24"/>
+          <w:lang w:val="tr-TR"/>
+        </w:rPr>
+      </w:pPr>
+    </w:p>
+    <w:p>
+      <w:pPr>
+        <w:spacing w:after="0" w:line="240" w:lineRule="auto"/>
+        <w:rPr>
+          <w:noProof/>
+          <w:sz w:val="24"/>
+          <w:szCs w:val="24"/>
+          <w:lang w:val="tr-TR"/>
+        </w:rPr>
+      </w:pPr>
+      <w:r>
+        <w:rPr>
+          <w:noProof/>
+          <w:sz w:val="24"/>
+          <w:szCs w:val="24"/>
+          <w:lang w:val="tr-TR"/>
+        </w:rPr>
+        <w:t>model = LSTMForecaster(config)</w:t>
+      </w:r>
+    </w:p>
+    <w:p>
+      <w:pPr>
+        <w:spacing w:after="0" w:line="240" w:lineRule="auto"/>
+        <w:rPr>
+          <w:noProof/>
+          <w:sz w:val="24"/>
+          <w:szCs w:val="24"/>
+          <w:lang w:val="tr-TR"/>
+        </w:rPr>
+      </w:pPr>
+    </w:p>
+    <w:p>
+      <w:pPr>
+        <w:rPr>
+          <w:noProof/>
+          <w:sz w:val="24"/>
+          <w:szCs w:val="24"/>
+          <w:lang w:val="tr-TR"/>
+        </w:rPr>
+      </w:pPr>
+      <w:r>
+        <w:rPr>
+          <w:noProof/>
+          <w:sz w:val="24"/>
+          <w:szCs w:val="24"/>
+          <w:lang w:val="tr-TR"/>
+        </w:rPr>
+        <w:br w:type="page"/>
+      </w:r>
+    </w:p>
+    <w:p>
+      <w:pPr>
+        <w:spacing w:after="0" w:line="240" w:lineRule="auto"/>
+        <w:rPr>
+          <w:noProof/>
+          <w:sz w:val="24"/>
+          <w:szCs w:val="24"/>
+          <w:lang w:val="tr-TR"/>
+        </w:rPr>
+      </w:pPr>
+    </w:p>
+    <w:p>
+      <w:pPr>
+        <w:spacing w:after="0" w:line="240" w:lineRule="auto"/>
+        <w:rPr>
+          <w:noProof/>
+          <w:sz w:val="24"/>
+          <w:szCs w:val="24"/>
+          <w:lang w:val="tr-TR"/>
+        </w:rPr>
+      </w:pPr>
+      <w:r>
+        <w:rPr>
+          <w:noProof/>
+          <w:sz w:val="24"/>
+          <w:szCs w:val="24"/>
+          <w:lang w:val="tr-TR"/>
+        </w:rPr>
+        <w:t>We also need to rethink another aspect. The variable equation "freq = ...", in particular, should be as independent of the data structure as possible. The calculation of "freq = ..." should depend on the data format detected by the 'SmartDatasetLoader'. I suspect this will also affect the other two "forecasters" we have already designed. Or am I mistaken?</w:t>
+      </w:r>
     </w:p>
     <w:sectPr>
       <w:pgSz w:w="11906" w:h="16838"/>
@@ -17795,9 +20391,9 @@
     </w:lvl>
   </w:abstractNum>
   <w:abstractNum w:abstractNumId="1" w15:restartNumberingAfterBreak="0">
-    <w:nsid w:val="18C72CDA"/>
+    <w:nsid w:val="020765D4"/>
     <w:multiLevelType w:val="multilevel"/>
-    <w:tmpl w:val="B7EE9C34"/>
+    <w:tmpl w:val="6A0825D0"/>
     <w:lvl w:ilvl="0">
       <w:start w:val="1"/>
       <w:numFmt w:val="bullet"/>
@@ -17944,9 +20540,9 @@
     </w:lvl>
   </w:abstractNum>
   <w:abstractNum w:abstractNumId="2" w15:restartNumberingAfterBreak="0">
-    <w:nsid w:val="2BB9033D"/>
+    <w:nsid w:val="0932680C"/>
     <w:multiLevelType w:val="multilevel"/>
-    <w:tmpl w:val="DD0CA684"/>
+    <w:tmpl w:val="A6E4F4D6"/>
     <w:lvl w:ilvl="0">
       <w:start w:val="1"/>
       <w:numFmt w:val="bullet"/>
@@ -18093,9 +20689,9 @@
     </w:lvl>
   </w:abstractNum>
   <w:abstractNum w:abstractNumId="3" w15:restartNumberingAfterBreak="0">
-    <w:nsid w:val="2D490C38"/>
+    <w:nsid w:val="18C72CDA"/>
     <w:multiLevelType w:val="multilevel"/>
-    <w:tmpl w:val="E1749C3E"/>
+    <w:tmpl w:val="B7EE9C34"/>
     <w:lvl w:ilvl="0">
       <w:start w:val="1"/>
       <w:numFmt w:val="bullet"/>
@@ -18242,98 +20838,9 @@
     </w:lvl>
   </w:abstractNum>
   <w:abstractNum w:abstractNumId="4" w15:restartNumberingAfterBreak="0">
-    <w:nsid w:val="321D4140"/>
-    <w:multiLevelType w:val="hybridMultilevel"/>
-    <w:tmpl w:val="3E7CA19E"/>
-    <w:lvl w:ilvl="0" w:tplc="041F000F">
-      <w:start w:val="1"/>
-      <w:numFmt w:val="decimal"/>
-      <w:lvlText w:val="%1."/>
-      <w:lvlJc w:val="left"/>
-      <w:pPr>
-        <w:ind w:left="720" w:hanging="360"/>
-      </w:pPr>
-      <w:rPr>
-        <w:rFonts w:hint="default"/>
-      </w:rPr>
-    </w:lvl>
-    <w:lvl w:ilvl="1" w:tplc="041F0019" w:tentative="1">
-      <w:start w:val="1"/>
-      <w:numFmt w:val="lowerLetter"/>
-      <w:lvlText w:val="%2."/>
-      <w:lvlJc w:val="left"/>
-      <w:pPr>
-        <w:ind w:left="1440" w:hanging="360"/>
-      </w:pPr>
-    </w:lvl>
-    <w:lvl w:ilvl="2" w:tplc="041F001B" w:tentative="1">
-      <w:start w:val="1"/>
-      <w:numFmt w:val="lowerRoman"/>
-      <w:lvlText w:val="%3."/>
-      <w:lvlJc w:val="right"/>
-      <w:pPr>
-        <w:ind w:left="2160" w:hanging="180"/>
-      </w:pPr>
-    </w:lvl>
-    <w:lvl w:ilvl="3" w:tplc="041F000F" w:tentative="1">
-      <w:start w:val="1"/>
-      <w:numFmt w:val="decimal"/>
-      <w:lvlText w:val="%4."/>
-      <w:lvlJc w:val="left"/>
-      <w:pPr>
-        <w:ind w:left="2880" w:hanging="360"/>
-      </w:pPr>
-    </w:lvl>
-    <w:lvl w:ilvl="4" w:tplc="041F0019" w:tentative="1">
-      <w:start w:val="1"/>
-      <w:numFmt w:val="lowerLetter"/>
-      <w:lvlText w:val="%5."/>
-      <w:lvlJc w:val="left"/>
-      <w:pPr>
-        <w:ind w:left="3600" w:hanging="360"/>
-      </w:pPr>
-    </w:lvl>
-    <w:lvl w:ilvl="5" w:tplc="041F001B" w:tentative="1">
-      <w:start w:val="1"/>
-      <w:numFmt w:val="lowerRoman"/>
-      <w:lvlText w:val="%6."/>
-      <w:lvlJc w:val="right"/>
-      <w:pPr>
-        <w:ind w:left="4320" w:hanging="180"/>
-      </w:pPr>
-    </w:lvl>
-    <w:lvl w:ilvl="6" w:tplc="041F000F" w:tentative="1">
-      <w:start w:val="1"/>
-      <w:numFmt w:val="decimal"/>
-      <w:lvlText w:val="%7."/>
-      <w:lvlJc w:val="left"/>
-      <w:pPr>
-        <w:ind w:left="5040" w:hanging="360"/>
-      </w:pPr>
-    </w:lvl>
-    <w:lvl w:ilvl="7" w:tplc="041F0019" w:tentative="1">
-      <w:start w:val="1"/>
-      <w:numFmt w:val="lowerLetter"/>
-      <w:lvlText w:val="%8."/>
-      <w:lvlJc w:val="left"/>
-      <w:pPr>
-        <w:ind w:left="5760" w:hanging="360"/>
-      </w:pPr>
-    </w:lvl>
-    <w:lvl w:ilvl="8" w:tplc="041F001B" w:tentative="1">
-      <w:start w:val="1"/>
-      <w:numFmt w:val="lowerRoman"/>
-      <w:lvlText w:val="%9."/>
-      <w:lvlJc w:val="right"/>
-      <w:pPr>
-        <w:ind w:left="6480" w:hanging="180"/>
-      </w:pPr>
-    </w:lvl>
-  </w:abstractNum>
-  <w:abstractNum w:abstractNumId="5" w15:restartNumberingAfterBreak="0">
-    <w:nsid w:val="36354E43"/>
+    <w:nsid w:val="2A9E1DA7"/>
     <w:multiLevelType w:val="multilevel"/>
-    <w:tmpl w:val="3AF2AC0C"/>
+    <w:tmpl w:val="AA4225DC"/>
     <w:lvl w:ilvl="0">
       <w:start w:val="1"/>
       <w:numFmt w:val="bullet"/>
@@ -18479,10 +20986,10 @@
       </w:rPr>
     </w:lvl>
   </w:abstractNum>
-  <w:abstractNum w:abstractNumId="6" w15:restartNumberingAfterBreak="0">
-    <w:nsid w:val="3D733783"/>
+  <w:abstractNum w:abstractNumId="5" w15:restartNumberingAfterBreak="0">
+    <w:nsid w:val="2BB9033D"/>
     <w:multiLevelType w:val="multilevel"/>
-    <w:tmpl w:val="A6383A0C"/>
+    <w:tmpl w:val="DD0CA684"/>
     <w:lvl w:ilvl="0">
       <w:start w:val="1"/>
       <w:numFmt w:val="bullet"/>
@@ -18628,10 +21135,10 @@
       </w:rPr>
     </w:lvl>
   </w:abstractNum>
-  <w:abstractNum w:abstractNumId="7" w15:restartNumberingAfterBreak="0">
-    <w:nsid w:val="44D72C93"/>
+  <w:abstractNum w:abstractNumId="6" w15:restartNumberingAfterBreak="0">
+    <w:nsid w:val="2D490C38"/>
     <w:multiLevelType w:val="multilevel"/>
-    <w:tmpl w:val="64604668"/>
+    <w:tmpl w:val="E1749C3E"/>
     <w:lvl w:ilvl="0">
       <w:start w:val="1"/>
       <w:numFmt w:val="bullet"/>
@@ -18777,10 +21284,99 @@
       </w:rPr>
     </w:lvl>
   </w:abstractNum>
+  <w:abstractNum w:abstractNumId="7" w15:restartNumberingAfterBreak="0">
+    <w:nsid w:val="321D4140"/>
+    <w:multiLevelType w:val="hybridMultilevel"/>
+    <w:tmpl w:val="3E7CA19E"/>
+    <w:lvl w:ilvl="0" w:tplc="041F000F">
+      <w:start w:val="1"/>
+      <w:numFmt w:val="decimal"/>
+      <w:lvlText w:val="%1."/>
+      <w:lvlJc w:val="left"/>
+      <w:pPr>
+        <w:ind w:left="720" w:hanging="360"/>
+      </w:pPr>
+      <w:rPr>
+        <w:rFonts w:hint="default"/>
+      </w:rPr>
+    </w:lvl>
+    <w:lvl w:ilvl="1" w:tplc="041F0019" w:tentative="1">
+      <w:start w:val="1"/>
+      <w:numFmt w:val="lowerLetter"/>
+      <w:lvlText w:val="%2."/>
+      <w:lvlJc w:val="left"/>
+      <w:pPr>
+        <w:ind w:left="1440" w:hanging="360"/>
+      </w:pPr>
+    </w:lvl>
+    <w:lvl w:ilvl="2" w:tplc="041F001B" w:tentative="1">
+      <w:start w:val="1"/>
+      <w:numFmt w:val="lowerRoman"/>
+      <w:lvlText w:val="%3."/>
+      <w:lvlJc w:val="right"/>
+      <w:pPr>
+        <w:ind w:left="2160" w:hanging="180"/>
+      </w:pPr>
+    </w:lvl>
+    <w:lvl w:ilvl="3" w:tplc="041F000F" w:tentative="1">
+      <w:start w:val="1"/>
+      <w:numFmt w:val="decimal"/>
+      <w:lvlText w:val="%4."/>
+      <w:lvlJc w:val="left"/>
+      <w:pPr>
+        <w:ind w:left="2880" w:hanging="360"/>
+      </w:pPr>
+    </w:lvl>
+    <w:lvl w:ilvl="4" w:tplc="041F0019" w:tentative="1">
+      <w:start w:val="1"/>
+      <w:numFmt w:val="lowerLetter"/>
+      <w:lvlText w:val="%5."/>
+      <w:lvlJc w:val="left"/>
+      <w:pPr>
+        <w:ind w:left="3600" w:hanging="360"/>
+      </w:pPr>
+    </w:lvl>
+    <w:lvl w:ilvl="5" w:tplc="041F001B" w:tentative="1">
+      <w:start w:val="1"/>
+      <w:numFmt w:val="lowerRoman"/>
+      <w:lvlText w:val="%6."/>
+      <w:lvlJc w:val="right"/>
+      <w:pPr>
+        <w:ind w:left="4320" w:hanging="180"/>
+      </w:pPr>
+    </w:lvl>
+    <w:lvl w:ilvl="6" w:tplc="041F000F" w:tentative="1">
+      <w:start w:val="1"/>
+      <w:numFmt w:val="decimal"/>
+      <w:lvlText w:val="%7."/>
+      <w:lvlJc w:val="left"/>
+      <w:pPr>
+        <w:ind w:left="5040" w:hanging="360"/>
+      </w:pPr>
+    </w:lvl>
+    <w:lvl w:ilvl="7" w:tplc="041F0019" w:tentative="1">
+      <w:start w:val="1"/>
+      <w:numFmt w:val="lowerLetter"/>
+      <w:lvlText w:val="%8."/>
+      <w:lvlJc w:val="left"/>
+      <w:pPr>
+        <w:ind w:left="5760" w:hanging="360"/>
+      </w:pPr>
+    </w:lvl>
+    <w:lvl w:ilvl="8" w:tplc="041F001B" w:tentative="1">
+      <w:start w:val="1"/>
+      <w:numFmt w:val="lowerRoman"/>
+      <w:lvlText w:val="%9."/>
+      <w:lvlJc w:val="right"/>
+      <w:pPr>
+        <w:ind w:left="6480" w:hanging="180"/>
+      </w:pPr>
+    </w:lvl>
+  </w:abstractNum>
   <w:abstractNum w:abstractNumId="8" w15:restartNumberingAfterBreak="0">
-    <w:nsid w:val="4DC845A1"/>
+    <w:nsid w:val="36354E43"/>
     <w:multiLevelType w:val="multilevel"/>
-    <w:tmpl w:val="EF786B8A"/>
+    <w:tmpl w:val="3AF2AC0C"/>
     <w:lvl w:ilvl="0">
       <w:start w:val="1"/>
       <w:numFmt w:val="bullet"/>
@@ -18927,9 +21523,9 @@
     </w:lvl>
   </w:abstractNum>
   <w:abstractNum w:abstractNumId="9" w15:restartNumberingAfterBreak="0">
-    <w:nsid w:val="63050202"/>
+    <w:nsid w:val="3D193969"/>
     <w:multiLevelType w:val="multilevel"/>
-    <w:tmpl w:val="8D1E2ABC"/>
+    <w:tmpl w:val="81EEF018"/>
     <w:lvl w:ilvl="0">
       <w:start w:val="1"/>
       <w:numFmt w:val="bullet"/>
@@ -19076,9 +21672,9 @@
     </w:lvl>
   </w:abstractNum>
   <w:abstractNum w:abstractNumId="10" w15:restartNumberingAfterBreak="0">
-    <w:nsid w:val="6B0579E7"/>
+    <w:nsid w:val="3D733783"/>
     <w:multiLevelType w:val="multilevel"/>
-    <w:tmpl w:val="A8DA2166"/>
+    <w:tmpl w:val="A6383A0C"/>
     <w:lvl w:ilvl="0">
       <w:start w:val="1"/>
       <w:numFmt w:val="bullet"/>
@@ -19225,9 +21821,9 @@
     </w:lvl>
   </w:abstractNum>
   <w:abstractNum w:abstractNumId="11" w15:restartNumberingAfterBreak="0">
-    <w:nsid w:val="6CF718B0"/>
+    <w:nsid w:val="44D72C93"/>
     <w:multiLevelType w:val="multilevel"/>
-    <w:tmpl w:val="9C1416D6"/>
+    <w:tmpl w:val="64604668"/>
     <w:lvl w:ilvl="0">
       <w:start w:val="1"/>
       <w:numFmt w:val="bullet"/>
@@ -19374,9 +21970,9 @@
     </w:lvl>
   </w:abstractNum>
   <w:abstractNum w:abstractNumId="12" w15:restartNumberingAfterBreak="0">
-    <w:nsid w:val="78733247"/>
+    <w:nsid w:val="4DC845A1"/>
     <w:multiLevelType w:val="multilevel"/>
-    <w:tmpl w:val="18361A16"/>
+    <w:tmpl w:val="EF786B8A"/>
     <w:lvl w:ilvl="0">
       <w:start w:val="1"/>
       <w:numFmt w:val="bullet"/>
@@ -19523,9 +22119,9 @@
     </w:lvl>
   </w:abstractNum>
   <w:abstractNum w:abstractNumId="13" w15:restartNumberingAfterBreak="0">
-    <w:nsid w:val="78940C2D"/>
+    <w:nsid w:val="63050202"/>
     <w:multiLevelType w:val="multilevel"/>
-    <w:tmpl w:val="7A36FD2E"/>
+    <w:tmpl w:val="8D1E2ABC"/>
     <w:lvl w:ilvl="0">
       <w:start w:val="1"/>
       <w:numFmt w:val="bullet"/>
@@ -19671,47 +22267,655 @@
       </w:rPr>
     </w:lvl>
   </w:abstractNum>
+  <w:abstractNum w:abstractNumId="14" w15:restartNumberingAfterBreak="0">
+    <w:nsid w:val="6B0579E7"/>
+    <w:multiLevelType w:val="multilevel"/>
+    <w:tmpl w:val="A8DA2166"/>
+    <w:lvl w:ilvl="0">
+      <w:start w:val="1"/>
+      <w:numFmt w:val="bullet"/>
+      <w:lvlText w:val=""/>
+      <w:lvlJc w:val="left"/>
+      <w:pPr>
+        <w:tabs>
+          <w:tab w:val="num" w:pos="720"/>
+        </w:tabs>
+        <w:ind w:left="720" w:hanging="360"/>
+      </w:pPr>
+      <w:rPr>
+        <w:rFonts w:ascii="Symbol" w:hAnsi="Symbol" w:hint="default"/>
+        <w:sz w:val="20"/>
+      </w:rPr>
+    </w:lvl>
+    <w:lvl w:ilvl="1" w:tentative="1">
+      <w:start w:val="1"/>
+      <w:numFmt w:val="bullet"/>
+      <w:lvlText w:val="o"/>
+      <w:lvlJc w:val="left"/>
+      <w:pPr>
+        <w:tabs>
+          <w:tab w:val="num" w:pos="1440"/>
+        </w:tabs>
+        <w:ind w:left="1440" w:hanging="360"/>
+      </w:pPr>
+      <w:rPr>
+        <w:rFonts w:ascii="Courier New" w:hAnsi="Courier New" w:hint="default"/>
+        <w:sz w:val="20"/>
+      </w:rPr>
+    </w:lvl>
+    <w:lvl w:ilvl="2" w:tentative="1">
+      <w:start w:val="1"/>
+      <w:numFmt w:val="bullet"/>
+      <w:lvlText w:val=""/>
+      <w:lvlJc w:val="left"/>
+      <w:pPr>
+        <w:tabs>
+          <w:tab w:val="num" w:pos="2160"/>
+        </w:tabs>
+        <w:ind w:left="2160" w:hanging="360"/>
+      </w:pPr>
+      <w:rPr>
+        <w:rFonts w:ascii="Wingdings" w:hAnsi="Wingdings" w:hint="default"/>
+        <w:sz w:val="20"/>
+      </w:rPr>
+    </w:lvl>
+    <w:lvl w:ilvl="3" w:tentative="1">
+      <w:start w:val="1"/>
+      <w:numFmt w:val="bullet"/>
+      <w:lvlText w:val=""/>
+      <w:lvlJc w:val="left"/>
+      <w:pPr>
+        <w:tabs>
+          <w:tab w:val="num" w:pos="2880"/>
+        </w:tabs>
+        <w:ind w:left="2880" w:hanging="360"/>
+      </w:pPr>
+      <w:rPr>
+        <w:rFonts w:ascii="Wingdings" w:hAnsi="Wingdings" w:hint="default"/>
+        <w:sz w:val="20"/>
+      </w:rPr>
+    </w:lvl>
+    <w:lvl w:ilvl="4" w:tentative="1">
+      <w:start w:val="1"/>
+      <w:numFmt w:val="bullet"/>
+      <w:lvlText w:val=""/>
+      <w:lvlJc w:val="left"/>
+      <w:pPr>
+        <w:tabs>
+          <w:tab w:val="num" w:pos="3600"/>
+        </w:tabs>
+        <w:ind w:left="3600" w:hanging="360"/>
+      </w:pPr>
+      <w:rPr>
+        <w:rFonts w:ascii="Wingdings" w:hAnsi="Wingdings" w:hint="default"/>
+        <w:sz w:val="20"/>
+      </w:rPr>
+    </w:lvl>
+    <w:lvl w:ilvl="5" w:tentative="1">
+      <w:start w:val="1"/>
+      <w:numFmt w:val="bullet"/>
+      <w:lvlText w:val=""/>
+      <w:lvlJc w:val="left"/>
+      <w:pPr>
+        <w:tabs>
+          <w:tab w:val="num" w:pos="4320"/>
+        </w:tabs>
+        <w:ind w:left="4320" w:hanging="360"/>
+      </w:pPr>
+      <w:rPr>
+        <w:rFonts w:ascii="Wingdings" w:hAnsi="Wingdings" w:hint="default"/>
+        <w:sz w:val="20"/>
+      </w:rPr>
+    </w:lvl>
+    <w:lvl w:ilvl="6" w:tentative="1">
+      <w:start w:val="1"/>
+      <w:numFmt w:val="bullet"/>
+      <w:lvlText w:val=""/>
+      <w:lvlJc w:val="left"/>
+      <w:pPr>
+        <w:tabs>
+          <w:tab w:val="num" w:pos="5040"/>
+        </w:tabs>
+        <w:ind w:left="5040" w:hanging="360"/>
+      </w:pPr>
+      <w:rPr>
+        <w:rFonts w:ascii="Wingdings" w:hAnsi="Wingdings" w:hint="default"/>
+        <w:sz w:val="20"/>
+      </w:rPr>
+    </w:lvl>
+    <w:lvl w:ilvl="7" w:tentative="1">
+      <w:start w:val="1"/>
+      <w:numFmt w:val="bullet"/>
+      <w:lvlText w:val=""/>
+      <w:lvlJc w:val="left"/>
+      <w:pPr>
+        <w:tabs>
+          <w:tab w:val="num" w:pos="5760"/>
+        </w:tabs>
+        <w:ind w:left="5760" w:hanging="360"/>
+      </w:pPr>
+      <w:rPr>
+        <w:rFonts w:ascii="Wingdings" w:hAnsi="Wingdings" w:hint="default"/>
+        <w:sz w:val="20"/>
+      </w:rPr>
+    </w:lvl>
+    <w:lvl w:ilvl="8" w:tentative="1">
+      <w:start w:val="1"/>
+      <w:numFmt w:val="bullet"/>
+      <w:lvlText w:val=""/>
+      <w:lvlJc w:val="left"/>
+      <w:pPr>
+        <w:tabs>
+          <w:tab w:val="num" w:pos="6480"/>
+        </w:tabs>
+        <w:ind w:left="6480" w:hanging="360"/>
+      </w:pPr>
+      <w:rPr>
+        <w:rFonts w:ascii="Wingdings" w:hAnsi="Wingdings" w:hint="default"/>
+        <w:sz w:val="20"/>
+      </w:rPr>
+    </w:lvl>
+  </w:abstractNum>
+  <w:abstractNum w:abstractNumId="15" w15:restartNumberingAfterBreak="0">
+    <w:nsid w:val="6CF718B0"/>
+    <w:multiLevelType w:val="multilevel"/>
+    <w:tmpl w:val="9C1416D6"/>
+    <w:lvl w:ilvl="0">
+      <w:start w:val="1"/>
+      <w:numFmt w:val="bullet"/>
+      <w:lvlText w:val=""/>
+      <w:lvlJc w:val="left"/>
+      <w:pPr>
+        <w:tabs>
+          <w:tab w:val="num" w:pos="720"/>
+        </w:tabs>
+        <w:ind w:left="720" w:hanging="360"/>
+      </w:pPr>
+      <w:rPr>
+        <w:rFonts w:ascii="Symbol" w:hAnsi="Symbol" w:hint="default"/>
+        <w:sz w:val="20"/>
+      </w:rPr>
+    </w:lvl>
+    <w:lvl w:ilvl="1" w:tentative="1">
+      <w:start w:val="1"/>
+      <w:numFmt w:val="bullet"/>
+      <w:lvlText w:val="o"/>
+      <w:lvlJc w:val="left"/>
+      <w:pPr>
+        <w:tabs>
+          <w:tab w:val="num" w:pos="1440"/>
+        </w:tabs>
+        <w:ind w:left="1440" w:hanging="360"/>
+      </w:pPr>
+      <w:rPr>
+        <w:rFonts w:ascii="Courier New" w:hAnsi="Courier New" w:hint="default"/>
+        <w:sz w:val="20"/>
+      </w:rPr>
+    </w:lvl>
+    <w:lvl w:ilvl="2" w:tentative="1">
+      <w:start w:val="1"/>
+      <w:numFmt w:val="bullet"/>
+      <w:lvlText w:val=""/>
+      <w:lvlJc w:val="left"/>
+      <w:pPr>
+        <w:tabs>
+          <w:tab w:val="num" w:pos="2160"/>
+        </w:tabs>
+        <w:ind w:left="2160" w:hanging="360"/>
+      </w:pPr>
+      <w:rPr>
+        <w:rFonts w:ascii="Wingdings" w:hAnsi="Wingdings" w:hint="default"/>
+        <w:sz w:val="20"/>
+      </w:rPr>
+    </w:lvl>
+    <w:lvl w:ilvl="3" w:tentative="1">
+      <w:start w:val="1"/>
+      <w:numFmt w:val="bullet"/>
+      <w:lvlText w:val=""/>
+      <w:lvlJc w:val="left"/>
+      <w:pPr>
+        <w:tabs>
+          <w:tab w:val="num" w:pos="2880"/>
+        </w:tabs>
+        <w:ind w:left="2880" w:hanging="360"/>
+      </w:pPr>
+      <w:rPr>
+        <w:rFonts w:ascii="Wingdings" w:hAnsi="Wingdings" w:hint="default"/>
+        <w:sz w:val="20"/>
+      </w:rPr>
+    </w:lvl>
+    <w:lvl w:ilvl="4" w:tentative="1">
+      <w:start w:val="1"/>
+      <w:numFmt w:val="bullet"/>
+      <w:lvlText w:val=""/>
+      <w:lvlJc w:val="left"/>
+      <w:pPr>
+        <w:tabs>
+          <w:tab w:val="num" w:pos="3600"/>
+        </w:tabs>
+        <w:ind w:left="3600" w:hanging="360"/>
+      </w:pPr>
+      <w:rPr>
+        <w:rFonts w:ascii="Wingdings" w:hAnsi="Wingdings" w:hint="default"/>
+        <w:sz w:val="20"/>
+      </w:rPr>
+    </w:lvl>
+    <w:lvl w:ilvl="5" w:tentative="1">
+      <w:start w:val="1"/>
+      <w:numFmt w:val="bullet"/>
+      <w:lvlText w:val=""/>
+      <w:lvlJc w:val="left"/>
+      <w:pPr>
+        <w:tabs>
+          <w:tab w:val="num" w:pos="4320"/>
+        </w:tabs>
+        <w:ind w:left="4320" w:hanging="360"/>
+      </w:pPr>
+      <w:rPr>
+        <w:rFonts w:ascii="Wingdings" w:hAnsi="Wingdings" w:hint="default"/>
+        <w:sz w:val="20"/>
+      </w:rPr>
+    </w:lvl>
+    <w:lvl w:ilvl="6" w:tentative="1">
+      <w:start w:val="1"/>
+      <w:numFmt w:val="bullet"/>
+      <w:lvlText w:val=""/>
+      <w:lvlJc w:val="left"/>
+      <w:pPr>
+        <w:tabs>
+          <w:tab w:val="num" w:pos="5040"/>
+        </w:tabs>
+        <w:ind w:left="5040" w:hanging="360"/>
+      </w:pPr>
+      <w:rPr>
+        <w:rFonts w:ascii="Wingdings" w:hAnsi="Wingdings" w:hint="default"/>
+        <w:sz w:val="20"/>
+      </w:rPr>
+    </w:lvl>
+    <w:lvl w:ilvl="7" w:tentative="1">
+      <w:start w:val="1"/>
+      <w:numFmt w:val="bullet"/>
+      <w:lvlText w:val=""/>
+      <w:lvlJc w:val="left"/>
+      <w:pPr>
+        <w:tabs>
+          <w:tab w:val="num" w:pos="5760"/>
+        </w:tabs>
+        <w:ind w:left="5760" w:hanging="360"/>
+      </w:pPr>
+      <w:rPr>
+        <w:rFonts w:ascii="Wingdings" w:hAnsi="Wingdings" w:hint="default"/>
+        <w:sz w:val="20"/>
+      </w:rPr>
+    </w:lvl>
+    <w:lvl w:ilvl="8" w:tentative="1">
+      <w:start w:val="1"/>
+      <w:numFmt w:val="bullet"/>
+      <w:lvlText w:val=""/>
+      <w:lvlJc w:val="left"/>
+      <w:pPr>
+        <w:tabs>
+          <w:tab w:val="num" w:pos="6480"/>
+        </w:tabs>
+        <w:ind w:left="6480" w:hanging="360"/>
+      </w:pPr>
+      <w:rPr>
+        <w:rFonts w:ascii="Wingdings" w:hAnsi="Wingdings" w:hint="default"/>
+        <w:sz w:val="20"/>
+      </w:rPr>
+    </w:lvl>
+  </w:abstractNum>
+  <w:abstractNum w:abstractNumId="16" w15:restartNumberingAfterBreak="0">
+    <w:nsid w:val="78733247"/>
+    <w:multiLevelType w:val="multilevel"/>
+    <w:tmpl w:val="18361A16"/>
+    <w:lvl w:ilvl="0">
+      <w:start w:val="1"/>
+      <w:numFmt w:val="bullet"/>
+      <w:lvlText w:val=""/>
+      <w:lvlJc w:val="left"/>
+      <w:pPr>
+        <w:tabs>
+          <w:tab w:val="num" w:pos="720"/>
+        </w:tabs>
+        <w:ind w:left="720" w:hanging="360"/>
+      </w:pPr>
+      <w:rPr>
+        <w:rFonts w:ascii="Symbol" w:hAnsi="Symbol" w:hint="default"/>
+        <w:sz w:val="20"/>
+      </w:rPr>
+    </w:lvl>
+    <w:lvl w:ilvl="1" w:tentative="1">
+      <w:start w:val="1"/>
+      <w:numFmt w:val="bullet"/>
+      <w:lvlText w:val="o"/>
+      <w:lvlJc w:val="left"/>
+      <w:pPr>
+        <w:tabs>
+          <w:tab w:val="num" w:pos="1440"/>
+        </w:tabs>
+        <w:ind w:left="1440" w:hanging="360"/>
+      </w:pPr>
+      <w:rPr>
+        <w:rFonts w:ascii="Courier New" w:hAnsi="Courier New" w:hint="default"/>
+        <w:sz w:val="20"/>
+      </w:rPr>
+    </w:lvl>
+    <w:lvl w:ilvl="2" w:tentative="1">
+      <w:start w:val="1"/>
+      <w:numFmt w:val="bullet"/>
+      <w:lvlText w:val=""/>
+      <w:lvlJc w:val="left"/>
+      <w:pPr>
+        <w:tabs>
+          <w:tab w:val="num" w:pos="2160"/>
+        </w:tabs>
+        <w:ind w:left="2160" w:hanging="360"/>
+      </w:pPr>
+      <w:rPr>
+        <w:rFonts w:ascii="Wingdings" w:hAnsi="Wingdings" w:hint="default"/>
+        <w:sz w:val="20"/>
+      </w:rPr>
+    </w:lvl>
+    <w:lvl w:ilvl="3" w:tentative="1">
+      <w:start w:val="1"/>
+      <w:numFmt w:val="bullet"/>
+      <w:lvlText w:val=""/>
+      <w:lvlJc w:val="left"/>
+      <w:pPr>
+        <w:tabs>
+          <w:tab w:val="num" w:pos="2880"/>
+        </w:tabs>
+        <w:ind w:left="2880" w:hanging="360"/>
+      </w:pPr>
+      <w:rPr>
+        <w:rFonts w:ascii="Wingdings" w:hAnsi="Wingdings" w:hint="default"/>
+        <w:sz w:val="20"/>
+      </w:rPr>
+    </w:lvl>
+    <w:lvl w:ilvl="4" w:tentative="1">
+      <w:start w:val="1"/>
+      <w:numFmt w:val="bullet"/>
+      <w:lvlText w:val=""/>
+      <w:lvlJc w:val="left"/>
+      <w:pPr>
+        <w:tabs>
+          <w:tab w:val="num" w:pos="3600"/>
+        </w:tabs>
+        <w:ind w:left="3600" w:hanging="360"/>
+      </w:pPr>
+      <w:rPr>
+        <w:rFonts w:ascii="Wingdings" w:hAnsi="Wingdings" w:hint="default"/>
+        <w:sz w:val="20"/>
+      </w:rPr>
+    </w:lvl>
+    <w:lvl w:ilvl="5" w:tentative="1">
+      <w:start w:val="1"/>
+      <w:numFmt w:val="bullet"/>
+      <w:lvlText w:val=""/>
+      <w:lvlJc w:val="left"/>
+      <w:pPr>
+        <w:tabs>
+          <w:tab w:val="num" w:pos="4320"/>
+        </w:tabs>
+        <w:ind w:left="4320" w:hanging="360"/>
+      </w:pPr>
+      <w:rPr>
+        <w:rFonts w:ascii="Wingdings" w:hAnsi="Wingdings" w:hint="default"/>
+        <w:sz w:val="20"/>
+      </w:rPr>
+    </w:lvl>
+    <w:lvl w:ilvl="6" w:tentative="1">
+      <w:start w:val="1"/>
+      <w:numFmt w:val="bullet"/>
+      <w:lvlText w:val=""/>
+      <w:lvlJc w:val="left"/>
+      <w:pPr>
+        <w:tabs>
+          <w:tab w:val="num" w:pos="5040"/>
+        </w:tabs>
+        <w:ind w:left="5040" w:hanging="360"/>
+      </w:pPr>
+      <w:rPr>
+        <w:rFonts w:ascii="Wingdings" w:hAnsi="Wingdings" w:hint="default"/>
+        <w:sz w:val="20"/>
+      </w:rPr>
+    </w:lvl>
+    <w:lvl w:ilvl="7" w:tentative="1">
+      <w:start w:val="1"/>
+      <w:numFmt w:val="bullet"/>
+      <w:lvlText w:val=""/>
+      <w:lvlJc w:val="left"/>
+      <w:pPr>
+        <w:tabs>
+          <w:tab w:val="num" w:pos="5760"/>
+        </w:tabs>
+        <w:ind w:left="5760" w:hanging="360"/>
+      </w:pPr>
+      <w:rPr>
+        <w:rFonts w:ascii="Wingdings" w:hAnsi="Wingdings" w:hint="default"/>
+        <w:sz w:val="20"/>
+      </w:rPr>
+    </w:lvl>
+    <w:lvl w:ilvl="8" w:tentative="1">
+      <w:start w:val="1"/>
+      <w:numFmt w:val="bullet"/>
+      <w:lvlText w:val=""/>
+      <w:lvlJc w:val="left"/>
+      <w:pPr>
+        <w:tabs>
+          <w:tab w:val="num" w:pos="6480"/>
+        </w:tabs>
+        <w:ind w:left="6480" w:hanging="360"/>
+      </w:pPr>
+      <w:rPr>
+        <w:rFonts w:ascii="Wingdings" w:hAnsi="Wingdings" w:hint="default"/>
+        <w:sz w:val="20"/>
+      </w:rPr>
+    </w:lvl>
+  </w:abstractNum>
+  <w:abstractNum w:abstractNumId="17" w15:restartNumberingAfterBreak="0">
+    <w:nsid w:val="78940C2D"/>
+    <w:multiLevelType w:val="multilevel"/>
+    <w:tmpl w:val="7A36FD2E"/>
+    <w:lvl w:ilvl="0">
+      <w:start w:val="1"/>
+      <w:numFmt w:val="bullet"/>
+      <w:lvlText w:val=""/>
+      <w:lvlJc w:val="left"/>
+      <w:pPr>
+        <w:tabs>
+          <w:tab w:val="num" w:pos="720"/>
+        </w:tabs>
+        <w:ind w:left="720" w:hanging="360"/>
+      </w:pPr>
+      <w:rPr>
+        <w:rFonts w:ascii="Symbol" w:hAnsi="Symbol" w:hint="default"/>
+        <w:sz w:val="20"/>
+      </w:rPr>
+    </w:lvl>
+    <w:lvl w:ilvl="1" w:tentative="1">
+      <w:start w:val="1"/>
+      <w:numFmt w:val="bullet"/>
+      <w:lvlText w:val="o"/>
+      <w:lvlJc w:val="left"/>
+      <w:pPr>
+        <w:tabs>
+          <w:tab w:val="num" w:pos="1440"/>
+        </w:tabs>
+        <w:ind w:left="1440" w:hanging="360"/>
+      </w:pPr>
+      <w:rPr>
+        <w:rFonts w:ascii="Courier New" w:hAnsi="Courier New" w:hint="default"/>
+        <w:sz w:val="20"/>
+      </w:rPr>
+    </w:lvl>
+    <w:lvl w:ilvl="2" w:tentative="1">
+      <w:start w:val="1"/>
+      <w:numFmt w:val="bullet"/>
+      <w:lvlText w:val=""/>
+      <w:lvlJc w:val="left"/>
+      <w:pPr>
+        <w:tabs>
+          <w:tab w:val="num" w:pos="2160"/>
+        </w:tabs>
+        <w:ind w:left="2160" w:hanging="360"/>
+      </w:pPr>
+      <w:rPr>
+        <w:rFonts w:ascii="Wingdings" w:hAnsi="Wingdings" w:hint="default"/>
+        <w:sz w:val="20"/>
+      </w:rPr>
+    </w:lvl>
+    <w:lvl w:ilvl="3" w:tentative="1">
+      <w:start w:val="1"/>
+      <w:numFmt w:val="bullet"/>
+      <w:lvlText w:val=""/>
+      <w:lvlJc w:val="left"/>
+      <w:pPr>
+        <w:tabs>
+          <w:tab w:val="num" w:pos="2880"/>
+        </w:tabs>
+        <w:ind w:left="2880" w:hanging="360"/>
+      </w:pPr>
+      <w:rPr>
+        <w:rFonts w:ascii="Wingdings" w:hAnsi="Wingdings" w:hint="default"/>
+        <w:sz w:val="20"/>
+      </w:rPr>
+    </w:lvl>
+    <w:lvl w:ilvl="4" w:tentative="1">
+      <w:start w:val="1"/>
+      <w:numFmt w:val="bullet"/>
+      <w:lvlText w:val=""/>
+      <w:lvlJc w:val="left"/>
+      <w:pPr>
+        <w:tabs>
+          <w:tab w:val="num" w:pos="3600"/>
+        </w:tabs>
+        <w:ind w:left="3600" w:hanging="360"/>
+      </w:pPr>
+      <w:rPr>
+        <w:rFonts w:ascii="Wingdings" w:hAnsi="Wingdings" w:hint="default"/>
+        <w:sz w:val="20"/>
+      </w:rPr>
+    </w:lvl>
+    <w:lvl w:ilvl="5" w:tentative="1">
+      <w:start w:val="1"/>
+      <w:numFmt w:val="bullet"/>
+      <w:lvlText w:val=""/>
+      <w:lvlJc w:val="left"/>
+      <w:pPr>
+        <w:tabs>
+          <w:tab w:val="num" w:pos="4320"/>
+        </w:tabs>
+        <w:ind w:left="4320" w:hanging="360"/>
+      </w:pPr>
+      <w:rPr>
+        <w:rFonts w:ascii="Wingdings" w:hAnsi="Wingdings" w:hint="default"/>
+        <w:sz w:val="20"/>
+      </w:rPr>
+    </w:lvl>
+    <w:lvl w:ilvl="6" w:tentative="1">
+      <w:start w:val="1"/>
+      <w:numFmt w:val="bullet"/>
+      <w:lvlText w:val=""/>
+      <w:lvlJc w:val="left"/>
+      <w:pPr>
+        <w:tabs>
+          <w:tab w:val="num" w:pos="5040"/>
+        </w:tabs>
+        <w:ind w:left="5040" w:hanging="360"/>
+      </w:pPr>
+      <w:rPr>
+        <w:rFonts w:ascii="Wingdings" w:hAnsi="Wingdings" w:hint="default"/>
+        <w:sz w:val="20"/>
+      </w:rPr>
+    </w:lvl>
+    <w:lvl w:ilvl="7" w:tentative="1">
+      <w:start w:val="1"/>
+      <w:numFmt w:val="bullet"/>
+      <w:lvlText w:val=""/>
+      <w:lvlJc w:val="left"/>
+      <w:pPr>
+        <w:tabs>
+          <w:tab w:val="num" w:pos="5760"/>
+        </w:tabs>
+        <w:ind w:left="5760" w:hanging="360"/>
+      </w:pPr>
+      <w:rPr>
+        <w:rFonts w:ascii="Wingdings" w:hAnsi="Wingdings" w:hint="default"/>
+        <w:sz w:val="20"/>
+      </w:rPr>
+    </w:lvl>
+    <w:lvl w:ilvl="8" w:tentative="1">
+      <w:start w:val="1"/>
+      <w:numFmt w:val="bullet"/>
+      <w:lvlText w:val=""/>
+      <w:lvlJc w:val="left"/>
+      <w:pPr>
+        <w:tabs>
+          <w:tab w:val="num" w:pos="6480"/>
+        </w:tabs>
+        <w:ind w:left="6480" w:hanging="360"/>
+      </w:pPr>
+      <w:rPr>
+        <w:rFonts w:ascii="Wingdings" w:hAnsi="Wingdings" w:hint="default"/>
+        <w:sz w:val="20"/>
+      </w:rPr>
+    </w:lvl>
+  </w:abstractNum>
   <w:num w:numId="1" w16cid:durableId="320813693">
-    <w:abstractNumId w:val="1"/>
+    <w:abstractNumId w:val="3"/>
   </w:num>
   <w:num w:numId="2" w16cid:durableId="680281116">
-    <w:abstractNumId w:val="4"/>
+    <w:abstractNumId w:val="7"/>
   </w:num>
   <w:num w:numId="3" w16cid:durableId="1288438365">
-    <w:abstractNumId w:val="7"/>
+    <w:abstractNumId w:val="11"/>
   </w:num>
   <w:num w:numId="4" w16cid:durableId="1155562159">
-    <w:abstractNumId w:val="10"/>
+    <w:abstractNumId w:val="14"/>
   </w:num>
   <w:num w:numId="5" w16cid:durableId="1958020517">
-    <w:abstractNumId w:val="9"/>
+    <w:abstractNumId w:val="13"/>
   </w:num>
   <w:num w:numId="6" w16cid:durableId="1596940668">
-    <w:abstractNumId w:val="5"/>
+    <w:abstractNumId w:val="8"/>
   </w:num>
   <w:num w:numId="7" w16cid:durableId="1579166471">
     <w:abstractNumId w:val="0"/>
   </w:num>
   <w:num w:numId="8" w16cid:durableId="753748469">
-    <w:abstractNumId w:val="13"/>
+    <w:abstractNumId w:val="17"/>
   </w:num>
   <w:num w:numId="9" w16cid:durableId="604701249">
+    <w:abstractNumId w:val="16"/>
+  </w:num>
+  <w:num w:numId="10" w16cid:durableId="1503279606">
+    <w:abstractNumId w:val="5"/>
+  </w:num>
+  <w:num w:numId="11" w16cid:durableId="785000340">
+    <w:abstractNumId w:val="10"/>
+  </w:num>
+  <w:num w:numId="12" w16cid:durableId="290215297">
     <w:abstractNumId w:val="12"/>
   </w:num>
-  <w:num w:numId="10" w16cid:durableId="1503279606">
+  <w:num w:numId="13" w16cid:durableId="1160194568">
+    <w:abstractNumId w:val="15"/>
+  </w:num>
+  <w:num w:numId="14" w16cid:durableId="1407336860">
+    <w:abstractNumId w:val="6"/>
+  </w:num>
+  <w:num w:numId="15" w16cid:durableId="797989056">
+    <w:abstractNumId w:val="9"/>
+  </w:num>
+  <w:num w:numId="16" w16cid:durableId="866019238">
     <w:abstractNumId w:val="2"/>
   </w:num>
-  <w:num w:numId="11" w16cid:durableId="785000340">
-    <w:abstractNumId w:val="6"/>
+  <w:num w:numId="17" w16cid:durableId="1782452779">
+    <w:abstractNumId w:val="4"/>
   </w:num>
-  <w:num w:numId="12" w16cid:durableId="290215297">
-    <w:abstractNumId w:val="8"/>
-  </w:num>
-  <w:num w:numId="13" w16cid:durableId="1160194568">
-    <w:abstractNumId w:val="11"/>
-  </w:num>
-  <w:num w:numId="14" w16cid:durableId="1407336860">
-    <w:abstractNumId w:val="3"/>
+  <w:num w:numId="18" w16cid:durableId="2037387320">
+    <w:abstractNumId w:val="1"/>
   </w:num>
 </w:numbering>
 </file>

</xml_diff>

<commit_message>
Sprint 9 - Commit 3: Update ARCHITECTURE.md
</commit_message>
<xml_diff>
--- a/docs/draft/development_flow.docx
+++ b/docs/draft/development_flow.docx
@@ -17971,7 +17971,7 @@
           <w:lang w:val="tr-TR"/>
         </w:rPr>
         <w:pict w14:anchorId="5663E2C3">
-          <v:rect id="_x0000_i1071" style="width:0;height:1.5pt" o:hralign="center" o:hrstd="t" o:hr="t" fillcolor="#a0a0a0" stroked="f"/>
+          <v:rect id="_x0000_i1029" style="width:0;height:1.5pt" o:hralign="center" o:hrstd="t" o:hr="t" fillcolor="#a0a0a0" stroked="f"/>
         </w:pict>
       </w:r>
     </w:p>
@@ -18203,7 +18203,7 @@
           <w:lang w:val="tr-TR"/>
         </w:rPr>
         <w:pict w14:anchorId="50FF30CD">
-          <v:rect id="_x0000_i1072" style="width:0;height:1.5pt" o:hralign="center" o:hrstd="t" o:hr="t" fillcolor="#a0a0a0" stroked="f"/>
+          <v:rect id="_x0000_i1030" style="width:0;height:1.5pt" o:hralign="center" o:hrstd="t" o:hr="t" fillcolor="#a0a0a0" stroked="f"/>
         </w:pict>
       </w:r>
     </w:p>
@@ -18435,7 +18435,7 @@
           <w:lang w:val="tr-TR"/>
         </w:rPr>
         <w:pict w14:anchorId="68FFF9C5">
-          <v:rect id="_x0000_i1073" style="width:0;height:1.5pt" o:hralign="center" o:hrstd="t" o:hr="t" fillcolor="#a0a0a0" stroked="f"/>
+          <v:rect id="_x0000_i1031" style="width:0;height:1.5pt" o:hralign="center" o:hrstd="t" o:hr="t" fillcolor="#a0a0a0" stroked="f"/>
         </w:pict>
       </w:r>
     </w:p>
@@ -18696,7 +18696,7 @@
           <w:lang w:val="tr-TR"/>
         </w:rPr>
         <w:pict w14:anchorId="3F1DD77A">
-          <v:rect id="_x0000_i1074" style="width:0;height:1.5pt" o:hralign="center" o:hrstd="t" o:hr="t" fillcolor="#a0a0a0" stroked="f"/>
+          <v:rect id="_x0000_i1032" style="width:0;height:1.5pt" o:hralign="center" o:hrstd="t" o:hr="t" fillcolor="#a0a0a0" stroked="f"/>
         </w:pict>
       </w:r>
     </w:p>
@@ -18985,7 +18985,7 @@
           <w:lang w:val="tr-TR"/>
         </w:rPr>
         <w:pict w14:anchorId="76E04626">
-          <v:rect id="_x0000_i1075" style="width:0;height:1.5pt" o:hralign="center" o:hrstd="t" o:hr="t" fillcolor="#a0a0a0" stroked="f"/>
+          <v:rect id="_x0000_i1033" style="width:0;height:1.5pt" o:hralign="center" o:hrstd="t" o:hr="t" fillcolor="#a0a0a0" stroked="f"/>
         </w:pict>
       </w:r>
     </w:p>
@@ -19122,7 +19122,7 @@
           <w:lang w:val="tr-TR"/>
         </w:rPr>
         <w:pict w14:anchorId="14F0100D">
-          <v:rect id="_x0000_i1076" style="width:0;height:1.5pt" o:hralign="center" o:hrstd="t" o:hr="t" fillcolor="#a0a0a0" stroked="f"/>
+          <v:rect id="_x0000_i1034" style="width:0;height:1.5pt" o:hralign="center" o:hrstd="t" o:hr="t" fillcolor="#a0a0a0" stroked="f"/>
         </w:pict>
       </w:r>
     </w:p>
@@ -19168,7 +19168,7 @@
           <w:lang w:val="tr-TR"/>
         </w:rPr>
         <w:pict w14:anchorId="58A47A18">
-          <v:rect id="_x0000_i1077" style="width:0;height:1.5pt" o:hralign="center" o:hrstd="t" o:hr="t" fillcolor="#a0a0a0" stroked="f"/>
+          <v:rect id="_x0000_i1035" style="width:0;height:1.5pt" o:hralign="center" o:hrstd="t" o:hr="t" fillcolor="#a0a0a0" stroked="f"/>
         </w:pict>
       </w:r>
     </w:p>
@@ -19341,9 +19341,12 @@
           <w:lang w:val="tr-TR"/>
         </w:rPr>
         <w:lastRenderedPageBreak/>
-        <w:t>Sprint 9</w:t>
-      </w:r>
-      <w:r>
+        <w:t>Sprint 9:</w:t>
+      </w:r>
+    </w:p>
+    <w:p>
+      <w:pPr>
+        <w:spacing w:after="0" w:line="240" w:lineRule="auto"/>
         <w:rPr>
           <w:b/>
           <w:bCs/>
@@ -19353,21 +19356,6 @@
           <w:u w:val="single"/>
           <w:lang w:val="tr-TR"/>
         </w:rPr>
-        <w:t>:</w:t>
-      </w:r>
-    </w:p>
-    <w:p>
-      <w:pPr>
-        <w:spacing w:after="0" w:line="240" w:lineRule="auto"/>
-        <w:rPr>
-          <w:b/>
-          <w:bCs/>
-          <w:noProof/>
-          <w:sz w:val="32"/>
-          <w:szCs w:val="32"/>
-          <w:u w:val="single"/>
-          <w:lang w:val="tr-TR"/>
-        </w:rPr>
       </w:pPr>
     </w:p>
     <w:p>
@@ -19611,7 +19599,7 @@
           <w:lang w:val="tr-TR"/>
         </w:rPr>
         <w:pict w14:anchorId="7C2E47EE">
-          <v:rect id="_x0000_i1103" style="width:0;height:1.5pt" o:hralign="center" o:hrstd="t" o:hr="t" fillcolor="#a0a0a0" stroked="f"/>
+          <v:rect id="_x0000_i1036" style="width:0;height:1.5pt" o:hralign="center" o:hrstd="t" o:hr="t" fillcolor="#a0a0a0" stroked="f"/>
         </w:pict>
       </w:r>
     </w:p>
@@ -19763,7 +19751,7 @@
           <w:lang w:val="tr-TR"/>
         </w:rPr>
         <w:pict w14:anchorId="168A6C4D">
-          <v:rect id="_x0000_i1104" style="width:0;height:1.5pt" o:hralign="center" o:hrstd="t" o:hr="t" fillcolor="#a0a0a0" stroked="f"/>
+          <v:rect id="_x0000_i1037" style="width:0;height:1.5pt" o:hralign="center" o:hrstd="t" o:hr="t" fillcolor="#a0a0a0" stroked="f"/>
         </w:pict>
       </w:r>
     </w:p>
@@ -19905,7 +19893,7 @@
           <w:lang w:val="tr-TR"/>
         </w:rPr>
         <w:pict w14:anchorId="57697CBE">
-          <v:rect id="_x0000_i1105" style="width:0;height:1.5pt" o:hralign="center" o:hrstd="t" o:hr="t" fillcolor="#a0a0a0" stroked="f"/>
+          <v:rect id="_x0000_i1038" style="width:0;height:1.5pt" o:hralign="center" o:hrstd="t" o:hr="t" fillcolor="#a0a0a0" stroked="f"/>
         </w:pict>
       </w:r>
     </w:p>
@@ -20228,6 +20216,871 @@
         </w:rPr>
         <w:t>We also need to rethink another aspect. The variable equation "freq = ...", in particular, should be as independent of the data structure as possible. The calculation of "freq = ..." should depend on the data format detected by the 'SmartDatasetLoader'. I suspect this will also affect the other two "forecasters" we have already designed. Or am I mistaken?</w:t>
       </w:r>
+    </w:p>
+    <w:p>
+      <w:pPr>
+        <w:spacing w:after="0" w:line="240" w:lineRule="auto"/>
+        <w:rPr>
+          <w:noProof/>
+          <w:sz w:val="24"/>
+          <w:szCs w:val="24"/>
+          <w:lang w:val="tr-TR"/>
+        </w:rPr>
+      </w:pPr>
+    </w:p>
+    <w:p>
+      <w:pPr>
+        <w:spacing w:after="0" w:line="240" w:lineRule="auto"/>
+        <w:rPr>
+          <w:noProof/>
+          <w:sz w:val="24"/>
+          <w:szCs w:val="24"/>
+          <w:lang w:val="tr-TR"/>
+        </w:rPr>
+      </w:pPr>
+    </w:p>
+    <w:p>
+      <w:pPr>
+        <w:spacing w:after="0" w:line="240" w:lineRule="auto"/>
+        <w:rPr>
+          <w:noProof/>
+          <w:sz w:val="24"/>
+          <w:szCs w:val="24"/>
+          <w:lang w:val="tr-TR"/>
+        </w:rPr>
+      </w:pPr>
+    </w:p>
+    <w:p>
+      <w:pPr>
+        <w:spacing w:after="0" w:line="240" w:lineRule="auto"/>
+        <w:rPr>
+          <w:noProof/>
+          <w:sz w:val="24"/>
+          <w:szCs w:val="24"/>
+          <w:lang w:val="tr-TR"/>
+        </w:rPr>
+      </w:pPr>
+    </w:p>
+    <w:p>
+      <w:pPr>
+        <w:spacing w:after="0" w:line="240" w:lineRule="auto"/>
+        <w:jc w:val="center"/>
+        <w:rPr>
+          <w:b/>
+          <w:bCs/>
+          <w:noProof/>
+          <w:sz w:val="32"/>
+          <w:szCs w:val="32"/>
+          <w:u w:val="single"/>
+          <w:lang w:val="tr-TR"/>
+        </w:rPr>
+      </w:pPr>
+      <w:r>
+        <w:rPr>
+          <w:b/>
+          <w:bCs/>
+          <w:noProof/>
+          <w:sz w:val="32"/>
+          <w:szCs w:val="32"/>
+          <w:u w:val="single"/>
+          <w:lang w:val="tr-TR"/>
+        </w:rPr>
+        <w:t>Conceptually Pipeline:</w:t>
+      </w:r>
+    </w:p>
+    <w:p>
+      <w:pPr>
+        <w:spacing w:after="0" w:line="240" w:lineRule="auto"/>
+        <w:jc w:val="center"/>
+        <w:rPr>
+          <w:noProof/>
+          <w:sz w:val="24"/>
+          <w:szCs w:val="24"/>
+          <w:lang w:val="tr-TR"/>
+        </w:rPr>
+      </w:pPr>
+    </w:p>
+    <w:p>
+      <w:pPr>
+        <w:spacing w:after="0" w:line="240" w:lineRule="auto"/>
+        <w:jc w:val="center"/>
+        <w:rPr>
+          <w:noProof/>
+          <w:sz w:val="24"/>
+          <w:szCs w:val="24"/>
+          <w:lang w:val="tr-TR"/>
+        </w:rPr>
+      </w:pPr>
+      <w:r>
+        <w:rPr>
+          <w:noProof/>
+          <w:sz w:val="24"/>
+          <w:szCs w:val="24"/>
+          <w:lang w:val="tr-TR"/>
+        </w:rPr>
+        <w:t>raw CSV</w:t>
+      </w:r>
+    </w:p>
+    <w:p>
+      <w:pPr>
+        <w:spacing w:after="0" w:line="240" w:lineRule="auto"/>
+        <w:jc w:val="center"/>
+        <w:rPr>
+          <w:noProof/>
+          <w:sz w:val="24"/>
+          <w:szCs w:val="24"/>
+          <w:lang w:val="tr-TR"/>
+        </w:rPr>
+      </w:pPr>
+      <w:r>
+        <w:rPr>
+          <w:noProof/>
+          <w:sz w:val="24"/>
+          <w:szCs w:val="24"/>
+          <w:lang w:val="tr-TR"/>
+        </w:rPr>
+        <w:t xml:space="preserve">      │</w:t>
+      </w:r>
+    </w:p>
+    <w:p>
+      <w:pPr>
+        <w:spacing w:after="0" w:line="240" w:lineRule="auto"/>
+        <w:jc w:val="center"/>
+        <w:rPr>
+          <w:noProof/>
+          <w:sz w:val="24"/>
+          <w:szCs w:val="24"/>
+          <w:lang w:val="tr-TR"/>
+        </w:rPr>
+      </w:pPr>
+      <w:r>
+        <w:rPr>
+          <w:noProof/>
+          <w:sz w:val="24"/>
+          <w:szCs w:val="24"/>
+          <w:lang w:val="tr-TR"/>
+        </w:rPr>
+        <w:t xml:space="preserve">      </w:t>
+      </w:r>
+      <w:r>
+        <w:rPr>
+          <w:rFonts w:ascii="Arial" w:hAnsi="Arial" w:cs="Arial"/>
+          <w:noProof/>
+          <w:sz w:val="24"/>
+          <w:szCs w:val="24"/>
+          <w:lang w:val="tr-TR"/>
+        </w:rPr>
+        <w:t>▼</w:t>
+      </w:r>
+    </w:p>
+    <w:p>
+      <w:pPr>
+        <w:spacing w:after="0" w:line="240" w:lineRule="auto"/>
+        <w:jc w:val="center"/>
+        <w:rPr>
+          <w:noProof/>
+          <w:sz w:val="24"/>
+          <w:szCs w:val="24"/>
+          <w:lang w:val="tr-TR"/>
+        </w:rPr>
+      </w:pPr>
+      <w:r>
+        <w:rPr>
+          <w:noProof/>
+          <w:sz w:val="24"/>
+          <w:szCs w:val="24"/>
+          <w:lang w:val="tr-TR"/>
+        </w:rPr>
+        <w:t>SmartDatasetLoader</w:t>
+      </w:r>
+    </w:p>
+    <w:p>
+      <w:pPr>
+        <w:spacing w:after="0" w:line="240" w:lineRule="auto"/>
+        <w:jc w:val="center"/>
+        <w:rPr>
+          <w:noProof/>
+          <w:sz w:val="24"/>
+          <w:szCs w:val="24"/>
+          <w:lang w:val="tr-TR"/>
+        </w:rPr>
+      </w:pPr>
+      <w:r>
+        <w:rPr>
+          <w:noProof/>
+          <w:sz w:val="24"/>
+          <w:szCs w:val="24"/>
+          <w:lang w:val="tr-TR"/>
+        </w:rPr>
+        <w:t xml:space="preserve">      │</w:t>
+      </w:r>
+    </w:p>
+    <w:p>
+      <w:pPr>
+        <w:spacing w:after="0" w:line="240" w:lineRule="auto"/>
+        <w:jc w:val="center"/>
+        <w:rPr>
+          <w:noProof/>
+          <w:sz w:val="24"/>
+          <w:szCs w:val="24"/>
+          <w:lang w:val="tr-TR"/>
+        </w:rPr>
+      </w:pPr>
+      <w:r>
+        <w:rPr>
+          <w:noProof/>
+          <w:sz w:val="24"/>
+          <w:szCs w:val="24"/>
+          <w:lang w:val="tr-TR"/>
+        </w:rPr>
+        <w:t xml:space="preserve">      </w:t>
+      </w:r>
+      <w:r>
+        <w:rPr>
+          <w:rFonts w:ascii="Arial" w:hAnsi="Arial" w:cs="Arial"/>
+          <w:noProof/>
+          <w:sz w:val="24"/>
+          <w:szCs w:val="24"/>
+          <w:lang w:val="tr-TR"/>
+        </w:rPr>
+        <w:t>▼</w:t>
+      </w:r>
+    </w:p>
+    <w:p>
+      <w:pPr>
+        <w:spacing w:after="0" w:line="240" w:lineRule="auto"/>
+        <w:jc w:val="center"/>
+        <w:rPr>
+          <w:noProof/>
+          <w:sz w:val="24"/>
+          <w:szCs w:val="24"/>
+          <w:lang w:val="tr-TR"/>
+        </w:rPr>
+      </w:pPr>
+      <w:r>
+        <w:rPr>
+          <w:noProof/>
+          <w:sz w:val="24"/>
+          <w:szCs w:val="24"/>
+          <w:lang w:val="tr-TR"/>
+        </w:rPr>
+        <w:t>BatteryDataset</w:t>
+      </w:r>
+    </w:p>
+    <w:p>
+      <w:pPr>
+        <w:spacing w:after="0" w:line="240" w:lineRule="auto"/>
+        <w:jc w:val="center"/>
+        <w:rPr>
+          <w:noProof/>
+          <w:sz w:val="24"/>
+          <w:szCs w:val="24"/>
+          <w:lang w:val="tr-TR"/>
+        </w:rPr>
+      </w:pPr>
+      <w:r>
+        <w:rPr>
+          <w:noProof/>
+          <w:sz w:val="24"/>
+          <w:szCs w:val="24"/>
+          <w:lang w:val="tr-TR"/>
+        </w:rPr>
+        <w:t xml:space="preserve">      │</w:t>
+      </w:r>
+    </w:p>
+    <w:p>
+      <w:pPr>
+        <w:spacing w:after="0" w:line="240" w:lineRule="auto"/>
+        <w:jc w:val="center"/>
+        <w:rPr>
+          <w:noProof/>
+          <w:sz w:val="24"/>
+          <w:szCs w:val="24"/>
+          <w:lang w:val="tr-TR"/>
+        </w:rPr>
+      </w:pPr>
+      <w:r>
+        <w:rPr>
+          <w:noProof/>
+          <w:sz w:val="24"/>
+          <w:szCs w:val="24"/>
+          <w:lang w:val="tr-TR"/>
+        </w:rPr>
+        <w:t xml:space="preserve">      </w:t>
+      </w:r>
+      <w:r>
+        <w:rPr>
+          <w:rFonts w:ascii="Arial" w:hAnsi="Arial" w:cs="Arial"/>
+          <w:noProof/>
+          <w:sz w:val="24"/>
+          <w:szCs w:val="24"/>
+          <w:lang w:val="tr-TR"/>
+        </w:rPr>
+        <w:t>▼</w:t>
+      </w:r>
+    </w:p>
+    <w:p>
+      <w:pPr>
+        <w:spacing w:after="0" w:line="240" w:lineRule="auto"/>
+        <w:jc w:val="center"/>
+        <w:rPr>
+          <w:noProof/>
+          <w:sz w:val="24"/>
+          <w:szCs w:val="24"/>
+          <w:lang w:val="tr-TR"/>
+        </w:rPr>
+      </w:pPr>
+      <w:r>
+        <w:rPr>
+          <w:noProof/>
+          <w:sz w:val="24"/>
+          <w:szCs w:val="24"/>
+          <w:lang w:val="tr-TR"/>
+        </w:rPr>
+        <w:t>Interpolation</w:t>
+      </w:r>
+    </w:p>
+    <w:p>
+      <w:pPr>
+        <w:spacing w:after="0" w:line="240" w:lineRule="auto"/>
+        <w:jc w:val="center"/>
+        <w:rPr>
+          <w:noProof/>
+          <w:sz w:val="24"/>
+          <w:szCs w:val="24"/>
+          <w:lang w:val="tr-TR"/>
+        </w:rPr>
+      </w:pPr>
+      <w:r>
+        <w:rPr>
+          <w:noProof/>
+          <w:sz w:val="24"/>
+          <w:szCs w:val="24"/>
+          <w:lang w:val="tr-TR"/>
+        </w:rPr>
+        <w:t xml:space="preserve">      │</w:t>
+      </w:r>
+    </w:p>
+    <w:p>
+      <w:pPr>
+        <w:spacing w:after="0" w:line="240" w:lineRule="auto"/>
+        <w:jc w:val="center"/>
+        <w:rPr>
+          <w:noProof/>
+          <w:sz w:val="24"/>
+          <w:szCs w:val="24"/>
+          <w:lang w:val="tr-TR"/>
+        </w:rPr>
+      </w:pPr>
+      <w:r>
+        <w:rPr>
+          <w:noProof/>
+          <w:sz w:val="24"/>
+          <w:szCs w:val="24"/>
+          <w:lang w:val="tr-TR"/>
+        </w:rPr>
+        <w:t xml:space="preserve">      </w:t>
+      </w:r>
+      <w:r>
+        <w:rPr>
+          <w:rFonts w:ascii="Arial" w:hAnsi="Arial" w:cs="Arial"/>
+          <w:noProof/>
+          <w:sz w:val="24"/>
+          <w:szCs w:val="24"/>
+          <w:lang w:val="tr-TR"/>
+        </w:rPr>
+        <w:t>▼</w:t>
+      </w:r>
+    </w:p>
+    <w:p>
+      <w:pPr>
+        <w:spacing w:after="0" w:line="240" w:lineRule="auto"/>
+        <w:jc w:val="center"/>
+        <w:rPr>
+          <w:noProof/>
+          <w:sz w:val="24"/>
+          <w:szCs w:val="24"/>
+          <w:lang w:val="tr-TR"/>
+        </w:rPr>
+      </w:pPr>
+      <w:r>
+        <w:rPr>
+          <w:noProof/>
+          <w:sz w:val="24"/>
+          <w:szCs w:val="24"/>
+          <w:lang w:val="tr-TR"/>
+        </w:rPr>
+        <w:t>Forecasting</w:t>
+      </w:r>
+    </w:p>
+    <w:p>
+      <w:pPr>
+        <w:spacing w:after="0" w:line="240" w:lineRule="auto"/>
+        <w:jc w:val="center"/>
+        <w:rPr>
+          <w:noProof/>
+          <w:sz w:val="24"/>
+          <w:szCs w:val="24"/>
+          <w:lang w:val="tr-TR"/>
+        </w:rPr>
+      </w:pPr>
+    </w:p>
+    <w:p>
+      <w:pPr>
+        <w:spacing w:after="0" w:line="240" w:lineRule="auto"/>
+        <w:jc w:val="center"/>
+        <w:rPr>
+          <w:noProof/>
+          <w:sz w:val="24"/>
+          <w:szCs w:val="24"/>
+          <w:lang w:val="tr-TR"/>
+        </w:rPr>
+      </w:pPr>
+    </w:p>
+    <w:p>
+      <w:pPr>
+        <w:spacing w:after="0" w:line="240" w:lineRule="auto"/>
+        <w:jc w:val="center"/>
+        <w:rPr>
+          <w:noProof/>
+          <w:sz w:val="24"/>
+          <w:szCs w:val="24"/>
+          <w:lang w:val="tr-TR"/>
+        </w:rPr>
+      </w:pPr>
+    </w:p>
+    <w:p>
+      <w:pPr>
+        <w:spacing w:after="0" w:line="240" w:lineRule="auto"/>
+        <w:jc w:val="center"/>
+        <w:rPr>
+          <w:noProof/>
+          <w:sz w:val="24"/>
+          <w:szCs w:val="24"/>
+          <w:lang w:val="tr-TR"/>
+        </w:rPr>
+      </w:pPr>
+    </w:p>
+    <w:p>
+      <w:pPr>
+        <w:spacing w:after="0" w:line="240" w:lineRule="auto"/>
+        <w:rPr>
+          <w:b/>
+          <w:bCs/>
+          <w:noProof/>
+          <w:sz w:val="32"/>
+          <w:szCs w:val="32"/>
+          <w:u w:val="single"/>
+          <w:lang w:val="tr-TR"/>
+        </w:rPr>
+      </w:pPr>
+      <w:r>
+        <w:rPr>
+          <w:b/>
+          <w:bCs/>
+          <w:noProof/>
+          <w:sz w:val="32"/>
+          <w:szCs w:val="32"/>
+          <w:u w:val="single"/>
+          <w:lang w:val="tr-TR"/>
+        </w:rPr>
+        <w:t>Formal Data Lifecycle:</w:t>
+      </w:r>
+    </w:p>
+    <w:p>
+      <w:pPr>
+        <w:spacing w:after="0" w:line="240" w:lineRule="auto"/>
+        <w:rPr>
+          <w:noProof/>
+          <w:sz w:val="24"/>
+          <w:szCs w:val="24"/>
+          <w:lang w:val="tr-TR"/>
+        </w:rPr>
+      </w:pPr>
+    </w:p>
+    <w:p>
+      <w:pPr>
+        <w:spacing w:after="0" w:line="240" w:lineRule="auto"/>
+        <w:rPr>
+          <w:noProof/>
+          <w:sz w:val="24"/>
+          <w:szCs w:val="24"/>
+          <w:lang w:val="tr-TR"/>
+        </w:rPr>
+      </w:pPr>
+      <w:r>
+        <w:rPr>
+          <w:noProof/>
+          <w:sz w:val="24"/>
+          <w:szCs w:val="24"/>
+          <w:lang w:val="tr-TR"/>
+        </w:rPr>
+        <w:t>datasets/</w:t>
+      </w:r>
+    </w:p>
+    <w:p>
+      <w:pPr>
+        <w:spacing w:after="0" w:line="240" w:lineRule="auto"/>
+        <w:rPr>
+          <w:noProof/>
+          <w:sz w:val="24"/>
+          <w:szCs w:val="24"/>
+          <w:lang w:val="tr-TR"/>
+        </w:rPr>
+      </w:pPr>
+      <w:r>
+        <w:rPr>
+          <w:noProof/>
+          <w:sz w:val="24"/>
+          <w:szCs w:val="24"/>
+          <w:lang w:val="tr-TR"/>
+        </w:rPr>
+        <w:t xml:space="preserve"> </w:t>
+      </w:r>
+      <w:r>
+        <w:rPr>
+          <w:noProof/>
+          <w:sz w:val="24"/>
+          <w:szCs w:val="24"/>
+          <w:lang w:val="tr-TR"/>
+        </w:rPr>
+        <w:t>│</w:t>
+      </w:r>
+    </w:p>
+    <w:p>
+      <w:pPr>
+        <w:spacing w:after="0" w:line="240" w:lineRule="auto"/>
+        <w:rPr>
+          <w:noProof/>
+          <w:sz w:val="24"/>
+          <w:szCs w:val="24"/>
+          <w:lang w:val="tr-TR"/>
+        </w:rPr>
+      </w:pPr>
+      <w:r>
+        <w:rPr>
+          <w:rFonts w:ascii="MS Gothic" w:eastAsia="MS Gothic" w:hAnsi="MS Gothic" w:cs="MS Gothic" w:hint="eastAsia"/>
+          <w:noProof/>
+          <w:sz w:val="24"/>
+          <w:szCs w:val="24"/>
+          <w:lang w:val="tr-TR"/>
+        </w:rPr>
+        <w:t>├</w:t>
+      </w:r>
+      <w:r>
+        <w:rPr>
+          <w:rFonts w:ascii="Calibri" w:hAnsi="Calibri" w:cs="Calibri"/>
+          <w:noProof/>
+          <w:sz w:val="24"/>
+          <w:szCs w:val="24"/>
+          <w:lang w:val="tr-TR"/>
+        </w:rPr>
+        <w:t>──</w:t>
+      </w:r>
+      <w:r>
+        <w:rPr>
+          <w:noProof/>
+          <w:sz w:val="24"/>
+          <w:szCs w:val="24"/>
+          <w:lang w:val="tr-TR"/>
+        </w:rPr>
+        <w:t xml:space="preserve"> raw/</w:t>
+      </w:r>
+    </w:p>
+    <w:p>
+      <w:pPr>
+        <w:spacing w:after="0" w:line="240" w:lineRule="auto"/>
+        <w:rPr>
+          <w:noProof/>
+          <w:sz w:val="24"/>
+          <w:szCs w:val="24"/>
+          <w:lang w:val="tr-TR"/>
+        </w:rPr>
+      </w:pPr>
+      <w:r>
+        <w:rPr>
+          <w:noProof/>
+          <w:sz w:val="24"/>
+          <w:szCs w:val="24"/>
+          <w:lang w:val="tr-TR"/>
+        </w:rPr>
+        <w:t xml:space="preserve"> </w:t>
+      </w:r>
+      <w:r>
+        <w:rPr>
+          <w:noProof/>
+          <w:sz w:val="24"/>
+          <w:szCs w:val="24"/>
+          <w:lang w:val="tr-TR"/>
+        </w:rPr>
+        <w:t xml:space="preserve">│      </w:t>
+      </w:r>
+      <w:r>
+        <w:rPr>
+          <w:noProof/>
+          <w:sz w:val="24"/>
+          <w:szCs w:val="24"/>
+          <w:lang w:val="tr-TR"/>
+        </w:rPr>
+        <w:t xml:space="preserve"> </w:t>
+      </w:r>
+      <w:r>
+        <w:rPr>
+          <w:noProof/>
+          <w:sz w:val="24"/>
+          <w:szCs w:val="24"/>
+          <w:lang w:val="tr-TR"/>
+        </w:rPr>
+        <w:t>Original measurements</w:t>
+      </w:r>
+    </w:p>
+    <w:p>
+      <w:pPr>
+        <w:spacing w:after="0" w:line="240" w:lineRule="auto"/>
+        <w:rPr>
+          <w:noProof/>
+          <w:sz w:val="24"/>
+          <w:szCs w:val="24"/>
+          <w:lang w:val="tr-TR"/>
+        </w:rPr>
+      </w:pPr>
+      <w:r>
+        <w:rPr>
+          <w:noProof/>
+          <w:sz w:val="24"/>
+          <w:szCs w:val="24"/>
+          <w:lang w:val="tr-TR"/>
+        </w:rPr>
+        <w:t xml:space="preserve"> </w:t>
+      </w:r>
+      <w:r>
+        <w:rPr>
+          <w:noProof/>
+          <w:sz w:val="24"/>
+          <w:szCs w:val="24"/>
+          <w:lang w:val="tr-TR"/>
+        </w:rPr>
+        <w:t>│</w:t>
+      </w:r>
+    </w:p>
+    <w:p>
+      <w:pPr>
+        <w:spacing w:after="0" w:line="240" w:lineRule="auto"/>
+        <w:rPr>
+          <w:noProof/>
+          <w:sz w:val="24"/>
+          <w:szCs w:val="24"/>
+          <w:lang w:val="tr-TR"/>
+        </w:rPr>
+      </w:pPr>
+      <w:r>
+        <w:rPr>
+          <w:rFonts w:ascii="MS Gothic" w:eastAsia="MS Gothic" w:hAnsi="MS Gothic" w:cs="MS Gothic" w:hint="eastAsia"/>
+          <w:noProof/>
+          <w:sz w:val="24"/>
+          <w:szCs w:val="24"/>
+          <w:lang w:val="tr-TR"/>
+        </w:rPr>
+        <w:t>├</w:t>
+      </w:r>
+      <w:r>
+        <w:rPr>
+          <w:rFonts w:ascii="Calibri" w:hAnsi="Calibri" w:cs="Calibri"/>
+          <w:noProof/>
+          <w:sz w:val="24"/>
+          <w:szCs w:val="24"/>
+          <w:lang w:val="tr-TR"/>
+        </w:rPr>
+        <w:t>──</w:t>
+      </w:r>
+      <w:r>
+        <w:rPr>
+          <w:noProof/>
+          <w:sz w:val="24"/>
+          <w:szCs w:val="24"/>
+          <w:lang w:val="tr-TR"/>
+        </w:rPr>
+        <w:t xml:space="preserve"> processed/</w:t>
+      </w:r>
+    </w:p>
+    <w:p>
+      <w:pPr>
+        <w:spacing w:after="0" w:line="240" w:lineRule="auto"/>
+        <w:rPr>
+          <w:noProof/>
+          <w:sz w:val="24"/>
+          <w:szCs w:val="24"/>
+          <w:lang w:val="tr-TR"/>
+        </w:rPr>
+      </w:pPr>
+      <w:r>
+        <w:rPr>
+          <w:noProof/>
+          <w:sz w:val="24"/>
+          <w:szCs w:val="24"/>
+          <w:lang w:val="tr-TR"/>
+        </w:rPr>
+        <w:t xml:space="preserve"> </w:t>
+      </w:r>
+      <w:r>
+        <w:rPr>
+          <w:noProof/>
+          <w:sz w:val="24"/>
+          <w:szCs w:val="24"/>
+          <w:lang w:val="tr-TR"/>
+        </w:rPr>
+        <w:t xml:space="preserve">│      </w:t>
+      </w:r>
+      <w:r>
+        <w:rPr>
+          <w:noProof/>
+          <w:sz w:val="24"/>
+          <w:szCs w:val="24"/>
+          <w:lang w:val="tr-TR"/>
+        </w:rPr>
+        <w:t xml:space="preserve"> </w:t>
+      </w:r>
+      <w:r>
+        <w:rPr>
+          <w:noProof/>
+          <w:sz w:val="24"/>
+          <w:szCs w:val="24"/>
+          <w:lang w:val="tr-TR"/>
+        </w:rPr>
+        <w:t>Cleaned + interpolated datasets</w:t>
+      </w:r>
+    </w:p>
+    <w:p>
+      <w:pPr>
+        <w:spacing w:after="0" w:line="240" w:lineRule="auto"/>
+        <w:rPr>
+          <w:noProof/>
+          <w:sz w:val="24"/>
+          <w:szCs w:val="24"/>
+          <w:lang w:val="tr-TR"/>
+        </w:rPr>
+      </w:pPr>
+      <w:r>
+        <w:rPr>
+          <w:noProof/>
+          <w:sz w:val="24"/>
+          <w:szCs w:val="24"/>
+          <w:lang w:val="tr-TR"/>
+        </w:rPr>
+        <w:t xml:space="preserve"> </w:t>
+      </w:r>
+      <w:r>
+        <w:rPr>
+          <w:noProof/>
+          <w:sz w:val="24"/>
+          <w:szCs w:val="24"/>
+          <w:lang w:val="tr-TR"/>
+        </w:rPr>
+        <w:t>│</w:t>
+      </w:r>
+    </w:p>
+    <w:p>
+      <w:pPr>
+        <w:spacing w:after="0" w:line="240" w:lineRule="auto"/>
+        <w:rPr>
+          <w:noProof/>
+          <w:sz w:val="24"/>
+          <w:szCs w:val="24"/>
+          <w:lang w:val="tr-TR"/>
+        </w:rPr>
+      </w:pPr>
+      <w:r>
+        <w:rPr>
+          <w:noProof/>
+          <w:sz w:val="24"/>
+          <w:szCs w:val="24"/>
+          <w:lang w:val="tr-TR"/>
+        </w:rPr>
+        <w:t xml:space="preserve"> </w:t>
+      </w:r>
+      <w:r>
+        <w:rPr>
+          <w:noProof/>
+          <w:sz w:val="24"/>
+          <w:szCs w:val="24"/>
+          <w:lang w:val="tr-TR"/>
+        </w:rPr>
+        <w:t>└── results/</w:t>
+      </w:r>
+    </w:p>
+    <w:p>
+      <w:pPr>
+        <w:spacing w:after="0" w:line="240" w:lineRule="auto"/>
+        <w:rPr>
+          <w:noProof/>
+          <w:sz w:val="24"/>
+          <w:szCs w:val="24"/>
+          <w:lang w:val="tr-TR"/>
+        </w:rPr>
+      </w:pPr>
+      <w:r>
+        <w:rPr>
+          <w:noProof/>
+          <w:sz w:val="24"/>
+          <w:szCs w:val="24"/>
+          <w:lang w:val="tr-TR"/>
+        </w:rPr>
+        <w:t xml:space="preserve">       </w:t>
+      </w:r>
+      <w:r>
+        <w:rPr>
+          <w:noProof/>
+          <w:sz w:val="24"/>
+          <w:szCs w:val="24"/>
+          <w:lang w:val="tr-TR"/>
+        </w:rPr>
+        <w:t xml:space="preserve">  </w:t>
+      </w:r>
+      <w:r>
+        <w:rPr>
+          <w:noProof/>
+          <w:sz w:val="24"/>
+          <w:szCs w:val="24"/>
+          <w:lang w:val="tr-TR"/>
+        </w:rPr>
+        <w:t>Forecasts, RUL, reports</w:t>
+      </w:r>
+    </w:p>
+    <w:p>
+      <w:pPr>
+        <w:spacing w:after="0" w:line="240" w:lineRule="auto"/>
+        <w:jc w:val="center"/>
+        <w:rPr>
+          <w:noProof/>
+          <w:sz w:val="24"/>
+          <w:szCs w:val="24"/>
+          <w:lang w:val="tr-TR"/>
+        </w:rPr>
+      </w:pPr>
+    </w:p>
+    <w:p>
+      <w:pPr>
+        <w:spacing w:after="0" w:line="240" w:lineRule="auto"/>
+        <w:jc w:val="center"/>
+        <w:rPr>
+          <w:noProof/>
+          <w:sz w:val="24"/>
+          <w:szCs w:val="24"/>
+          <w:lang w:val="tr-TR"/>
+        </w:rPr>
+      </w:pPr>
+    </w:p>
+    <w:p>
+      <w:pPr>
+        <w:spacing w:after="0" w:line="240" w:lineRule="auto"/>
+        <w:jc w:val="center"/>
+        <w:rPr>
+          <w:noProof/>
+          <w:sz w:val="24"/>
+          <w:szCs w:val="24"/>
+          <w:lang w:val="tr-TR"/>
+        </w:rPr>
+      </w:pPr>
     </w:p>
     <w:sectPr>
       <w:pgSz w:w="11906" w:h="16838"/>

</xml_diff>

<commit_message>
Sprint 9 - Commit 4: Building the Baseline Hybrid Forecaster
</commit_message>
<xml_diff>
--- a/docs/draft/development_flow.docx
+++ b/docs/draft/development_flow.docx
@@ -1,6 +1,6 @@
 
 <file path=word/document.xml><?xml version="1.0" encoding="utf-8"?>
-<w:document xmlns:wpc="http://schemas.microsoft.com/office/word/2010/wordprocessingCanvas" xmlns:cx="http://schemas.microsoft.com/office/drawing/2014/chartex" xmlns:cx1="http://schemas.microsoft.com/office/drawing/2015/9/8/chartex" xmlns:cx2="http://schemas.microsoft.com/office/drawing/2015/10/21/chartex" xmlns:cx3="http://schemas.microsoft.com/office/drawing/2016/5/9/chartex" xmlns:cx4="http://schemas.microsoft.com/office/drawing/2016/5/10/chartex" xmlns:cx5="http://schemas.microsoft.com/office/drawing/2016/5/11/chartex" xmlns:cx6="http://schemas.microsoft.com/office/drawing/2016/5/12/chartex" xmlns:cx7="http://schemas.microsoft.com/office/drawing/2016/5/13/chartex" xmlns:cx8="http://schemas.microsoft.com/office/drawing/2016/5/14/chartex" xmlns:mc="http://schemas.openxmlformats.org/markup-compatibility/2006" xmlns:aink="http://schemas.microsoft.com/office/drawing/2016/ink" xmlns:am3d="http://schemas.microsoft.com/office/drawing/2017/model3d" xmlns:o="urn:schemas-microsoft-com:office:office" xmlns:oel="http://schemas.microsoft.com/office/2019/extlst" xmlns:r="http://schemas.openxmlformats.org/officeDocument/2006/relationships" xmlns:m="http://schemas.openxmlformats.org/officeDocument/2006/math" xmlns:v="urn:schemas-microsoft-com:vml" xmlns:wp14="http://schemas.microsoft.com/office/word/2010/wordprocessingDrawing" xmlns:wp="http://schemas.openxmlformats.org/drawingml/2006/wordprocessingDrawing" xmlns:w10="urn:schemas-microsoft-com:office:word" xmlns:w="http://schemas.openxmlformats.org/wordprocessingml/2006/main" xmlns:w14="http://schemas.microsoft.com/office/word/2010/wordml" xmlns:w15="http://schemas.microsoft.com/office/word/2012/wordml" xmlns:w16cex="http://schemas.microsoft.com/office/word/2018/wordml/cex" xmlns:w16cid="http://schemas.microsoft.com/office/word/2016/wordml/cid" xmlns:w16="http://schemas.microsoft.com/office/word/2018/wordml" xmlns:w16du="http://schemas.microsoft.com/office/word/2023/wordml/word16du" xmlns:w16sdtdh="http://schemas.microsoft.com/office/word/2020/wordml/sdtdatahash" xmlns:w16sdtfl="http://schemas.microsoft.com/office/word/2024/wordml/sdtformatlock" xmlns:w16se="http://schemas.microsoft.com/office/word/2015/wordml/symex" xmlns:wpg="http://schemas.microsoft.com/office/word/2010/wordprocessingGroup" xmlns:wpi="http://schemas.microsoft.com/office/word/2010/wordprocessingInk" xmlns:wne="http://schemas.microsoft.com/office/word/2006/wordml" xmlns:wps="http://schemas.microsoft.com/office/word/2010/wordprocessingShape" mc:Ignorable="w14 w15 w16se w16cid w16 w16cex w16sdtdh w16sdtfl w16du wp14">
+<w:document xmlns:wpc="http://schemas.microsoft.com/office/word/2010/wordprocessingCanvas" xmlns:cx="http://schemas.microsoft.com/office/drawing/2014/chartex" xmlns:cx1="http://schemas.microsoft.com/office/drawing/2015/9/8/chartex" xmlns:cx2="http://schemas.microsoft.com/office/drawing/2015/10/21/chartex" xmlns:cx3="http://schemas.microsoft.com/office/drawing/2016/5/9/chartex" xmlns:cx4="http://schemas.microsoft.com/office/drawing/2016/5/10/chartex" xmlns:cx5="http://schemas.microsoft.com/office/drawing/2016/5/11/chartex" xmlns:cx6="http://schemas.microsoft.com/office/drawing/2016/5/12/chartex" xmlns:cx7="http://schemas.microsoft.com/office/drawing/2016/5/13/chartex" xmlns:cx8="http://schemas.microsoft.com/office/drawing/2016/5/14/chartex" xmlns:mc="http://schemas.openxmlformats.org/markup-compatibility/2006" xmlns:aink="http://schemas.microsoft.com/office/drawing/2016/ink" xmlns:am3d="http://schemas.microsoft.com/office/drawing/2017/model3d" xmlns:o="urn:schemas-microsoft-com:office:office" xmlns:oel="http://schemas.microsoft.com/office/2019/extlst" xmlns:r="http://schemas.openxmlformats.org/officeDocument/2006/relationships" xmlns:m="http://schemas.openxmlformats.org/officeDocument/2006/math" xmlns:v="urn:schemas-microsoft-com:vml" xmlns:wp14="http://schemas.microsoft.com/office/word/2010/wordprocessingDrawing" xmlns:wp="http://schemas.openxmlformats.org/drawingml/2006/wordprocessingDrawing" xmlns:w10="urn:schemas-microsoft-com:office:word" xmlns:w="http://schemas.openxmlformats.org/wordprocessingml/2006/main" xmlns:w14="http://schemas.microsoft.com/office/word/2010/wordml" xmlns:w15="http://schemas.microsoft.com/office/word/2012/wordml" xmlns:w16cei="http://schemas.microsoft.com/office/word/2026/wordml/cei" xmlns:w16cex="http://schemas.microsoft.com/office/word/2018/wordml/cex" xmlns:w16cid="http://schemas.microsoft.com/office/word/2016/wordml/cid" xmlns:w16="http://schemas.microsoft.com/office/word/2018/wordml" xmlns:w16du="http://schemas.microsoft.com/office/word/2023/wordml/word16du" xmlns:w16sdtdh="http://schemas.microsoft.com/office/word/2020/wordml/sdtdatahash" xmlns:w16sdtfl="http://schemas.microsoft.com/office/word/2024/wordml/sdtformatlock" xmlns:w16se="http://schemas.microsoft.com/office/word/2015/wordml/symex" xmlns:wpg="http://schemas.microsoft.com/office/word/2010/wordprocessingGroup" xmlns:wpi="http://schemas.microsoft.com/office/word/2010/wordprocessingInk" xmlns:wne="http://schemas.microsoft.com/office/word/2006/wordml" xmlns:wps="http://schemas.microsoft.com/office/word/2010/wordprocessingShape" mc:Ignorable="w14 w15 w16se w16cid w16 w16cex w16sdtdh w16sdtfl w16du wp14">
   <w:body>
     <w:p>
       <w:pPr>
@@ -21072,8 +21072,321 @@
     </w:p>
     <w:p>
       <w:pPr>
-        <w:spacing w:after="0" w:line="240" w:lineRule="auto"/>
-        <w:jc w:val="center"/>
+        <w:rPr>
+          <w:noProof/>
+          <w:sz w:val="24"/>
+          <w:szCs w:val="24"/>
+          <w:lang w:val="tr-TR"/>
+        </w:rPr>
+      </w:pPr>
+      <w:r>
+        <w:rPr>
+          <w:noProof/>
+          <w:sz w:val="24"/>
+          <w:szCs w:val="24"/>
+          <w:lang w:val="tr-TR"/>
+        </w:rPr>
+        <w:br w:type="page"/>
+      </w:r>
+    </w:p>
+    <w:p>
+      <w:pPr>
+        <w:spacing w:after="0" w:line="240" w:lineRule="auto"/>
+        <w:rPr>
+          <w:b/>
+          <w:bCs/>
+          <w:noProof/>
+          <w:sz w:val="32"/>
+          <w:szCs w:val="32"/>
+          <w:lang w:val="tr-TR"/>
+        </w:rPr>
+      </w:pPr>
+      <w:r>
+        <w:rPr>
+          <w:b/>
+          <w:bCs/>
+          <w:noProof/>
+          <w:sz w:val="32"/>
+          <w:szCs w:val="32"/>
+          <w:lang w:val="tr-TR"/>
+        </w:rPr>
+        <w:lastRenderedPageBreak/>
+        <w:t>Trend Model</w:t>
+      </w:r>
+    </w:p>
+    <w:p>
+      <w:pPr>
+        <w:spacing w:after="0" w:line="240" w:lineRule="auto"/>
+        <w:rPr>
+          <w:noProof/>
+          <w:sz w:val="24"/>
+          <w:szCs w:val="24"/>
+          <w:lang w:val="tr-TR"/>
+        </w:rPr>
+      </w:pPr>
+      <w:r>
+        <w:rPr>
+          <w:noProof/>
+          <w:sz w:val="24"/>
+          <w:szCs w:val="24"/>
+          <w:lang w:val="tr-TR"/>
+        </w:rPr>
+        <w:t>The trend model captures the deterministic long-term behaviour.</w:t>
+      </w:r>
+    </w:p>
+    <w:p>
+      <w:pPr>
+        <w:spacing w:after="0" w:line="240" w:lineRule="auto"/>
+        <w:rPr>
+          <w:noProof/>
+          <w:sz w:val="24"/>
+          <w:szCs w:val="24"/>
+          <w:lang w:val="tr-TR"/>
+        </w:rPr>
+      </w:pPr>
+      <w:r>
+        <w:rPr>
+          <w:noProof/>
+          <w:sz w:val="24"/>
+          <w:szCs w:val="24"/>
+          <w:lang w:val="tr-TR"/>
+        </w:rPr>
+        <w:t>Examples:</w:t>
+      </w:r>
+    </w:p>
+    <w:p>
+      <w:pPr>
+        <w:numPr>
+          <w:ilvl w:val="0"/>
+          <w:numId w:val="19"/>
+        </w:numPr>
+        <w:spacing w:after="0" w:line="240" w:lineRule="auto"/>
+        <w:rPr>
+          <w:noProof/>
+          <w:sz w:val="24"/>
+          <w:szCs w:val="24"/>
+          <w:lang w:val="tr-TR"/>
+        </w:rPr>
+      </w:pPr>
+      <w:r>
+        <w:rPr>
+          <w:noProof/>
+          <w:sz w:val="24"/>
+          <w:szCs w:val="24"/>
+          <w:lang w:val="tr-TR"/>
+        </w:rPr>
+        <w:t xml:space="preserve">Kalman Filter </w:t>
+      </w:r>
+    </w:p>
+    <w:p>
+      <w:pPr>
+        <w:numPr>
+          <w:ilvl w:val="0"/>
+          <w:numId w:val="19"/>
+        </w:numPr>
+        <w:spacing w:after="0" w:line="240" w:lineRule="auto"/>
+        <w:rPr>
+          <w:noProof/>
+          <w:sz w:val="24"/>
+          <w:szCs w:val="24"/>
+          <w:lang w:val="tr-TR"/>
+        </w:rPr>
+      </w:pPr>
+      <w:r>
+        <w:rPr>
+          <w:noProof/>
+          <w:sz w:val="24"/>
+          <w:szCs w:val="24"/>
+          <w:lang w:val="tr-TR"/>
+        </w:rPr>
+        <w:t xml:space="preserve">ARIMA </w:t>
+      </w:r>
+    </w:p>
+    <w:p>
+      <w:pPr>
+        <w:numPr>
+          <w:ilvl w:val="0"/>
+          <w:numId w:val="19"/>
+        </w:numPr>
+        <w:spacing w:after="0" w:line="240" w:lineRule="auto"/>
+        <w:rPr>
+          <w:noProof/>
+          <w:sz w:val="24"/>
+          <w:szCs w:val="24"/>
+          <w:lang w:val="tr-TR"/>
+        </w:rPr>
+      </w:pPr>
+      <w:r>
+        <w:rPr>
+          <w:noProof/>
+          <w:sz w:val="24"/>
+          <w:szCs w:val="24"/>
+          <w:lang w:val="tr-TR"/>
+        </w:rPr>
+        <w:t>ETS</w:t>
+      </w:r>
+    </w:p>
+    <w:p>
+      <w:pPr>
+        <w:spacing w:after="0" w:line="240" w:lineRule="auto"/>
+        <w:rPr>
+          <w:noProof/>
+          <w:sz w:val="24"/>
+          <w:szCs w:val="24"/>
+          <w:lang w:val="tr-TR"/>
+        </w:rPr>
+      </w:pPr>
+    </w:p>
+    <w:p>
+      <w:pPr>
+        <w:spacing w:after="0" w:line="240" w:lineRule="auto"/>
+        <w:rPr>
+          <w:noProof/>
+          <w:sz w:val="24"/>
+          <w:szCs w:val="24"/>
+          <w:lang w:val="tr-TR"/>
+        </w:rPr>
+      </w:pPr>
+    </w:p>
+    <w:p>
+      <w:pPr>
+        <w:spacing w:after="0" w:line="240" w:lineRule="auto"/>
+        <w:rPr>
+          <w:b/>
+          <w:bCs/>
+          <w:noProof/>
+          <w:sz w:val="32"/>
+          <w:szCs w:val="32"/>
+          <w:lang w:val="tr-TR"/>
+        </w:rPr>
+      </w:pPr>
+      <w:r>
+        <w:rPr>
+          <w:b/>
+          <w:bCs/>
+          <w:noProof/>
+          <w:sz w:val="32"/>
+          <w:szCs w:val="32"/>
+          <w:lang w:val="tr-TR"/>
+        </w:rPr>
+        <w:t>Residual Model</w:t>
+      </w:r>
+    </w:p>
+    <w:p>
+      <w:pPr>
+        <w:spacing w:after="0" w:line="240" w:lineRule="auto"/>
+        <w:rPr>
+          <w:noProof/>
+          <w:sz w:val="24"/>
+          <w:szCs w:val="24"/>
+          <w:lang w:val="tr-TR"/>
+        </w:rPr>
+      </w:pPr>
+      <w:r>
+        <w:rPr>
+          <w:noProof/>
+          <w:sz w:val="24"/>
+          <w:szCs w:val="24"/>
+          <w:lang w:val="tr-TR"/>
+        </w:rPr>
+        <w:t>The residual model learns the nonlinear forecasting error.</w:t>
+      </w:r>
+    </w:p>
+    <w:p>
+      <w:pPr>
+        <w:spacing w:after="0" w:line="240" w:lineRule="auto"/>
+        <w:rPr>
+          <w:noProof/>
+          <w:sz w:val="24"/>
+          <w:szCs w:val="24"/>
+          <w:lang w:val="tr-TR"/>
+        </w:rPr>
+      </w:pPr>
+      <w:r>
+        <w:rPr>
+          <w:noProof/>
+          <w:sz w:val="24"/>
+          <w:szCs w:val="24"/>
+          <w:lang w:val="tr-TR"/>
+        </w:rPr>
+        <w:t>Examples:</w:t>
+      </w:r>
+    </w:p>
+    <w:p>
+      <w:pPr>
+        <w:numPr>
+          <w:ilvl w:val="0"/>
+          <w:numId w:val="20"/>
+        </w:numPr>
+        <w:spacing w:after="0" w:line="240" w:lineRule="auto"/>
+        <w:rPr>
+          <w:noProof/>
+          <w:sz w:val="24"/>
+          <w:szCs w:val="24"/>
+          <w:lang w:val="tr-TR"/>
+        </w:rPr>
+      </w:pPr>
+      <w:r>
+        <w:rPr>
+          <w:noProof/>
+          <w:sz w:val="24"/>
+          <w:szCs w:val="24"/>
+          <w:lang w:val="tr-TR"/>
+        </w:rPr>
+        <w:t xml:space="preserve">LSTM </w:t>
+      </w:r>
+    </w:p>
+    <w:p>
+      <w:pPr>
+        <w:numPr>
+          <w:ilvl w:val="0"/>
+          <w:numId w:val="20"/>
+        </w:numPr>
+        <w:spacing w:after="0" w:line="240" w:lineRule="auto"/>
+        <w:rPr>
+          <w:noProof/>
+          <w:sz w:val="24"/>
+          <w:szCs w:val="24"/>
+          <w:lang w:val="tr-TR"/>
+        </w:rPr>
+      </w:pPr>
+      <w:r>
+        <w:rPr>
+          <w:noProof/>
+          <w:sz w:val="24"/>
+          <w:szCs w:val="24"/>
+          <w:lang w:val="tr-TR"/>
+        </w:rPr>
+        <w:t xml:space="preserve">GRU </w:t>
+      </w:r>
+    </w:p>
+    <w:p>
+      <w:pPr>
+        <w:numPr>
+          <w:ilvl w:val="0"/>
+          <w:numId w:val="20"/>
+        </w:numPr>
+        <w:spacing w:after="0" w:line="240" w:lineRule="auto"/>
+        <w:rPr>
+          <w:noProof/>
+          <w:sz w:val="24"/>
+          <w:szCs w:val="24"/>
+          <w:lang w:val="tr-TR"/>
+        </w:rPr>
+      </w:pPr>
+      <w:r>
+        <w:rPr>
+          <w:noProof/>
+          <w:sz w:val="24"/>
+          <w:szCs w:val="24"/>
+          <w:lang w:val="tr-TR"/>
+        </w:rPr>
+        <w:t>Transformer (planned)</w:t>
+      </w:r>
+    </w:p>
+    <w:p>
+      <w:pPr>
+        <w:spacing w:after="0" w:line="240" w:lineRule="auto"/>
         <w:rPr>
           <w:noProof/>
           <w:sz w:val="24"/>
@@ -21093,7 +21406,7 @@
 </file>
 
 <file path=word/numbering.xml><?xml version="1.0" encoding="utf-8"?>
-<w:numbering xmlns:wpc="http://schemas.microsoft.com/office/word/2010/wordprocessingCanvas" xmlns:cx="http://schemas.microsoft.com/office/drawing/2014/chartex" xmlns:cx1="http://schemas.microsoft.com/office/drawing/2015/9/8/chartex" xmlns:cx2="http://schemas.microsoft.com/office/drawing/2015/10/21/chartex" xmlns:cx3="http://schemas.microsoft.com/office/drawing/2016/5/9/chartex" xmlns:cx4="http://schemas.microsoft.com/office/drawing/2016/5/10/chartex" xmlns:cx5="http://schemas.microsoft.com/office/drawing/2016/5/11/chartex" xmlns:cx6="http://schemas.microsoft.com/office/drawing/2016/5/12/chartex" xmlns:cx7="http://schemas.microsoft.com/office/drawing/2016/5/13/chartex" xmlns:cx8="http://schemas.microsoft.com/office/drawing/2016/5/14/chartex" xmlns:mc="http://schemas.openxmlformats.org/markup-compatibility/2006" xmlns:aink="http://schemas.microsoft.com/office/drawing/2016/ink" xmlns:am3d="http://schemas.microsoft.com/office/drawing/2017/model3d" xmlns:o="urn:schemas-microsoft-com:office:office" xmlns:oel="http://schemas.microsoft.com/office/2019/extlst" xmlns:r="http://schemas.openxmlformats.org/officeDocument/2006/relationships" xmlns:m="http://schemas.openxmlformats.org/officeDocument/2006/math" xmlns:v="urn:schemas-microsoft-com:vml" xmlns:wp14="http://schemas.microsoft.com/office/word/2010/wordprocessingDrawing" xmlns:wp="http://schemas.openxmlformats.org/drawingml/2006/wordprocessingDrawing" xmlns:w10="urn:schemas-microsoft-com:office:word" xmlns:w="http://schemas.openxmlformats.org/wordprocessingml/2006/main" xmlns:w14="http://schemas.microsoft.com/office/word/2010/wordml" xmlns:w15="http://schemas.microsoft.com/office/word/2012/wordml" xmlns:w16cex="http://schemas.microsoft.com/office/word/2018/wordml/cex" xmlns:w16cid="http://schemas.microsoft.com/office/word/2016/wordml/cid" xmlns:w16="http://schemas.microsoft.com/office/word/2018/wordml" xmlns:w16du="http://schemas.microsoft.com/office/word/2023/wordml/word16du" xmlns:w16sdtdh="http://schemas.microsoft.com/office/word/2020/wordml/sdtdatahash" xmlns:w16sdtfl="http://schemas.microsoft.com/office/word/2024/wordml/sdtformatlock" xmlns:w16se="http://schemas.microsoft.com/office/word/2015/wordml/symex" xmlns:wpg="http://schemas.microsoft.com/office/word/2010/wordprocessingGroup" xmlns:wpi="http://schemas.microsoft.com/office/word/2010/wordprocessingInk" xmlns:wne="http://schemas.microsoft.com/office/word/2006/wordml" xmlns:wps="http://schemas.microsoft.com/office/word/2010/wordprocessingShape" mc:Ignorable="w14 w15 w16se w16cid w16 w16cex w16sdtdh w16sdtfl w16du wp14">
+<w:numbering xmlns:wpc="http://schemas.microsoft.com/office/word/2010/wordprocessingCanvas" xmlns:cx="http://schemas.microsoft.com/office/drawing/2014/chartex" xmlns:cx1="http://schemas.microsoft.com/office/drawing/2015/9/8/chartex" xmlns:cx2="http://schemas.microsoft.com/office/drawing/2015/10/21/chartex" xmlns:cx3="http://schemas.microsoft.com/office/drawing/2016/5/9/chartex" xmlns:cx4="http://schemas.microsoft.com/office/drawing/2016/5/10/chartex" xmlns:cx5="http://schemas.microsoft.com/office/drawing/2016/5/11/chartex" xmlns:cx6="http://schemas.microsoft.com/office/drawing/2016/5/12/chartex" xmlns:cx7="http://schemas.microsoft.com/office/drawing/2016/5/13/chartex" xmlns:cx8="http://schemas.microsoft.com/office/drawing/2016/5/14/chartex" xmlns:mc="http://schemas.openxmlformats.org/markup-compatibility/2006" xmlns:aink="http://schemas.microsoft.com/office/drawing/2016/ink" xmlns:am3d="http://schemas.microsoft.com/office/drawing/2017/model3d" xmlns:o="urn:schemas-microsoft-com:office:office" xmlns:oel="http://schemas.microsoft.com/office/2019/extlst" xmlns:r="http://schemas.openxmlformats.org/officeDocument/2006/relationships" xmlns:m="http://schemas.openxmlformats.org/officeDocument/2006/math" xmlns:v="urn:schemas-microsoft-com:vml" xmlns:wp14="http://schemas.microsoft.com/office/word/2010/wordprocessingDrawing" xmlns:wp="http://schemas.openxmlformats.org/drawingml/2006/wordprocessingDrawing" xmlns:w10="urn:schemas-microsoft-com:office:word" xmlns:w="http://schemas.openxmlformats.org/wordprocessingml/2006/main" xmlns:w14="http://schemas.microsoft.com/office/word/2010/wordml" xmlns:w15="http://schemas.microsoft.com/office/word/2012/wordml" xmlns:w16cei="http://schemas.microsoft.com/office/word/2026/wordml/cei" xmlns:w16cex="http://schemas.microsoft.com/office/word/2018/wordml/cex" xmlns:w16cid="http://schemas.microsoft.com/office/word/2016/wordml/cid" xmlns:w16="http://schemas.microsoft.com/office/word/2018/wordml" xmlns:w16du="http://schemas.microsoft.com/office/word/2023/wordml/word16du" xmlns:w16sdtdh="http://schemas.microsoft.com/office/word/2020/wordml/sdtdatahash" xmlns:w16sdtfl="http://schemas.microsoft.com/office/word/2024/wordml/sdtformatlock" xmlns:w16se="http://schemas.microsoft.com/office/word/2015/wordml/symex" xmlns:wpg="http://schemas.microsoft.com/office/word/2010/wordprocessingGroup" xmlns:wpi="http://schemas.microsoft.com/office/word/2010/wordprocessingInk" xmlns:wne="http://schemas.microsoft.com/office/word/2006/wordml" xmlns:wps="http://schemas.microsoft.com/office/word/2010/wordprocessingShape" mc:Ignorable="w14 w15 w16se w16cid w16 w16cex w16sdtdh w16sdtfl w16du wp14">
   <w:abstractNum w:abstractNumId="0" w15:restartNumberingAfterBreak="0">
     <w:nsid w:val="01B652AA"/>
     <w:multiLevelType w:val="multilevel"/>
@@ -21393,9 +21706,9 @@
     </w:lvl>
   </w:abstractNum>
   <w:abstractNum w:abstractNumId="2" w15:restartNumberingAfterBreak="0">
-    <w:nsid w:val="0932680C"/>
+    <w:nsid w:val="02260A03"/>
     <w:multiLevelType w:val="multilevel"/>
-    <w:tmpl w:val="A6E4F4D6"/>
+    <w:tmpl w:val="AA0E78AC"/>
     <w:lvl w:ilvl="0">
       <w:start w:val="1"/>
       <w:numFmt w:val="bullet"/>
@@ -21542,9 +21855,9 @@
     </w:lvl>
   </w:abstractNum>
   <w:abstractNum w:abstractNumId="3" w15:restartNumberingAfterBreak="0">
-    <w:nsid w:val="18C72CDA"/>
+    <w:nsid w:val="0932680C"/>
     <w:multiLevelType w:val="multilevel"/>
-    <w:tmpl w:val="B7EE9C34"/>
+    <w:tmpl w:val="A6E4F4D6"/>
     <w:lvl w:ilvl="0">
       <w:start w:val="1"/>
       <w:numFmt w:val="bullet"/>
@@ -21691,9 +22004,9 @@
     </w:lvl>
   </w:abstractNum>
   <w:abstractNum w:abstractNumId="4" w15:restartNumberingAfterBreak="0">
-    <w:nsid w:val="2A9E1DA7"/>
+    <w:nsid w:val="18C72CDA"/>
     <w:multiLevelType w:val="multilevel"/>
-    <w:tmpl w:val="AA4225DC"/>
+    <w:tmpl w:val="B7EE9C34"/>
     <w:lvl w:ilvl="0">
       <w:start w:val="1"/>
       <w:numFmt w:val="bullet"/>
@@ -21840,9 +22153,9 @@
     </w:lvl>
   </w:abstractNum>
   <w:abstractNum w:abstractNumId="5" w15:restartNumberingAfterBreak="0">
-    <w:nsid w:val="2BB9033D"/>
+    <w:nsid w:val="2A9E1DA7"/>
     <w:multiLevelType w:val="multilevel"/>
-    <w:tmpl w:val="DD0CA684"/>
+    <w:tmpl w:val="AA4225DC"/>
     <w:lvl w:ilvl="0">
       <w:start w:val="1"/>
       <w:numFmt w:val="bullet"/>
@@ -21989,9 +22302,9 @@
     </w:lvl>
   </w:abstractNum>
   <w:abstractNum w:abstractNumId="6" w15:restartNumberingAfterBreak="0">
-    <w:nsid w:val="2D490C38"/>
+    <w:nsid w:val="2BB9033D"/>
     <w:multiLevelType w:val="multilevel"/>
-    <w:tmpl w:val="E1749C3E"/>
+    <w:tmpl w:val="DD0CA684"/>
     <w:lvl w:ilvl="0">
       <w:start w:val="1"/>
       <w:numFmt w:val="bullet"/>
@@ -22138,98 +22451,9 @@
     </w:lvl>
   </w:abstractNum>
   <w:abstractNum w:abstractNumId="7" w15:restartNumberingAfterBreak="0">
-    <w:nsid w:val="321D4140"/>
-    <w:multiLevelType w:val="hybridMultilevel"/>
-    <w:tmpl w:val="3E7CA19E"/>
-    <w:lvl w:ilvl="0" w:tplc="041F000F">
-      <w:start w:val="1"/>
-      <w:numFmt w:val="decimal"/>
-      <w:lvlText w:val="%1."/>
-      <w:lvlJc w:val="left"/>
-      <w:pPr>
-        <w:ind w:left="720" w:hanging="360"/>
-      </w:pPr>
-      <w:rPr>
-        <w:rFonts w:hint="default"/>
-      </w:rPr>
-    </w:lvl>
-    <w:lvl w:ilvl="1" w:tplc="041F0019" w:tentative="1">
-      <w:start w:val="1"/>
-      <w:numFmt w:val="lowerLetter"/>
-      <w:lvlText w:val="%2."/>
-      <w:lvlJc w:val="left"/>
-      <w:pPr>
-        <w:ind w:left="1440" w:hanging="360"/>
-      </w:pPr>
-    </w:lvl>
-    <w:lvl w:ilvl="2" w:tplc="041F001B" w:tentative="1">
-      <w:start w:val="1"/>
-      <w:numFmt w:val="lowerRoman"/>
-      <w:lvlText w:val="%3."/>
-      <w:lvlJc w:val="right"/>
-      <w:pPr>
-        <w:ind w:left="2160" w:hanging="180"/>
-      </w:pPr>
-    </w:lvl>
-    <w:lvl w:ilvl="3" w:tplc="041F000F" w:tentative="1">
-      <w:start w:val="1"/>
-      <w:numFmt w:val="decimal"/>
-      <w:lvlText w:val="%4."/>
-      <w:lvlJc w:val="left"/>
-      <w:pPr>
-        <w:ind w:left="2880" w:hanging="360"/>
-      </w:pPr>
-    </w:lvl>
-    <w:lvl w:ilvl="4" w:tplc="041F0019" w:tentative="1">
-      <w:start w:val="1"/>
-      <w:numFmt w:val="lowerLetter"/>
-      <w:lvlText w:val="%5."/>
-      <w:lvlJc w:val="left"/>
-      <w:pPr>
-        <w:ind w:left="3600" w:hanging="360"/>
-      </w:pPr>
-    </w:lvl>
-    <w:lvl w:ilvl="5" w:tplc="041F001B" w:tentative="1">
-      <w:start w:val="1"/>
-      <w:numFmt w:val="lowerRoman"/>
-      <w:lvlText w:val="%6."/>
-      <w:lvlJc w:val="right"/>
-      <w:pPr>
-        <w:ind w:left="4320" w:hanging="180"/>
-      </w:pPr>
-    </w:lvl>
-    <w:lvl w:ilvl="6" w:tplc="041F000F" w:tentative="1">
-      <w:start w:val="1"/>
-      <w:numFmt w:val="decimal"/>
-      <w:lvlText w:val="%7."/>
-      <w:lvlJc w:val="left"/>
-      <w:pPr>
-        <w:ind w:left="5040" w:hanging="360"/>
-      </w:pPr>
-    </w:lvl>
-    <w:lvl w:ilvl="7" w:tplc="041F0019" w:tentative="1">
-      <w:start w:val="1"/>
-      <w:numFmt w:val="lowerLetter"/>
-      <w:lvlText w:val="%8."/>
-      <w:lvlJc w:val="left"/>
-      <w:pPr>
-        <w:ind w:left="5760" w:hanging="360"/>
-      </w:pPr>
-    </w:lvl>
-    <w:lvl w:ilvl="8" w:tplc="041F001B" w:tentative="1">
-      <w:start w:val="1"/>
-      <w:numFmt w:val="lowerRoman"/>
-      <w:lvlText w:val="%9."/>
-      <w:lvlJc w:val="right"/>
-      <w:pPr>
-        <w:ind w:left="6480" w:hanging="180"/>
-      </w:pPr>
-    </w:lvl>
-  </w:abstractNum>
-  <w:abstractNum w:abstractNumId="8" w15:restartNumberingAfterBreak="0">
-    <w:nsid w:val="36354E43"/>
+    <w:nsid w:val="2D490C38"/>
     <w:multiLevelType w:val="multilevel"/>
-    <w:tmpl w:val="3AF2AC0C"/>
+    <w:tmpl w:val="E1749C3E"/>
     <w:lvl w:ilvl="0">
       <w:start w:val="1"/>
       <w:numFmt w:val="bullet"/>
@@ -22375,10 +22599,10 @@
       </w:rPr>
     </w:lvl>
   </w:abstractNum>
-  <w:abstractNum w:abstractNumId="9" w15:restartNumberingAfterBreak="0">
-    <w:nsid w:val="3D193969"/>
+  <w:abstractNum w:abstractNumId="8" w15:restartNumberingAfterBreak="0">
+    <w:nsid w:val="30AD1C62"/>
     <w:multiLevelType w:val="multilevel"/>
-    <w:tmpl w:val="81EEF018"/>
+    <w:tmpl w:val="371475F2"/>
     <w:lvl w:ilvl="0">
       <w:start w:val="1"/>
       <w:numFmt w:val="bullet"/>
@@ -22524,10 +22748,99 @@
       </w:rPr>
     </w:lvl>
   </w:abstractNum>
+  <w:abstractNum w:abstractNumId="9" w15:restartNumberingAfterBreak="0">
+    <w:nsid w:val="321D4140"/>
+    <w:multiLevelType w:val="hybridMultilevel"/>
+    <w:tmpl w:val="3E7CA19E"/>
+    <w:lvl w:ilvl="0" w:tplc="041F000F">
+      <w:start w:val="1"/>
+      <w:numFmt w:val="decimal"/>
+      <w:lvlText w:val="%1."/>
+      <w:lvlJc w:val="left"/>
+      <w:pPr>
+        <w:ind w:left="720" w:hanging="360"/>
+      </w:pPr>
+      <w:rPr>
+        <w:rFonts w:hint="default"/>
+      </w:rPr>
+    </w:lvl>
+    <w:lvl w:ilvl="1" w:tplc="041F0019" w:tentative="1">
+      <w:start w:val="1"/>
+      <w:numFmt w:val="lowerLetter"/>
+      <w:lvlText w:val="%2."/>
+      <w:lvlJc w:val="left"/>
+      <w:pPr>
+        <w:ind w:left="1440" w:hanging="360"/>
+      </w:pPr>
+    </w:lvl>
+    <w:lvl w:ilvl="2" w:tplc="041F001B" w:tentative="1">
+      <w:start w:val="1"/>
+      <w:numFmt w:val="lowerRoman"/>
+      <w:lvlText w:val="%3."/>
+      <w:lvlJc w:val="right"/>
+      <w:pPr>
+        <w:ind w:left="2160" w:hanging="180"/>
+      </w:pPr>
+    </w:lvl>
+    <w:lvl w:ilvl="3" w:tplc="041F000F" w:tentative="1">
+      <w:start w:val="1"/>
+      <w:numFmt w:val="decimal"/>
+      <w:lvlText w:val="%4."/>
+      <w:lvlJc w:val="left"/>
+      <w:pPr>
+        <w:ind w:left="2880" w:hanging="360"/>
+      </w:pPr>
+    </w:lvl>
+    <w:lvl w:ilvl="4" w:tplc="041F0019" w:tentative="1">
+      <w:start w:val="1"/>
+      <w:numFmt w:val="lowerLetter"/>
+      <w:lvlText w:val="%5."/>
+      <w:lvlJc w:val="left"/>
+      <w:pPr>
+        <w:ind w:left="3600" w:hanging="360"/>
+      </w:pPr>
+    </w:lvl>
+    <w:lvl w:ilvl="5" w:tplc="041F001B" w:tentative="1">
+      <w:start w:val="1"/>
+      <w:numFmt w:val="lowerRoman"/>
+      <w:lvlText w:val="%6."/>
+      <w:lvlJc w:val="right"/>
+      <w:pPr>
+        <w:ind w:left="4320" w:hanging="180"/>
+      </w:pPr>
+    </w:lvl>
+    <w:lvl w:ilvl="6" w:tplc="041F000F" w:tentative="1">
+      <w:start w:val="1"/>
+      <w:numFmt w:val="decimal"/>
+      <w:lvlText w:val="%7."/>
+      <w:lvlJc w:val="left"/>
+      <w:pPr>
+        <w:ind w:left="5040" w:hanging="360"/>
+      </w:pPr>
+    </w:lvl>
+    <w:lvl w:ilvl="7" w:tplc="041F0019" w:tentative="1">
+      <w:start w:val="1"/>
+      <w:numFmt w:val="lowerLetter"/>
+      <w:lvlText w:val="%8."/>
+      <w:lvlJc w:val="left"/>
+      <w:pPr>
+        <w:ind w:left="5760" w:hanging="360"/>
+      </w:pPr>
+    </w:lvl>
+    <w:lvl w:ilvl="8" w:tplc="041F001B" w:tentative="1">
+      <w:start w:val="1"/>
+      <w:numFmt w:val="lowerRoman"/>
+      <w:lvlText w:val="%9."/>
+      <w:lvlJc w:val="right"/>
+      <w:pPr>
+        <w:ind w:left="6480" w:hanging="180"/>
+      </w:pPr>
+    </w:lvl>
+  </w:abstractNum>
   <w:abstractNum w:abstractNumId="10" w15:restartNumberingAfterBreak="0">
-    <w:nsid w:val="3D733783"/>
+    <w:nsid w:val="36354E43"/>
     <w:multiLevelType w:val="multilevel"/>
-    <w:tmpl w:val="A6383A0C"/>
+    <w:tmpl w:val="3AF2AC0C"/>
     <w:lvl w:ilvl="0">
       <w:start w:val="1"/>
       <w:numFmt w:val="bullet"/>
@@ -22674,9 +22987,9 @@
     </w:lvl>
   </w:abstractNum>
   <w:abstractNum w:abstractNumId="11" w15:restartNumberingAfterBreak="0">
-    <w:nsid w:val="44D72C93"/>
+    <w:nsid w:val="3D193969"/>
     <w:multiLevelType w:val="multilevel"/>
-    <w:tmpl w:val="64604668"/>
+    <w:tmpl w:val="81EEF018"/>
     <w:lvl w:ilvl="0">
       <w:start w:val="1"/>
       <w:numFmt w:val="bullet"/>
@@ -22823,9 +23136,9 @@
     </w:lvl>
   </w:abstractNum>
   <w:abstractNum w:abstractNumId="12" w15:restartNumberingAfterBreak="0">
-    <w:nsid w:val="4DC845A1"/>
+    <w:nsid w:val="3D733783"/>
     <w:multiLevelType w:val="multilevel"/>
-    <w:tmpl w:val="EF786B8A"/>
+    <w:tmpl w:val="A6383A0C"/>
     <w:lvl w:ilvl="0">
       <w:start w:val="1"/>
       <w:numFmt w:val="bullet"/>
@@ -22972,9 +23285,9 @@
     </w:lvl>
   </w:abstractNum>
   <w:abstractNum w:abstractNumId="13" w15:restartNumberingAfterBreak="0">
-    <w:nsid w:val="63050202"/>
+    <w:nsid w:val="44D72C93"/>
     <w:multiLevelType w:val="multilevel"/>
-    <w:tmpl w:val="8D1E2ABC"/>
+    <w:tmpl w:val="64604668"/>
     <w:lvl w:ilvl="0">
       <w:start w:val="1"/>
       <w:numFmt w:val="bullet"/>
@@ -23121,9 +23434,9 @@
     </w:lvl>
   </w:abstractNum>
   <w:abstractNum w:abstractNumId="14" w15:restartNumberingAfterBreak="0">
-    <w:nsid w:val="6B0579E7"/>
+    <w:nsid w:val="4DC845A1"/>
     <w:multiLevelType w:val="multilevel"/>
-    <w:tmpl w:val="A8DA2166"/>
+    <w:tmpl w:val="EF786B8A"/>
     <w:lvl w:ilvl="0">
       <w:start w:val="1"/>
       <w:numFmt w:val="bullet"/>
@@ -23270,9 +23583,9 @@
     </w:lvl>
   </w:abstractNum>
   <w:abstractNum w:abstractNumId="15" w15:restartNumberingAfterBreak="0">
-    <w:nsid w:val="6CF718B0"/>
+    <w:nsid w:val="63050202"/>
     <w:multiLevelType w:val="multilevel"/>
-    <w:tmpl w:val="9C1416D6"/>
+    <w:tmpl w:val="8D1E2ABC"/>
     <w:lvl w:ilvl="0">
       <w:start w:val="1"/>
       <w:numFmt w:val="bullet"/>
@@ -23419,9 +23732,9 @@
     </w:lvl>
   </w:abstractNum>
   <w:abstractNum w:abstractNumId="16" w15:restartNumberingAfterBreak="0">
-    <w:nsid w:val="78733247"/>
+    <w:nsid w:val="6B0579E7"/>
     <w:multiLevelType w:val="multilevel"/>
-    <w:tmpl w:val="18361A16"/>
+    <w:tmpl w:val="A8DA2166"/>
     <w:lvl w:ilvl="0">
       <w:start w:val="1"/>
       <w:numFmt w:val="bullet"/>
@@ -23568,9 +23881,9 @@
     </w:lvl>
   </w:abstractNum>
   <w:abstractNum w:abstractNumId="17" w15:restartNumberingAfterBreak="0">
-    <w:nsid w:val="78940C2D"/>
+    <w:nsid w:val="6CF718B0"/>
     <w:multiLevelType w:val="multilevel"/>
-    <w:tmpl w:val="7A36FD2E"/>
+    <w:tmpl w:val="9C1416D6"/>
     <w:lvl w:ilvl="0">
       <w:start w:val="1"/>
       <w:numFmt w:val="bullet"/>
@@ -23716,59 +24029,363 @@
       </w:rPr>
     </w:lvl>
   </w:abstractNum>
+  <w:abstractNum w:abstractNumId="18" w15:restartNumberingAfterBreak="0">
+    <w:nsid w:val="78733247"/>
+    <w:multiLevelType w:val="multilevel"/>
+    <w:tmpl w:val="18361A16"/>
+    <w:lvl w:ilvl="0">
+      <w:start w:val="1"/>
+      <w:numFmt w:val="bullet"/>
+      <w:lvlText w:val=""/>
+      <w:lvlJc w:val="left"/>
+      <w:pPr>
+        <w:tabs>
+          <w:tab w:val="num" w:pos="720"/>
+        </w:tabs>
+        <w:ind w:left="720" w:hanging="360"/>
+      </w:pPr>
+      <w:rPr>
+        <w:rFonts w:ascii="Symbol" w:hAnsi="Symbol" w:hint="default"/>
+        <w:sz w:val="20"/>
+      </w:rPr>
+    </w:lvl>
+    <w:lvl w:ilvl="1" w:tentative="1">
+      <w:start w:val="1"/>
+      <w:numFmt w:val="bullet"/>
+      <w:lvlText w:val="o"/>
+      <w:lvlJc w:val="left"/>
+      <w:pPr>
+        <w:tabs>
+          <w:tab w:val="num" w:pos="1440"/>
+        </w:tabs>
+        <w:ind w:left="1440" w:hanging="360"/>
+      </w:pPr>
+      <w:rPr>
+        <w:rFonts w:ascii="Courier New" w:hAnsi="Courier New" w:hint="default"/>
+        <w:sz w:val="20"/>
+      </w:rPr>
+    </w:lvl>
+    <w:lvl w:ilvl="2" w:tentative="1">
+      <w:start w:val="1"/>
+      <w:numFmt w:val="bullet"/>
+      <w:lvlText w:val=""/>
+      <w:lvlJc w:val="left"/>
+      <w:pPr>
+        <w:tabs>
+          <w:tab w:val="num" w:pos="2160"/>
+        </w:tabs>
+        <w:ind w:left="2160" w:hanging="360"/>
+      </w:pPr>
+      <w:rPr>
+        <w:rFonts w:ascii="Wingdings" w:hAnsi="Wingdings" w:hint="default"/>
+        <w:sz w:val="20"/>
+      </w:rPr>
+    </w:lvl>
+    <w:lvl w:ilvl="3" w:tentative="1">
+      <w:start w:val="1"/>
+      <w:numFmt w:val="bullet"/>
+      <w:lvlText w:val=""/>
+      <w:lvlJc w:val="left"/>
+      <w:pPr>
+        <w:tabs>
+          <w:tab w:val="num" w:pos="2880"/>
+        </w:tabs>
+        <w:ind w:left="2880" w:hanging="360"/>
+      </w:pPr>
+      <w:rPr>
+        <w:rFonts w:ascii="Wingdings" w:hAnsi="Wingdings" w:hint="default"/>
+        <w:sz w:val="20"/>
+      </w:rPr>
+    </w:lvl>
+    <w:lvl w:ilvl="4" w:tentative="1">
+      <w:start w:val="1"/>
+      <w:numFmt w:val="bullet"/>
+      <w:lvlText w:val=""/>
+      <w:lvlJc w:val="left"/>
+      <w:pPr>
+        <w:tabs>
+          <w:tab w:val="num" w:pos="3600"/>
+        </w:tabs>
+        <w:ind w:left="3600" w:hanging="360"/>
+      </w:pPr>
+      <w:rPr>
+        <w:rFonts w:ascii="Wingdings" w:hAnsi="Wingdings" w:hint="default"/>
+        <w:sz w:val="20"/>
+      </w:rPr>
+    </w:lvl>
+    <w:lvl w:ilvl="5" w:tentative="1">
+      <w:start w:val="1"/>
+      <w:numFmt w:val="bullet"/>
+      <w:lvlText w:val=""/>
+      <w:lvlJc w:val="left"/>
+      <w:pPr>
+        <w:tabs>
+          <w:tab w:val="num" w:pos="4320"/>
+        </w:tabs>
+        <w:ind w:left="4320" w:hanging="360"/>
+      </w:pPr>
+      <w:rPr>
+        <w:rFonts w:ascii="Wingdings" w:hAnsi="Wingdings" w:hint="default"/>
+        <w:sz w:val="20"/>
+      </w:rPr>
+    </w:lvl>
+    <w:lvl w:ilvl="6" w:tentative="1">
+      <w:start w:val="1"/>
+      <w:numFmt w:val="bullet"/>
+      <w:lvlText w:val=""/>
+      <w:lvlJc w:val="left"/>
+      <w:pPr>
+        <w:tabs>
+          <w:tab w:val="num" w:pos="5040"/>
+        </w:tabs>
+        <w:ind w:left="5040" w:hanging="360"/>
+      </w:pPr>
+      <w:rPr>
+        <w:rFonts w:ascii="Wingdings" w:hAnsi="Wingdings" w:hint="default"/>
+        <w:sz w:val="20"/>
+      </w:rPr>
+    </w:lvl>
+    <w:lvl w:ilvl="7" w:tentative="1">
+      <w:start w:val="1"/>
+      <w:numFmt w:val="bullet"/>
+      <w:lvlText w:val=""/>
+      <w:lvlJc w:val="left"/>
+      <w:pPr>
+        <w:tabs>
+          <w:tab w:val="num" w:pos="5760"/>
+        </w:tabs>
+        <w:ind w:left="5760" w:hanging="360"/>
+      </w:pPr>
+      <w:rPr>
+        <w:rFonts w:ascii="Wingdings" w:hAnsi="Wingdings" w:hint="default"/>
+        <w:sz w:val="20"/>
+      </w:rPr>
+    </w:lvl>
+    <w:lvl w:ilvl="8" w:tentative="1">
+      <w:start w:val="1"/>
+      <w:numFmt w:val="bullet"/>
+      <w:lvlText w:val=""/>
+      <w:lvlJc w:val="left"/>
+      <w:pPr>
+        <w:tabs>
+          <w:tab w:val="num" w:pos="6480"/>
+        </w:tabs>
+        <w:ind w:left="6480" w:hanging="360"/>
+      </w:pPr>
+      <w:rPr>
+        <w:rFonts w:ascii="Wingdings" w:hAnsi="Wingdings" w:hint="default"/>
+        <w:sz w:val="20"/>
+      </w:rPr>
+    </w:lvl>
+  </w:abstractNum>
+  <w:abstractNum w:abstractNumId="19" w15:restartNumberingAfterBreak="0">
+    <w:nsid w:val="78940C2D"/>
+    <w:multiLevelType w:val="multilevel"/>
+    <w:tmpl w:val="7A36FD2E"/>
+    <w:lvl w:ilvl="0">
+      <w:start w:val="1"/>
+      <w:numFmt w:val="bullet"/>
+      <w:lvlText w:val=""/>
+      <w:lvlJc w:val="left"/>
+      <w:pPr>
+        <w:tabs>
+          <w:tab w:val="num" w:pos="720"/>
+        </w:tabs>
+        <w:ind w:left="720" w:hanging="360"/>
+      </w:pPr>
+      <w:rPr>
+        <w:rFonts w:ascii="Symbol" w:hAnsi="Symbol" w:hint="default"/>
+        <w:sz w:val="20"/>
+      </w:rPr>
+    </w:lvl>
+    <w:lvl w:ilvl="1" w:tentative="1">
+      <w:start w:val="1"/>
+      <w:numFmt w:val="bullet"/>
+      <w:lvlText w:val="o"/>
+      <w:lvlJc w:val="left"/>
+      <w:pPr>
+        <w:tabs>
+          <w:tab w:val="num" w:pos="1440"/>
+        </w:tabs>
+        <w:ind w:left="1440" w:hanging="360"/>
+      </w:pPr>
+      <w:rPr>
+        <w:rFonts w:ascii="Courier New" w:hAnsi="Courier New" w:hint="default"/>
+        <w:sz w:val="20"/>
+      </w:rPr>
+    </w:lvl>
+    <w:lvl w:ilvl="2" w:tentative="1">
+      <w:start w:val="1"/>
+      <w:numFmt w:val="bullet"/>
+      <w:lvlText w:val=""/>
+      <w:lvlJc w:val="left"/>
+      <w:pPr>
+        <w:tabs>
+          <w:tab w:val="num" w:pos="2160"/>
+        </w:tabs>
+        <w:ind w:left="2160" w:hanging="360"/>
+      </w:pPr>
+      <w:rPr>
+        <w:rFonts w:ascii="Wingdings" w:hAnsi="Wingdings" w:hint="default"/>
+        <w:sz w:val="20"/>
+      </w:rPr>
+    </w:lvl>
+    <w:lvl w:ilvl="3" w:tentative="1">
+      <w:start w:val="1"/>
+      <w:numFmt w:val="bullet"/>
+      <w:lvlText w:val=""/>
+      <w:lvlJc w:val="left"/>
+      <w:pPr>
+        <w:tabs>
+          <w:tab w:val="num" w:pos="2880"/>
+        </w:tabs>
+        <w:ind w:left="2880" w:hanging="360"/>
+      </w:pPr>
+      <w:rPr>
+        <w:rFonts w:ascii="Wingdings" w:hAnsi="Wingdings" w:hint="default"/>
+        <w:sz w:val="20"/>
+      </w:rPr>
+    </w:lvl>
+    <w:lvl w:ilvl="4" w:tentative="1">
+      <w:start w:val="1"/>
+      <w:numFmt w:val="bullet"/>
+      <w:lvlText w:val=""/>
+      <w:lvlJc w:val="left"/>
+      <w:pPr>
+        <w:tabs>
+          <w:tab w:val="num" w:pos="3600"/>
+        </w:tabs>
+        <w:ind w:left="3600" w:hanging="360"/>
+      </w:pPr>
+      <w:rPr>
+        <w:rFonts w:ascii="Wingdings" w:hAnsi="Wingdings" w:hint="default"/>
+        <w:sz w:val="20"/>
+      </w:rPr>
+    </w:lvl>
+    <w:lvl w:ilvl="5" w:tentative="1">
+      <w:start w:val="1"/>
+      <w:numFmt w:val="bullet"/>
+      <w:lvlText w:val=""/>
+      <w:lvlJc w:val="left"/>
+      <w:pPr>
+        <w:tabs>
+          <w:tab w:val="num" w:pos="4320"/>
+        </w:tabs>
+        <w:ind w:left="4320" w:hanging="360"/>
+      </w:pPr>
+      <w:rPr>
+        <w:rFonts w:ascii="Wingdings" w:hAnsi="Wingdings" w:hint="default"/>
+        <w:sz w:val="20"/>
+      </w:rPr>
+    </w:lvl>
+    <w:lvl w:ilvl="6" w:tentative="1">
+      <w:start w:val="1"/>
+      <w:numFmt w:val="bullet"/>
+      <w:lvlText w:val=""/>
+      <w:lvlJc w:val="left"/>
+      <w:pPr>
+        <w:tabs>
+          <w:tab w:val="num" w:pos="5040"/>
+        </w:tabs>
+        <w:ind w:left="5040" w:hanging="360"/>
+      </w:pPr>
+      <w:rPr>
+        <w:rFonts w:ascii="Wingdings" w:hAnsi="Wingdings" w:hint="default"/>
+        <w:sz w:val="20"/>
+      </w:rPr>
+    </w:lvl>
+    <w:lvl w:ilvl="7" w:tentative="1">
+      <w:start w:val="1"/>
+      <w:numFmt w:val="bullet"/>
+      <w:lvlText w:val=""/>
+      <w:lvlJc w:val="left"/>
+      <w:pPr>
+        <w:tabs>
+          <w:tab w:val="num" w:pos="5760"/>
+        </w:tabs>
+        <w:ind w:left="5760" w:hanging="360"/>
+      </w:pPr>
+      <w:rPr>
+        <w:rFonts w:ascii="Wingdings" w:hAnsi="Wingdings" w:hint="default"/>
+        <w:sz w:val="20"/>
+      </w:rPr>
+    </w:lvl>
+    <w:lvl w:ilvl="8" w:tentative="1">
+      <w:start w:val="1"/>
+      <w:numFmt w:val="bullet"/>
+      <w:lvlText w:val=""/>
+      <w:lvlJc w:val="left"/>
+      <w:pPr>
+        <w:tabs>
+          <w:tab w:val="num" w:pos="6480"/>
+        </w:tabs>
+        <w:ind w:left="6480" w:hanging="360"/>
+      </w:pPr>
+      <w:rPr>
+        <w:rFonts w:ascii="Wingdings" w:hAnsi="Wingdings" w:hint="default"/>
+        <w:sz w:val="20"/>
+      </w:rPr>
+    </w:lvl>
+  </w:abstractNum>
   <w:num w:numId="1" w16cid:durableId="320813693">
-    <w:abstractNumId w:val="3"/>
+    <w:abstractNumId w:val="4"/>
   </w:num>
   <w:num w:numId="2" w16cid:durableId="680281116">
-    <w:abstractNumId w:val="7"/>
+    <w:abstractNumId w:val="9"/>
   </w:num>
   <w:num w:numId="3" w16cid:durableId="1288438365">
-    <w:abstractNumId w:val="11"/>
+    <w:abstractNumId w:val="13"/>
   </w:num>
   <w:num w:numId="4" w16cid:durableId="1155562159">
-    <w:abstractNumId w:val="14"/>
+    <w:abstractNumId w:val="16"/>
   </w:num>
   <w:num w:numId="5" w16cid:durableId="1958020517">
-    <w:abstractNumId w:val="13"/>
+    <w:abstractNumId w:val="15"/>
   </w:num>
   <w:num w:numId="6" w16cid:durableId="1596940668">
-    <w:abstractNumId w:val="8"/>
+    <w:abstractNumId w:val="10"/>
   </w:num>
   <w:num w:numId="7" w16cid:durableId="1579166471">
     <w:abstractNumId w:val="0"/>
   </w:num>
   <w:num w:numId="8" w16cid:durableId="753748469">
+    <w:abstractNumId w:val="19"/>
+  </w:num>
+  <w:num w:numId="9" w16cid:durableId="604701249">
+    <w:abstractNumId w:val="18"/>
+  </w:num>
+  <w:num w:numId="10" w16cid:durableId="1503279606">
+    <w:abstractNumId w:val="6"/>
+  </w:num>
+  <w:num w:numId="11" w16cid:durableId="785000340">
+    <w:abstractNumId w:val="12"/>
+  </w:num>
+  <w:num w:numId="12" w16cid:durableId="290215297">
+    <w:abstractNumId w:val="14"/>
+  </w:num>
+  <w:num w:numId="13" w16cid:durableId="1160194568">
     <w:abstractNumId w:val="17"/>
   </w:num>
-  <w:num w:numId="9" w16cid:durableId="604701249">
-    <w:abstractNumId w:val="16"/>
-  </w:num>
-  <w:num w:numId="10" w16cid:durableId="1503279606">
-    <w:abstractNumId w:val="5"/>
-  </w:num>
-  <w:num w:numId="11" w16cid:durableId="785000340">
-    <w:abstractNumId w:val="10"/>
-  </w:num>
-  <w:num w:numId="12" w16cid:durableId="290215297">
-    <w:abstractNumId w:val="12"/>
-  </w:num>
-  <w:num w:numId="13" w16cid:durableId="1160194568">
-    <w:abstractNumId w:val="15"/>
-  </w:num>
   <w:num w:numId="14" w16cid:durableId="1407336860">
-    <w:abstractNumId w:val="6"/>
+    <w:abstractNumId w:val="7"/>
   </w:num>
   <w:num w:numId="15" w16cid:durableId="797989056">
-    <w:abstractNumId w:val="9"/>
+    <w:abstractNumId w:val="11"/>
   </w:num>
   <w:num w:numId="16" w16cid:durableId="866019238">
-    <w:abstractNumId w:val="2"/>
+    <w:abstractNumId w:val="3"/>
   </w:num>
   <w:num w:numId="17" w16cid:durableId="1782452779">
-    <w:abstractNumId w:val="4"/>
+    <w:abstractNumId w:val="5"/>
   </w:num>
   <w:num w:numId="18" w16cid:durableId="2037387320">
     <w:abstractNumId w:val="1"/>
+  </w:num>
+  <w:num w:numId="19" w16cid:durableId="504443146">
+    <w:abstractNumId w:val="8"/>
+  </w:num>
+  <w:num w:numId="20" w16cid:durableId="16588099">
+    <w:abstractNumId w:val="2"/>
   </w:num>
 </w:numbering>
 </file>

</xml_diff>

<commit_message>
Sprint 9 - Commit 5: Refactor hybrid forecasting architecture
</commit_message>
<xml_diff>
--- a/docs/draft/development_flow.docx
+++ b/docs/draft/development_flow.docx
@@ -21395,6 +21395,718 @@
         </w:rPr>
       </w:pPr>
     </w:p>
+    <w:p>
+      <w:pPr>
+        <w:spacing w:after="0" w:line="240" w:lineRule="auto"/>
+        <w:rPr>
+          <w:noProof/>
+          <w:sz w:val="24"/>
+          <w:szCs w:val="24"/>
+          <w:lang w:val="tr-TR"/>
+        </w:rPr>
+      </w:pPr>
+    </w:p>
+    <w:p>
+      <w:pPr>
+        <w:rPr>
+          <w:noProof/>
+          <w:sz w:val="24"/>
+          <w:szCs w:val="24"/>
+          <w:lang w:val="tr-TR"/>
+        </w:rPr>
+      </w:pPr>
+      <w:r>
+        <w:rPr>
+          <w:noProof/>
+          <w:sz w:val="24"/>
+          <w:szCs w:val="24"/>
+          <w:lang w:val="tr-TR"/>
+        </w:rPr>
+        <w:br w:type="page"/>
+      </w:r>
+    </w:p>
+    <w:p>
+      <w:pPr>
+        <w:spacing w:after="0" w:line="240" w:lineRule="auto"/>
+        <w:rPr>
+          <w:noProof/>
+          <w:sz w:val="32"/>
+          <w:szCs w:val="32"/>
+          <w:lang w:val="tr-TR"/>
+        </w:rPr>
+      </w:pPr>
+      <w:r>
+        <w:rPr>
+          <w:b/>
+          <w:bCs/>
+          <w:noProof/>
+          <w:sz w:val="32"/>
+          <w:szCs w:val="32"/>
+          <w:lang w:val="tr-TR"/>
+        </w:rPr>
+        <w:lastRenderedPageBreak/>
+        <w:t>zenerestimation/forecasting/kalman_filter.py</w:t>
+      </w:r>
+    </w:p>
+    <w:p>
+      <w:pPr>
+        <w:spacing w:after="0" w:line="240" w:lineRule="auto"/>
+        <w:rPr>
+          <w:noProof/>
+          <w:sz w:val="24"/>
+          <w:szCs w:val="24"/>
+          <w:lang w:val="tr-TR"/>
+        </w:rPr>
+      </w:pPr>
+    </w:p>
+    <w:p>
+      <w:pPr>
+        <w:spacing w:after="0" w:line="240" w:lineRule="auto"/>
+        <w:rPr>
+          <w:noProof/>
+          <w:sz w:val="24"/>
+          <w:szCs w:val="24"/>
+          <w:u w:val="single"/>
+          <w:lang w:val="tr-TR"/>
+        </w:rPr>
+      </w:pPr>
+      <w:r>
+        <w:rPr>
+          <w:noProof/>
+          <w:sz w:val="24"/>
+          <w:szCs w:val="24"/>
+          <w:u w:val="single"/>
+          <w:lang w:val="tr-TR"/>
+        </w:rPr>
+        <w:t>This first part contains:</w:t>
+      </w:r>
+    </w:p>
+    <w:p>
+      <w:pPr>
+        <w:spacing w:after="0" w:line="240" w:lineRule="auto"/>
+        <w:rPr>
+          <w:noProof/>
+          <w:sz w:val="24"/>
+          <w:szCs w:val="24"/>
+          <w:lang w:val="tr-TR"/>
+        </w:rPr>
+      </w:pPr>
+    </w:p>
+    <w:p>
+      <w:pPr>
+        <w:spacing w:after="0" w:line="240" w:lineRule="auto"/>
+        <w:rPr>
+          <w:noProof/>
+          <w:sz w:val="24"/>
+          <w:szCs w:val="24"/>
+          <w:lang w:val="tr-TR"/>
+        </w:rPr>
+      </w:pPr>
+      <w:r>
+        <w:rPr>
+          <w:noProof/>
+          <w:sz w:val="24"/>
+          <w:szCs w:val="24"/>
+          <w:lang w:val="tr-TR"/>
+        </w:rPr>
+        <w:t xml:space="preserve">  imports </w:t>
+      </w:r>
+    </w:p>
+    <w:p>
+      <w:pPr>
+        <w:spacing w:after="0" w:line="240" w:lineRule="auto"/>
+        <w:rPr>
+          <w:noProof/>
+          <w:sz w:val="24"/>
+          <w:szCs w:val="24"/>
+          <w:lang w:val="tr-TR"/>
+        </w:rPr>
+      </w:pPr>
+      <w:r>
+        <w:rPr>
+          <w:noProof/>
+          <w:sz w:val="24"/>
+          <w:szCs w:val="24"/>
+          <w:lang w:val="tr-TR"/>
+        </w:rPr>
+        <w:t xml:space="preserve">  class definition </w:t>
+      </w:r>
+    </w:p>
+    <w:p>
+      <w:pPr>
+        <w:spacing w:after="0" w:line="240" w:lineRule="auto"/>
+        <w:rPr>
+          <w:noProof/>
+          <w:sz w:val="24"/>
+          <w:szCs w:val="24"/>
+          <w:lang w:val="tr-TR"/>
+        </w:rPr>
+      </w:pPr>
+      <w:r>
+        <w:rPr>
+          <w:noProof/>
+          <w:sz w:val="24"/>
+          <w:szCs w:val="24"/>
+          <w:lang w:val="tr-TR"/>
+        </w:rPr>
+        <w:t xml:space="preserve">  constructor </w:t>
+      </w:r>
+    </w:p>
+    <w:p>
+      <w:pPr>
+        <w:spacing w:after="0" w:line="240" w:lineRule="auto"/>
+        <w:rPr>
+          <w:noProof/>
+          <w:sz w:val="24"/>
+          <w:szCs w:val="24"/>
+          <w:lang w:val="tr-TR"/>
+        </w:rPr>
+      </w:pPr>
+      <w:r>
+        <w:rPr>
+          <w:noProof/>
+          <w:sz w:val="24"/>
+          <w:szCs w:val="24"/>
+          <w:lang w:val="tr-TR"/>
+        </w:rPr>
+        <w:t xml:space="preserve">  state initialization </w:t>
+      </w:r>
+    </w:p>
+    <w:p>
+      <w:pPr>
+        <w:spacing w:after="0" w:line="240" w:lineRule="auto"/>
+        <w:rPr>
+          <w:noProof/>
+          <w:sz w:val="24"/>
+          <w:szCs w:val="24"/>
+          <w:lang w:val="tr-TR"/>
+        </w:rPr>
+      </w:pPr>
+      <w:r>
+        <w:rPr>
+          <w:noProof/>
+          <w:sz w:val="24"/>
+          <w:szCs w:val="24"/>
+          <w:lang w:val="tr-TR"/>
+        </w:rPr>
+        <w:t xml:space="preserve">  transition matrix </w:t>
+      </w:r>
+    </w:p>
+    <w:p>
+      <w:pPr>
+        <w:spacing w:after="0" w:line="240" w:lineRule="auto"/>
+        <w:rPr>
+          <w:noProof/>
+          <w:sz w:val="24"/>
+          <w:szCs w:val="24"/>
+          <w:lang w:val="tr-TR"/>
+        </w:rPr>
+      </w:pPr>
+      <w:r>
+        <w:rPr>
+          <w:noProof/>
+          <w:sz w:val="24"/>
+          <w:szCs w:val="24"/>
+          <w:lang w:val="tr-TR"/>
+        </w:rPr>
+        <w:t>  measurement matrix</w:t>
+      </w:r>
+    </w:p>
+    <w:p>
+      <w:pPr>
+        <w:spacing w:after="0" w:line="240" w:lineRule="auto"/>
+        <w:rPr>
+          <w:noProof/>
+          <w:sz w:val="24"/>
+          <w:szCs w:val="24"/>
+          <w:lang w:val="tr-TR"/>
+        </w:rPr>
+      </w:pPr>
+    </w:p>
+    <w:p>
+      <w:pPr>
+        <w:spacing w:after="0" w:line="240" w:lineRule="auto"/>
+        <w:rPr>
+          <w:noProof/>
+          <w:sz w:val="24"/>
+          <w:szCs w:val="24"/>
+          <w:lang w:val="tr-TR"/>
+        </w:rPr>
+      </w:pPr>
+    </w:p>
+    <w:p>
+      <w:pPr>
+        <w:spacing w:after="0" w:line="240" w:lineRule="auto"/>
+        <w:rPr>
+          <w:b/>
+          <w:bCs/>
+          <w:noProof/>
+          <w:sz w:val="32"/>
+          <w:szCs w:val="32"/>
+          <w:lang w:val="tr-TR"/>
+        </w:rPr>
+      </w:pPr>
+      <w:r>
+        <w:rPr>
+          <w:b/>
+          <w:bCs/>
+          <w:noProof/>
+          <w:sz w:val="32"/>
+          <w:szCs w:val="32"/>
+          <w:lang w:val="tr-TR"/>
+        </w:rPr>
+        <w:t>Instead of</w:t>
+      </w:r>
+      <w:r>
+        <w:rPr>
+          <w:b/>
+          <w:bCs/>
+          <w:noProof/>
+          <w:sz w:val="32"/>
+          <w:szCs w:val="32"/>
+          <w:lang w:val="tr-TR"/>
+        </w:rPr>
+        <w:t>:</w:t>
+      </w:r>
+    </w:p>
+    <w:p>
+      <w:pPr>
+        <w:spacing w:after="0" w:line="240" w:lineRule="auto"/>
+        <w:rPr>
+          <w:noProof/>
+          <w:sz w:val="24"/>
+          <w:szCs w:val="24"/>
+          <w:lang w:val="tr-TR"/>
+        </w:rPr>
+      </w:pPr>
+      <w:r>
+        <w:rPr>
+          <w:noProof/>
+          <w:sz w:val="24"/>
+          <w:szCs w:val="24"/>
+          <w:lang w:val="tr-TR"/>
+        </w:rPr>
+        <w:t>Forecast model</w:t>
+      </w:r>
+    </w:p>
+    <w:p>
+      <w:pPr>
+        <w:spacing w:after="0" w:line="240" w:lineRule="auto"/>
+        <w:rPr>
+          <w:noProof/>
+          <w:sz w:val="24"/>
+          <w:szCs w:val="24"/>
+          <w:lang w:val="tr-TR"/>
+        </w:rPr>
+      </w:pPr>
+      <w:r>
+        <w:rPr>
+          <w:noProof/>
+          <w:sz w:val="24"/>
+          <w:szCs w:val="24"/>
+          <w:lang w:val="tr-TR"/>
+        </w:rPr>
+        <w:t xml:space="preserve">       </w:t>
+      </w:r>
+      <w:r>
+        <w:rPr>
+          <w:noProof/>
+          <w:sz w:val="24"/>
+          <w:szCs w:val="24"/>
+          <w:lang w:val="tr-TR"/>
+        </w:rPr>
+        <w:t xml:space="preserve">   </w:t>
+      </w:r>
+      <w:r>
+        <w:rPr>
+          <w:noProof/>
+          <w:sz w:val="24"/>
+          <w:szCs w:val="24"/>
+          <w:lang w:val="tr-TR"/>
+        </w:rPr>
+        <w:t>│</w:t>
+      </w:r>
+    </w:p>
+    <w:p>
+      <w:pPr>
+        <w:spacing w:after="0" w:line="240" w:lineRule="auto"/>
+        <w:rPr>
+          <w:noProof/>
+          <w:sz w:val="24"/>
+          <w:szCs w:val="24"/>
+          <w:lang w:val="tr-TR"/>
+        </w:rPr>
+      </w:pPr>
+      <w:r>
+        <w:rPr>
+          <w:noProof/>
+          <w:sz w:val="24"/>
+          <w:szCs w:val="24"/>
+          <w:lang w:val="tr-TR"/>
+        </w:rPr>
+        <w:t>Trend model</w:t>
+      </w:r>
+    </w:p>
+    <w:p>
+      <w:pPr>
+        <w:spacing w:after="0" w:line="240" w:lineRule="auto"/>
+        <w:rPr>
+          <w:noProof/>
+          <w:sz w:val="24"/>
+          <w:szCs w:val="24"/>
+          <w:lang w:val="tr-TR"/>
+        </w:rPr>
+      </w:pPr>
+      <w:r>
+        <w:rPr>
+          <w:noProof/>
+          <w:sz w:val="24"/>
+          <w:szCs w:val="24"/>
+          <w:lang w:val="tr-TR"/>
+        </w:rPr>
+        <w:t xml:space="preserve">       </w:t>
+      </w:r>
+      <w:r>
+        <w:rPr>
+          <w:noProof/>
+          <w:sz w:val="24"/>
+          <w:szCs w:val="24"/>
+          <w:lang w:val="tr-TR"/>
+        </w:rPr>
+        <w:t xml:space="preserve">  </w:t>
+      </w:r>
+      <w:r>
+        <w:rPr>
+          <w:noProof/>
+          <w:sz w:val="24"/>
+          <w:szCs w:val="24"/>
+          <w:lang w:val="tr-TR"/>
+        </w:rPr>
+        <w:t xml:space="preserve"> │</w:t>
+      </w:r>
+    </w:p>
+    <w:p>
+      <w:pPr>
+        <w:spacing w:after="0" w:line="240" w:lineRule="auto"/>
+        <w:rPr>
+          <w:noProof/>
+          <w:sz w:val="24"/>
+          <w:szCs w:val="24"/>
+          <w:lang w:val="tr-TR"/>
+        </w:rPr>
+      </w:pPr>
+      <w:r>
+        <w:rPr>
+          <w:noProof/>
+          <w:sz w:val="24"/>
+          <w:szCs w:val="24"/>
+          <w:lang w:val="tr-TR"/>
+        </w:rPr>
+        <w:t>Residual model</w:t>
+      </w:r>
+    </w:p>
+    <w:p>
+      <w:pPr>
+        <w:spacing w:after="0" w:line="240" w:lineRule="auto"/>
+        <w:rPr>
+          <w:noProof/>
+          <w:sz w:val="24"/>
+          <w:szCs w:val="24"/>
+          <w:lang w:val="tr-TR"/>
+        </w:rPr>
+      </w:pPr>
+    </w:p>
+    <w:p>
+      <w:pPr>
+        <w:spacing w:after="0" w:line="240" w:lineRule="auto"/>
+        <w:rPr>
+          <w:b/>
+          <w:bCs/>
+          <w:noProof/>
+          <w:sz w:val="32"/>
+          <w:szCs w:val="32"/>
+          <w:lang w:val="tr-TR"/>
+        </w:rPr>
+      </w:pPr>
+      <w:r>
+        <w:rPr>
+          <w:b/>
+          <w:bCs/>
+          <w:noProof/>
+          <w:sz w:val="32"/>
+          <w:szCs w:val="32"/>
+          <w:lang w:val="tr-TR"/>
+        </w:rPr>
+        <w:t>Model Pipeline</w:t>
+      </w:r>
+      <w:r>
+        <w:rPr>
+          <w:b/>
+          <w:bCs/>
+          <w:noProof/>
+          <w:sz w:val="32"/>
+          <w:szCs w:val="32"/>
+          <w:lang w:val="tr-TR"/>
+        </w:rPr>
+        <w:t>:</w:t>
+      </w:r>
+    </w:p>
+    <w:p>
+      <w:pPr>
+        <w:spacing w:after="0" w:line="240" w:lineRule="auto"/>
+        <w:rPr>
+          <w:noProof/>
+          <w:sz w:val="24"/>
+          <w:szCs w:val="24"/>
+          <w:lang w:val="tr-TR"/>
+        </w:rPr>
+      </w:pPr>
+      <w:r>
+        <w:rPr>
+          <w:noProof/>
+          <w:sz w:val="24"/>
+          <w:szCs w:val="24"/>
+          <w:lang w:val="tr-TR"/>
+        </w:rPr>
+        <w:t>Hybrid forecaster</w:t>
+      </w:r>
+    </w:p>
+    <w:p>
+      <w:pPr>
+        <w:spacing w:after="0" w:line="240" w:lineRule="auto"/>
+        <w:rPr>
+          <w:noProof/>
+          <w:sz w:val="24"/>
+          <w:szCs w:val="24"/>
+          <w:lang w:val="tr-TR"/>
+        </w:rPr>
+      </w:pPr>
+      <w:r>
+        <w:rPr>
+          <w:noProof/>
+          <w:sz w:val="24"/>
+          <w:szCs w:val="24"/>
+          <w:lang w:val="tr-TR"/>
+        </w:rPr>
+        <w:t xml:space="preserve">        </w:t>
+      </w:r>
+      <w:r>
+        <w:rPr>
+          <w:noProof/>
+          <w:sz w:val="24"/>
+          <w:szCs w:val="24"/>
+          <w:lang w:val="tr-TR"/>
+        </w:rPr>
+        <w:t xml:space="preserve">  </w:t>
+      </w:r>
+      <w:r>
+        <w:rPr>
+          <w:noProof/>
+          <w:sz w:val="24"/>
+          <w:szCs w:val="24"/>
+          <w:lang w:val="tr-TR"/>
+        </w:rPr>
+        <w:t>│</w:t>
+      </w:r>
+    </w:p>
+    <w:p>
+      <w:pPr>
+        <w:spacing w:after="0" w:line="240" w:lineRule="auto"/>
+        <w:rPr>
+          <w:b/>
+          <w:bCs/>
+          <w:noProof/>
+          <w:sz w:val="24"/>
+          <w:szCs w:val="24"/>
+          <w:lang w:val="tr-TR"/>
+        </w:rPr>
+      </w:pPr>
+      <w:r>
+        <w:rPr>
+          <w:b/>
+          <w:bCs/>
+          <w:noProof/>
+          <w:sz w:val="24"/>
+          <w:szCs w:val="24"/>
+          <w:lang w:val="tr-TR"/>
+        </w:rPr>
+        <w:t>Trend extractor</w:t>
+      </w:r>
+    </w:p>
+    <w:p>
+      <w:pPr>
+        <w:spacing w:after="0" w:line="240" w:lineRule="auto"/>
+        <w:rPr>
+          <w:noProof/>
+          <w:sz w:val="24"/>
+          <w:szCs w:val="24"/>
+          <w:lang w:val="tr-TR"/>
+        </w:rPr>
+      </w:pPr>
+      <w:r>
+        <w:rPr>
+          <w:noProof/>
+          <w:sz w:val="24"/>
+          <w:szCs w:val="24"/>
+          <w:lang w:val="tr-TR"/>
+        </w:rPr>
+        <w:t xml:space="preserve">        </w:t>
+      </w:r>
+      <w:r>
+        <w:rPr>
+          <w:noProof/>
+          <w:sz w:val="24"/>
+          <w:szCs w:val="24"/>
+          <w:lang w:val="tr-TR"/>
+        </w:rPr>
+        <w:t xml:space="preserve">  </w:t>
+      </w:r>
+      <w:r>
+        <w:rPr>
+          <w:noProof/>
+          <w:sz w:val="24"/>
+          <w:szCs w:val="24"/>
+          <w:lang w:val="tr-TR"/>
+        </w:rPr>
+        <w:t>│</w:t>
+      </w:r>
+    </w:p>
+    <w:p>
+      <w:pPr>
+        <w:spacing w:after="0" w:line="240" w:lineRule="auto"/>
+        <w:rPr>
+          <w:b/>
+          <w:bCs/>
+          <w:noProof/>
+          <w:sz w:val="24"/>
+          <w:szCs w:val="24"/>
+          <w:lang w:val="tr-TR"/>
+        </w:rPr>
+      </w:pPr>
+      <w:r>
+        <w:rPr>
+          <w:b/>
+          <w:bCs/>
+          <w:noProof/>
+          <w:sz w:val="24"/>
+          <w:szCs w:val="24"/>
+          <w:lang w:val="tr-TR"/>
+        </w:rPr>
+        <w:t>Residual forecaster</w:t>
+      </w:r>
+    </w:p>
+    <w:p>
+      <w:pPr>
+        <w:spacing w:after="0" w:line="240" w:lineRule="auto"/>
+        <w:rPr>
+          <w:noProof/>
+          <w:sz w:val="24"/>
+          <w:szCs w:val="24"/>
+          <w:lang w:val="tr-TR"/>
+        </w:rPr>
+      </w:pPr>
+    </w:p>
+    <w:p>
+      <w:pPr>
+        <w:spacing w:after="0" w:line="240" w:lineRule="auto"/>
+        <w:rPr>
+          <w:noProof/>
+          <w:sz w:val="24"/>
+          <w:szCs w:val="24"/>
+          <w:lang w:val="tr-TR"/>
+        </w:rPr>
+      </w:pPr>
+      <w:r>
+        <w:rPr>
+          <w:noProof/>
+          <w:sz w:val="24"/>
+          <w:szCs w:val="24"/>
+          <w:lang w:val="tr-TR"/>
+        </w:rPr>
+        <w:t>where</w:t>
+      </w:r>
+    </w:p>
+    <w:p>
+      <w:pPr>
+        <w:numPr>
+          <w:ilvl w:val="0"/>
+          <w:numId w:val="21"/>
+        </w:numPr>
+        <w:spacing w:after="0" w:line="240" w:lineRule="auto"/>
+        <w:rPr>
+          <w:noProof/>
+          <w:sz w:val="24"/>
+          <w:szCs w:val="24"/>
+          <w:lang w:val="tr-TR"/>
+        </w:rPr>
+      </w:pPr>
+      <w:r>
+        <w:rPr>
+          <w:b/>
+          <w:bCs/>
+          <w:noProof/>
+          <w:sz w:val="24"/>
+          <w:szCs w:val="24"/>
+          <w:lang w:val="tr-TR"/>
+        </w:rPr>
+        <w:t>Trend extractor</w:t>
+      </w:r>
+      <w:r>
+        <w:rPr>
+          <w:noProof/>
+          <w:sz w:val="24"/>
+          <w:szCs w:val="24"/>
+          <w:lang w:val="tr-TR"/>
+        </w:rPr>
+        <w:t xml:space="preserve"> → Linear regression, Kalman filter, polynomial fit, STL decomposition, etc. </w:t>
+      </w:r>
+    </w:p>
+    <w:p>
+      <w:pPr>
+        <w:numPr>
+          <w:ilvl w:val="0"/>
+          <w:numId w:val="21"/>
+        </w:numPr>
+        <w:spacing w:after="0" w:line="240" w:lineRule="auto"/>
+        <w:rPr>
+          <w:noProof/>
+          <w:sz w:val="24"/>
+          <w:szCs w:val="24"/>
+          <w:lang w:val="tr-TR"/>
+        </w:rPr>
+      </w:pPr>
+      <w:r>
+        <w:rPr>
+          <w:b/>
+          <w:bCs/>
+          <w:noProof/>
+          <w:sz w:val="24"/>
+          <w:szCs w:val="24"/>
+          <w:lang w:val="tr-TR"/>
+        </w:rPr>
+        <w:t>Residual forecaster</w:t>
+      </w:r>
+      <w:r>
+        <w:rPr>
+          <w:noProof/>
+          <w:sz w:val="24"/>
+          <w:szCs w:val="24"/>
+          <w:lang w:val="tr-TR"/>
+        </w:rPr>
+        <w:t xml:space="preserve"> → LSTM, GRU, Transformer, ARIMA, etc.</w:t>
+      </w:r>
+    </w:p>
+    <w:p>
+      <w:pPr>
+        <w:spacing w:after="0" w:line="240" w:lineRule="auto"/>
+        <w:rPr>
+          <w:noProof/>
+          <w:sz w:val="24"/>
+          <w:szCs w:val="24"/>
+          <w:lang w:val="tr-TR"/>
+        </w:rPr>
+      </w:pPr>
+    </w:p>
     <w:sectPr>
       <w:pgSz w:w="11906" w:h="16838"/>
       <w:pgMar w:top="1417" w:right="1417" w:bottom="1417" w:left="1417" w:header="708" w:footer="708" w:gutter="0"/>
@@ -21408,9 +22120,9 @@
 <file path=word/numbering.xml><?xml version="1.0" encoding="utf-8"?>
 <w:numbering xmlns:wpc="http://schemas.microsoft.com/office/word/2010/wordprocessingCanvas" xmlns:cx="http://schemas.microsoft.com/office/drawing/2014/chartex" xmlns:cx1="http://schemas.microsoft.com/office/drawing/2015/9/8/chartex" xmlns:cx2="http://schemas.microsoft.com/office/drawing/2015/10/21/chartex" xmlns:cx3="http://schemas.microsoft.com/office/drawing/2016/5/9/chartex" xmlns:cx4="http://schemas.microsoft.com/office/drawing/2016/5/10/chartex" xmlns:cx5="http://schemas.microsoft.com/office/drawing/2016/5/11/chartex" xmlns:cx6="http://schemas.microsoft.com/office/drawing/2016/5/12/chartex" xmlns:cx7="http://schemas.microsoft.com/office/drawing/2016/5/13/chartex" xmlns:cx8="http://schemas.microsoft.com/office/drawing/2016/5/14/chartex" xmlns:mc="http://schemas.openxmlformats.org/markup-compatibility/2006" xmlns:aink="http://schemas.microsoft.com/office/drawing/2016/ink" xmlns:am3d="http://schemas.microsoft.com/office/drawing/2017/model3d" xmlns:o="urn:schemas-microsoft-com:office:office" xmlns:oel="http://schemas.microsoft.com/office/2019/extlst" xmlns:r="http://schemas.openxmlformats.org/officeDocument/2006/relationships" xmlns:m="http://schemas.openxmlformats.org/officeDocument/2006/math" xmlns:v="urn:schemas-microsoft-com:vml" xmlns:wp14="http://schemas.microsoft.com/office/word/2010/wordprocessingDrawing" xmlns:wp="http://schemas.openxmlformats.org/drawingml/2006/wordprocessingDrawing" xmlns:w10="urn:schemas-microsoft-com:office:word" xmlns:w="http://schemas.openxmlformats.org/wordprocessingml/2006/main" xmlns:w14="http://schemas.microsoft.com/office/word/2010/wordml" xmlns:w15="http://schemas.microsoft.com/office/word/2012/wordml" xmlns:w16cei="http://schemas.microsoft.com/office/word/2026/wordml/cei" xmlns:w16cex="http://schemas.microsoft.com/office/word/2018/wordml/cex" xmlns:w16cid="http://schemas.microsoft.com/office/word/2016/wordml/cid" xmlns:w16="http://schemas.microsoft.com/office/word/2018/wordml" xmlns:w16du="http://schemas.microsoft.com/office/word/2023/wordml/word16du" xmlns:w16sdtdh="http://schemas.microsoft.com/office/word/2020/wordml/sdtdatahash" xmlns:w16sdtfl="http://schemas.microsoft.com/office/word/2024/wordml/sdtformatlock" xmlns:w16se="http://schemas.microsoft.com/office/word/2015/wordml/symex" xmlns:wpg="http://schemas.microsoft.com/office/word/2010/wordprocessingGroup" xmlns:wpi="http://schemas.microsoft.com/office/word/2010/wordprocessingInk" xmlns:wne="http://schemas.microsoft.com/office/word/2006/wordml" xmlns:wps="http://schemas.microsoft.com/office/word/2010/wordprocessingShape" mc:Ignorable="w14 w15 w16se w16cid w16 w16cex w16sdtdh w16sdtfl w16du wp14">
   <w:abstractNum w:abstractNumId="0" w15:restartNumberingAfterBreak="0">
-    <w:nsid w:val="01B652AA"/>
+    <w:nsid w:val="017D5122"/>
     <w:multiLevelType w:val="multilevel"/>
-    <w:tmpl w:val="1012BF34"/>
+    <w:tmpl w:val="936C3D04"/>
     <w:lvl w:ilvl="0">
       <w:start w:val="1"/>
       <w:numFmt w:val="bullet"/>
@@ -21557,9 +22269,9 @@
     </w:lvl>
   </w:abstractNum>
   <w:abstractNum w:abstractNumId="1" w15:restartNumberingAfterBreak="0">
-    <w:nsid w:val="020765D4"/>
+    <w:nsid w:val="01B652AA"/>
     <w:multiLevelType w:val="multilevel"/>
-    <w:tmpl w:val="6A0825D0"/>
+    <w:tmpl w:val="1012BF34"/>
     <w:lvl w:ilvl="0">
       <w:start w:val="1"/>
       <w:numFmt w:val="bullet"/>
@@ -21706,9 +22418,9 @@
     </w:lvl>
   </w:abstractNum>
   <w:abstractNum w:abstractNumId="2" w15:restartNumberingAfterBreak="0">
-    <w:nsid w:val="02260A03"/>
+    <w:nsid w:val="020765D4"/>
     <w:multiLevelType w:val="multilevel"/>
-    <w:tmpl w:val="AA0E78AC"/>
+    <w:tmpl w:val="6A0825D0"/>
     <w:lvl w:ilvl="0">
       <w:start w:val="1"/>
       <w:numFmt w:val="bullet"/>
@@ -21855,9 +22567,9 @@
     </w:lvl>
   </w:abstractNum>
   <w:abstractNum w:abstractNumId="3" w15:restartNumberingAfterBreak="0">
-    <w:nsid w:val="0932680C"/>
+    <w:nsid w:val="02260A03"/>
     <w:multiLevelType w:val="multilevel"/>
-    <w:tmpl w:val="A6E4F4D6"/>
+    <w:tmpl w:val="AA0E78AC"/>
     <w:lvl w:ilvl="0">
       <w:start w:val="1"/>
       <w:numFmt w:val="bullet"/>
@@ -22004,9 +22716,9 @@
     </w:lvl>
   </w:abstractNum>
   <w:abstractNum w:abstractNumId="4" w15:restartNumberingAfterBreak="0">
-    <w:nsid w:val="18C72CDA"/>
+    <w:nsid w:val="0932680C"/>
     <w:multiLevelType w:val="multilevel"/>
-    <w:tmpl w:val="B7EE9C34"/>
+    <w:tmpl w:val="A6E4F4D6"/>
     <w:lvl w:ilvl="0">
       <w:start w:val="1"/>
       <w:numFmt w:val="bullet"/>
@@ -22153,9 +22865,9 @@
     </w:lvl>
   </w:abstractNum>
   <w:abstractNum w:abstractNumId="5" w15:restartNumberingAfterBreak="0">
-    <w:nsid w:val="2A9E1DA7"/>
+    <w:nsid w:val="18C72CDA"/>
     <w:multiLevelType w:val="multilevel"/>
-    <w:tmpl w:val="AA4225DC"/>
+    <w:tmpl w:val="B7EE9C34"/>
     <w:lvl w:ilvl="0">
       <w:start w:val="1"/>
       <w:numFmt w:val="bullet"/>
@@ -22302,9 +23014,9 @@
     </w:lvl>
   </w:abstractNum>
   <w:abstractNum w:abstractNumId="6" w15:restartNumberingAfterBreak="0">
-    <w:nsid w:val="2BB9033D"/>
+    <w:nsid w:val="2A9E1DA7"/>
     <w:multiLevelType w:val="multilevel"/>
-    <w:tmpl w:val="DD0CA684"/>
+    <w:tmpl w:val="AA4225DC"/>
     <w:lvl w:ilvl="0">
       <w:start w:val="1"/>
       <w:numFmt w:val="bullet"/>
@@ -22451,9 +23163,9 @@
     </w:lvl>
   </w:abstractNum>
   <w:abstractNum w:abstractNumId="7" w15:restartNumberingAfterBreak="0">
-    <w:nsid w:val="2D490C38"/>
+    <w:nsid w:val="2BB9033D"/>
     <w:multiLevelType w:val="multilevel"/>
-    <w:tmpl w:val="E1749C3E"/>
+    <w:tmpl w:val="DD0CA684"/>
     <w:lvl w:ilvl="0">
       <w:start w:val="1"/>
       <w:numFmt w:val="bullet"/>
@@ -22600,9 +23312,9 @@
     </w:lvl>
   </w:abstractNum>
   <w:abstractNum w:abstractNumId="8" w15:restartNumberingAfterBreak="0">
-    <w:nsid w:val="30AD1C62"/>
+    <w:nsid w:val="2D490C38"/>
     <w:multiLevelType w:val="multilevel"/>
-    <w:tmpl w:val="371475F2"/>
+    <w:tmpl w:val="E1749C3E"/>
     <w:lvl w:ilvl="0">
       <w:start w:val="1"/>
       <w:numFmt w:val="bullet"/>
@@ -22749,98 +23461,9 @@
     </w:lvl>
   </w:abstractNum>
   <w:abstractNum w:abstractNumId="9" w15:restartNumberingAfterBreak="0">
-    <w:nsid w:val="321D4140"/>
-    <w:multiLevelType w:val="hybridMultilevel"/>
-    <w:tmpl w:val="3E7CA19E"/>
-    <w:lvl w:ilvl="0" w:tplc="041F000F">
-      <w:start w:val="1"/>
-      <w:numFmt w:val="decimal"/>
-      <w:lvlText w:val="%1."/>
-      <w:lvlJc w:val="left"/>
-      <w:pPr>
-        <w:ind w:left="720" w:hanging="360"/>
-      </w:pPr>
-      <w:rPr>
-        <w:rFonts w:hint="default"/>
-      </w:rPr>
-    </w:lvl>
-    <w:lvl w:ilvl="1" w:tplc="041F0019" w:tentative="1">
-      <w:start w:val="1"/>
-      <w:numFmt w:val="lowerLetter"/>
-      <w:lvlText w:val="%2."/>
-      <w:lvlJc w:val="left"/>
-      <w:pPr>
-        <w:ind w:left="1440" w:hanging="360"/>
-      </w:pPr>
-    </w:lvl>
-    <w:lvl w:ilvl="2" w:tplc="041F001B" w:tentative="1">
-      <w:start w:val="1"/>
-      <w:numFmt w:val="lowerRoman"/>
-      <w:lvlText w:val="%3."/>
-      <w:lvlJc w:val="right"/>
-      <w:pPr>
-        <w:ind w:left="2160" w:hanging="180"/>
-      </w:pPr>
-    </w:lvl>
-    <w:lvl w:ilvl="3" w:tplc="041F000F" w:tentative="1">
-      <w:start w:val="1"/>
-      <w:numFmt w:val="decimal"/>
-      <w:lvlText w:val="%4."/>
-      <w:lvlJc w:val="left"/>
-      <w:pPr>
-        <w:ind w:left="2880" w:hanging="360"/>
-      </w:pPr>
-    </w:lvl>
-    <w:lvl w:ilvl="4" w:tplc="041F0019" w:tentative="1">
-      <w:start w:val="1"/>
-      <w:numFmt w:val="lowerLetter"/>
-      <w:lvlText w:val="%5."/>
-      <w:lvlJc w:val="left"/>
-      <w:pPr>
-        <w:ind w:left="3600" w:hanging="360"/>
-      </w:pPr>
-    </w:lvl>
-    <w:lvl w:ilvl="5" w:tplc="041F001B" w:tentative="1">
-      <w:start w:val="1"/>
-      <w:numFmt w:val="lowerRoman"/>
-      <w:lvlText w:val="%6."/>
-      <w:lvlJc w:val="right"/>
-      <w:pPr>
-        <w:ind w:left="4320" w:hanging="180"/>
-      </w:pPr>
-    </w:lvl>
-    <w:lvl w:ilvl="6" w:tplc="041F000F" w:tentative="1">
-      <w:start w:val="1"/>
-      <w:numFmt w:val="decimal"/>
-      <w:lvlText w:val="%7."/>
-      <w:lvlJc w:val="left"/>
-      <w:pPr>
-        <w:ind w:left="5040" w:hanging="360"/>
-      </w:pPr>
-    </w:lvl>
-    <w:lvl w:ilvl="7" w:tplc="041F0019" w:tentative="1">
-      <w:start w:val="1"/>
-      <w:numFmt w:val="lowerLetter"/>
-      <w:lvlText w:val="%8."/>
-      <w:lvlJc w:val="left"/>
-      <w:pPr>
-        <w:ind w:left="5760" w:hanging="360"/>
-      </w:pPr>
-    </w:lvl>
-    <w:lvl w:ilvl="8" w:tplc="041F001B" w:tentative="1">
-      <w:start w:val="1"/>
-      <w:numFmt w:val="lowerRoman"/>
-      <w:lvlText w:val="%9."/>
-      <w:lvlJc w:val="right"/>
-      <w:pPr>
-        <w:ind w:left="6480" w:hanging="180"/>
-      </w:pPr>
-    </w:lvl>
-  </w:abstractNum>
-  <w:abstractNum w:abstractNumId="10" w15:restartNumberingAfterBreak="0">
-    <w:nsid w:val="36354E43"/>
+    <w:nsid w:val="30AD1C62"/>
     <w:multiLevelType w:val="multilevel"/>
-    <w:tmpl w:val="3AF2AC0C"/>
+    <w:tmpl w:val="371475F2"/>
     <w:lvl w:ilvl="0">
       <w:start w:val="1"/>
       <w:numFmt w:val="bullet"/>
@@ -22986,10 +23609,99 @@
       </w:rPr>
     </w:lvl>
   </w:abstractNum>
+  <w:abstractNum w:abstractNumId="10" w15:restartNumberingAfterBreak="0">
+    <w:nsid w:val="321D4140"/>
+    <w:multiLevelType w:val="hybridMultilevel"/>
+    <w:tmpl w:val="3E7CA19E"/>
+    <w:lvl w:ilvl="0" w:tplc="041F000F">
+      <w:start w:val="1"/>
+      <w:numFmt w:val="decimal"/>
+      <w:lvlText w:val="%1."/>
+      <w:lvlJc w:val="left"/>
+      <w:pPr>
+        <w:ind w:left="720" w:hanging="360"/>
+      </w:pPr>
+      <w:rPr>
+        <w:rFonts w:hint="default"/>
+      </w:rPr>
+    </w:lvl>
+    <w:lvl w:ilvl="1" w:tplc="041F0019" w:tentative="1">
+      <w:start w:val="1"/>
+      <w:numFmt w:val="lowerLetter"/>
+      <w:lvlText w:val="%2."/>
+      <w:lvlJc w:val="left"/>
+      <w:pPr>
+        <w:ind w:left="1440" w:hanging="360"/>
+      </w:pPr>
+    </w:lvl>
+    <w:lvl w:ilvl="2" w:tplc="041F001B" w:tentative="1">
+      <w:start w:val="1"/>
+      <w:numFmt w:val="lowerRoman"/>
+      <w:lvlText w:val="%3."/>
+      <w:lvlJc w:val="right"/>
+      <w:pPr>
+        <w:ind w:left="2160" w:hanging="180"/>
+      </w:pPr>
+    </w:lvl>
+    <w:lvl w:ilvl="3" w:tplc="041F000F" w:tentative="1">
+      <w:start w:val="1"/>
+      <w:numFmt w:val="decimal"/>
+      <w:lvlText w:val="%4."/>
+      <w:lvlJc w:val="left"/>
+      <w:pPr>
+        <w:ind w:left="2880" w:hanging="360"/>
+      </w:pPr>
+    </w:lvl>
+    <w:lvl w:ilvl="4" w:tplc="041F0019" w:tentative="1">
+      <w:start w:val="1"/>
+      <w:numFmt w:val="lowerLetter"/>
+      <w:lvlText w:val="%5."/>
+      <w:lvlJc w:val="left"/>
+      <w:pPr>
+        <w:ind w:left="3600" w:hanging="360"/>
+      </w:pPr>
+    </w:lvl>
+    <w:lvl w:ilvl="5" w:tplc="041F001B" w:tentative="1">
+      <w:start w:val="1"/>
+      <w:numFmt w:val="lowerRoman"/>
+      <w:lvlText w:val="%6."/>
+      <w:lvlJc w:val="right"/>
+      <w:pPr>
+        <w:ind w:left="4320" w:hanging="180"/>
+      </w:pPr>
+    </w:lvl>
+    <w:lvl w:ilvl="6" w:tplc="041F000F" w:tentative="1">
+      <w:start w:val="1"/>
+      <w:numFmt w:val="decimal"/>
+      <w:lvlText w:val="%7."/>
+      <w:lvlJc w:val="left"/>
+      <w:pPr>
+        <w:ind w:left="5040" w:hanging="360"/>
+      </w:pPr>
+    </w:lvl>
+    <w:lvl w:ilvl="7" w:tplc="041F0019" w:tentative="1">
+      <w:start w:val="1"/>
+      <w:numFmt w:val="lowerLetter"/>
+      <w:lvlText w:val="%8."/>
+      <w:lvlJc w:val="left"/>
+      <w:pPr>
+        <w:ind w:left="5760" w:hanging="360"/>
+      </w:pPr>
+    </w:lvl>
+    <w:lvl w:ilvl="8" w:tplc="041F001B" w:tentative="1">
+      <w:start w:val="1"/>
+      <w:numFmt w:val="lowerRoman"/>
+      <w:lvlText w:val="%9."/>
+      <w:lvlJc w:val="right"/>
+      <w:pPr>
+        <w:ind w:left="6480" w:hanging="180"/>
+      </w:pPr>
+    </w:lvl>
+  </w:abstractNum>
   <w:abstractNum w:abstractNumId="11" w15:restartNumberingAfterBreak="0">
-    <w:nsid w:val="3D193969"/>
+    <w:nsid w:val="36354E43"/>
     <w:multiLevelType w:val="multilevel"/>
-    <w:tmpl w:val="81EEF018"/>
+    <w:tmpl w:val="3AF2AC0C"/>
     <w:lvl w:ilvl="0">
       <w:start w:val="1"/>
       <w:numFmt w:val="bullet"/>
@@ -23136,9 +23848,9 @@
     </w:lvl>
   </w:abstractNum>
   <w:abstractNum w:abstractNumId="12" w15:restartNumberingAfterBreak="0">
-    <w:nsid w:val="3D733783"/>
+    <w:nsid w:val="3D193969"/>
     <w:multiLevelType w:val="multilevel"/>
-    <w:tmpl w:val="A6383A0C"/>
+    <w:tmpl w:val="81EEF018"/>
     <w:lvl w:ilvl="0">
       <w:start w:val="1"/>
       <w:numFmt w:val="bullet"/>
@@ -23285,9 +23997,9 @@
     </w:lvl>
   </w:abstractNum>
   <w:abstractNum w:abstractNumId="13" w15:restartNumberingAfterBreak="0">
-    <w:nsid w:val="44D72C93"/>
+    <w:nsid w:val="3D733783"/>
     <w:multiLevelType w:val="multilevel"/>
-    <w:tmpl w:val="64604668"/>
+    <w:tmpl w:val="A6383A0C"/>
     <w:lvl w:ilvl="0">
       <w:start w:val="1"/>
       <w:numFmt w:val="bullet"/>
@@ -23434,9 +24146,9 @@
     </w:lvl>
   </w:abstractNum>
   <w:abstractNum w:abstractNumId="14" w15:restartNumberingAfterBreak="0">
-    <w:nsid w:val="4DC845A1"/>
+    <w:nsid w:val="44D72C93"/>
     <w:multiLevelType w:val="multilevel"/>
-    <w:tmpl w:val="EF786B8A"/>
+    <w:tmpl w:val="64604668"/>
     <w:lvl w:ilvl="0">
       <w:start w:val="1"/>
       <w:numFmt w:val="bullet"/>
@@ -23583,9 +24295,9 @@
     </w:lvl>
   </w:abstractNum>
   <w:abstractNum w:abstractNumId="15" w15:restartNumberingAfterBreak="0">
-    <w:nsid w:val="63050202"/>
+    <w:nsid w:val="4DC845A1"/>
     <w:multiLevelType w:val="multilevel"/>
-    <w:tmpl w:val="8D1E2ABC"/>
+    <w:tmpl w:val="EF786B8A"/>
     <w:lvl w:ilvl="0">
       <w:start w:val="1"/>
       <w:numFmt w:val="bullet"/>
@@ -23732,9 +24444,9 @@
     </w:lvl>
   </w:abstractNum>
   <w:abstractNum w:abstractNumId="16" w15:restartNumberingAfterBreak="0">
-    <w:nsid w:val="6B0579E7"/>
+    <w:nsid w:val="63050202"/>
     <w:multiLevelType w:val="multilevel"/>
-    <w:tmpl w:val="A8DA2166"/>
+    <w:tmpl w:val="8D1E2ABC"/>
     <w:lvl w:ilvl="0">
       <w:start w:val="1"/>
       <w:numFmt w:val="bullet"/>
@@ -23881,9 +24593,9 @@
     </w:lvl>
   </w:abstractNum>
   <w:abstractNum w:abstractNumId="17" w15:restartNumberingAfterBreak="0">
-    <w:nsid w:val="6CF718B0"/>
+    <w:nsid w:val="6B0579E7"/>
     <w:multiLevelType w:val="multilevel"/>
-    <w:tmpl w:val="9C1416D6"/>
+    <w:tmpl w:val="A8DA2166"/>
     <w:lvl w:ilvl="0">
       <w:start w:val="1"/>
       <w:numFmt w:val="bullet"/>
@@ -24030,9 +24742,9 @@
     </w:lvl>
   </w:abstractNum>
   <w:abstractNum w:abstractNumId="18" w15:restartNumberingAfterBreak="0">
-    <w:nsid w:val="78733247"/>
+    <w:nsid w:val="6CF718B0"/>
     <w:multiLevelType w:val="multilevel"/>
-    <w:tmpl w:val="18361A16"/>
+    <w:tmpl w:val="9C1416D6"/>
     <w:lvl w:ilvl="0">
       <w:start w:val="1"/>
       <w:numFmt w:val="bullet"/>
@@ -24179,9 +24891,9 @@
     </w:lvl>
   </w:abstractNum>
   <w:abstractNum w:abstractNumId="19" w15:restartNumberingAfterBreak="0">
-    <w:nsid w:val="78940C2D"/>
+    <w:nsid w:val="78733247"/>
     <w:multiLevelType w:val="multilevel"/>
-    <w:tmpl w:val="7A36FD2E"/>
+    <w:tmpl w:val="18361A16"/>
     <w:lvl w:ilvl="0">
       <w:start w:val="1"/>
       <w:numFmt w:val="bullet"/>
@@ -24327,65 +25039,217 @@
       </w:rPr>
     </w:lvl>
   </w:abstractNum>
+  <w:abstractNum w:abstractNumId="20" w15:restartNumberingAfterBreak="0">
+    <w:nsid w:val="78940C2D"/>
+    <w:multiLevelType w:val="multilevel"/>
+    <w:tmpl w:val="7A36FD2E"/>
+    <w:lvl w:ilvl="0">
+      <w:start w:val="1"/>
+      <w:numFmt w:val="bullet"/>
+      <w:lvlText w:val=""/>
+      <w:lvlJc w:val="left"/>
+      <w:pPr>
+        <w:tabs>
+          <w:tab w:val="num" w:pos="720"/>
+        </w:tabs>
+        <w:ind w:left="720" w:hanging="360"/>
+      </w:pPr>
+      <w:rPr>
+        <w:rFonts w:ascii="Symbol" w:hAnsi="Symbol" w:hint="default"/>
+        <w:sz w:val="20"/>
+      </w:rPr>
+    </w:lvl>
+    <w:lvl w:ilvl="1" w:tentative="1">
+      <w:start w:val="1"/>
+      <w:numFmt w:val="bullet"/>
+      <w:lvlText w:val="o"/>
+      <w:lvlJc w:val="left"/>
+      <w:pPr>
+        <w:tabs>
+          <w:tab w:val="num" w:pos="1440"/>
+        </w:tabs>
+        <w:ind w:left="1440" w:hanging="360"/>
+      </w:pPr>
+      <w:rPr>
+        <w:rFonts w:ascii="Courier New" w:hAnsi="Courier New" w:hint="default"/>
+        <w:sz w:val="20"/>
+      </w:rPr>
+    </w:lvl>
+    <w:lvl w:ilvl="2" w:tentative="1">
+      <w:start w:val="1"/>
+      <w:numFmt w:val="bullet"/>
+      <w:lvlText w:val=""/>
+      <w:lvlJc w:val="left"/>
+      <w:pPr>
+        <w:tabs>
+          <w:tab w:val="num" w:pos="2160"/>
+        </w:tabs>
+        <w:ind w:left="2160" w:hanging="360"/>
+      </w:pPr>
+      <w:rPr>
+        <w:rFonts w:ascii="Wingdings" w:hAnsi="Wingdings" w:hint="default"/>
+        <w:sz w:val="20"/>
+      </w:rPr>
+    </w:lvl>
+    <w:lvl w:ilvl="3" w:tentative="1">
+      <w:start w:val="1"/>
+      <w:numFmt w:val="bullet"/>
+      <w:lvlText w:val=""/>
+      <w:lvlJc w:val="left"/>
+      <w:pPr>
+        <w:tabs>
+          <w:tab w:val="num" w:pos="2880"/>
+        </w:tabs>
+        <w:ind w:left="2880" w:hanging="360"/>
+      </w:pPr>
+      <w:rPr>
+        <w:rFonts w:ascii="Wingdings" w:hAnsi="Wingdings" w:hint="default"/>
+        <w:sz w:val="20"/>
+      </w:rPr>
+    </w:lvl>
+    <w:lvl w:ilvl="4" w:tentative="1">
+      <w:start w:val="1"/>
+      <w:numFmt w:val="bullet"/>
+      <w:lvlText w:val=""/>
+      <w:lvlJc w:val="left"/>
+      <w:pPr>
+        <w:tabs>
+          <w:tab w:val="num" w:pos="3600"/>
+        </w:tabs>
+        <w:ind w:left="3600" w:hanging="360"/>
+      </w:pPr>
+      <w:rPr>
+        <w:rFonts w:ascii="Wingdings" w:hAnsi="Wingdings" w:hint="default"/>
+        <w:sz w:val="20"/>
+      </w:rPr>
+    </w:lvl>
+    <w:lvl w:ilvl="5" w:tentative="1">
+      <w:start w:val="1"/>
+      <w:numFmt w:val="bullet"/>
+      <w:lvlText w:val=""/>
+      <w:lvlJc w:val="left"/>
+      <w:pPr>
+        <w:tabs>
+          <w:tab w:val="num" w:pos="4320"/>
+        </w:tabs>
+        <w:ind w:left="4320" w:hanging="360"/>
+      </w:pPr>
+      <w:rPr>
+        <w:rFonts w:ascii="Wingdings" w:hAnsi="Wingdings" w:hint="default"/>
+        <w:sz w:val="20"/>
+      </w:rPr>
+    </w:lvl>
+    <w:lvl w:ilvl="6" w:tentative="1">
+      <w:start w:val="1"/>
+      <w:numFmt w:val="bullet"/>
+      <w:lvlText w:val=""/>
+      <w:lvlJc w:val="left"/>
+      <w:pPr>
+        <w:tabs>
+          <w:tab w:val="num" w:pos="5040"/>
+        </w:tabs>
+        <w:ind w:left="5040" w:hanging="360"/>
+      </w:pPr>
+      <w:rPr>
+        <w:rFonts w:ascii="Wingdings" w:hAnsi="Wingdings" w:hint="default"/>
+        <w:sz w:val="20"/>
+      </w:rPr>
+    </w:lvl>
+    <w:lvl w:ilvl="7" w:tentative="1">
+      <w:start w:val="1"/>
+      <w:numFmt w:val="bullet"/>
+      <w:lvlText w:val=""/>
+      <w:lvlJc w:val="left"/>
+      <w:pPr>
+        <w:tabs>
+          <w:tab w:val="num" w:pos="5760"/>
+        </w:tabs>
+        <w:ind w:left="5760" w:hanging="360"/>
+      </w:pPr>
+      <w:rPr>
+        <w:rFonts w:ascii="Wingdings" w:hAnsi="Wingdings" w:hint="default"/>
+        <w:sz w:val="20"/>
+      </w:rPr>
+    </w:lvl>
+    <w:lvl w:ilvl="8" w:tentative="1">
+      <w:start w:val="1"/>
+      <w:numFmt w:val="bullet"/>
+      <w:lvlText w:val=""/>
+      <w:lvlJc w:val="left"/>
+      <w:pPr>
+        <w:tabs>
+          <w:tab w:val="num" w:pos="6480"/>
+        </w:tabs>
+        <w:ind w:left="6480" w:hanging="360"/>
+      </w:pPr>
+      <w:rPr>
+        <w:rFonts w:ascii="Wingdings" w:hAnsi="Wingdings" w:hint="default"/>
+        <w:sz w:val="20"/>
+      </w:rPr>
+    </w:lvl>
+  </w:abstractNum>
   <w:num w:numId="1" w16cid:durableId="320813693">
+    <w:abstractNumId w:val="5"/>
+  </w:num>
+  <w:num w:numId="2" w16cid:durableId="680281116">
+    <w:abstractNumId w:val="10"/>
+  </w:num>
+  <w:num w:numId="3" w16cid:durableId="1288438365">
+    <w:abstractNumId w:val="14"/>
+  </w:num>
+  <w:num w:numId="4" w16cid:durableId="1155562159">
+    <w:abstractNumId w:val="17"/>
+  </w:num>
+  <w:num w:numId="5" w16cid:durableId="1958020517">
+    <w:abstractNumId w:val="16"/>
+  </w:num>
+  <w:num w:numId="6" w16cid:durableId="1596940668">
+    <w:abstractNumId w:val="11"/>
+  </w:num>
+  <w:num w:numId="7" w16cid:durableId="1579166471">
+    <w:abstractNumId w:val="1"/>
+  </w:num>
+  <w:num w:numId="8" w16cid:durableId="753748469">
+    <w:abstractNumId w:val="20"/>
+  </w:num>
+  <w:num w:numId="9" w16cid:durableId="604701249">
+    <w:abstractNumId w:val="19"/>
+  </w:num>
+  <w:num w:numId="10" w16cid:durableId="1503279606">
+    <w:abstractNumId w:val="7"/>
+  </w:num>
+  <w:num w:numId="11" w16cid:durableId="785000340">
+    <w:abstractNumId w:val="13"/>
+  </w:num>
+  <w:num w:numId="12" w16cid:durableId="290215297">
+    <w:abstractNumId w:val="15"/>
+  </w:num>
+  <w:num w:numId="13" w16cid:durableId="1160194568">
+    <w:abstractNumId w:val="18"/>
+  </w:num>
+  <w:num w:numId="14" w16cid:durableId="1407336860">
+    <w:abstractNumId w:val="8"/>
+  </w:num>
+  <w:num w:numId="15" w16cid:durableId="797989056">
+    <w:abstractNumId w:val="12"/>
+  </w:num>
+  <w:num w:numId="16" w16cid:durableId="866019238">
     <w:abstractNumId w:val="4"/>
   </w:num>
-  <w:num w:numId="2" w16cid:durableId="680281116">
+  <w:num w:numId="17" w16cid:durableId="1782452779">
+    <w:abstractNumId w:val="6"/>
+  </w:num>
+  <w:num w:numId="18" w16cid:durableId="2037387320">
+    <w:abstractNumId w:val="2"/>
+  </w:num>
+  <w:num w:numId="19" w16cid:durableId="504443146">
     <w:abstractNumId w:val="9"/>
   </w:num>
-  <w:num w:numId="3" w16cid:durableId="1288438365">
-    <w:abstractNumId w:val="13"/>
-  </w:num>
-  <w:num w:numId="4" w16cid:durableId="1155562159">
-    <w:abstractNumId w:val="16"/>
-  </w:num>
-  <w:num w:numId="5" w16cid:durableId="1958020517">
-    <w:abstractNumId w:val="15"/>
-  </w:num>
-  <w:num w:numId="6" w16cid:durableId="1596940668">
-    <w:abstractNumId w:val="10"/>
-  </w:num>
-  <w:num w:numId="7" w16cid:durableId="1579166471">
-    <w:abstractNumId w:val="0"/>
-  </w:num>
-  <w:num w:numId="8" w16cid:durableId="753748469">
-    <w:abstractNumId w:val="19"/>
-  </w:num>
-  <w:num w:numId="9" w16cid:durableId="604701249">
-    <w:abstractNumId w:val="18"/>
-  </w:num>
-  <w:num w:numId="10" w16cid:durableId="1503279606">
-    <w:abstractNumId w:val="6"/>
-  </w:num>
-  <w:num w:numId="11" w16cid:durableId="785000340">
-    <w:abstractNumId w:val="12"/>
-  </w:num>
-  <w:num w:numId="12" w16cid:durableId="290215297">
-    <w:abstractNumId w:val="14"/>
-  </w:num>
-  <w:num w:numId="13" w16cid:durableId="1160194568">
-    <w:abstractNumId w:val="17"/>
-  </w:num>
-  <w:num w:numId="14" w16cid:durableId="1407336860">
-    <w:abstractNumId w:val="7"/>
-  </w:num>
-  <w:num w:numId="15" w16cid:durableId="797989056">
-    <w:abstractNumId w:val="11"/>
-  </w:num>
-  <w:num w:numId="16" w16cid:durableId="866019238">
+  <w:num w:numId="20" w16cid:durableId="16588099">
     <w:abstractNumId w:val="3"/>
   </w:num>
-  <w:num w:numId="17" w16cid:durableId="1782452779">
-    <w:abstractNumId w:val="5"/>
-  </w:num>
-  <w:num w:numId="18" w16cid:durableId="2037387320">
-    <w:abstractNumId w:val="1"/>
-  </w:num>
-  <w:num w:numId="19" w16cid:durableId="504443146">
-    <w:abstractNumId w:val="8"/>
-  </w:num>
-  <w:num w:numId="20" w16cid:durableId="16588099">
-    <w:abstractNumId w:val="2"/>
+  <w:num w:numId="21" w16cid:durableId="724178803">
+    <w:abstractNumId w:val="0"/>
   </w:num>
 </w:numbering>
 </file>

</xml_diff>

<commit_message>
Sprint 9: Complete hybrid forecasting framework
</commit_message>
<xml_diff>
--- a/docs/draft/development_flow.docx
+++ b/docs/draft/development_flow.docx
@@ -21655,18 +21655,7 @@
           <w:szCs w:val="32"/>
           <w:lang w:val="tr-TR"/>
         </w:rPr>
-        <w:t>Instead of</w:t>
-      </w:r>
-      <w:r>
-        <w:rPr>
-          <w:b/>
-          <w:bCs/>
-          <w:noProof/>
-          <w:sz w:val="32"/>
-          <w:szCs w:val="32"/>
-          <w:lang w:val="tr-TR"/>
-        </w:rPr>
-        <w:t>:</w:t>
+        <w:t>Instead of:</w:t>
       </w:r>
     </w:p>
     <w:p>
@@ -22095,6 +22084,1474 @@
         </w:rPr>
         <w:t xml:space="preserve"> → LSTM, GRU, Transformer, ARIMA, etc.</w:t>
       </w:r>
+    </w:p>
+    <w:p>
+      <w:pPr>
+        <w:spacing w:after="0" w:line="240" w:lineRule="auto"/>
+        <w:rPr>
+          <w:noProof/>
+          <w:sz w:val="24"/>
+          <w:szCs w:val="24"/>
+          <w:lang w:val="tr-TR"/>
+        </w:rPr>
+      </w:pPr>
+    </w:p>
+    <w:p>
+      <w:pPr>
+        <w:rPr>
+          <w:noProof/>
+          <w:sz w:val="24"/>
+          <w:szCs w:val="24"/>
+          <w:lang w:val="tr-TR"/>
+        </w:rPr>
+      </w:pPr>
+      <w:r>
+        <w:rPr>
+          <w:noProof/>
+          <w:sz w:val="24"/>
+          <w:szCs w:val="24"/>
+          <w:lang w:val="tr-TR"/>
+        </w:rPr>
+        <w:br w:type="page"/>
+      </w:r>
+    </w:p>
+    <w:p>
+      <w:pPr>
+        <w:spacing w:after="0" w:line="240" w:lineRule="auto"/>
+        <w:rPr>
+          <w:b/>
+          <w:bCs/>
+          <w:noProof/>
+          <w:sz w:val="24"/>
+          <w:szCs w:val="24"/>
+          <w:lang w:val="tr-TR"/>
+        </w:rPr>
+      </w:pPr>
+      <w:r>
+        <w:rPr>
+          <w:b/>
+          <w:bCs/>
+          <w:noProof/>
+          <w:sz w:val="24"/>
+          <w:szCs w:val="24"/>
+          <w:lang w:val="tr-TR"/>
+        </w:rPr>
+        <w:lastRenderedPageBreak/>
+        <w:t>Commit 6</w:t>
+      </w:r>
+      <w:r>
+        <w:rPr>
+          <w:b/>
+          <w:bCs/>
+          <w:noProof/>
+          <w:sz w:val="24"/>
+          <w:szCs w:val="24"/>
+          <w:lang w:val="tr-TR"/>
+        </w:rPr>
+        <w:t>:</w:t>
+      </w:r>
+    </w:p>
+    <w:p>
+      <w:pPr>
+        <w:spacing w:after="0" w:line="240" w:lineRule="auto"/>
+        <w:rPr>
+          <w:noProof/>
+          <w:sz w:val="24"/>
+          <w:szCs w:val="24"/>
+          <w:lang w:val="tr-TR"/>
+        </w:rPr>
+      </w:pPr>
+    </w:p>
+    <w:p>
+      <w:pPr>
+        <w:spacing w:after="0" w:line="240" w:lineRule="auto"/>
+        <w:rPr>
+          <w:b/>
+          <w:bCs/>
+          <w:noProof/>
+          <w:sz w:val="24"/>
+          <w:szCs w:val="24"/>
+          <w:lang w:val="tr-TR"/>
+        </w:rPr>
+      </w:pPr>
+      <w:r>
+        <w:rPr>
+          <w:b/>
+          <w:bCs/>
+          <w:noProof/>
+          <w:sz w:val="24"/>
+          <w:szCs w:val="24"/>
+          <w:lang w:val="tr-TR"/>
+        </w:rPr>
+        <w:t>"Implement production-grade Kalman–LSTM hybrid forecasting.</w:t>
+      </w:r>
+      <w:r>
+        <w:rPr>
+          <w:b/>
+          <w:bCs/>
+          <w:noProof/>
+          <w:sz w:val="24"/>
+          <w:szCs w:val="24"/>
+          <w:lang w:val="tr-TR"/>
+        </w:rPr>
+        <w:t>”</w:t>
+      </w:r>
+    </w:p>
+    <w:p>
+      <w:pPr>
+        <w:spacing w:after="0" w:line="240" w:lineRule="auto"/>
+        <w:rPr>
+          <w:noProof/>
+          <w:sz w:val="24"/>
+          <w:szCs w:val="24"/>
+          <w:lang w:val="tr-TR"/>
+        </w:rPr>
+      </w:pPr>
+    </w:p>
+    <w:p>
+      <w:pPr>
+        <w:numPr>
+          <w:ilvl w:val="0"/>
+          <w:numId w:val="22"/>
+        </w:numPr>
+        <w:spacing w:after="0" w:line="240" w:lineRule="auto"/>
+        <w:rPr>
+          <w:noProof/>
+          <w:sz w:val="24"/>
+          <w:szCs w:val="24"/>
+          <w:lang w:val="tr-TR"/>
+        </w:rPr>
+      </w:pPr>
+      <w:r>
+        <w:rPr>
+          <w:b/>
+          <w:bCs/>
+          <w:noProof/>
+          <w:sz w:val="24"/>
+          <w:szCs w:val="24"/>
+          <w:lang w:val="tr-TR"/>
+        </w:rPr>
+        <w:t>Improve residual extraction</w:t>
+      </w:r>
+      <w:r>
+        <w:rPr>
+          <w:noProof/>
+          <w:sz w:val="24"/>
+          <w:szCs w:val="24"/>
+          <w:lang w:val="tr-TR"/>
+        </w:rPr>
+        <w:t xml:space="preserve"> </w:t>
+      </w:r>
+    </w:p>
+    <w:p>
+      <w:pPr>
+        <w:numPr>
+          <w:ilvl w:val="1"/>
+          <w:numId w:val="22"/>
+        </w:numPr>
+        <w:spacing w:after="0" w:line="240" w:lineRule="auto"/>
+        <w:rPr>
+          <w:noProof/>
+          <w:sz w:val="24"/>
+          <w:szCs w:val="24"/>
+          <w:lang w:val="tr-TR"/>
+        </w:rPr>
+      </w:pPr>
+      <w:r>
+        <w:rPr>
+          <w:noProof/>
+          <w:sz w:val="24"/>
+          <w:szCs w:val="24"/>
+          <w:lang w:val="tr-TR"/>
+        </w:rPr>
+        <w:t xml:space="preserve">Use the smoothed Kalman trend. </w:t>
+      </w:r>
+    </w:p>
+    <w:p>
+      <w:pPr>
+        <w:numPr>
+          <w:ilvl w:val="1"/>
+          <w:numId w:val="22"/>
+        </w:numPr>
+        <w:spacing w:after="0" w:line="240" w:lineRule="auto"/>
+        <w:rPr>
+          <w:noProof/>
+          <w:sz w:val="24"/>
+          <w:szCs w:val="24"/>
+          <w:lang w:val="tr-TR"/>
+        </w:rPr>
+      </w:pPr>
+      <w:r>
+        <w:rPr>
+          <w:noProof/>
+          <w:sz w:val="24"/>
+          <w:szCs w:val="24"/>
+          <w:lang w:val="tr-TR"/>
+        </w:rPr>
+        <w:t>Ensure the identity</w:t>
+      </w:r>
+    </w:p>
+    <w:p>
+      <w:pPr>
+        <w:spacing w:after="0" w:line="240" w:lineRule="auto"/>
+        <w:ind w:left="1440"/>
+        <w:rPr>
+          <w:noProof/>
+          <w:sz w:val="24"/>
+          <w:szCs w:val="24"/>
+          <w:lang w:val="tr-TR"/>
+        </w:rPr>
+      </w:pPr>
+    </w:p>
+    <w:p>
+      <w:pPr>
+        <w:spacing w:after="0" w:line="240" w:lineRule="auto"/>
+        <w:rPr>
+          <w:noProof/>
+          <w:sz w:val="24"/>
+          <w:szCs w:val="24"/>
+          <w:lang w:val="tr-TR"/>
+        </w:rPr>
+      </w:pPr>
+      <m:oMathPara>
+        <m:oMath>
+          <m:r>
+            <m:rPr>
+              <m:nor/>
+            </m:rPr>
+            <w:rPr>
+              <w:noProof/>
+              <w:sz w:val="24"/>
+              <w:szCs w:val="24"/>
+              <w:lang w:val="tr-TR"/>
+            </w:rPr>
+            <m:t>measurement</m:t>
+          </m:r>
+          <m:r>
+            <w:rPr>
+              <w:rFonts w:ascii="Cambria Math" w:hAnsi="Cambria Math"/>
+              <w:noProof/>
+              <w:sz w:val="24"/>
+              <w:szCs w:val="24"/>
+              <w:lang w:val="tr-TR"/>
+            </w:rPr>
+            <m:t>=</m:t>
+          </m:r>
+          <m:r>
+            <m:rPr>
+              <m:nor/>
+            </m:rPr>
+            <w:rPr>
+              <w:noProof/>
+              <w:sz w:val="24"/>
+              <w:szCs w:val="24"/>
+              <w:lang w:val="tr-TR"/>
+            </w:rPr>
+            <m:t>trend</m:t>
+          </m:r>
+          <m:r>
+            <w:rPr>
+              <w:rFonts w:ascii="Cambria Math" w:hAnsi="Cambria Math"/>
+              <w:noProof/>
+              <w:sz w:val="24"/>
+              <w:szCs w:val="24"/>
+              <w:lang w:val="tr-TR"/>
+            </w:rPr>
+            <m:t>+</m:t>
+          </m:r>
+          <m:r>
+            <m:rPr>
+              <m:nor/>
+            </m:rPr>
+            <w:rPr>
+              <w:noProof/>
+              <w:sz w:val="24"/>
+              <w:szCs w:val="24"/>
+              <w:lang w:val="tr-TR"/>
+            </w:rPr>
+            <m:t>residual</m:t>
+          </m:r>
+          <m:r>
+            <w:rPr>
+              <w:noProof/>
+              <w:sz w:val="24"/>
+              <w:szCs w:val="24"/>
+              <w:lang w:val="tr-TR"/>
+            </w:rPr>
+            <w:br/>
+          </m:r>
+        </m:oMath>
+      </m:oMathPara>
+    </w:p>
+    <w:p>
+      <w:pPr>
+        <w:spacing w:after="0" w:line="240" w:lineRule="auto"/>
+        <w:rPr>
+          <w:noProof/>
+          <w:sz w:val="24"/>
+          <w:szCs w:val="24"/>
+          <w:lang w:val="tr-TR"/>
+        </w:rPr>
+      </w:pPr>
+    </w:p>
+    <w:p>
+      <w:pPr>
+        <w:numPr>
+          <w:ilvl w:val="1"/>
+          <w:numId w:val="22"/>
+        </w:numPr>
+        <w:spacing w:after="0" w:line="240" w:lineRule="auto"/>
+        <w:rPr>
+          <w:noProof/>
+          <w:sz w:val="24"/>
+          <w:szCs w:val="24"/>
+          <w:lang w:val="tr-TR"/>
+        </w:rPr>
+      </w:pPr>
+      <w:r>
+        <w:rPr>
+          <w:noProof/>
+          <w:sz w:val="24"/>
+          <w:szCs w:val="24"/>
+          <w:lang w:val="tr-TR"/>
+        </w:rPr>
+        <w:t xml:space="preserve">Store residuals for later diagnostics. </w:t>
+      </w:r>
+    </w:p>
+    <w:p>
+      <w:pPr>
+        <w:numPr>
+          <w:ilvl w:val="0"/>
+          <w:numId w:val="22"/>
+        </w:numPr>
+        <w:spacing w:after="0" w:line="240" w:lineRule="auto"/>
+        <w:rPr>
+          <w:noProof/>
+          <w:sz w:val="24"/>
+          <w:szCs w:val="24"/>
+          <w:lang w:val="tr-TR"/>
+        </w:rPr>
+      </w:pPr>
+      <w:r>
+        <w:rPr>
+          <w:b/>
+          <w:bCs/>
+          <w:noProof/>
+          <w:sz w:val="24"/>
+          <w:szCs w:val="24"/>
+          <w:lang w:val="tr-TR"/>
+        </w:rPr>
+        <w:t>Improve trend forecasting</w:t>
+      </w:r>
+      <w:r>
+        <w:rPr>
+          <w:noProof/>
+          <w:sz w:val="24"/>
+          <w:szCs w:val="24"/>
+          <w:lang w:val="tr-TR"/>
+        </w:rPr>
+        <w:t xml:space="preserve"> </w:t>
+      </w:r>
+    </w:p>
+    <w:p>
+      <w:pPr>
+        <w:numPr>
+          <w:ilvl w:val="1"/>
+          <w:numId w:val="22"/>
+        </w:numPr>
+        <w:spacing w:after="0" w:line="240" w:lineRule="auto"/>
+        <w:rPr>
+          <w:noProof/>
+          <w:sz w:val="24"/>
+          <w:szCs w:val="24"/>
+          <w:lang w:val="tr-TR"/>
+        </w:rPr>
+      </w:pPr>
+      <w:r>
+        <w:rPr>
+          <w:noProof/>
+          <w:sz w:val="24"/>
+          <w:szCs w:val="24"/>
+          <w:lang w:val="tr-TR"/>
+        </w:rPr>
+        <w:t xml:space="preserve">Use the final Kalman state (level + drift). </w:t>
+      </w:r>
+    </w:p>
+    <w:p>
+      <w:pPr>
+        <w:numPr>
+          <w:ilvl w:val="1"/>
+          <w:numId w:val="22"/>
+        </w:numPr>
+        <w:spacing w:after="0" w:line="240" w:lineRule="auto"/>
+        <w:rPr>
+          <w:noProof/>
+          <w:sz w:val="24"/>
+          <w:szCs w:val="24"/>
+          <w:lang w:val="tr-TR"/>
+        </w:rPr>
+      </w:pPr>
+      <w:r>
+        <w:rPr>
+          <w:noProof/>
+          <w:sz w:val="24"/>
+          <w:szCs w:val="24"/>
+          <w:lang w:val="tr-TR"/>
+        </w:rPr>
+        <w:t xml:space="preserve">Support arbitrary forecast horizons. </w:t>
+      </w:r>
+    </w:p>
+    <w:p>
+      <w:pPr>
+        <w:numPr>
+          <w:ilvl w:val="1"/>
+          <w:numId w:val="22"/>
+        </w:numPr>
+        <w:spacing w:after="0" w:line="240" w:lineRule="auto"/>
+        <w:rPr>
+          <w:noProof/>
+          <w:sz w:val="24"/>
+          <w:szCs w:val="24"/>
+          <w:lang w:val="tr-TR"/>
+        </w:rPr>
+      </w:pPr>
+      <w:r>
+        <w:rPr>
+          <w:noProof/>
+          <w:sz w:val="24"/>
+          <w:szCs w:val="24"/>
+          <w:lang w:val="tr-TR"/>
+        </w:rPr>
+        <w:t xml:space="preserve">Return a standard ForecastResult. </w:t>
+      </w:r>
+    </w:p>
+    <w:p>
+      <w:pPr>
+        <w:numPr>
+          <w:ilvl w:val="0"/>
+          <w:numId w:val="22"/>
+        </w:numPr>
+        <w:spacing w:after="0" w:line="240" w:lineRule="auto"/>
+        <w:rPr>
+          <w:noProof/>
+          <w:sz w:val="24"/>
+          <w:szCs w:val="24"/>
+          <w:lang w:val="tr-TR"/>
+        </w:rPr>
+      </w:pPr>
+      <w:r>
+        <w:rPr>
+          <w:b/>
+          <w:bCs/>
+          <w:noProof/>
+          <w:sz w:val="24"/>
+          <w:szCs w:val="24"/>
+          <w:lang w:val="tr-TR"/>
+        </w:rPr>
+        <w:t>Improve forecast combination</w:t>
+      </w:r>
+      <w:r>
+        <w:rPr>
+          <w:noProof/>
+          <w:sz w:val="24"/>
+          <w:szCs w:val="24"/>
+          <w:lang w:val="tr-TR"/>
+        </w:rPr>
+        <w:t xml:space="preserve"> </w:t>
+      </w:r>
+    </w:p>
+    <w:p>
+      <w:pPr>
+        <w:numPr>
+          <w:ilvl w:val="1"/>
+          <w:numId w:val="22"/>
+        </w:numPr>
+        <w:spacing w:after="0" w:line="240" w:lineRule="auto"/>
+        <w:rPr>
+          <w:noProof/>
+          <w:sz w:val="24"/>
+          <w:szCs w:val="24"/>
+          <w:lang w:val="tr-TR"/>
+        </w:rPr>
+      </w:pPr>
+      <w:r>
+        <w:rPr>
+          <w:noProof/>
+          <w:sz w:val="24"/>
+          <w:szCs w:val="24"/>
+          <w:lang w:val="tr-TR"/>
+        </w:rPr>
+        <w:t xml:space="preserve">Merge trend and residual forecasts. </w:t>
+      </w:r>
+    </w:p>
+    <w:p>
+      <w:pPr>
+        <w:numPr>
+          <w:ilvl w:val="1"/>
+          <w:numId w:val="22"/>
+        </w:numPr>
+        <w:spacing w:after="0" w:line="240" w:lineRule="auto"/>
+        <w:rPr>
+          <w:noProof/>
+          <w:sz w:val="24"/>
+          <w:szCs w:val="24"/>
+          <w:lang w:val="tr-TR"/>
+        </w:rPr>
+      </w:pPr>
+      <w:r>
+        <w:rPr>
+          <w:noProof/>
+          <w:sz w:val="24"/>
+          <w:szCs w:val="24"/>
+          <w:lang w:val="tr-TR"/>
+        </w:rPr>
+        <w:t xml:space="preserve">Preserve the correct datetime index. </w:t>
+      </w:r>
+    </w:p>
+    <w:p>
+      <w:pPr>
+        <w:numPr>
+          <w:ilvl w:val="1"/>
+          <w:numId w:val="22"/>
+        </w:numPr>
+        <w:spacing w:after="0" w:line="240" w:lineRule="auto"/>
+        <w:rPr>
+          <w:noProof/>
+          <w:sz w:val="24"/>
+          <w:szCs w:val="24"/>
+          <w:lang w:val="tr-TR"/>
+        </w:rPr>
+      </w:pPr>
+      <w:r>
+        <w:rPr>
+          <w:noProof/>
+          <w:sz w:val="24"/>
+          <w:szCs w:val="24"/>
+          <w:lang w:val="tr-TR"/>
+        </w:rPr>
+        <w:t xml:space="preserve">Merge metadata cleanly. </w:t>
+      </w:r>
+    </w:p>
+    <w:p>
+      <w:pPr>
+        <w:numPr>
+          <w:ilvl w:val="1"/>
+          <w:numId w:val="22"/>
+        </w:numPr>
+        <w:spacing w:after="0" w:line="240" w:lineRule="auto"/>
+        <w:rPr>
+          <w:noProof/>
+          <w:sz w:val="24"/>
+          <w:szCs w:val="24"/>
+          <w:lang w:val="tr-TR"/>
+        </w:rPr>
+      </w:pPr>
+      <w:r>
+        <w:rPr>
+          <w:noProof/>
+          <w:sz w:val="24"/>
+          <w:szCs w:val="24"/>
+          <w:lang w:val="tr-TR"/>
+        </w:rPr>
+        <w:t xml:space="preserve">Include useful diagnostics such as: </w:t>
+      </w:r>
+    </w:p>
+    <w:p>
+      <w:pPr>
+        <w:numPr>
+          <w:ilvl w:val="2"/>
+          <w:numId w:val="22"/>
+        </w:numPr>
+        <w:spacing w:after="0" w:line="240" w:lineRule="auto"/>
+        <w:rPr>
+          <w:noProof/>
+          <w:sz w:val="24"/>
+          <w:szCs w:val="24"/>
+          <w:lang w:val="tr-TR"/>
+        </w:rPr>
+      </w:pPr>
+      <w:r>
+        <w:rPr>
+          <w:noProof/>
+          <w:sz w:val="24"/>
+          <w:szCs w:val="24"/>
+          <w:lang w:val="tr-TR"/>
+        </w:rPr>
+        <w:t xml:space="preserve">bias correction </w:t>
+      </w:r>
+    </w:p>
+    <w:p>
+      <w:pPr>
+        <w:numPr>
+          <w:ilvl w:val="2"/>
+          <w:numId w:val="22"/>
+        </w:numPr>
+        <w:spacing w:after="0" w:line="240" w:lineRule="auto"/>
+        <w:rPr>
+          <w:noProof/>
+          <w:sz w:val="24"/>
+          <w:szCs w:val="24"/>
+          <w:lang w:val="tr-TR"/>
+        </w:rPr>
+      </w:pPr>
+      <w:r>
+        <w:rPr>
+          <w:noProof/>
+          <w:sz w:val="24"/>
+          <w:szCs w:val="24"/>
+          <w:lang w:val="tr-TR"/>
+        </w:rPr>
+        <w:t xml:space="preserve">innovation σ </w:t>
+      </w:r>
+    </w:p>
+    <w:p>
+      <w:pPr>
+        <w:numPr>
+          <w:ilvl w:val="2"/>
+          <w:numId w:val="22"/>
+        </w:numPr>
+        <w:spacing w:after="0" w:line="240" w:lineRule="auto"/>
+        <w:rPr>
+          <w:noProof/>
+          <w:sz w:val="24"/>
+          <w:szCs w:val="24"/>
+          <w:lang w:val="tr-TR"/>
+        </w:rPr>
+      </w:pPr>
+      <w:r>
+        <w:rPr>
+          <w:noProof/>
+          <w:sz w:val="24"/>
+          <w:szCs w:val="24"/>
+          <w:lang w:val="tr-TR"/>
+        </w:rPr>
+        <w:t xml:space="preserve">drift estimate </w:t>
+      </w:r>
+    </w:p>
+    <w:p>
+      <w:pPr>
+        <w:numPr>
+          <w:ilvl w:val="2"/>
+          <w:numId w:val="22"/>
+        </w:numPr>
+        <w:spacing w:after="0" w:line="240" w:lineRule="auto"/>
+        <w:rPr>
+          <w:noProof/>
+          <w:sz w:val="24"/>
+          <w:szCs w:val="24"/>
+          <w:lang w:val="tr-TR"/>
+        </w:rPr>
+      </w:pPr>
+      <w:r>
+        <w:rPr>
+          <w:noProof/>
+          <w:sz w:val="24"/>
+          <w:szCs w:val="24"/>
+          <w:lang w:val="tr-TR"/>
+        </w:rPr>
+        <w:t xml:space="preserve">architecture version </w:t>
+      </w:r>
+    </w:p>
+    <w:p>
+      <w:pPr>
+        <w:numPr>
+          <w:ilvl w:val="0"/>
+          <w:numId w:val="22"/>
+        </w:numPr>
+        <w:spacing w:after="0" w:line="240" w:lineRule="auto"/>
+        <w:rPr>
+          <w:noProof/>
+          <w:sz w:val="24"/>
+          <w:szCs w:val="24"/>
+          <w:lang w:val="tr-TR"/>
+        </w:rPr>
+      </w:pPr>
+      <w:r>
+        <w:rPr>
+          <w:b/>
+          <w:bCs/>
+          <w:noProof/>
+          <w:sz w:val="24"/>
+          <w:szCs w:val="24"/>
+          <w:lang w:val="tr-TR"/>
+        </w:rPr>
+        <w:t>Hybrid diagnostic</w:t>
+      </w:r>
+      <w:r>
+        <w:rPr>
+          <w:b/>
+          <w:bCs/>
+          <w:noProof/>
+          <w:sz w:val="24"/>
+          <w:szCs w:val="24"/>
+          <w:lang w:val="tr-TR"/>
+        </w:rPr>
+        <w:t>s</w:t>
+      </w:r>
+    </w:p>
+    <w:p>
+      <w:pPr>
+        <w:spacing w:after="0" w:line="240" w:lineRule="auto"/>
+        <w:ind w:left="708" w:firstLine="708"/>
+        <w:rPr>
+          <w:noProof/>
+          <w:sz w:val="24"/>
+          <w:szCs w:val="24"/>
+          <w:lang w:val="tr-TR"/>
+        </w:rPr>
+      </w:pPr>
+      <w:r>
+        <w:rPr>
+          <w:noProof/>
+          <w:sz w:val="24"/>
+          <w:szCs w:val="24"/>
+          <w:lang w:val="tr-TR"/>
+        </w:rPr>
+        <w:t>innovations()</w:t>
+      </w:r>
+    </w:p>
+    <w:p>
+      <w:pPr>
+        <w:spacing w:after="0" w:line="240" w:lineRule="auto"/>
+        <w:ind w:left="720" w:firstLine="696"/>
+        <w:rPr>
+          <w:noProof/>
+          <w:sz w:val="24"/>
+          <w:szCs w:val="24"/>
+          <w:lang w:val="tr-TR"/>
+        </w:rPr>
+      </w:pPr>
+      <w:r>
+        <w:rPr>
+          <w:noProof/>
+          <w:sz w:val="24"/>
+          <w:szCs w:val="24"/>
+          <w:lang w:val="tr-TR"/>
+        </w:rPr>
+        <w:t>residuals()</w:t>
+      </w:r>
+    </w:p>
+    <w:p>
+      <w:pPr>
+        <w:spacing w:after="0" w:line="240" w:lineRule="auto"/>
+        <w:ind w:left="720" w:firstLine="696"/>
+        <w:rPr>
+          <w:noProof/>
+          <w:sz w:val="24"/>
+          <w:szCs w:val="24"/>
+          <w:lang w:val="tr-TR"/>
+        </w:rPr>
+      </w:pPr>
+      <w:r>
+        <w:rPr>
+          <w:noProof/>
+          <w:sz w:val="24"/>
+          <w:szCs w:val="24"/>
+          <w:lang w:val="tr-TR"/>
+        </w:rPr>
+        <w:t>trend()</w:t>
+      </w:r>
+    </w:p>
+    <w:p>
+      <w:pPr>
+        <w:spacing w:after="0" w:line="240" w:lineRule="auto"/>
+        <w:ind w:left="720" w:firstLine="696"/>
+        <w:rPr>
+          <w:noProof/>
+          <w:sz w:val="24"/>
+          <w:szCs w:val="24"/>
+          <w:lang w:val="tr-TR"/>
+        </w:rPr>
+      </w:pPr>
+      <w:r>
+        <w:rPr>
+          <w:noProof/>
+          <w:sz w:val="24"/>
+          <w:szCs w:val="24"/>
+          <w:lang w:val="tr-TR"/>
+        </w:rPr>
+        <w:t>drift()</w:t>
+      </w:r>
+    </w:p>
+    <w:p>
+      <w:pPr>
+        <w:spacing w:after="0" w:line="240" w:lineRule="auto"/>
+        <w:ind w:left="708" w:firstLine="708"/>
+        <w:rPr>
+          <w:noProof/>
+          <w:sz w:val="24"/>
+          <w:szCs w:val="24"/>
+          <w:lang w:val="tr-TR"/>
+        </w:rPr>
+      </w:pPr>
+      <w:r>
+        <w:rPr>
+          <w:noProof/>
+          <w:sz w:val="24"/>
+          <w:szCs w:val="24"/>
+          <w:lang w:val="tr-TR"/>
+        </w:rPr>
+        <w:t>sigma()</w:t>
+      </w:r>
+    </w:p>
+    <w:p>
+      <w:pPr>
+        <w:spacing w:after="0" w:line="240" w:lineRule="auto"/>
+        <w:rPr>
+          <w:noProof/>
+          <w:sz w:val="24"/>
+          <w:szCs w:val="24"/>
+          <w:lang w:val="tr-TR"/>
+        </w:rPr>
+      </w:pPr>
+    </w:p>
+    <w:p>
+      <w:pPr>
+        <w:spacing w:after="0" w:line="240" w:lineRule="auto"/>
+        <w:rPr>
+          <w:noProof/>
+          <w:sz w:val="24"/>
+          <w:szCs w:val="24"/>
+          <w:lang w:val="tr-TR"/>
+        </w:rPr>
+      </w:pPr>
+    </w:p>
+    <w:p>
+      <w:pPr>
+        <w:rPr>
+          <w:noProof/>
+          <w:sz w:val="24"/>
+          <w:szCs w:val="24"/>
+          <w:lang w:val="tr-TR"/>
+        </w:rPr>
+      </w:pPr>
+      <w:r>
+        <w:rPr>
+          <w:noProof/>
+          <w:sz w:val="24"/>
+          <w:szCs w:val="24"/>
+          <w:lang w:val="tr-TR"/>
+        </w:rPr>
+        <w:br w:type="page"/>
+      </w:r>
+    </w:p>
+    <w:p>
+      <w:pPr>
+        <w:spacing w:after="0" w:line="240" w:lineRule="auto"/>
+        <w:rPr>
+          <w:b/>
+          <w:bCs/>
+          <w:noProof/>
+          <w:sz w:val="24"/>
+          <w:szCs w:val="24"/>
+          <w:lang w:val="tr-TR"/>
+        </w:rPr>
+      </w:pPr>
+      <w:r>
+        <w:rPr>
+          <w:b/>
+          <w:bCs/>
+          <w:noProof/>
+          <w:sz w:val="24"/>
+          <w:szCs w:val="24"/>
+          <w:lang w:val="tr-TR"/>
+        </w:rPr>
+        <w:lastRenderedPageBreak/>
+        <w:t>Revised priority</w:t>
+      </w:r>
+    </w:p>
+    <w:p>
+      <w:pPr>
+        <w:spacing w:after="0" w:line="240" w:lineRule="auto"/>
+        <w:rPr>
+          <w:b/>
+          <w:bCs/>
+          <w:noProof/>
+          <w:sz w:val="24"/>
+          <w:szCs w:val="24"/>
+          <w:lang w:val="tr-TR"/>
+        </w:rPr>
+      </w:pPr>
+    </w:p>
+    <w:p>
+      <w:pPr>
+        <w:spacing w:after="0" w:line="240" w:lineRule="auto"/>
+        <w:rPr>
+          <w:b/>
+          <w:bCs/>
+          <w:noProof/>
+          <w:sz w:val="24"/>
+          <w:szCs w:val="24"/>
+          <w:lang w:val="tr-TR"/>
+        </w:rPr>
+      </w:pPr>
+      <w:r>
+        <w:rPr>
+          <w:b/>
+          <w:bCs/>
+          <w:noProof/>
+          <w:sz w:val="24"/>
+          <w:szCs w:val="24"/>
+          <w:lang w:val="tr-TR"/>
+        </w:rPr>
+        <w:t>Phase 1 — Visualization improvements</w:t>
+      </w:r>
+    </w:p>
+    <w:p>
+      <w:pPr>
+        <w:numPr>
+          <w:ilvl w:val="0"/>
+          <w:numId w:val="23"/>
+        </w:numPr>
+        <w:spacing w:after="0" w:line="240" w:lineRule="auto"/>
+        <w:rPr>
+          <w:noProof/>
+          <w:sz w:val="24"/>
+          <w:szCs w:val="24"/>
+          <w:lang w:val="tr-TR"/>
+        </w:rPr>
+      </w:pPr>
+      <w:r>
+        <w:rPr>
+          <w:rFonts w:ascii="Segoe UI Emoji" w:hAnsi="Segoe UI Emoji" w:cs="Segoe UI Emoji"/>
+          <w:noProof/>
+          <w:sz w:val="24"/>
+          <w:szCs w:val="24"/>
+          <w:lang w:val="tr-TR"/>
+        </w:rPr>
+        <w:t>✅</w:t>
+      </w:r>
+      <w:r>
+        <w:rPr>
+          <w:noProof/>
+          <w:sz w:val="24"/>
+          <w:szCs w:val="24"/>
+          <w:lang w:val="tr-TR"/>
+        </w:rPr>
+        <w:t xml:space="preserve"> Show fitted/model values on the plot. </w:t>
+      </w:r>
+    </w:p>
+    <w:p>
+      <w:pPr>
+        <w:numPr>
+          <w:ilvl w:val="0"/>
+          <w:numId w:val="23"/>
+        </w:numPr>
+        <w:spacing w:after="0" w:line="240" w:lineRule="auto"/>
+        <w:rPr>
+          <w:noProof/>
+          <w:sz w:val="24"/>
+          <w:szCs w:val="24"/>
+          <w:lang w:val="tr-TR"/>
+        </w:rPr>
+      </w:pPr>
+      <w:r>
+        <w:rPr>
+          <w:rFonts w:ascii="Segoe UI Emoji" w:hAnsi="Segoe UI Emoji" w:cs="Segoe UI Emoji"/>
+          <w:noProof/>
+          <w:sz w:val="24"/>
+          <w:szCs w:val="24"/>
+          <w:lang w:val="tr-TR"/>
+        </w:rPr>
+        <w:t>✅</w:t>
+      </w:r>
+      <w:r>
+        <w:rPr>
+          <w:noProof/>
+          <w:sz w:val="24"/>
+          <w:szCs w:val="24"/>
+          <w:lang w:val="tr-TR"/>
+        </w:rPr>
+        <w:t xml:space="preserve"> Add the experiment information box (ID, battery, model, version, horizon). </w:t>
+      </w:r>
+    </w:p>
+    <w:p>
+      <w:pPr>
+        <w:spacing w:after="0" w:line="240" w:lineRule="auto"/>
+        <w:rPr>
+          <w:b/>
+          <w:bCs/>
+          <w:noProof/>
+          <w:sz w:val="24"/>
+          <w:szCs w:val="24"/>
+          <w:lang w:val="tr-TR"/>
+        </w:rPr>
+      </w:pPr>
+      <w:r>
+        <w:rPr>
+          <w:b/>
+          <w:bCs/>
+          <w:noProof/>
+          <w:sz w:val="24"/>
+          <w:szCs w:val="24"/>
+          <w:lang w:val="tr-TR"/>
+        </w:rPr>
+        <w:t xml:space="preserve">Phase 2 — Hybrid diagnostics </w:t>
+      </w:r>
+      <w:r>
+        <w:rPr>
+          <w:rFonts w:ascii="Segoe UI Emoji" w:hAnsi="Segoe UI Emoji" w:cs="Segoe UI Emoji"/>
+          <w:b/>
+          <w:bCs/>
+          <w:noProof/>
+          <w:sz w:val="24"/>
+          <w:szCs w:val="24"/>
+          <w:lang w:val="tr-TR"/>
+        </w:rPr>
+        <w:t>⭐</w:t>
+      </w:r>
+      <w:r>
+        <w:rPr>
+          <w:b/>
+          <w:bCs/>
+          <w:noProof/>
+          <w:sz w:val="24"/>
+          <w:szCs w:val="24"/>
+          <w:lang w:val="tr-TR"/>
+        </w:rPr>
+        <w:t xml:space="preserve"> (next major milestone)</w:t>
+      </w:r>
+    </w:p>
+    <w:p>
+      <w:pPr>
+        <w:spacing w:after="0" w:line="240" w:lineRule="auto"/>
+        <w:rPr>
+          <w:noProof/>
+          <w:sz w:val="24"/>
+          <w:szCs w:val="24"/>
+          <w:lang w:val="tr-TR"/>
+        </w:rPr>
+      </w:pPr>
+      <w:r>
+        <w:rPr>
+          <w:noProof/>
+          <w:sz w:val="24"/>
+          <w:szCs w:val="24"/>
+          <w:lang w:val="tr-TR"/>
+        </w:rPr>
+        <w:t>This would introduce a dedicated diagnostics API for all hybrid forecasters.</w:t>
+      </w:r>
+    </w:p>
+    <w:p>
+      <w:pPr>
+        <w:spacing w:after="0" w:line="240" w:lineRule="auto"/>
+        <w:rPr>
+          <w:noProof/>
+          <w:sz w:val="24"/>
+          <w:szCs w:val="24"/>
+          <w:lang w:val="tr-TR"/>
+        </w:rPr>
+      </w:pPr>
+    </w:p>
+    <w:p>
+      <w:pPr>
+        <w:spacing w:after="0" w:line="240" w:lineRule="auto"/>
+        <w:rPr>
+          <w:b/>
+          <w:bCs/>
+          <w:noProof/>
+          <w:sz w:val="24"/>
+          <w:szCs w:val="24"/>
+          <w:lang w:val="tr-TR"/>
+        </w:rPr>
+      </w:pPr>
+      <w:r>
+        <w:rPr>
+          <w:b/>
+          <w:bCs/>
+          <w:noProof/>
+          <w:sz w:val="24"/>
+          <w:szCs w:val="24"/>
+          <w:lang w:val="tr-TR"/>
+        </w:rPr>
+        <w:t>Phase 3 — Hybrid diagnostic plots</w:t>
+      </w:r>
+    </w:p>
+    <w:p>
+      <w:pPr>
+        <w:numPr>
+          <w:ilvl w:val="0"/>
+          <w:numId w:val="24"/>
+        </w:numPr>
+        <w:spacing w:after="0" w:line="240" w:lineRule="auto"/>
+        <w:rPr>
+          <w:noProof/>
+          <w:sz w:val="24"/>
+          <w:szCs w:val="24"/>
+          <w:lang w:val="tr-TR"/>
+        </w:rPr>
+      </w:pPr>
+      <w:r>
+        <w:rPr>
+          <w:b/>
+          <w:bCs/>
+          <w:noProof/>
+          <w:sz w:val="24"/>
+          <w:szCs w:val="24"/>
+          <w:lang w:val="tr-TR"/>
+        </w:rPr>
+        <w:t>Measured vs Trend vs Hybrid</w:t>
+      </w:r>
+      <w:r>
+        <w:rPr>
+          <w:noProof/>
+          <w:sz w:val="24"/>
+          <w:szCs w:val="24"/>
+          <w:lang w:val="tr-TR"/>
+        </w:rPr>
+        <w:t xml:space="preserve"> </w:t>
+      </w:r>
+    </w:p>
+    <w:p>
+      <w:pPr>
+        <w:numPr>
+          <w:ilvl w:val="0"/>
+          <w:numId w:val="24"/>
+        </w:numPr>
+        <w:spacing w:after="0" w:line="240" w:lineRule="auto"/>
+        <w:rPr>
+          <w:noProof/>
+          <w:sz w:val="24"/>
+          <w:szCs w:val="24"/>
+          <w:lang w:val="tr-TR"/>
+        </w:rPr>
+      </w:pPr>
+      <w:r>
+        <w:rPr>
+          <w:b/>
+          <w:bCs/>
+          <w:noProof/>
+          <w:sz w:val="24"/>
+          <w:szCs w:val="24"/>
+          <w:lang w:val="tr-TR"/>
+        </w:rPr>
+        <w:t>Residual series</w:t>
+      </w:r>
+      <w:r>
+        <w:rPr>
+          <w:noProof/>
+          <w:sz w:val="24"/>
+          <w:szCs w:val="24"/>
+          <w:lang w:val="tr-TR"/>
+        </w:rPr>
+        <w:t xml:space="preserve"> </w:t>
+      </w:r>
+    </w:p>
+    <w:p>
+      <w:pPr>
+        <w:numPr>
+          <w:ilvl w:val="0"/>
+          <w:numId w:val="24"/>
+        </w:numPr>
+        <w:spacing w:after="0" w:line="240" w:lineRule="auto"/>
+        <w:rPr>
+          <w:noProof/>
+          <w:sz w:val="24"/>
+          <w:szCs w:val="24"/>
+          <w:lang w:val="tr-TR"/>
+        </w:rPr>
+      </w:pPr>
+      <w:r>
+        <w:rPr>
+          <w:b/>
+          <w:bCs/>
+          <w:noProof/>
+          <w:sz w:val="24"/>
+          <w:szCs w:val="24"/>
+          <w:lang w:val="tr-TR"/>
+        </w:rPr>
+        <w:t>Residual histogram</w:t>
+      </w:r>
+      <w:r>
+        <w:rPr>
+          <w:noProof/>
+          <w:sz w:val="24"/>
+          <w:szCs w:val="24"/>
+          <w:lang w:val="tr-TR"/>
+        </w:rPr>
+        <w:t xml:space="preserve"> </w:t>
+      </w:r>
+    </w:p>
+    <w:p>
+      <w:pPr>
+        <w:numPr>
+          <w:ilvl w:val="0"/>
+          <w:numId w:val="24"/>
+        </w:numPr>
+        <w:spacing w:after="0" w:line="240" w:lineRule="auto"/>
+        <w:rPr>
+          <w:noProof/>
+          <w:sz w:val="24"/>
+          <w:szCs w:val="24"/>
+          <w:lang w:val="tr-TR"/>
+        </w:rPr>
+      </w:pPr>
+      <w:r>
+        <w:rPr>
+          <w:b/>
+          <w:bCs/>
+          <w:noProof/>
+          <w:sz w:val="24"/>
+          <w:szCs w:val="24"/>
+          <w:lang w:val="tr-TR"/>
+        </w:rPr>
+        <w:t>Residual autocorrelation</w:t>
+      </w:r>
+      <w:r>
+        <w:rPr>
+          <w:noProof/>
+          <w:sz w:val="24"/>
+          <w:szCs w:val="24"/>
+          <w:lang w:val="tr-TR"/>
+        </w:rPr>
+        <w:t xml:space="preserve"> </w:t>
+      </w:r>
+    </w:p>
+    <w:p>
+      <w:pPr>
+        <w:numPr>
+          <w:ilvl w:val="0"/>
+          <w:numId w:val="24"/>
+        </w:numPr>
+        <w:spacing w:after="0" w:line="240" w:lineRule="auto"/>
+        <w:rPr>
+          <w:noProof/>
+          <w:sz w:val="24"/>
+          <w:szCs w:val="24"/>
+          <w:lang w:val="tr-TR"/>
+        </w:rPr>
+      </w:pPr>
+      <w:r>
+        <w:rPr>
+          <w:b/>
+          <w:bCs/>
+          <w:noProof/>
+          <w:sz w:val="24"/>
+          <w:szCs w:val="24"/>
+          <w:lang w:val="tr-TR"/>
+        </w:rPr>
+        <w:t>Trend forecast + Residual forecast + Hybrid forecast</w:t>
+      </w:r>
+      <w:r>
+        <w:rPr>
+          <w:noProof/>
+          <w:sz w:val="24"/>
+          <w:szCs w:val="24"/>
+          <w:lang w:val="tr-TR"/>
+        </w:rPr>
+        <w:t xml:space="preserve"> </w:t>
+      </w:r>
+    </w:p>
+    <w:p>
+      <w:pPr>
+        <w:numPr>
+          <w:ilvl w:val="0"/>
+          <w:numId w:val="24"/>
+        </w:numPr>
+        <w:spacing w:after="0" w:line="240" w:lineRule="auto"/>
+        <w:rPr>
+          <w:noProof/>
+          <w:sz w:val="24"/>
+          <w:szCs w:val="24"/>
+          <w:lang w:val="tr-TR"/>
+        </w:rPr>
+      </w:pPr>
+      <w:r>
+        <w:rPr>
+          <w:b/>
+          <w:bCs/>
+          <w:noProof/>
+          <w:sz w:val="24"/>
+          <w:szCs w:val="24"/>
+          <w:lang w:val="tr-TR"/>
+        </w:rPr>
+        <w:t>Residual correction contribution</w:t>
+      </w:r>
+      <w:r>
+        <w:rPr>
+          <w:noProof/>
+          <w:sz w:val="24"/>
+          <w:szCs w:val="24"/>
+          <w:lang w:val="tr-TR"/>
+        </w:rPr>
+        <w:t xml:space="preserve"> (how much the LSTM adjusted the Kalman prediction) </w:t>
+      </w:r>
+    </w:p>
+    <w:p>
+      <w:pPr>
+        <w:spacing w:after="0" w:line="240" w:lineRule="auto"/>
+        <w:ind w:left="720"/>
+        <w:rPr>
+          <w:noProof/>
+          <w:sz w:val="24"/>
+          <w:szCs w:val="24"/>
+          <w:lang w:val="tr-TR"/>
+        </w:rPr>
+      </w:pPr>
+    </w:p>
+    <w:p>
+      <w:pPr>
+        <w:spacing w:after="0" w:line="240" w:lineRule="auto"/>
+        <w:rPr>
+          <w:noProof/>
+          <w:sz w:val="24"/>
+          <w:szCs w:val="24"/>
+          <w:lang w:val="tr-TR"/>
+        </w:rPr>
+      </w:pPr>
+      <w:r>
+        <w:rPr>
+          <w:noProof/>
+          <w:sz w:val="24"/>
+          <w:szCs w:val="24"/>
+          <w:lang w:val="tr-TR"/>
+        </w:rPr>
+        <w:pict w14:anchorId="097AE042">
+          <v:rect id="_x0000_i1045" style="width:0;height:1.5pt" o:hralign="center" o:hrstd="t" o:hr="t" fillcolor="#a0a0a0" stroked="f"/>
+        </w:pict>
+      </w:r>
+    </w:p>
+    <w:p>
+      <w:pPr>
+        <w:spacing w:after="0" w:line="240" w:lineRule="auto"/>
+        <w:rPr>
+          <w:b/>
+          <w:bCs/>
+          <w:noProof/>
+          <w:sz w:val="24"/>
+          <w:szCs w:val="24"/>
+          <w:lang w:val="tr-TR"/>
+        </w:rPr>
+      </w:pPr>
+      <w:r>
+        <w:rPr>
+          <w:b/>
+          <w:bCs/>
+          <w:noProof/>
+          <w:sz w:val="24"/>
+          <w:szCs w:val="24"/>
+          <w:lang w:val="tr-TR"/>
+        </w:rPr>
+        <w:t>Phase 4 — Confidence intervals</w:t>
+      </w:r>
+    </w:p>
+    <w:p>
+      <w:pPr>
+        <w:spacing w:after="0" w:line="240" w:lineRule="auto"/>
+        <w:rPr>
+          <w:noProof/>
+          <w:sz w:val="24"/>
+          <w:szCs w:val="24"/>
+          <w:lang w:val="tr-TR"/>
+        </w:rPr>
+      </w:pPr>
+    </w:p>
+    <w:p>
+      <w:pPr>
+        <w:numPr>
+          <w:ilvl w:val="0"/>
+          <w:numId w:val="25"/>
+        </w:numPr>
+        <w:spacing w:after="0" w:line="240" w:lineRule="auto"/>
+        <w:rPr>
+          <w:noProof/>
+          <w:sz w:val="24"/>
+          <w:szCs w:val="24"/>
+          <w:lang w:val="tr-TR"/>
+        </w:rPr>
+      </w:pPr>
+      <w:r>
+        <w:rPr>
+          <w:noProof/>
+          <w:sz w:val="24"/>
+          <w:szCs w:val="24"/>
+          <w:lang w:val="tr-TR"/>
+        </w:rPr>
+        <w:t xml:space="preserve">Kalman covariance propagation, </w:t>
+      </w:r>
+    </w:p>
+    <w:p>
+      <w:pPr>
+        <w:numPr>
+          <w:ilvl w:val="0"/>
+          <w:numId w:val="25"/>
+        </w:numPr>
+        <w:spacing w:after="0" w:line="240" w:lineRule="auto"/>
+        <w:rPr>
+          <w:noProof/>
+          <w:sz w:val="24"/>
+          <w:szCs w:val="24"/>
+          <w:lang w:val="tr-TR"/>
+        </w:rPr>
+      </w:pPr>
+      <w:r>
+        <w:rPr>
+          <w:noProof/>
+          <w:sz w:val="24"/>
+          <w:szCs w:val="24"/>
+          <w:lang w:val="tr-TR"/>
+        </w:rPr>
+        <w:t xml:space="preserve">LSTM residual variance estimation, </w:t>
+      </w:r>
+    </w:p>
+    <w:p>
+      <w:pPr>
+        <w:numPr>
+          <w:ilvl w:val="0"/>
+          <w:numId w:val="25"/>
+        </w:numPr>
+        <w:spacing w:after="0" w:line="240" w:lineRule="auto"/>
+        <w:rPr>
+          <w:noProof/>
+          <w:sz w:val="24"/>
+          <w:szCs w:val="24"/>
+          <w:lang w:val="tr-TR"/>
+        </w:rPr>
+      </w:pPr>
+      <w:r>
+        <w:rPr>
+          <w:noProof/>
+          <w:sz w:val="24"/>
+          <w:szCs w:val="24"/>
+          <w:lang w:val="tr-TR"/>
+        </w:rPr>
+        <w:t xml:space="preserve">Hybrid uncertainty propagation, </w:t>
+      </w:r>
+    </w:p>
+    <w:p>
+      <w:pPr>
+        <w:numPr>
+          <w:ilvl w:val="0"/>
+          <w:numId w:val="25"/>
+        </w:numPr>
+        <w:spacing w:after="0" w:line="240" w:lineRule="auto"/>
+        <w:rPr>
+          <w:noProof/>
+          <w:sz w:val="24"/>
+          <w:szCs w:val="24"/>
+          <w:lang w:val="tr-TR"/>
+        </w:rPr>
+      </w:pPr>
+      <w:r>
+        <w:rPr>
+          <w:noProof/>
+          <w:sz w:val="24"/>
+          <w:szCs w:val="24"/>
+          <w:lang w:val="tr-TR"/>
+        </w:rPr>
+        <w:t xml:space="preserve">Confidence bands on the final forecast. </w:t>
+      </w:r>
+    </w:p>
+    <w:p>
+      <w:pPr>
+        <w:spacing w:after="0" w:line="240" w:lineRule="auto"/>
+        <w:rPr>
+          <w:noProof/>
+          <w:sz w:val="24"/>
+          <w:szCs w:val="24"/>
+          <w:lang w:val="tr-TR"/>
+        </w:rPr>
+      </w:pPr>
     </w:p>
     <w:p>
       <w:pPr>
@@ -23312,6 +24769,127 @@
     </w:lvl>
   </w:abstractNum>
   <w:abstractNum w:abstractNumId="8" w15:restartNumberingAfterBreak="0">
+    <w:nsid w:val="2D166EB7"/>
+    <w:multiLevelType w:val="multilevel"/>
+    <w:tmpl w:val="43D0E1A4"/>
+    <w:lvl w:ilvl="0">
+      <w:start w:val="1"/>
+      <w:numFmt w:val="decimal"/>
+      <w:lvlText w:val="%1."/>
+      <w:lvlJc w:val="left"/>
+      <w:pPr>
+        <w:tabs>
+          <w:tab w:val="num" w:pos="720"/>
+        </w:tabs>
+        <w:ind w:left="720" w:hanging="360"/>
+      </w:pPr>
+    </w:lvl>
+    <w:lvl w:ilvl="1">
+      <w:start w:val="1"/>
+      <w:numFmt w:val="bullet"/>
+      <w:lvlText w:val="o"/>
+      <w:lvlJc w:val="left"/>
+      <w:pPr>
+        <w:tabs>
+          <w:tab w:val="num" w:pos="1440"/>
+        </w:tabs>
+        <w:ind w:left="1440" w:hanging="360"/>
+      </w:pPr>
+      <w:rPr>
+        <w:rFonts w:ascii="Courier New" w:hAnsi="Courier New" w:hint="default"/>
+        <w:sz w:val="20"/>
+      </w:rPr>
+    </w:lvl>
+    <w:lvl w:ilvl="2">
+      <w:start w:val="1"/>
+      <w:numFmt w:val="bullet"/>
+      <w:lvlText w:val=""/>
+      <w:lvlJc w:val="left"/>
+      <w:pPr>
+        <w:tabs>
+          <w:tab w:val="num" w:pos="2160"/>
+        </w:tabs>
+        <w:ind w:left="2160" w:hanging="360"/>
+      </w:pPr>
+      <w:rPr>
+        <w:rFonts w:ascii="Wingdings" w:hAnsi="Wingdings" w:hint="default"/>
+        <w:sz w:val="20"/>
+      </w:rPr>
+    </w:lvl>
+    <w:lvl w:ilvl="3" w:tentative="1">
+      <w:start w:val="1"/>
+      <w:numFmt w:val="decimal"/>
+      <w:lvlText w:val="%4."/>
+      <w:lvlJc w:val="left"/>
+      <w:pPr>
+        <w:tabs>
+          <w:tab w:val="num" w:pos="2880"/>
+        </w:tabs>
+        <w:ind w:left="2880" w:hanging="360"/>
+      </w:pPr>
+    </w:lvl>
+    <w:lvl w:ilvl="4" w:tentative="1">
+      <w:start w:val="1"/>
+      <w:numFmt w:val="decimal"/>
+      <w:lvlText w:val="%5."/>
+      <w:lvlJc w:val="left"/>
+      <w:pPr>
+        <w:tabs>
+          <w:tab w:val="num" w:pos="3600"/>
+        </w:tabs>
+        <w:ind w:left="3600" w:hanging="360"/>
+      </w:pPr>
+    </w:lvl>
+    <w:lvl w:ilvl="5" w:tentative="1">
+      <w:start w:val="1"/>
+      <w:numFmt w:val="decimal"/>
+      <w:lvlText w:val="%6."/>
+      <w:lvlJc w:val="left"/>
+      <w:pPr>
+        <w:tabs>
+          <w:tab w:val="num" w:pos="4320"/>
+        </w:tabs>
+        <w:ind w:left="4320" w:hanging="360"/>
+      </w:pPr>
+    </w:lvl>
+    <w:lvl w:ilvl="6" w:tentative="1">
+      <w:start w:val="1"/>
+      <w:numFmt w:val="decimal"/>
+      <w:lvlText w:val="%7."/>
+      <w:lvlJc w:val="left"/>
+      <w:pPr>
+        <w:tabs>
+          <w:tab w:val="num" w:pos="5040"/>
+        </w:tabs>
+        <w:ind w:left="5040" w:hanging="360"/>
+      </w:pPr>
+    </w:lvl>
+    <w:lvl w:ilvl="7" w:tentative="1">
+      <w:start w:val="1"/>
+      <w:numFmt w:val="decimal"/>
+      <w:lvlText w:val="%8."/>
+      <w:lvlJc w:val="left"/>
+      <w:pPr>
+        <w:tabs>
+          <w:tab w:val="num" w:pos="5760"/>
+        </w:tabs>
+        <w:ind w:left="5760" w:hanging="360"/>
+      </w:pPr>
+    </w:lvl>
+    <w:lvl w:ilvl="8" w:tentative="1">
+      <w:start w:val="1"/>
+      <w:numFmt w:val="decimal"/>
+      <w:lvlText w:val="%9."/>
+      <w:lvlJc w:val="left"/>
+      <w:pPr>
+        <w:tabs>
+          <w:tab w:val="num" w:pos="6480"/>
+        </w:tabs>
+        <w:ind w:left="6480" w:hanging="360"/>
+      </w:pPr>
+    </w:lvl>
+  </w:abstractNum>
+  <w:abstractNum w:abstractNumId="9" w15:restartNumberingAfterBreak="0">
     <w:nsid w:val="2D490C38"/>
     <w:multiLevelType w:val="multilevel"/>
     <w:tmpl w:val="E1749C3E"/>
@@ -23460,7 +25038,7 @@
       </w:rPr>
     </w:lvl>
   </w:abstractNum>
-  <w:abstractNum w:abstractNumId="9" w15:restartNumberingAfterBreak="0">
+  <w:abstractNum w:abstractNumId="10" w15:restartNumberingAfterBreak="0">
     <w:nsid w:val="30AD1C62"/>
     <w:multiLevelType w:val="multilevel"/>
     <w:tmpl w:val="371475F2"/>
@@ -23609,7 +25187,7 @@
       </w:rPr>
     </w:lvl>
   </w:abstractNum>
-  <w:abstractNum w:abstractNumId="10" w15:restartNumberingAfterBreak="0">
+  <w:abstractNum w:abstractNumId="11" w15:restartNumberingAfterBreak="0">
     <w:nsid w:val="321D4140"/>
     <w:multiLevelType w:val="hybridMultilevel"/>
     <w:tmpl w:val="3E7CA19E"/>
@@ -23698,7 +25276,7 @@
       </w:pPr>
     </w:lvl>
   </w:abstractNum>
-  <w:abstractNum w:abstractNumId="11" w15:restartNumberingAfterBreak="0">
+  <w:abstractNum w:abstractNumId="12" w15:restartNumberingAfterBreak="0">
     <w:nsid w:val="36354E43"/>
     <w:multiLevelType w:val="multilevel"/>
     <w:tmpl w:val="3AF2AC0C"/>
@@ -23847,7 +25425,7 @@
       </w:rPr>
     </w:lvl>
   </w:abstractNum>
-  <w:abstractNum w:abstractNumId="12" w15:restartNumberingAfterBreak="0">
+  <w:abstractNum w:abstractNumId="13" w15:restartNumberingAfterBreak="0">
     <w:nsid w:val="3D193969"/>
     <w:multiLevelType w:val="multilevel"/>
     <w:tmpl w:val="81EEF018"/>
@@ -23996,7 +25574,7 @@
       </w:rPr>
     </w:lvl>
   </w:abstractNum>
-  <w:abstractNum w:abstractNumId="13" w15:restartNumberingAfterBreak="0">
+  <w:abstractNum w:abstractNumId="14" w15:restartNumberingAfterBreak="0">
     <w:nsid w:val="3D733783"/>
     <w:multiLevelType w:val="multilevel"/>
     <w:tmpl w:val="A6383A0C"/>
@@ -24145,7 +25723,120 @@
       </w:rPr>
     </w:lvl>
   </w:abstractNum>
-  <w:abstractNum w:abstractNumId="14" w15:restartNumberingAfterBreak="0">
+  <w:abstractNum w:abstractNumId="15" w15:restartNumberingAfterBreak="0">
+    <w:nsid w:val="43E44423"/>
+    <w:multiLevelType w:val="multilevel"/>
+    <w:tmpl w:val="7938D2BE"/>
+    <w:lvl w:ilvl="0">
+      <w:start w:val="1"/>
+      <w:numFmt w:val="decimal"/>
+      <w:lvlText w:val="%1."/>
+      <w:lvlJc w:val="left"/>
+      <w:pPr>
+        <w:tabs>
+          <w:tab w:val="num" w:pos="720"/>
+        </w:tabs>
+        <w:ind w:left="720" w:hanging="360"/>
+      </w:pPr>
+    </w:lvl>
+    <w:lvl w:ilvl="1" w:tentative="1">
+      <w:start w:val="1"/>
+      <w:numFmt w:val="decimal"/>
+      <w:lvlText w:val="%2."/>
+      <w:lvlJc w:val="left"/>
+      <w:pPr>
+        <w:tabs>
+          <w:tab w:val="num" w:pos="1440"/>
+        </w:tabs>
+        <w:ind w:left="1440" w:hanging="360"/>
+      </w:pPr>
+    </w:lvl>
+    <w:lvl w:ilvl="2" w:tentative="1">
+      <w:start w:val="1"/>
+      <w:numFmt w:val="decimal"/>
+      <w:lvlText w:val="%3."/>
+      <w:lvlJc w:val="left"/>
+      <w:pPr>
+        <w:tabs>
+          <w:tab w:val="num" w:pos="2160"/>
+        </w:tabs>
+        <w:ind w:left="2160" w:hanging="360"/>
+      </w:pPr>
+    </w:lvl>
+    <w:lvl w:ilvl="3" w:tentative="1">
+      <w:start w:val="1"/>
+      <w:numFmt w:val="decimal"/>
+      <w:lvlText w:val="%4."/>
+      <w:lvlJc w:val="left"/>
+      <w:pPr>
+        <w:tabs>
+          <w:tab w:val="num" w:pos="2880"/>
+        </w:tabs>
+        <w:ind w:left="2880" w:hanging="360"/>
+      </w:pPr>
+    </w:lvl>
+    <w:lvl w:ilvl="4" w:tentative="1">
+      <w:start w:val="1"/>
+      <w:numFmt w:val="decimal"/>
+      <w:lvlText w:val="%5."/>
+      <w:lvlJc w:val="left"/>
+      <w:pPr>
+        <w:tabs>
+          <w:tab w:val="num" w:pos="3600"/>
+        </w:tabs>
+        <w:ind w:left="3600" w:hanging="360"/>
+      </w:pPr>
+    </w:lvl>
+    <w:lvl w:ilvl="5" w:tentative="1">
+      <w:start w:val="1"/>
+      <w:numFmt w:val="decimal"/>
+      <w:lvlText w:val="%6."/>
+      <w:lvlJc w:val="left"/>
+      <w:pPr>
+        <w:tabs>
+          <w:tab w:val="num" w:pos="4320"/>
+        </w:tabs>
+        <w:ind w:left="4320" w:hanging="360"/>
+      </w:pPr>
+    </w:lvl>
+    <w:lvl w:ilvl="6" w:tentative="1">
+      <w:start w:val="1"/>
+      <w:numFmt w:val="decimal"/>
+      <w:lvlText w:val="%7."/>
+      <w:lvlJc w:val="left"/>
+      <w:pPr>
+        <w:tabs>
+          <w:tab w:val="num" w:pos="5040"/>
+        </w:tabs>
+        <w:ind w:left="5040" w:hanging="360"/>
+      </w:pPr>
+    </w:lvl>
+    <w:lvl w:ilvl="7" w:tentative="1">
+      <w:start w:val="1"/>
+      <w:numFmt w:val="decimal"/>
+      <w:lvlText w:val="%8."/>
+      <w:lvlJc w:val="left"/>
+      <w:pPr>
+        <w:tabs>
+          <w:tab w:val="num" w:pos="5760"/>
+        </w:tabs>
+        <w:ind w:left="5760" w:hanging="360"/>
+      </w:pPr>
+    </w:lvl>
+    <w:lvl w:ilvl="8" w:tentative="1">
+      <w:start w:val="1"/>
+      <w:numFmt w:val="decimal"/>
+      <w:lvlText w:val="%9."/>
+      <w:lvlJc w:val="left"/>
+      <w:pPr>
+        <w:tabs>
+          <w:tab w:val="num" w:pos="6480"/>
+        </w:tabs>
+        <w:ind w:left="6480" w:hanging="360"/>
+      </w:pPr>
+    </w:lvl>
+  </w:abstractNum>
+  <w:abstractNum w:abstractNumId="16" w15:restartNumberingAfterBreak="0">
     <w:nsid w:val="44D72C93"/>
     <w:multiLevelType w:val="multilevel"/>
     <w:tmpl w:val="64604668"/>
@@ -24294,7 +25985,7 @@
       </w:rPr>
     </w:lvl>
   </w:abstractNum>
-  <w:abstractNum w:abstractNumId="15" w15:restartNumberingAfterBreak="0">
+  <w:abstractNum w:abstractNumId="17" w15:restartNumberingAfterBreak="0">
     <w:nsid w:val="4DC845A1"/>
     <w:multiLevelType w:val="multilevel"/>
     <w:tmpl w:val="EF786B8A"/>
@@ -24443,7 +26134,7 @@
       </w:rPr>
     </w:lvl>
   </w:abstractNum>
-  <w:abstractNum w:abstractNumId="16" w15:restartNumberingAfterBreak="0">
+  <w:abstractNum w:abstractNumId="18" w15:restartNumberingAfterBreak="0">
     <w:nsid w:val="63050202"/>
     <w:multiLevelType w:val="multilevel"/>
     <w:tmpl w:val="8D1E2ABC"/>
@@ -24592,10 +26283,10 @@
       </w:rPr>
     </w:lvl>
   </w:abstractNum>
-  <w:abstractNum w:abstractNumId="17" w15:restartNumberingAfterBreak="0">
-    <w:nsid w:val="6B0579E7"/>
+  <w:abstractNum w:abstractNumId="19" w15:restartNumberingAfterBreak="0">
+    <w:nsid w:val="6A741FCF"/>
     <w:multiLevelType w:val="multilevel"/>
-    <w:tmpl w:val="A8DA2166"/>
+    <w:tmpl w:val="FFFA9D52"/>
     <w:lvl w:ilvl="0">
       <w:start w:val="1"/>
       <w:numFmt w:val="bullet"/>
@@ -24741,10 +26432,10 @@
       </w:rPr>
     </w:lvl>
   </w:abstractNum>
-  <w:abstractNum w:abstractNumId="18" w15:restartNumberingAfterBreak="0">
-    <w:nsid w:val="6CF718B0"/>
+  <w:abstractNum w:abstractNumId="20" w15:restartNumberingAfterBreak="0">
+    <w:nsid w:val="6B0579E7"/>
     <w:multiLevelType w:val="multilevel"/>
-    <w:tmpl w:val="9C1416D6"/>
+    <w:tmpl w:val="A8DA2166"/>
     <w:lvl w:ilvl="0">
       <w:start w:val="1"/>
       <w:numFmt w:val="bullet"/>
@@ -24890,10 +26581,10 @@
       </w:rPr>
     </w:lvl>
   </w:abstractNum>
-  <w:abstractNum w:abstractNumId="19" w15:restartNumberingAfterBreak="0">
-    <w:nsid w:val="78733247"/>
+  <w:abstractNum w:abstractNumId="21" w15:restartNumberingAfterBreak="0">
+    <w:nsid w:val="6CF718B0"/>
     <w:multiLevelType w:val="multilevel"/>
-    <w:tmpl w:val="18361A16"/>
+    <w:tmpl w:val="9C1416D6"/>
     <w:lvl w:ilvl="0">
       <w:start w:val="1"/>
       <w:numFmt w:val="bullet"/>
@@ -25039,10 +26730,10 @@
       </w:rPr>
     </w:lvl>
   </w:abstractNum>
-  <w:abstractNum w:abstractNumId="20" w15:restartNumberingAfterBreak="0">
-    <w:nsid w:val="78940C2D"/>
+  <w:abstractNum w:abstractNumId="22" w15:restartNumberingAfterBreak="0">
+    <w:nsid w:val="6FA67E2D"/>
     <w:multiLevelType w:val="multilevel"/>
-    <w:tmpl w:val="7A36FD2E"/>
+    <w:tmpl w:val="9558CC96"/>
     <w:lvl w:ilvl="0">
       <w:start w:val="1"/>
       <w:numFmt w:val="bullet"/>
@@ -25188,50 +26879,348 @@
       </w:rPr>
     </w:lvl>
   </w:abstractNum>
+  <w:abstractNum w:abstractNumId="23" w15:restartNumberingAfterBreak="0">
+    <w:nsid w:val="78733247"/>
+    <w:multiLevelType w:val="multilevel"/>
+    <w:tmpl w:val="18361A16"/>
+    <w:lvl w:ilvl="0">
+      <w:start w:val="1"/>
+      <w:numFmt w:val="bullet"/>
+      <w:lvlText w:val=""/>
+      <w:lvlJc w:val="left"/>
+      <w:pPr>
+        <w:tabs>
+          <w:tab w:val="num" w:pos="720"/>
+        </w:tabs>
+        <w:ind w:left="720" w:hanging="360"/>
+      </w:pPr>
+      <w:rPr>
+        <w:rFonts w:ascii="Symbol" w:hAnsi="Symbol" w:hint="default"/>
+        <w:sz w:val="20"/>
+      </w:rPr>
+    </w:lvl>
+    <w:lvl w:ilvl="1" w:tentative="1">
+      <w:start w:val="1"/>
+      <w:numFmt w:val="bullet"/>
+      <w:lvlText w:val="o"/>
+      <w:lvlJc w:val="left"/>
+      <w:pPr>
+        <w:tabs>
+          <w:tab w:val="num" w:pos="1440"/>
+        </w:tabs>
+        <w:ind w:left="1440" w:hanging="360"/>
+      </w:pPr>
+      <w:rPr>
+        <w:rFonts w:ascii="Courier New" w:hAnsi="Courier New" w:hint="default"/>
+        <w:sz w:val="20"/>
+      </w:rPr>
+    </w:lvl>
+    <w:lvl w:ilvl="2" w:tentative="1">
+      <w:start w:val="1"/>
+      <w:numFmt w:val="bullet"/>
+      <w:lvlText w:val=""/>
+      <w:lvlJc w:val="left"/>
+      <w:pPr>
+        <w:tabs>
+          <w:tab w:val="num" w:pos="2160"/>
+        </w:tabs>
+        <w:ind w:left="2160" w:hanging="360"/>
+      </w:pPr>
+      <w:rPr>
+        <w:rFonts w:ascii="Wingdings" w:hAnsi="Wingdings" w:hint="default"/>
+        <w:sz w:val="20"/>
+      </w:rPr>
+    </w:lvl>
+    <w:lvl w:ilvl="3" w:tentative="1">
+      <w:start w:val="1"/>
+      <w:numFmt w:val="bullet"/>
+      <w:lvlText w:val=""/>
+      <w:lvlJc w:val="left"/>
+      <w:pPr>
+        <w:tabs>
+          <w:tab w:val="num" w:pos="2880"/>
+        </w:tabs>
+        <w:ind w:left="2880" w:hanging="360"/>
+      </w:pPr>
+      <w:rPr>
+        <w:rFonts w:ascii="Wingdings" w:hAnsi="Wingdings" w:hint="default"/>
+        <w:sz w:val="20"/>
+      </w:rPr>
+    </w:lvl>
+    <w:lvl w:ilvl="4" w:tentative="1">
+      <w:start w:val="1"/>
+      <w:numFmt w:val="bullet"/>
+      <w:lvlText w:val=""/>
+      <w:lvlJc w:val="left"/>
+      <w:pPr>
+        <w:tabs>
+          <w:tab w:val="num" w:pos="3600"/>
+        </w:tabs>
+        <w:ind w:left="3600" w:hanging="360"/>
+      </w:pPr>
+      <w:rPr>
+        <w:rFonts w:ascii="Wingdings" w:hAnsi="Wingdings" w:hint="default"/>
+        <w:sz w:val="20"/>
+      </w:rPr>
+    </w:lvl>
+    <w:lvl w:ilvl="5" w:tentative="1">
+      <w:start w:val="1"/>
+      <w:numFmt w:val="bullet"/>
+      <w:lvlText w:val=""/>
+      <w:lvlJc w:val="left"/>
+      <w:pPr>
+        <w:tabs>
+          <w:tab w:val="num" w:pos="4320"/>
+        </w:tabs>
+        <w:ind w:left="4320" w:hanging="360"/>
+      </w:pPr>
+      <w:rPr>
+        <w:rFonts w:ascii="Wingdings" w:hAnsi="Wingdings" w:hint="default"/>
+        <w:sz w:val="20"/>
+      </w:rPr>
+    </w:lvl>
+    <w:lvl w:ilvl="6" w:tentative="1">
+      <w:start w:val="1"/>
+      <w:numFmt w:val="bullet"/>
+      <w:lvlText w:val=""/>
+      <w:lvlJc w:val="left"/>
+      <w:pPr>
+        <w:tabs>
+          <w:tab w:val="num" w:pos="5040"/>
+        </w:tabs>
+        <w:ind w:left="5040" w:hanging="360"/>
+      </w:pPr>
+      <w:rPr>
+        <w:rFonts w:ascii="Wingdings" w:hAnsi="Wingdings" w:hint="default"/>
+        <w:sz w:val="20"/>
+      </w:rPr>
+    </w:lvl>
+    <w:lvl w:ilvl="7" w:tentative="1">
+      <w:start w:val="1"/>
+      <w:numFmt w:val="bullet"/>
+      <w:lvlText w:val=""/>
+      <w:lvlJc w:val="left"/>
+      <w:pPr>
+        <w:tabs>
+          <w:tab w:val="num" w:pos="5760"/>
+        </w:tabs>
+        <w:ind w:left="5760" w:hanging="360"/>
+      </w:pPr>
+      <w:rPr>
+        <w:rFonts w:ascii="Wingdings" w:hAnsi="Wingdings" w:hint="default"/>
+        <w:sz w:val="20"/>
+      </w:rPr>
+    </w:lvl>
+    <w:lvl w:ilvl="8" w:tentative="1">
+      <w:start w:val="1"/>
+      <w:numFmt w:val="bullet"/>
+      <w:lvlText w:val=""/>
+      <w:lvlJc w:val="left"/>
+      <w:pPr>
+        <w:tabs>
+          <w:tab w:val="num" w:pos="6480"/>
+        </w:tabs>
+        <w:ind w:left="6480" w:hanging="360"/>
+      </w:pPr>
+      <w:rPr>
+        <w:rFonts w:ascii="Wingdings" w:hAnsi="Wingdings" w:hint="default"/>
+        <w:sz w:val="20"/>
+      </w:rPr>
+    </w:lvl>
+  </w:abstractNum>
+  <w:abstractNum w:abstractNumId="24" w15:restartNumberingAfterBreak="0">
+    <w:nsid w:val="78940C2D"/>
+    <w:multiLevelType w:val="multilevel"/>
+    <w:tmpl w:val="7A36FD2E"/>
+    <w:lvl w:ilvl="0">
+      <w:start w:val="1"/>
+      <w:numFmt w:val="bullet"/>
+      <w:lvlText w:val=""/>
+      <w:lvlJc w:val="left"/>
+      <w:pPr>
+        <w:tabs>
+          <w:tab w:val="num" w:pos="720"/>
+        </w:tabs>
+        <w:ind w:left="720" w:hanging="360"/>
+      </w:pPr>
+      <w:rPr>
+        <w:rFonts w:ascii="Symbol" w:hAnsi="Symbol" w:hint="default"/>
+        <w:sz w:val="20"/>
+      </w:rPr>
+    </w:lvl>
+    <w:lvl w:ilvl="1" w:tentative="1">
+      <w:start w:val="1"/>
+      <w:numFmt w:val="bullet"/>
+      <w:lvlText w:val="o"/>
+      <w:lvlJc w:val="left"/>
+      <w:pPr>
+        <w:tabs>
+          <w:tab w:val="num" w:pos="1440"/>
+        </w:tabs>
+        <w:ind w:left="1440" w:hanging="360"/>
+      </w:pPr>
+      <w:rPr>
+        <w:rFonts w:ascii="Courier New" w:hAnsi="Courier New" w:hint="default"/>
+        <w:sz w:val="20"/>
+      </w:rPr>
+    </w:lvl>
+    <w:lvl w:ilvl="2" w:tentative="1">
+      <w:start w:val="1"/>
+      <w:numFmt w:val="bullet"/>
+      <w:lvlText w:val=""/>
+      <w:lvlJc w:val="left"/>
+      <w:pPr>
+        <w:tabs>
+          <w:tab w:val="num" w:pos="2160"/>
+        </w:tabs>
+        <w:ind w:left="2160" w:hanging="360"/>
+      </w:pPr>
+      <w:rPr>
+        <w:rFonts w:ascii="Wingdings" w:hAnsi="Wingdings" w:hint="default"/>
+        <w:sz w:val="20"/>
+      </w:rPr>
+    </w:lvl>
+    <w:lvl w:ilvl="3" w:tentative="1">
+      <w:start w:val="1"/>
+      <w:numFmt w:val="bullet"/>
+      <w:lvlText w:val=""/>
+      <w:lvlJc w:val="left"/>
+      <w:pPr>
+        <w:tabs>
+          <w:tab w:val="num" w:pos="2880"/>
+        </w:tabs>
+        <w:ind w:left="2880" w:hanging="360"/>
+      </w:pPr>
+      <w:rPr>
+        <w:rFonts w:ascii="Wingdings" w:hAnsi="Wingdings" w:hint="default"/>
+        <w:sz w:val="20"/>
+      </w:rPr>
+    </w:lvl>
+    <w:lvl w:ilvl="4" w:tentative="1">
+      <w:start w:val="1"/>
+      <w:numFmt w:val="bullet"/>
+      <w:lvlText w:val=""/>
+      <w:lvlJc w:val="left"/>
+      <w:pPr>
+        <w:tabs>
+          <w:tab w:val="num" w:pos="3600"/>
+        </w:tabs>
+        <w:ind w:left="3600" w:hanging="360"/>
+      </w:pPr>
+      <w:rPr>
+        <w:rFonts w:ascii="Wingdings" w:hAnsi="Wingdings" w:hint="default"/>
+        <w:sz w:val="20"/>
+      </w:rPr>
+    </w:lvl>
+    <w:lvl w:ilvl="5" w:tentative="1">
+      <w:start w:val="1"/>
+      <w:numFmt w:val="bullet"/>
+      <w:lvlText w:val=""/>
+      <w:lvlJc w:val="left"/>
+      <w:pPr>
+        <w:tabs>
+          <w:tab w:val="num" w:pos="4320"/>
+        </w:tabs>
+        <w:ind w:left="4320" w:hanging="360"/>
+      </w:pPr>
+      <w:rPr>
+        <w:rFonts w:ascii="Wingdings" w:hAnsi="Wingdings" w:hint="default"/>
+        <w:sz w:val="20"/>
+      </w:rPr>
+    </w:lvl>
+    <w:lvl w:ilvl="6" w:tentative="1">
+      <w:start w:val="1"/>
+      <w:numFmt w:val="bullet"/>
+      <w:lvlText w:val=""/>
+      <w:lvlJc w:val="left"/>
+      <w:pPr>
+        <w:tabs>
+          <w:tab w:val="num" w:pos="5040"/>
+        </w:tabs>
+        <w:ind w:left="5040" w:hanging="360"/>
+      </w:pPr>
+      <w:rPr>
+        <w:rFonts w:ascii="Wingdings" w:hAnsi="Wingdings" w:hint="default"/>
+        <w:sz w:val="20"/>
+      </w:rPr>
+    </w:lvl>
+    <w:lvl w:ilvl="7" w:tentative="1">
+      <w:start w:val="1"/>
+      <w:numFmt w:val="bullet"/>
+      <w:lvlText w:val=""/>
+      <w:lvlJc w:val="left"/>
+      <w:pPr>
+        <w:tabs>
+          <w:tab w:val="num" w:pos="5760"/>
+        </w:tabs>
+        <w:ind w:left="5760" w:hanging="360"/>
+      </w:pPr>
+      <w:rPr>
+        <w:rFonts w:ascii="Wingdings" w:hAnsi="Wingdings" w:hint="default"/>
+        <w:sz w:val="20"/>
+      </w:rPr>
+    </w:lvl>
+    <w:lvl w:ilvl="8" w:tentative="1">
+      <w:start w:val="1"/>
+      <w:numFmt w:val="bullet"/>
+      <w:lvlText w:val=""/>
+      <w:lvlJc w:val="left"/>
+      <w:pPr>
+        <w:tabs>
+          <w:tab w:val="num" w:pos="6480"/>
+        </w:tabs>
+        <w:ind w:left="6480" w:hanging="360"/>
+      </w:pPr>
+      <w:rPr>
+        <w:rFonts w:ascii="Wingdings" w:hAnsi="Wingdings" w:hint="default"/>
+        <w:sz w:val="20"/>
+      </w:rPr>
+    </w:lvl>
+  </w:abstractNum>
   <w:num w:numId="1" w16cid:durableId="320813693">
     <w:abstractNumId w:val="5"/>
   </w:num>
   <w:num w:numId="2" w16cid:durableId="680281116">
-    <w:abstractNumId w:val="10"/>
+    <w:abstractNumId w:val="11"/>
   </w:num>
   <w:num w:numId="3" w16cid:durableId="1288438365">
-    <w:abstractNumId w:val="14"/>
+    <w:abstractNumId w:val="16"/>
   </w:num>
   <w:num w:numId="4" w16cid:durableId="1155562159">
-    <w:abstractNumId w:val="17"/>
+    <w:abstractNumId w:val="20"/>
   </w:num>
   <w:num w:numId="5" w16cid:durableId="1958020517">
-    <w:abstractNumId w:val="16"/>
+    <w:abstractNumId w:val="18"/>
   </w:num>
   <w:num w:numId="6" w16cid:durableId="1596940668">
-    <w:abstractNumId w:val="11"/>
+    <w:abstractNumId w:val="12"/>
   </w:num>
   <w:num w:numId="7" w16cid:durableId="1579166471">
     <w:abstractNumId w:val="1"/>
   </w:num>
   <w:num w:numId="8" w16cid:durableId="753748469">
-    <w:abstractNumId w:val="20"/>
+    <w:abstractNumId w:val="24"/>
   </w:num>
   <w:num w:numId="9" w16cid:durableId="604701249">
-    <w:abstractNumId w:val="19"/>
+    <w:abstractNumId w:val="23"/>
   </w:num>
   <w:num w:numId="10" w16cid:durableId="1503279606">
     <w:abstractNumId w:val="7"/>
   </w:num>
   <w:num w:numId="11" w16cid:durableId="785000340">
-    <w:abstractNumId w:val="13"/>
+    <w:abstractNumId w:val="14"/>
   </w:num>
   <w:num w:numId="12" w16cid:durableId="290215297">
-    <w:abstractNumId w:val="15"/>
+    <w:abstractNumId w:val="17"/>
   </w:num>
   <w:num w:numId="13" w16cid:durableId="1160194568">
-    <w:abstractNumId w:val="18"/>
+    <w:abstractNumId w:val="21"/>
   </w:num>
   <w:num w:numId="14" w16cid:durableId="1407336860">
-    <w:abstractNumId w:val="8"/>
+    <w:abstractNumId w:val="9"/>
   </w:num>
   <w:num w:numId="15" w16cid:durableId="797989056">
-    <w:abstractNumId w:val="12"/>
+    <w:abstractNumId w:val="13"/>
   </w:num>
   <w:num w:numId="16" w16cid:durableId="866019238">
     <w:abstractNumId w:val="4"/>
@@ -25243,13 +27232,25 @@
     <w:abstractNumId w:val="2"/>
   </w:num>
   <w:num w:numId="19" w16cid:durableId="504443146">
-    <w:abstractNumId w:val="9"/>
+    <w:abstractNumId w:val="10"/>
   </w:num>
   <w:num w:numId="20" w16cid:durableId="16588099">
     <w:abstractNumId w:val="3"/>
   </w:num>
   <w:num w:numId="21" w16cid:durableId="724178803">
     <w:abstractNumId w:val="0"/>
+  </w:num>
+  <w:num w:numId="22" w16cid:durableId="10420835">
+    <w:abstractNumId w:val="8"/>
+  </w:num>
+  <w:num w:numId="23" w16cid:durableId="1855613261">
+    <w:abstractNumId w:val="19"/>
+  </w:num>
+  <w:num w:numId="24" w16cid:durableId="1044720201">
+    <w:abstractNumId w:val="15"/>
+  </w:num>
+  <w:num w:numId="25" w16cid:durableId="516847964">
+    <w:abstractNumId w:val="22"/>
   </w:num>
 </w:numbering>
 </file>

</xml_diff>

<commit_message>
Sprint 10: Complete Diagnostics Hybrid Forecasting Framework
</commit_message>
<xml_diff>
--- a/docs/draft/development_flow.docx
+++ b/docs/draft/development_flow.docx
@@ -22372,6 +22372,9 @@
             <m:t>residual</m:t>
           </m:r>
           <m:r>
+            <m:rPr>
+              <m:sty m:val="p"/>
+            </m:rPr>
             <w:rPr>
               <w:noProof/>
               <w:sz w:val="24"/>
@@ -23407,7 +23410,7 @@
           <w:lang w:val="tr-TR"/>
         </w:rPr>
         <w:pict w14:anchorId="097AE042">
-          <v:rect id="_x0000_i1045" style="width:0;height:1.5pt" o:hralign="center" o:hrstd="t" o:hr="t" fillcolor="#a0a0a0" stroked="f"/>
+          <v:rect id="_x0000_i1039" style="width:0;height:1.5pt" o:hralign="center" o:hrstd="t" o:hr="t" fillcolor="#a0a0a0" stroked="f"/>
         </w:pict>
       </w:r>
     </w:p>
@@ -23563,6 +23566,829 @@
           <w:lang w:val="tr-TR"/>
         </w:rPr>
       </w:pPr>
+    </w:p>
+    <w:p>
+      <w:pPr>
+        <w:rPr>
+          <w:noProof/>
+          <w:sz w:val="24"/>
+          <w:szCs w:val="24"/>
+          <w:lang w:val="tr-TR"/>
+        </w:rPr>
+      </w:pPr>
+      <w:r>
+        <w:rPr>
+          <w:noProof/>
+          <w:sz w:val="24"/>
+          <w:szCs w:val="24"/>
+          <w:lang w:val="tr-TR"/>
+        </w:rPr>
+        <w:br w:type="page"/>
+      </w:r>
+    </w:p>
+    <w:p>
+      <w:pPr>
+        <w:spacing w:after="0" w:line="240" w:lineRule="auto"/>
+        <w:rPr>
+          <w:b/>
+          <w:bCs/>
+          <w:noProof/>
+          <w:sz w:val="32"/>
+          <w:szCs w:val="32"/>
+          <w:u w:val="single"/>
+        </w:rPr>
+      </w:pPr>
+      <w:r>
+        <w:rPr>
+          <w:b/>
+          <w:bCs/>
+          <w:noProof/>
+          <w:sz w:val="32"/>
+          <w:szCs w:val="32"/>
+          <w:u w:val="single"/>
+        </w:rPr>
+        <w:lastRenderedPageBreak/>
+        <w:t>Architecture of ‘</w:t>
+      </w:r>
+      <w:r>
+        <w:rPr>
+          <w:b/>
+          <w:bCs/>
+          <w:noProof/>
+          <w:sz w:val="32"/>
+          <w:szCs w:val="32"/>
+          <w:u w:val="single"/>
+        </w:rPr>
+        <w:t>HybridDiagnostics</w:t>
+      </w:r>
+      <w:r>
+        <w:rPr>
+          <w:b/>
+          <w:bCs/>
+          <w:noProof/>
+          <w:sz w:val="32"/>
+          <w:szCs w:val="32"/>
+          <w:u w:val="single"/>
+        </w:rPr>
+        <w:t>’ :</w:t>
+      </w:r>
+    </w:p>
+    <w:p>
+      <w:pPr>
+        <w:spacing w:after="0" w:line="240" w:lineRule="auto"/>
+        <w:rPr>
+          <w:noProof/>
+          <w:sz w:val="24"/>
+          <w:szCs w:val="24"/>
+          <w:lang w:val="tr-TR"/>
+        </w:rPr>
+      </w:pPr>
+    </w:p>
+    <w:p>
+      <w:pPr>
+        <w:spacing w:after="0" w:line="240" w:lineRule="auto"/>
+        <w:rPr>
+          <w:b/>
+          <w:bCs/>
+          <w:noProof/>
+          <w:sz w:val="28"/>
+          <w:szCs w:val="28"/>
+          <w:lang w:val="tr-TR"/>
+        </w:rPr>
+      </w:pPr>
+      <w:r>
+        <w:rPr>
+          <w:b/>
+          <w:bCs/>
+          <w:noProof/>
+          <w:sz w:val="28"/>
+          <w:szCs w:val="28"/>
+          <w:lang w:val="tr-TR"/>
+        </w:rPr>
+        <w:t>HybridDiagnostics</w:t>
+      </w:r>
+    </w:p>
+    <w:p>
+      <w:pPr>
+        <w:spacing w:after="0" w:line="240" w:lineRule="auto"/>
+        <w:rPr>
+          <w:noProof/>
+          <w:sz w:val="24"/>
+          <w:szCs w:val="24"/>
+          <w:lang w:val="tr-TR"/>
+        </w:rPr>
+      </w:pPr>
+    </w:p>
+    <w:p>
+      <w:pPr>
+        <w:spacing w:after="0" w:line="240" w:lineRule="auto"/>
+        <w:rPr>
+          <w:noProof/>
+          <w:sz w:val="24"/>
+          <w:szCs w:val="24"/>
+          <w:lang w:val="tr-TR"/>
+        </w:rPr>
+      </w:pPr>
+      <w:r>
+        <w:rPr>
+          <w:rFonts w:ascii="MS Gothic" w:eastAsia="MS Gothic" w:hAnsi="MS Gothic" w:cs="MS Gothic" w:hint="eastAsia"/>
+          <w:noProof/>
+          <w:sz w:val="24"/>
+          <w:szCs w:val="24"/>
+          <w:lang w:val="tr-TR"/>
+        </w:rPr>
+        <w:t>├</w:t>
+      </w:r>
+      <w:r>
+        <w:rPr>
+          <w:rFonts w:ascii="Calibri" w:hAnsi="Calibri" w:cs="Calibri"/>
+          <w:noProof/>
+          <w:sz w:val="24"/>
+          <w:szCs w:val="24"/>
+          <w:lang w:val="tr-TR"/>
+        </w:rPr>
+        <w:t>──</w:t>
+      </w:r>
+      <w:r>
+        <w:rPr>
+          <w:noProof/>
+          <w:sz w:val="24"/>
+          <w:szCs w:val="24"/>
+          <w:lang w:val="tr-TR"/>
+        </w:rPr>
+        <w:t xml:space="preserve"> </w:t>
+      </w:r>
+      <w:r>
+        <w:rPr>
+          <w:b/>
+          <w:bCs/>
+          <w:noProof/>
+          <w:sz w:val="24"/>
+          <w:szCs w:val="24"/>
+          <w:lang w:val="tr-TR"/>
+        </w:rPr>
+        <w:t>Decomposition</w:t>
+      </w:r>
+    </w:p>
+    <w:p>
+      <w:pPr>
+        <w:spacing w:after="0" w:line="240" w:lineRule="auto"/>
+        <w:rPr>
+          <w:noProof/>
+          <w:sz w:val="24"/>
+          <w:szCs w:val="24"/>
+          <w:lang w:val="tr-TR"/>
+        </w:rPr>
+      </w:pPr>
+    </w:p>
+    <w:p>
+      <w:pPr>
+        <w:spacing w:after="0" w:line="240" w:lineRule="auto"/>
+        <w:rPr>
+          <w:noProof/>
+          <w:sz w:val="24"/>
+          <w:szCs w:val="24"/>
+          <w:lang w:val="tr-TR"/>
+        </w:rPr>
+      </w:pPr>
+      <w:r>
+        <w:rPr>
+          <w:noProof/>
+          <w:sz w:val="24"/>
+          <w:szCs w:val="24"/>
+          <w:lang w:val="tr-TR"/>
+        </w:rPr>
+        <w:t xml:space="preserve"> </w:t>
+      </w:r>
+      <w:r>
+        <w:rPr>
+          <w:noProof/>
+          <w:sz w:val="24"/>
+          <w:szCs w:val="24"/>
+          <w:lang w:val="tr-TR"/>
+        </w:rPr>
+        <w:t>│      verify_decomposition()</w:t>
+      </w:r>
+    </w:p>
+    <w:p>
+      <w:pPr>
+        <w:spacing w:after="0" w:line="240" w:lineRule="auto"/>
+        <w:rPr>
+          <w:noProof/>
+          <w:sz w:val="24"/>
+          <w:szCs w:val="24"/>
+          <w:lang w:val="tr-TR"/>
+        </w:rPr>
+      </w:pPr>
+    </w:p>
+    <w:p>
+      <w:pPr>
+        <w:spacing w:after="0" w:line="240" w:lineRule="auto"/>
+        <w:rPr>
+          <w:noProof/>
+          <w:sz w:val="24"/>
+          <w:szCs w:val="24"/>
+          <w:lang w:val="tr-TR"/>
+        </w:rPr>
+      </w:pPr>
+      <w:r>
+        <w:rPr>
+          <w:noProof/>
+          <w:sz w:val="24"/>
+          <w:szCs w:val="24"/>
+          <w:lang w:val="tr-TR"/>
+        </w:rPr>
+        <w:t xml:space="preserve"> </w:t>
+      </w:r>
+      <w:r>
+        <w:rPr>
+          <w:noProof/>
+          <w:sz w:val="24"/>
+          <w:szCs w:val="24"/>
+          <w:lang w:val="tr-TR"/>
+        </w:rPr>
+        <w:t>│      trend_variance()</w:t>
+      </w:r>
+    </w:p>
+    <w:p>
+      <w:pPr>
+        <w:spacing w:after="0" w:line="240" w:lineRule="auto"/>
+        <w:rPr>
+          <w:noProof/>
+          <w:sz w:val="24"/>
+          <w:szCs w:val="24"/>
+          <w:lang w:val="tr-TR"/>
+        </w:rPr>
+      </w:pPr>
+    </w:p>
+    <w:p>
+      <w:pPr>
+        <w:spacing w:after="0" w:line="240" w:lineRule="auto"/>
+        <w:rPr>
+          <w:noProof/>
+          <w:sz w:val="24"/>
+          <w:szCs w:val="24"/>
+          <w:lang w:val="tr-TR"/>
+        </w:rPr>
+      </w:pPr>
+      <w:r>
+        <w:rPr>
+          <w:noProof/>
+          <w:sz w:val="24"/>
+          <w:szCs w:val="24"/>
+          <w:lang w:val="tr-TR"/>
+        </w:rPr>
+        <w:t xml:space="preserve"> </w:t>
+      </w:r>
+      <w:r>
+        <w:rPr>
+          <w:noProof/>
+          <w:sz w:val="24"/>
+          <w:szCs w:val="24"/>
+          <w:lang w:val="tr-TR"/>
+        </w:rPr>
+        <w:t>│      residual_variance()</w:t>
+      </w:r>
+    </w:p>
+    <w:p>
+      <w:pPr>
+        <w:spacing w:after="0" w:line="240" w:lineRule="auto"/>
+        <w:rPr>
+          <w:noProof/>
+          <w:sz w:val="24"/>
+          <w:szCs w:val="24"/>
+          <w:lang w:val="tr-TR"/>
+        </w:rPr>
+      </w:pPr>
+    </w:p>
+    <w:p>
+      <w:pPr>
+        <w:spacing w:after="0" w:line="240" w:lineRule="auto"/>
+        <w:rPr>
+          <w:noProof/>
+          <w:sz w:val="24"/>
+          <w:szCs w:val="24"/>
+          <w:lang w:val="tr-TR"/>
+        </w:rPr>
+      </w:pPr>
+      <w:r>
+        <w:rPr>
+          <w:noProof/>
+          <w:sz w:val="24"/>
+          <w:szCs w:val="24"/>
+          <w:lang w:val="tr-TR"/>
+        </w:rPr>
+        <w:t xml:space="preserve"> </w:t>
+      </w:r>
+      <w:r>
+        <w:rPr>
+          <w:noProof/>
+          <w:sz w:val="24"/>
+          <w:szCs w:val="24"/>
+          <w:lang w:val="tr-TR"/>
+        </w:rPr>
+        <w:t>│</w:t>
+      </w:r>
+    </w:p>
+    <w:p>
+      <w:pPr>
+        <w:spacing w:after="0" w:line="240" w:lineRule="auto"/>
+        <w:rPr>
+          <w:noProof/>
+          <w:sz w:val="24"/>
+          <w:szCs w:val="24"/>
+          <w:lang w:val="tr-TR"/>
+        </w:rPr>
+      </w:pPr>
+    </w:p>
+    <w:p>
+      <w:pPr>
+        <w:spacing w:after="0" w:line="240" w:lineRule="auto"/>
+        <w:rPr>
+          <w:noProof/>
+          <w:sz w:val="24"/>
+          <w:szCs w:val="24"/>
+          <w:lang w:val="tr-TR"/>
+        </w:rPr>
+      </w:pPr>
+      <w:r>
+        <w:rPr>
+          <w:rFonts w:ascii="MS Gothic" w:eastAsia="MS Gothic" w:hAnsi="MS Gothic" w:cs="MS Gothic" w:hint="eastAsia"/>
+          <w:noProof/>
+          <w:sz w:val="24"/>
+          <w:szCs w:val="24"/>
+          <w:lang w:val="tr-TR"/>
+        </w:rPr>
+        <w:t>├</w:t>
+      </w:r>
+      <w:r>
+        <w:rPr>
+          <w:rFonts w:ascii="Calibri" w:hAnsi="Calibri" w:cs="Calibri"/>
+          <w:noProof/>
+          <w:sz w:val="24"/>
+          <w:szCs w:val="24"/>
+          <w:lang w:val="tr-TR"/>
+        </w:rPr>
+        <w:t>──</w:t>
+      </w:r>
+      <w:r>
+        <w:rPr>
+          <w:noProof/>
+          <w:sz w:val="24"/>
+          <w:szCs w:val="24"/>
+          <w:lang w:val="tr-TR"/>
+        </w:rPr>
+        <w:t xml:space="preserve"> </w:t>
+      </w:r>
+      <w:r>
+        <w:rPr>
+          <w:b/>
+          <w:bCs/>
+          <w:noProof/>
+          <w:sz w:val="24"/>
+          <w:szCs w:val="24"/>
+          <w:lang w:val="tr-TR"/>
+        </w:rPr>
+        <w:t>Residual Statistics</w:t>
+      </w:r>
+    </w:p>
+    <w:p>
+      <w:pPr>
+        <w:spacing w:after="0" w:line="240" w:lineRule="auto"/>
+        <w:rPr>
+          <w:noProof/>
+          <w:sz w:val="24"/>
+          <w:szCs w:val="24"/>
+          <w:lang w:val="tr-TR"/>
+        </w:rPr>
+      </w:pPr>
+    </w:p>
+    <w:p>
+      <w:pPr>
+        <w:spacing w:after="0" w:line="240" w:lineRule="auto"/>
+        <w:rPr>
+          <w:noProof/>
+          <w:sz w:val="24"/>
+          <w:szCs w:val="24"/>
+          <w:lang w:val="tr-TR"/>
+        </w:rPr>
+      </w:pPr>
+      <w:r>
+        <w:rPr>
+          <w:noProof/>
+          <w:sz w:val="24"/>
+          <w:szCs w:val="24"/>
+          <w:lang w:val="tr-TR"/>
+        </w:rPr>
+        <w:t xml:space="preserve"> </w:t>
+      </w:r>
+      <w:r>
+        <w:rPr>
+          <w:noProof/>
+          <w:sz w:val="24"/>
+          <w:szCs w:val="24"/>
+          <w:lang w:val="tr-TR"/>
+        </w:rPr>
+        <w:t>│      residual_mean()</w:t>
+      </w:r>
+    </w:p>
+    <w:p>
+      <w:pPr>
+        <w:spacing w:after="0" w:line="240" w:lineRule="auto"/>
+        <w:rPr>
+          <w:noProof/>
+          <w:sz w:val="24"/>
+          <w:szCs w:val="24"/>
+          <w:lang w:val="tr-TR"/>
+        </w:rPr>
+      </w:pPr>
+    </w:p>
+    <w:p>
+      <w:pPr>
+        <w:spacing w:after="0" w:line="240" w:lineRule="auto"/>
+        <w:rPr>
+          <w:noProof/>
+          <w:sz w:val="24"/>
+          <w:szCs w:val="24"/>
+          <w:lang w:val="tr-TR"/>
+        </w:rPr>
+      </w:pPr>
+      <w:r>
+        <w:rPr>
+          <w:noProof/>
+          <w:sz w:val="24"/>
+          <w:szCs w:val="24"/>
+          <w:lang w:val="tr-TR"/>
+        </w:rPr>
+        <w:t xml:space="preserve"> </w:t>
+      </w:r>
+      <w:r>
+        <w:rPr>
+          <w:noProof/>
+          <w:sz w:val="24"/>
+          <w:szCs w:val="24"/>
+          <w:lang w:val="tr-TR"/>
+        </w:rPr>
+        <w:t>│      residual_std()</w:t>
+      </w:r>
+    </w:p>
+    <w:p>
+      <w:pPr>
+        <w:spacing w:after="0" w:line="240" w:lineRule="auto"/>
+        <w:rPr>
+          <w:noProof/>
+          <w:sz w:val="24"/>
+          <w:szCs w:val="24"/>
+          <w:lang w:val="tr-TR"/>
+        </w:rPr>
+      </w:pPr>
+    </w:p>
+    <w:p>
+      <w:pPr>
+        <w:spacing w:after="0" w:line="240" w:lineRule="auto"/>
+        <w:rPr>
+          <w:noProof/>
+          <w:sz w:val="24"/>
+          <w:szCs w:val="24"/>
+          <w:lang w:val="tr-TR"/>
+        </w:rPr>
+      </w:pPr>
+      <w:r>
+        <w:rPr>
+          <w:noProof/>
+          <w:sz w:val="24"/>
+          <w:szCs w:val="24"/>
+          <w:lang w:val="tr-TR"/>
+        </w:rPr>
+        <w:t xml:space="preserve"> </w:t>
+      </w:r>
+      <w:r>
+        <w:rPr>
+          <w:noProof/>
+          <w:sz w:val="24"/>
+          <w:szCs w:val="24"/>
+          <w:lang w:val="tr-TR"/>
+        </w:rPr>
+        <w:t>│      autocorrelation()</w:t>
+      </w:r>
+    </w:p>
+    <w:p>
+      <w:pPr>
+        <w:spacing w:after="0" w:line="240" w:lineRule="auto"/>
+        <w:rPr>
+          <w:noProof/>
+          <w:sz w:val="24"/>
+          <w:szCs w:val="24"/>
+          <w:lang w:val="tr-TR"/>
+        </w:rPr>
+      </w:pPr>
+    </w:p>
+    <w:p>
+      <w:pPr>
+        <w:spacing w:after="0" w:line="240" w:lineRule="auto"/>
+        <w:rPr>
+          <w:noProof/>
+          <w:sz w:val="24"/>
+          <w:szCs w:val="24"/>
+          <w:lang w:val="tr-TR"/>
+        </w:rPr>
+      </w:pPr>
+      <w:r>
+        <w:rPr>
+          <w:noProof/>
+          <w:sz w:val="24"/>
+          <w:szCs w:val="24"/>
+          <w:lang w:val="tr-TR"/>
+        </w:rPr>
+        <w:t xml:space="preserve"> </w:t>
+      </w:r>
+      <w:r>
+        <w:rPr>
+          <w:noProof/>
+          <w:sz w:val="24"/>
+          <w:szCs w:val="24"/>
+          <w:lang w:val="tr-TR"/>
+        </w:rPr>
+        <w:t>│      durbin_watson()</w:t>
+      </w:r>
+    </w:p>
+    <w:p>
+      <w:pPr>
+        <w:spacing w:after="0" w:line="240" w:lineRule="auto"/>
+        <w:rPr>
+          <w:noProof/>
+          <w:sz w:val="24"/>
+          <w:szCs w:val="24"/>
+          <w:lang w:val="tr-TR"/>
+        </w:rPr>
+      </w:pPr>
+    </w:p>
+    <w:p>
+      <w:pPr>
+        <w:spacing w:after="0" w:line="240" w:lineRule="auto"/>
+        <w:rPr>
+          <w:noProof/>
+          <w:sz w:val="24"/>
+          <w:szCs w:val="24"/>
+          <w:lang w:val="tr-TR"/>
+        </w:rPr>
+      </w:pPr>
+      <w:r>
+        <w:rPr>
+          <w:noProof/>
+          <w:sz w:val="24"/>
+          <w:szCs w:val="24"/>
+          <w:lang w:val="tr-TR"/>
+        </w:rPr>
+        <w:t xml:space="preserve"> </w:t>
+      </w:r>
+      <w:r>
+        <w:rPr>
+          <w:noProof/>
+          <w:sz w:val="24"/>
+          <w:szCs w:val="24"/>
+          <w:lang w:val="tr-TR"/>
+        </w:rPr>
+        <w:t>│      ljung_box()</w:t>
+      </w:r>
+    </w:p>
+    <w:p>
+      <w:pPr>
+        <w:spacing w:after="0" w:line="240" w:lineRule="auto"/>
+        <w:rPr>
+          <w:noProof/>
+          <w:sz w:val="24"/>
+          <w:szCs w:val="24"/>
+          <w:lang w:val="tr-TR"/>
+        </w:rPr>
+      </w:pPr>
+    </w:p>
+    <w:p>
+      <w:pPr>
+        <w:spacing w:after="0" w:line="240" w:lineRule="auto"/>
+        <w:rPr>
+          <w:noProof/>
+          <w:sz w:val="24"/>
+          <w:szCs w:val="24"/>
+          <w:lang w:val="tr-TR"/>
+        </w:rPr>
+      </w:pPr>
+      <w:r>
+        <w:rPr>
+          <w:noProof/>
+          <w:sz w:val="24"/>
+          <w:szCs w:val="24"/>
+          <w:lang w:val="tr-TR"/>
+        </w:rPr>
+        <w:t xml:space="preserve"> </w:t>
+      </w:r>
+      <w:r>
+        <w:rPr>
+          <w:noProof/>
+          <w:sz w:val="24"/>
+          <w:szCs w:val="24"/>
+          <w:lang w:val="tr-TR"/>
+        </w:rPr>
+        <w:t>│</w:t>
+      </w:r>
+    </w:p>
+    <w:p>
+      <w:pPr>
+        <w:spacing w:after="0" w:line="240" w:lineRule="auto"/>
+        <w:rPr>
+          <w:noProof/>
+          <w:sz w:val="24"/>
+          <w:szCs w:val="24"/>
+          <w:lang w:val="tr-TR"/>
+        </w:rPr>
+      </w:pPr>
+    </w:p>
+    <w:p>
+      <w:pPr>
+        <w:spacing w:after="0" w:line="240" w:lineRule="auto"/>
+        <w:rPr>
+          <w:noProof/>
+          <w:sz w:val="24"/>
+          <w:szCs w:val="24"/>
+          <w:lang w:val="tr-TR"/>
+        </w:rPr>
+      </w:pPr>
+      <w:r>
+        <w:rPr>
+          <w:noProof/>
+          <w:sz w:val="24"/>
+          <w:szCs w:val="24"/>
+          <w:lang w:val="tr-TR"/>
+        </w:rPr>
+        <w:t xml:space="preserve"> </w:t>
+      </w:r>
+      <w:r>
+        <w:rPr>
+          <w:noProof/>
+          <w:sz w:val="24"/>
+          <w:szCs w:val="24"/>
+          <w:lang w:val="tr-TR"/>
+        </w:rPr>
+        <w:t xml:space="preserve">└── </w:t>
+      </w:r>
+      <w:r>
+        <w:rPr>
+          <w:b/>
+          <w:bCs/>
+          <w:noProof/>
+          <w:sz w:val="24"/>
+          <w:szCs w:val="24"/>
+          <w:lang w:val="tr-TR"/>
+        </w:rPr>
+        <w:t>Quality Assessment</w:t>
+      </w:r>
+    </w:p>
+    <w:p>
+      <w:pPr>
+        <w:spacing w:after="0" w:line="240" w:lineRule="auto"/>
+        <w:rPr>
+          <w:noProof/>
+          <w:sz w:val="24"/>
+          <w:szCs w:val="24"/>
+          <w:lang w:val="tr-TR"/>
+        </w:rPr>
+      </w:pPr>
+    </w:p>
+    <w:p>
+      <w:pPr>
+        <w:spacing w:after="0" w:line="240" w:lineRule="auto"/>
+        <w:rPr>
+          <w:noProof/>
+          <w:sz w:val="24"/>
+          <w:szCs w:val="24"/>
+          <w:lang w:val="tr-TR"/>
+        </w:rPr>
+      </w:pPr>
+      <w:r>
+        <w:rPr>
+          <w:noProof/>
+          <w:sz w:val="24"/>
+          <w:szCs w:val="24"/>
+          <w:lang w:val="tr-TR"/>
+        </w:rPr>
+        <w:t xml:space="preserve">       </w:t>
+      </w:r>
+      <w:r>
+        <w:rPr>
+          <w:noProof/>
+          <w:sz w:val="24"/>
+          <w:szCs w:val="24"/>
+          <w:lang w:val="tr-TR"/>
+        </w:rPr>
+        <w:t xml:space="preserve"> </w:t>
+      </w:r>
+      <w:r>
+        <w:rPr>
+          <w:noProof/>
+          <w:sz w:val="24"/>
+          <w:szCs w:val="24"/>
+          <w:lang w:val="tr-TR"/>
+        </w:rPr>
+        <w:t>quality_score()</w:t>
+      </w:r>
+    </w:p>
+    <w:p>
+      <w:pPr>
+        <w:spacing w:after="0" w:line="240" w:lineRule="auto"/>
+        <w:rPr>
+          <w:noProof/>
+          <w:sz w:val="24"/>
+          <w:szCs w:val="24"/>
+          <w:lang w:val="tr-TR"/>
+        </w:rPr>
+      </w:pPr>
+    </w:p>
+    <w:p>
+      <w:pPr>
+        <w:spacing w:after="0" w:line="240" w:lineRule="auto"/>
+        <w:rPr>
+          <w:noProof/>
+          <w:sz w:val="24"/>
+          <w:szCs w:val="24"/>
+          <w:lang w:val="tr-TR"/>
+        </w:rPr>
+      </w:pPr>
+      <w:r>
+        <w:rPr>
+          <w:noProof/>
+          <w:sz w:val="24"/>
+          <w:szCs w:val="24"/>
+          <w:lang w:val="tr-TR"/>
+        </w:rPr>
+        <w:t xml:space="preserve">       </w:t>
+      </w:r>
+      <w:r>
+        <w:rPr>
+          <w:noProof/>
+          <w:sz w:val="24"/>
+          <w:szCs w:val="24"/>
+          <w:lang w:val="tr-TR"/>
+        </w:rPr>
+        <w:t xml:space="preserve"> </w:t>
+      </w:r>
+      <w:r>
+        <w:rPr>
+          <w:noProof/>
+          <w:sz w:val="24"/>
+          <w:szCs w:val="24"/>
+          <w:lang w:val="tr-TR"/>
+        </w:rPr>
+        <w:t>quality_grade()</w:t>
+      </w:r>
+    </w:p>
+    <w:p>
+      <w:pPr>
+        <w:spacing w:after="0" w:line="240" w:lineRule="auto"/>
+        <w:rPr>
+          <w:noProof/>
+          <w:sz w:val="24"/>
+          <w:szCs w:val="24"/>
+          <w:lang w:val="tr-TR"/>
+        </w:rPr>
+      </w:pPr>
+    </w:p>
+    <w:p>
+      <w:pPr>
+        <w:spacing w:after="0" w:line="240" w:lineRule="auto"/>
+        <w:rPr>
+          <w:noProof/>
+          <w:sz w:val="24"/>
+          <w:szCs w:val="24"/>
+          <w:lang w:val="tr-TR"/>
+        </w:rPr>
+      </w:pPr>
+      <w:r>
+        <w:rPr>
+          <w:noProof/>
+          <w:sz w:val="24"/>
+          <w:szCs w:val="24"/>
+          <w:lang w:val="tr-TR"/>
+        </w:rPr>
+        <w:t xml:space="preserve">       </w:t>
+      </w:r>
+      <w:r>
+        <w:rPr>
+          <w:noProof/>
+          <w:sz w:val="24"/>
+          <w:szCs w:val="24"/>
+          <w:lang w:val="tr-TR"/>
+        </w:rPr>
+        <w:t xml:space="preserve"> </w:t>
+      </w:r>
+      <w:r>
+        <w:rPr>
+          <w:noProof/>
+          <w:sz w:val="24"/>
+          <w:szCs w:val="24"/>
+          <w:lang w:val="tr-TR"/>
+        </w:rPr>
+        <w:t>recommendations()</w:t>
+      </w:r>
     </w:p>
     <w:sectPr>
       <w:pgSz w:w="11906" w:h="16838"/>

</xml_diff>